<commit_message>
Add live demo site, group report, and remove unused figma files
Co-authored-by: keinithaxinamalai-art <keinithaxinamalai-art@users.noreply.github.com>
</commit_message>
<xml_diff>
--- a/Project.docx
+++ b/Project.docx
@@ -4,2361 +4,880 @@
   <w:body>
     <w:p>
       <w:pPr>
-        <w:pStyle w:val="Heading1"/>
+        <w:spacing w:after="240" w:before="0" w:line="276" w:lineRule="auto"/>
+        <w:jc w:val="center"/>
       </w:pPr>
       <w:r>
-        <w:t>ICT308 Iteration 1 Technical Report</w:t>
-      </w:r>
-    </w:p>
-    <w:p>
-      <w:r>
         <w:rPr>
-          <w:rFonts w:ascii="Calibri" w:hAnsi="Calibri"/>
+          <w:rFonts w:ascii="Calibri" w:hAnsi="Calibri" w:cs="Calibri" w:eastAsia="Calibri"/>
           <w:b/>
-          <w:sz w:val="24"/>
+          <w:i w:val="0"/>
+          <w:sz w:val="32"/>
         </w:rPr>
-        <w:t>Canberra SmartWaste — Smart Waste Management System for Canberra</w:t>
-      </w:r>
-    </w:p>
-    <w:p>
-      <w:r>
-        <w:rPr>
-          <w:rFonts w:ascii="Calibri" w:hAnsi="Calibri"/>
-          <w:sz w:val="24"/>
-        </w:rPr>
-        <w:t>ICT308 – Project 2 (BIT Capstone) · Semester 2, 2026</w:t>
-      </w:r>
-    </w:p>
-    <w:p>
-      <w:r>
-        <w:rPr>
-          <w:rFonts w:ascii="Calibri" w:hAnsi="Calibri"/>
-          <w:sz w:val="24"/>
-        </w:rPr>
-        <w:t>Group prototype · Week 6 submission</w:t>
-      </w:r>
-    </w:p>
-    <w:p>
-      <w:r>
-        <w:rPr>
-          <w:rFonts w:ascii="Calibri" w:hAnsi="Calibri"/>
-          <w:b/>
-          <w:sz w:val="24"/>
-        </w:rPr>
-        <w:t>GitHub:</w:t>
-      </w:r>
-      <w:r>
-        <w:rPr>
-          <w:rFonts w:ascii="Calibri" w:hAnsi="Calibri"/>
-          <w:sz w:val="24"/>
-        </w:rPr>
-        <w:t xml:space="preserve"> https://github.com/keinithaxinamalai-art/Smart-waste-management-system</w:t>
-      </w:r>
-    </w:p>
-    <w:p>
-      <w:r>
-        <w:rPr>
-          <w:rFonts w:ascii="Calibri" w:hAnsi="Calibri"/>
-          <w:b/>
-          <w:sz w:val="24"/>
-        </w:rPr>
-        <w:t>Jira:</w:t>
-      </w:r>
-      <w:r>
-        <w:rPr>
-          <w:rFonts w:ascii="Calibri" w:hAnsi="Calibri"/>
-          <w:sz w:val="24"/>
-        </w:rPr>
-        <w:t xml:space="preserve"> (group Jira project link — attach in the Moodle cover sheet)</w:t>
+        <w:t>Canberra SmartWaste: A Smart Waste Management System for Canberra</w:t>
       </w:r>
     </w:p>
     <w:p>
       <w:pPr>
-        <w:pStyle w:val="Heading2"/>
+        <w:spacing w:after="80" w:before="0" w:line="276" w:lineRule="auto"/>
       </w:pPr>
       <w:r>
+        <w:rPr>
+          <w:rFonts w:ascii="Calibri" w:hAnsi="Calibri" w:cs="Calibri" w:eastAsia="Calibri"/>
+          <w:b/>
+          <w:i w:val="0"/>
+          <w:sz w:val="24"/>
+        </w:rPr>
+        <w:t xml:space="preserve">Group Members: </w:t>
+      </w:r>
+      <w:r>
+        <w:rPr>
+          <w:rFonts w:ascii="Calibri" w:hAnsi="Calibri" w:cs="Calibri" w:eastAsia="Calibri"/>
+          <w:b w:val="0"/>
+          <w:i w:val="0"/>
+          <w:sz w:val="24"/>
+        </w:rPr>
+        <w:t>Bijay Pokhrel, Samir Bhandari, Krishna Trivedi, Ayush Ale, Charanpal Kaur</w:t>
+      </w:r>
+    </w:p>
+    <w:p>
+      <w:pPr>
+        <w:spacing w:after="80" w:before="0" w:line="276" w:lineRule="auto"/>
+      </w:pPr>
+      <w:r>
+        <w:rPr>
+          <w:rFonts w:ascii="Calibri" w:hAnsi="Calibri" w:cs="Calibri" w:eastAsia="Calibri"/>
+          <w:b/>
+          <w:i w:val="0"/>
+          <w:sz w:val="24"/>
+        </w:rPr>
+        <w:t xml:space="preserve">GitHub Repository: </w:t>
+      </w:r>
+      <w:r>
+        <w:rPr>
+          <w:rFonts w:ascii="Calibri" w:hAnsi="Calibri" w:cs="Calibri" w:eastAsia="Calibri"/>
+          <w:b w:val="0"/>
+          <w:i w:val="0"/>
+          <w:sz w:val="24"/>
+        </w:rPr>
+        <w:t>https://github.com/keinithaxinamalai-art/Smart-waste-management-system</w:t>
+      </w:r>
+    </w:p>
+    <w:p>
+      <w:pPr>
+        <w:spacing w:after="80" w:before="0" w:line="276" w:lineRule="auto"/>
+      </w:pPr>
+      <w:r>
+        <w:rPr>
+          <w:rFonts w:ascii="Calibri" w:hAnsi="Calibri" w:cs="Calibri" w:eastAsia="Calibri"/>
+          <w:b/>
+          <w:i w:val="0"/>
+          <w:sz w:val="24"/>
+        </w:rPr>
+        <w:t xml:space="preserve">Live demonstration (for the Week 6 presentation): </w:t>
+      </w:r>
+      <w:r>
+        <w:rPr>
+          <w:rFonts w:ascii="Calibri" w:hAnsi="Calibri" w:cs="Calibri" w:eastAsia="Calibri"/>
+          <w:b w:val="0"/>
+          <w:i w:val="0"/>
+          <w:sz w:val="24"/>
+        </w:rPr>
+        <w:t>https://keinithaxinamalai-art.github.io/Smart-waste-management-system/</w:t>
+      </w:r>
+    </w:p>
+    <w:p>
+      <w:pPr>
+        <w:spacing w:after="160" w:before="280" w:line="276" w:lineRule="auto"/>
+      </w:pPr>
+      <w:r>
+        <w:rPr>
+          <w:rFonts w:ascii="Calibri" w:hAnsi="Calibri" w:cs="Calibri" w:eastAsia="Calibri"/>
+          <w:b/>
+          <w:i w:val="0"/>
+          <w:sz w:val="28"/>
+        </w:rPr>
         <w:t>1. Project Overview</w:t>
       </w:r>
     </w:p>
     <w:p>
+      <w:pPr>
+        <w:spacing w:after="200" w:before="0" w:line="276" w:lineRule="auto"/>
+        <w:ind w:firstLine="0"/>
+      </w:pPr>
       <w:r>
         <w:rPr>
-          <w:rFonts w:ascii="Calibri" w:hAnsi="Calibri"/>
+          <w:rFonts w:ascii="Calibri" w:hAnsi="Calibri" w:cs="Calibri" w:eastAsia="Calibri"/>
+          <w:b w:val="0"/>
+          <w:i w:val="0"/>
           <w:sz w:val="24"/>
         </w:rPr>
-        <w:t>Fixed municipal collection schedules waste truck kilometres and still leave busy public bins overflowing. Canberra SmartWaste is an Iteration 1 software prototype for Transport Canberra and City Services (TCCS). It monitors simulated ACT smart-bin telemetry, classifies fill levels, scores collection urgency, accepts citizen reports, and lets staff complete pickups that reset bins and close linked tickets.</w:t>
-      </w:r>
-    </w:p>
-    <w:p>
-      <w:r>
-        <w:rPr>
-          <w:rFonts w:ascii="Calibri" w:hAnsi="Calibri"/>
-          <w:sz w:val="24"/>
-        </w:rPr>
-        <w:t>Iteration 1 deliberately excludes physical IoT hardware. All sensor readings, routes, and credentials are simulated so the team can demonstrate complete role-based workflows in a classroom without a backend or cloud database.</w:t>
-      </w:r>
-    </w:p>
-    <w:p>
-      <w:r>
-        <w:rPr>
-          <w:rFonts w:ascii="Calibri" w:hAnsi="Calibri"/>
-          <w:sz w:val="24"/>
-        </w:rPr>
-        <w:t>Completed work covers five modules that map to GitHub feature branches: administrator operations (Bijay), authentication and tests (Ayush), citizen reporting (Samir), persistence and algorithms (Krishna), and maintenance diagnostics (Charanpal). The working prototype, this report, the 15-slide demonstration deck, the GitHub repository, and the Jira board are the Iteration 1 deliverables.</w:t>
+        <w:t>Canberra SmartWaste is an Iteration 1 prototype to make it easier to see and manage municipal waste collection in Canberra. Efficiencies can be lost with fixed collection days due to the fact that bins in busy areas might fill at different times, and refuse collection vehicles could be taking out bins that don't need to be emptied. As the number of smart-waste studies grows, they are employing a variety of sensor data, central monitoring and operational decision support to enable a more responsive collection (Sosunova &amp; Porras, 2022). In the same vein, in an Australian municipal context An et al. (2022) prove how smart-bin fullness data can be used to complement a dashboard for decision-makers.</w:t>
       </w:r>
     </w:p>
     <w:p>
       <w:pPr>
-        <w:pStyle w:val="Heading2"/>
+        <w:spacing w:after="200" w:before="0" w:line="276" w:lineRule="auto"/>
+        <w:ind w:firstLine="0"/>
       </w:pPr>
       <w:r>
+        <w:rPr>
+          <w:rFonts w:ascii="Calibri" w:hAnsi="Calibri" w:cs="Calibri" w:eastAsia="Calibri"/>
+          <w:b w:val="0"/>
+          <w:i w:val="0"/>
+          <w:sz w:val="24"/>
+        </w:rPr>
+        <w:t>So the goal of the Iteration 1 was to develop the software prototype and not a deployment of Internet of Things (IoT). This system is based on simulated Canberra smart bin data, and offers 3 role based experiences: Citizen, Collection Staff and Administrator. Prototyping, citizen waste-issue reporting and tracking, smart-bin monitoring, a reusable fill status algorithm, a deterministic collection priority scoring, a suggested collection sequence, collection completion, dashboard statistics, search and alerts, maintenance diagnostics, and local persistence and automated testing completed work. Readable WST-2026-XXXX reference numbers are provided for citizens and they can track the report status along Submitted, Under Review, Scheduled and Resolved.</w:t>
+      </w:r>
+    </w:p>
+    <w:p>
+      <w:pPr>
+        <w:spacing w:after="200" w:before="0" w:line="276" w:lineRule="auto"/>
+        <w:ind w:firstLine="0"/>
+      </w:pPr>
+      <w:r>
+        <w:rPr>
+          <w:rFonts w:ascii="Calibri" w:hAnsi="Calibri" w:cs="Calibri" w:eastAsia="Calibri"/>
+          <w:b w:val="0"/>
+          <w:i w:val="0"/>
+          <w:sz w:val="24"/>
+        </w:rPr>
+        <w:t>Recent literature has demonstrated that monitoring and sharing information in smart bins can help in the municipal maintenance, collection and routing decisions (Wang et al., 2021). Public participation is also relevant because the outcomes of waste management also rely on partial participation of the residents in the local waste practices (Kuang &amp; Lin, 2021). As a result, Canberra SmartWaste is an operational monitoring tool, along with a citizen reporting tool.</w:t>
+      </w:r>
+    </w:p>
+    <w:p>
+      <w:pPr>
+        <w:spacing w:after="160" w:before="280" w:line="276" w:lineRule="auto"/>
+      </w:pPr>
+      <w:r>
+        <w:rPr>
+          <w:rFonts w:ascii="Calibri" w:hAnsi="Calibri" w:cs="Calibri" w:eastAsia="Calibri"/>
+          <w:b/>
+          <w:i w:val="0"/>
+          <w:sz w:val="28"/>
+        </w:rPr>
         <w:t>2. System Implementation</w:t>
       </w:r>
     </w:p>
     <w:p>
       <w:pPr>
-        <w:pStyle w:val="Heading3"/>
+        <w:spacing w:after="160" w:before="280" w:line="276" w:lineRule="auto"/>
       </w:pPr>
       <w:r>
-        <w:t>2.1 Architecture</w:t>
-      </w:r>
-    </w:p>
-    <w:p>
-      <w:r>
         <w:rPr>
-          <w:rFonts w:ascii="Calibri" w:hAnsi="Calibri"/>
+          <w:rFonts w:ascii="Calibri" w:hAnsi="Calibri" w:cs="Calibri" w:eastAsia="Calibri"/>
+          <w:b/>
+          <w:i w:val="0"/>
           <w:sz w:val="24"/>
         </w:rPr>
-        <w:t>The prototype is a single-page React 19 + TypeScript 6 + Vite 8 application. There is no Node/Express API and no PostgreSQL database in this iteration. A React Context (</w:t>
-      </w:r>
-      <w:r>
-        <w:rPr>
-          <w:rFonts w:ascii="Calibri" w:hAnsi="Calibri"/>
-          <w:i/>
-          <w:sz w:val="24"/>
-        </w:rPr>
-        <w:t>AppContext</w:t>
-      </w:r>
-      <w:r>
-        <w:rPr>
-          <w:rFonts w:ascii="Calibri" w:hAnsi="Calibri"/>
-          <w:sz w:val="24"/>
-        </w:rPr>
-        <w:t xml:space="preserve">) is the runtime source of truth for role, bins, reports, collections, and technician tickets. </w:t>
-      </w:r>
-      <w:r>
-        <w:rPr>
-          <w:rFonts w:ascii="Calibri" w:hAnsi="Calibri"/>
-          <w:i/>
-          <w:sz w:val="24"/>
-        </w:rPr>
-        <w:t>src/services/dataStore.ts</w:t>
-      </w:r>
-      <w:r>
-        <w:rPr>
-          <w:rFonts w:ascii="Calibri" w:hAnsi="Calibri"/>
-          <w:sz w:val="24"/>
-        </w:rPr>
-        <w:t xml:space="preserve"> serialises that state to </w:t>
-      </w:r>
-      <w:r>
-        <w:rPr>
-          <w:rFonts w:ascii="Calibri" w:hAnsi="Calibri"/>
-          <w:i/>
-          <w:sz w:val="24"/>
-        </w:rPr>
-        <w:t>localStorage</w:t>
-      </w:r>
-      <w:r>
-        <w:rPr>
-          <w:rFonts w:ascii="Calibri" w:hAnsi="Calibri"/>
-          <w:sz w:val="24"/>
-        </w:rPr>
-        <w:t xml:space="preserve"> so a demonstration can be paused and resumed in the same browser. An administrator </w:t>
-      </w:r>
-      <w:r>
-        <w:rPr>
-          <w:rFonts w:ascii="Calibri" w:hAnsi="Calibri"/>
-          <w:b/>
-          <w:sz w:val="24"/>
-        </w:rPr>
-        <w:t>Reset Demo Data</w:t>
-      </w:r>
-      <w:r>
-        <w:rPr>
-          <w:rFonts w:ascii="Calibri" w:hAnsi="Calibri"/>
-          <w:sz w:val="24"/>
-        </w:rPr>
-        <w:t xml:space="preserve"> control restores the seeded ACT dataset.</w:t>
-      </w:r>
-    </w:p>
-    <w:p>
-      <w:r>
-        <w:rPr>
-          <w:rFonts w:ascii="Calibri" w:hAnsi="Calibri"/>
-          <w:sz w:val="24"/>
-        </w:rPr>
-        <w:t>This architecture matches the presentation: a modern frontend stack, unified state, and local persistence suitable for repeatable marking. Later iterations can replace the store with live microcontroller telemetry and a cloud database without rewriting the views.</w:t>
+        <w:t>2.1 Architecture and Software Components</w:t>
       </w:r>
     </w:p>
     <w:p>
       <w:pPr>
-        <w:pStyle w:val="Heading3"/>
+        <w:spacing w:after="200" w:before="0" w:line="276" w:lineRule="auto"/>
+        <w:ind w:firstLine="0"/>
       </w:pPr>
       <w:r>
-        <w:t>2.2 Implemented modules</w:t>
-      </w:r>
-    </w:p>
-    <w:p>
-      <w:r>
         <w:rPr>
-          <w:rFonts w:ascii="Calibri" w:hAnsi="Calibri"/>
-          <w:b/>
+          <w:rFonts w:ascii="Calibri" w:hAnsi="Calibri" w:cs="Calibri" w:eastAsia="Calibri"/>
+          <w:b w:val="0"/>
+          <w:i w:val="0"/>
           <w:sz w:val="24"/>
         </w:rPr>
-        <w:t>Session and role protection.</w:t>
-      </w:r>
-      <w:r>
-        <w:rPr>
-          <w:rFonts w:ascii="Calibri" w:hAnsi="Calibri"/>
-          <w:sz w:val="24"/>
-        </w:rPr>
-        <w:t xml:space="preserve"> Unauthenticated users see the prototype login (or an anonymous public report form). Valid demo accounts are </w:t>
-      </w:r>
-      <w:r>
-        <w:rPr>
-          <w:rFonts w:ascii="Calibri" w:hAnsi="Calibri"/>
-          <w:i/>
-          <w:sz w:val="24"/>
-        </w:rPr>
-        <w:t>admin@smartwaste.demo</w:t>
-      </w:r>
-      <w:r>
-        <w:rPr>
-          <w:rFonts w:ascii="Calibri" w:hAnsi="Calibri"/>
-          <w:sz w:val="24"/>
-        </w:rPr>
-        <w:t xml:space="preserve">, </w:t>
-      </w:r>
-      <w:r>
-        <w:rPr>
-          <w:rFonts w:ascii="Calibri" w:hAnsi="Calibri"/>
-          <w:i/>
-          <w:sz w:val="24"/>
-        </w:rPr>
-        <w:t>staff@smartwaste.demo</w:t>
-      </w:r>
-      <w:r>
-        <w:rPr>
-          <w:rFonts w:ascii="Calibri" w:hAnsi="Calibri"/>
-          <w:sz w:val="24"/>
-        </w:rPr>
-        <w:t xml:space="preserve">, and </w:t>
-      </w:r>
-      <w:r>
-        <w:rPr>
-          <w:rFonts w:ascii="Calibri" w:hAnsi="Calibri"/>
-          <w:i/>
-          <w:sz w:val="24"/>
-        </w:rPr>
-        <w:t>citizen@smartwaste.demo</w:t>
-      </w:r>
-      <w:r>
-        <w:rPr>
-          <w:rFonts w:ascii="Calibri" w:hAnsi="Calibri"/>
-          <w:sz w:val="24"/>
-        </w:rPr>
-        <w:t xml:space="preserve">. Citizens stay in the reporting portal; collection staff see the priority pickup queue; administrators receive the full operations shell (dashboard, map, routes, public-report admin, driver view, maintenance, KPIs). Route protection and central </w:t>
-      </w:r>
-      <w:r>
-        <w:rPr>
-          <w:rFonts w:ascii="Calibri" w:hAnsi="Calibri"/>
-          <w:i/>
-          <w:sz w:val="24"/>
-        </w:rPr>
-        <w:t>ROLE_LABELS</w:t>
-      </w:r>
-      <w:r>
-        <w:rPr>
-          <w:rFonts w:ascii="Calibri" w:hAnsi="Calibri"/>
-          <w:sz w:val="24"/>
-        </w:rPr>
-        <w:t xml:space="preserve"> prevent staff from opening manager screens.</w:t>
-      </w:r>
-    </w:p>
-    <w:p>
-      <w:r>
-        <w:rPr>
-          <w:rFonts w:ascii="Calibri" w:hAnsi="Calibri"/>
-          <w:b/>
-          <w:sz w:val="24"/>
-        </w:rPr>
-        <w:t>Bin monitoring and classification.</w:t>
-      </w:r>
-      <w:r>
-        <w:rPr>
-          <w:rFonts w:ascii="Calibri" w:hAnsi="Calibri"/>
-          <w:sz w:val="24"/>
-        </w:rPr>
-        <w:t xml:space="preserve"> Seeded bins cover eight Canberra suburbs (Canberra City, Belconnen, Gungahlin, Woden, Tuggeranong, Dickson, Kingston, Manuka). </w:t>
-      </w:r>
-      <w:r>
-        <w:rPr>
-          <w:rFonts w:ascii="Calibri" w:hAnsi="Calibri"/>
-          <w:i/>
-          <w:sz w:val="24"/>
-        </w:rPr>
-        <w:t>getBinStatus()</w:t>
-      </w:r>
-      <w:r>
-        <w:rPr>
-          <w:rFonts w:ascii="Calibri" w:hAnsi="Calibri"/>
-          <w:sz w:val="24"/>
-        </w:rPr>
-        <w:t xml:space="preserve"> clamps invalid sensor values and maps fill to four operational tiers: 0–49% Normal, 50–79% Moderate, 80–89% Collection Required, 90–100% Critical. The dashboard critical-bin spotlight, map legend, alerts, and staff queue all use the same helper, so a 92% reading on </w:t>
-      </w:r>
-      <w:r>
-        <w:rPr>
-          <w:rFonts w:ascii="Calibri" w:hAnsi="Calibri"/>
-          <w:i/>
-          <w:sz w:val="24"/>
-        </w:rPr>
-        <w:t>WDN-104</w:t>
-      </w:r>
-      <w:r>
-        <w:rPr>
-          <w:rFonts w:ascii="Calibri" w:hAnsi="Calibri"/>
-          <w:sz w:val="24"/>
-        </w:rPr>
-        <w:t xml:space="preserve"> is Critical everywhere.</w:t>
-      </w:r>
-    </w:p>
-    <w:p>
-      <w:r>
-        <w:rPr>
-          <w:rFonts w:ascii="Calibri" w:hAnsi="Calibri"/>
-          <w:b/>
-          <w:sz w:val="24"/>
-        </w:rPr>
-        <w:t>Priority scoring.</w:t>
-      </w:r>
-      <w:r>
-        <w:rPr>
-          <w:rFonts w:ascii="Calibri" w:hAnsi="Calibri"/>
-          <w:sz w:val="24"/>
-        </w:rPr>
-        <w:t xml:space="preserve"> </w:t>
-      </w:r>
-      <w:r>
-        <w:rPr>
-          <w:rFonts w:ascii="Calibri" w:hAnsi="Calibri"/>
-          <w:i/>
-          <w:sz w:val="24"/>
-        </w:rPr>
-        <w:t>calculateCollectionPriority()</w:t>
-      </w:r>
-      <w:r>
-        <w:rPr>
-          <w:rFonts w:ascii="Calibri" w:hAnsi="Calibri"/>
-          <w:sz w:val="24"/>
-        </w:rPr>
-        <w:t xml:space="preserve"> is a deterministic weighted model: fill contribution (fill × 0.5), urgency contribution (Critical 30 / High 20 / Medium 10 / Low 0), and overdue contribution (capped at 20). Scores map to Low / Medium / High / Critical. Routes view orders stops by score among bins at or above 80% fill.</w:t>
-      </w:r>
-    </w:p>
-    <w:p>
-      <w:r>
-        <w:rPr>
-          <w:rFonts w:ascii="Calibri" w:hAnsi="Calibri"/>
-          <w:b/>
-          <w:sz w:val="24"/>
-        </w:rPr>
-        <w:t>Citizen reporting.</w:t>
-      </w:r>
-      <w:r>
-        <w:rPr>
-          <w:rFonts w:ascii="Calibri" w:hAnsi="Calibri"/>
-          <w:sz w:val="24"/>
-        </w:rPr>
-        <w:t xml:space="preserve"> The intake form captures issue category, street location, ACT suburb, urgency, optional smart-bin ID, and optional photo flag. Client validation rejects empty or whitespace-only required fields. Successful submissions receive a unique </w:t>
-      </w:r>
-      <w:r>
-        <w:rPr>
-          <w:rFonts w:ascii="Calibri" w:hAnsi="Calibri"/>
-          <w:i/>
-          <w:sz w:val="24"/>
-        </w:rPr>
-        <w:t>WST-2026-XXXX</w:t>
-      </w:r>
-      <w:r>
-        <w:rPr>
-          <w:rFonts w:ascii="Calibri" w:hAnsi="Calibri"/>
-          <w:sz w:val="24"/>
-        </w:rPr>
-        <w:t xml:space="preserve"> reference. Status values are normalised to Submitted, Under Review, Scheduled, and Resolved. Administrators advance tickets; citizens see the updated status in report history.</w:t>
-      </w:r>
-    </w:p>
-    <w:p>
-      <w:r>
-        <w:rPr>
-          <w:rFonts w:ascii="Calibri" w:hAnsi="Calibri"/>
-          <w:b/>
-          <w:sz w:val="24"/>
-        </w:rPr>
-        <w:t>Collection execution.</w:t>
-      </w:r>
-      <w:r>
-        <w:rPr>
-          <w:rFonts w:ascii="Calibri" w:hAnsi="Calibri"/>
-          <w:sz w:val="24"/>
-        </w:rPr>
-        <w:t xml:space="preserve"> Marking a bin collected resets fill to 5%, writes </w:t>
-      </w:r>
-      <w:r>
-        <w:rPr>
-          <w:rFonts w:ascii="Calibri" w:hAnsi="Calibri"/>
-          <w:i/>
-          <w:sz w:val="24"/>
-        </w:rPr>
-        <w:t>lastCollected</w:t>
-      </w:r>
-      <w:r>
-        <w:rPr>
-          <w:rFonts w:ascii="Calibri" w:hAnsi="Calibri"/>
-          <w:sz w:val="24"/>
-        </w:rPr>
-        <w:t xml:space="preserve">, recalculates priority, completes matching collection records, and resolves </w:t>
-      </w:r>
-      <w:r>
-        <w:rPr>
-          <w:rFonts w:ascii="Calibri" w:hAnsi="Calibri"/>
-          <w:b/>
-          <w:sz w:val="24"/>
-        </w:rPr>
-        <w:t>only</w:t>
-      </w:r>
-      <w:r>
-        <w:rPr>
-          <w:rFonts w:ascii="Calibri" w:hAnsi="Calibri"/>
-          <w:sz w:val="24"/>
-        </w:rPr>
-        <w:t xml:space="preserve"> public reports whose </w:t>
-      </w:r>
-      <w:r>
-        <w:rPr>
-          <w:rFonts w:ascii="Calibri" w:hAnsi="Calibri"/>
-          <w:i/>
-          <w:sz w:val="24"/>
-        </w:rPr>
-        <w:t>binId</w:t>
-      </w:r>
-      <w:r>
-        <w:rPr>
-          <w:rFonts w:ascii="Calibri" w:hAnsi="Calibri"/>
-          <w:sz w:val="24"/>
-        </w:rPr>
-        <w:t xml:space="preserve"> equals the serviced bin. Unrelated tickets in the same suburb stay open. This is the relational integrity rule exercised in Vitest.</w:t>
-      </w:r>
-    </w:p>
-    <w:p>
-      <w:r>
-        <w:rPr>
-          <w:rFonts w:ascii="Calibri" w:hAnsi="Calibri"/>
-          <w:b/>
-          <w:sz w:val="24"/>
-        </w:rPr>
-        <w:t>Maintenance diagnostics.</w:t>
-      </w:r>
-      <w:r>
-        <w:rPr>
-          <w:rFonts w:ascii="Calibri" w:hAnsi="Calibri"/>
-          <w:sz w:val="24"/>
-        </w:rPr>
-        <w:t xml:space="preserve"> The maintenance view monitors simulated sensor errors, low-battery warnings, lid mechanism jams, and offline modules. Technician work orders persist in </w:t>
-      </w:r>
-      <w:r>
-        <w:rPr>
-          <w:rFonts w:ascii="Calibri" w:hAnsi="Calibri"/>
-          <w:i/>
-          <w:sz w:val="24"/>
-        </w:rPr>
-        <w:t>localStorage</w:t>
-      </w:r>
-      <w:r>
-        <w:rPr>
-          <w:rFonts w:ascii="Calibri" w:hAnsi="Calibri"/>
-          <w:sz w:val="24"/>
-        </w:rPr>
-        <w:t xml:space="preserve"> and follow Open → In Progress → Resolved. Demo reset restores the seeded tickets.</w:t>
+        <w:t>The prototype is done using React 19, TypeScript 6 and Vite 8. The choice for React was made due to the support for re-usable dashboards, tables, forms, alerts and role-specific views. Users, bins, reports, collection records, status values and priorities share the same domain types, which helps to avoid errors from having inconsistent values. We use modular CSS to style the interface and icons are provided by Lucide React and data visualisation by Recharts.</w:t>
       </w:r>
     </w:p>
     <w:p>
       <w:pPr>
-        <w:pStyle w:val="Heading3"/>
+        <w:spacing w:after="200" w:before="0" w:line="276" w:lineRule="auto"/>
+        <w:ind w:firstLine="0"/>
       </w:pPr>
       <w:r>
-        <w:t>2.3 User interface</w:t>
-      </w:r>
-    </w:p>
-    <w:p>
-      <w:r>
         <w:rPr>
-          <w:rFonts w:ascii="Calibri" w:hAnsi="Calibri"/>
+          <w:rFonts w:ascii="Calibri" w:hAnsi="Calibri" w:cs="Calibri" w:eastAsia="Calibri"/>
+          <w:b w:val="0"/>
+          <w:i w:val="0"/>
           <w:sz w:val="24"/>
         </w:rPr>
-        <w:t>Role-specific views are built as modular React components with vanilla CSS custom properties (no Tailwind in this codebase). Lucide icons provide a consistent visual language. The header search overlay and notification bell are wired to the same reactive bin and report state used by the dashboard.</w:t>
-      </w:r>
-    </w:p>
-    <w:p>
-      <w:r>
-        <w:rPr>
-          <w:rFonts w:ascii="Calibri" w:hAnsi="Calibri"/>
-          <w:sz w:val="24"/>
-        </w:rPr>
-        <w:t xml:space="preserve">Screenshot the following screens for the Moodle Word submission (run </w:t>
-      </w:r>
-      <w:r>
-        <w:rPr>
-          <w:rFonts w:ascii="Calibri" w:hAnsi="Calibri"/>
-          <w:i/>
-          <w:sz w:val="24"/>
-        </w:rPr>
-        <w:t>npm run dev</w:t>
-      </w:r>
-      <w:r>
-        <w:rPr>
-          <w:rFonts w:ascii="Calibri" w:hAnsi="Calibri"/>
-          <w:sz w:val="24"/>
-        </w:rPr>
-        <w:t>, then capture each role):</w:t>
+        <w:t>React Context is used to handle the shared application state. AppContext handles the authenticated role, bins, reports and collections and provides actions for log in, log out, submission of reports, changes of report status, assignment of routes, completion of collections and reset of demonstration data. The persistence is centralised in dataStore.ts with the help of localStorage available in the browser. This was made as an engineering choice in Iteration 1 designed to ensure browser persistence and to enable a repeatable demonstration in the classroom without the need to add a backend that wasn't necessary for the first prototype. Architecture continues to be extensible as the persistence service may easily be replaced with API and database calls in the future.</w:t>
       </w:r>
     </w:p>
     <w:p>
       <w:pPr>
-        <w:pStyle w:val="ListBullet"/>
+        <w:spacing w:after="200" w:before="0" w:line="276" w:lineRule="auto"/>
+        <w:ind w:firstLine="0"/>
       </w:pPr>
       <w:r>
         <w:rPr>
-          <w:rFonts w:ascii="Calibri" w:hAnsi="Calibri"/>
-          <w:b/>
+          <w:rFonts w:ascii="Calibri" w:hAnsi="Calibri" w:cs="Calibri" w:eastAsia="Calibri"/>
+          <w:b w:val="0"/>
+          <w:i w:val="0"/>
           <w:sz w:val="24"/>
         </w:rPr>
-        <w:t>Login</w:t>
-      </w:r>
-      <w:r>
-        <w:rPr>
-          <w:rFonts w:ascii="Calibri" w:hAnsi="Calibri"/>
-          <w:sz w:val="24"/>
-        </w:rPr>
-        <w:t xml:space="preserve"> — three prototype roles, password field, invalid-credential error, public report shortcut.</w:t>
+        <w:t>One significant architecture improvement that was made was to eliminate duplicate run-time data sources. The dashboard, map, alerts and collection views now share the current state of the application. Accordingly, dependent views will be updated regularly, and not continue to show stale seed data, when the fill level of the bin changes during collection.</w:t>
       </w:r>
     </w:p>
     <w:p>
       <w:pPr>
-        <w:pStyle w:val="ListBullet"/>
+        <w:spacing w:after="160" w:before="280" w:line="276" w:lineRule="auto"/>
       </w:pPr>
       <w:r>
         <w:rPr>
-          <w:rFonts w:ascii="Calibri" w:hAnsi="Calibri"/>
+          <w:rFonts w:ascii="Calibri" w:hAnsi="Calibri" w:cs="Calibri" w:eastAsia="Calibri"/>
           <w:b/>
+          <w:i w:val="0"/>
           <w:sz w:val="24"/>
         </w:rPr>
-        <w:t>Citizen portal</w:t>
-      </w:r>
-      <w:r>
-        <w:rPr>
-          <w:rFonts w:ascii="Calibri" w:hAnsi="Calibri"/>
-          <w:sz w:val="24"/>
-        </w:rPr>
-        <w:t xml:space="preserve"> — structured intake (suburb list, issue categories, urgency, optional bin ID) and Track Reports history with reference search.</w:t>
+        <w:t>2.2 User Interface and Functional Modules</w:t>
       </w:r>
     </w:p>
     <w:p>
       <w:pPr>
-        <w:pStyle w:val="ListBullet"/>
+        <w:spacing w:after="200" w:before="0" w:line="276" w:lineRule="auto"/>
+        <w:ind w:firstLine="0"/>
       </w:pPr>
       <w:r>
         <w:rPr>
-          <w:rFonts w:ascii="Calibri" w:hAnsi="Calibri"/>
-          <w:b/>
+          <w:rFonts w:ascii="Calibri" w:hAnsi="Calibri" w:cs="Calibri" w:eastAsia="Calibri"/>
+          <w:b w:val="0"/>
+          <w:i w:val="0"/>
           <w:sz w:val="24"/>
         </w:rPr>
-        <w:t>Administrator dashboard</w:t>
-      </w:r>
-      <w:r>
-        <w:rPr>
-          <w:rFonts w:ascii="Calibri" w:hAnsi="Calibri"/>
-          <w:sz w:val="24"/>
-        </w:rPr>
-        <w:t xml:space="preserve"> — live stats, critical-bin spotlight with dispatch, telemetry map, alerts, CSV export.</w:t>
+        <w:t>The authentication of a prototype starts in an unauthenticated mode. Users log in with fake test accounts and the app checks if the account is the one they have selected to log in. The Citizen, Collection Staff and Administrator functionality are separated by role controls. Citizens can view reporting and report history; collection staff can view the required pickup work; and the administrators can view the operational dashboard, public-report administration, smart-bin views, suggested collection sequence, diagnostics and reset demonstration-data.</w:t>
       </w:r>
     </w:p>
     <w:p>
       <w:pPr>
-        <w:pStyle w:val="ListBullet"/>
+        <w:spacing w:after="200" w:before="0" w:line="276" w:lineRule="auto"/>
+        <w:ind w:firstLine="0"/>
       </w:pPr>
       <w:r>
         <w:rPr>
-          <w:rFonts w:ascii="Calibri" w:hAnsi="Calibri"/>
-          <w:b/>
+          <w:rFonts w:ascii="Calibri" w:hAnsi="Calibri" w:cs="Calibri" w:eastAsia="Calibri"/>
+          <w:b w:val="0"/>
+          <w:i w:val="0"/>
           <w:sz w:val="24"/>
         </w:rPr>
-        <w:t>Route planning</w:t>
-      </w:r>
-      <w:r>
-        <w:rPr>
-          <w:rFonts w:ascii="Calibri" w:hAnsi="Calibri"/>
-          <w:sz w:val="24"/>
-        </w:rPr>
-        <w:t xml:space="preserve"> — suggested sequence for fill ≥ 80%, one-click driver assignment.</w:t>
+        <w:t>The citizen reporting module includes issue category, location, Canberra suburb, urgency, waste type, optional bin identification, description and optional contact information. With validation, you cannot leave out required data and whitespace descriptions. Upon successful submission, a unique reference, WST-2026-XXXX is assigned, and a Submitted status is set. The same record is accessible to administrators, and can be advanced through several statuses: Under Review, Scheduled and Resolved. This common workflow gives the traceability between the public input and operational action. Kuang and Lin (2021) highlight supporting facilities and contextual factors as affecting public involvement in waste practices and thus the need to ensure that there is a visible reporting interface through digital technology alongside the internal municipal process.</w:t>
       </w:r>
     </w:p>
     <w:p>
       <w:pPr>
-        <w:pStyle w:val="ListBullet"/>
+        <w:spacing w:after="200" w:before="0" w:line="276" w:lineRule="auto"/>
+        <w:ind w:firstLine="0"/>
       </w:pPr>
       <w:r>
         <w:rPr>
-          <w:rFonts w:ascii="Calibri" w:hAnsi="Calibri"/>
-          <w:b/>
+          <w:rFonts w:ascii="Calibri" w:hAnsi="Calibri" w:cs="Calibri" w:eastAsia="Calibri"/>
+          <w:b w:val="0"/>
+          <w:i w:val="0"/>
           <w:sz w:val="24"/>
         </w:rPr>
-        <w:t>Staff collection</w:t>
-      </w:r>
-      <w:r>
-        <w:rPr>
-          <w:rFonts w:ascii="Calibri" w:hAnsi="Calibri"/>
-          <w:sz w:val="24"/>
-        </w:rPr>
-        <w:t xml:space="preserve"> — priority stop, Mark Collected, upcoming stops.</w:t>
+        <w:t>The simulated data is from a number of locations around Canberra, such as Belconnen, Gungahlin, Woden, Dickson, Kingston and Canberra City. The getBinStatus() function can be called repeatedly as a re-usable function and falls into four predetermined status bins: 0–49% Normal, 50–79% Moderate, 80–89% Collection Required and 90–100% Critical. Values put in to the input are securely limited to stay away from errors due to inappropriate sensor values. The thresholds are project specific business rules and not industry standards claimed. This logic is used in the map, dashboard and collection screens as well to keep the classifications consistent.</w:t>
       </w:r>
     </w:p>
     <w:p>
       <w:pPr>
-        <w:pStyle w:val="ListBullet"/>
+        <w:spacing w:after="200" w:before="0" w:line="276" w:lineRule="auto"/>
+        <w:ind w:firstLine="0"/>
       </w:pPr>
       <w:r>
         <w:rPr>
-          <w:rFonts w:ascii="Calibri" w:hAnsi="Calibri"/>
-          <w:b/>
+          <w:rFonts w:ascii="Calibri" w:hAnsi="Calibri" w:cs="Calibri" w:eastAsia="Calibri"/>
+          <w:b w:val="0"/>
+          <w:i w:val="0"/>
           <w:sz w:val="24"/>
         </w:rPr>
-        <w:t>Public report admin</w:t>
-      </w:r>
-      <w:r>
-        <w:rPr>
-          <w:rFonts w:ascii="Calibri" w:hAnsi="Calibri"/>
-          <w:sz w:val="24"/>
-        </w:rPr>
-        <w:t xml:space="preserve"> — filter chips for Submitted / Under Review / Scheduled / Resolved.</w:t>
+        <w:t>The fill contribution, report urgency and time since collection are factors in the collection-priority algorithm. Fill level is worth up to 50 points, urgency up to 30 points and overdue time up to 20 points. The final score falls into one of the levels Low, Medium, High or Critical. This is not a black box A.I. based approach, but a rule based approach that is transparent. Canberra SmartWaste provides an example of the same general principle that is demonstrated by Roy et al. (2022) and Ghahramani et al. (2022) on an achievable level of Iteration 1.</w:t>
       </w:r>
     </w:p>
     <w:p>
       <w:pPr>
-        <w:pStyle w:val="ListBullet"/>
+        <w:spacing w:after="200" w:before="0" w:line="276" w:lineRule="auto"/>
+        <w:ind w:firstLine="0"/>
       </w:pPr>
       <w:r>
         <w:rPr>
-          <w:rFonts w:ascii="Calibri" w:hAnsi="Calibri"/>
-          <w:b/>
+          <w:rFonts w:ascii="Calibri" w:hAnsi="Calibri" w:cs="Calibri" w:eastAsia="Calibri"/>
+          <w:b w:val="0"/>
+          <w:i w:val="0"/>
           <w:sz w:val="24"/>
         </w:rPr>
-        <w:t>Maintenance</w:t>
-      </w:r>
-      <w:r>
-        <w:rPr>
-          <w:rFonts w:ascii="Calibri" w:hAnsi="Calibri"/>
-          <w:sz w:val="24"/>
-        </w:rPr>
-        <w:t xml:space="preserve"> — sensor stats plus work-order lifecycle controls.</w:t>
+        <w:t>The required collection sequence only includes bins that are either Collection Required or Critical. The sequence can be assigned to collection staff and the assignment information is stored in the data layer. When staff put a bin as collected, the fill level will be reset to 5%, it will become a Normal bin, last collected time will be updated, priority will be recalculated, related collection records will be set as Completed, and reports that are not explicitly connected to this bin will not be automatically resolved. This is an explicit relationship that will stop unrelated reports from the same suburb from being incorrectly resolved.</w:t>
       </w:r>
     </w:p>
     <w:p>
       <w:pPr>
-        <w:pStyle w:val="ListBullet"/>
+        <w:spacing w:after="200" w:before="0" w:line="276" w:lineRule="auto"/>
+        <w:ind w:firstLine="0"/>
       </w:pPr>
       <w:r>
         <w:rPr>
-          <w:rFonts w:ascii="Calibri" w:hAnsi="Calibri"/>
-          <w:b/>
+          <w:rFonts w:ascii="Calibri" w:hAnsi="Calibri" w:cs="Calibri" w:eastAsia="Calibri"/>
+          <w:b w:val="0"/>
+          <w:i w:val="0"/>
           <w:sz w:val="24"/>
         </w:rPr>
-        <w:t>Reports &amp; KPIs</w:t>
-      </w:r>
-      <w:r>
-        <w:rPr>
-          <w:rFonts w:ascii="Calibri" w:hAnsi="Calibri"/>
-          <w:sz w:val="24"/>
-        </w:rPr>
-        <w:t xml:space="preserve"> — composition and volume charts derived from current bin context.</w:t>
+        <w:t>The administrator dashboard is populated with application state statistics including monitored bins, critical bins, bins for collection, active reports, resolved reports and average network fill. Dynamic alerts help maximize the efficiency of hazardous bin and new reports and pending collections identification. The ability to search includes bins, reports and collection records. There is also a maintenance view that shows simulated sensor faults and can enable prototype maintenance-ticket acknowledgement. These qualities all illustrate integration among modules, NOT a series of standalone interface screens.</w:t>
       </w:r>
     </w:p>
     <w:p>
       <w:pPr>
-        <w:pStyle w:val="Heading3"/>
+        <w:spacing w:after="160" w:before="280" w:line="276" w:lineRule="auto"/>
       </w:pPr>
       <w:r>
-        <w:t>2.4 Software components</w:t>
+        <w:rPr>
+          <w:rFonts w:ascii="Calibri" w:hAnsi="Calibri" w:cs="Calibri" w:eastAsia="Calibri"/>
+          <w:b/>
+          <w:i w:val="0"/>
+          <w:sz w:val="24"/>
+        </w:rPr>
+        <w:t>2.3 Testing and Quality Controls</w:t>
       </w:r>
     </w:p>
-    <w:tbl>
-      <w:tblPr>
-        <w:tblStyle w:val="TableGrid"/>
-        <w:tblW w:type="auto" w:w="0"/>
-        <w:tblLook w:firstColumn="1" w:firstRow="1" w:lastColumn="0" w:lastRow="0" w:noHBand="0" w:noVBand="1" w:val="04A0"/>
-      </w:tblPr>
-      <w:tblGrid>
-        <w:gridCol w:w="4680"/>
-        <w:gridCol w:w="4680"/>
-      </w:tblGrid>
-      <w:tr>
-        <w:tc>
-          <w:tcPr>
-            <w:tcW w:type="dxa" w:w="4680"/>
-          </w:tcPr>
-          <w:p>
-            <w:r>
-              <w:rPr>
-                <w:rFonts w:ascii="Calibri" w:hAnsi="Calibri"/>
-                <w:b/>
-                <w:sz w:val="22"/>
-              </w:rPr>
-              <w:t>Layer</w:t>
-            </w:r>
-          </w:p>
-        </w:tc>
-        <w:tc>
-          <w:tcPr>
-            <w:tcW w:type="dxa" w:w="4680"/>
-          </w:tcPr>
-          <w:p>
-            <w:r>
-              <w:rPr>
-                <w:rFonts w:ascii="Calibri" w:hAnsi="Calibri"/>
-                <w:b/>
-                <w:sz w:val="22"/>
-              </w:rPr>
-              <w:t>Implementation</w:t>
-            </w:r>
-          </w:p>
-        </w:tc>
-      </w:tr>
-      <w:tr>
-        <w:tc>
-          <w:tcPr>
-            <w:tcW w:type="dxa" w:w="4680"/>
-          </w:tcPr>
-          <w:p>
-            <w:r>
-              <w:rPr>
-                <w:rFonts w:ascii="Calibri" w:hAnsi="Calibri"/>
-                <w:sz w:val="22"/>
-              </w:rPr>
-              <w:t>UI</w:t>
-            </w:r>
-          </w:p>
-        </w:tc>
-        <w:tc>
-          <w:tcPr>
-            <w:tcW w:type="dxa" w:w="4680"/>
-          </w:tcPr>
-          <w:p>
-            <w:r>
-              <w:rPr>
-                <w:rFonts w:ascii="Calibri" w:hAnsi="Calibri"/>
-                <w:sz w:val="22"/>
-              </w:rPr>
-              <w:t>React 19, TypeScript 6, Vite 8, modular CSS</w:t>
-            </w:r>
-          </w:p>
-        </w:tc>
-      </w:tr>
-      <w:tr>
-        <w:tc>
-          <w:tcPr>
-            <w:tcW w:type="dxa" w:w="4680"/>
-          </w:tcPr>
-          <w:p>
-            <w:r>
-              <w:rPr>
-                <w:rFonts w:ascii="Calibri" w:hAnsi="Calibri"/>
-                <w:sz w:val="22"/>
-              </w:rPr>
-              <w:t>State</w:t>
-            </w:r>
-          </w:p>
-        </w:tc>
-        <w:tc>
-          <w:tcPr>
-            <w:tcW w:type="dxa" w:w="4680"/>
-          </w:tcPr>
-          <w:p>
-            <w:r>
-              <w:rPr>
-                <w:rFonts w:ascii="Calibri" w:hAnsi="Calibri"/>
-                <w:sz w:val="22"/>
-              </w:rPr>
-              <w:t>`AppContext` + `useApp()`</w:t>
-            </w:r>
-          </w:p>
-        </w:tc>
-      </w:tr>
-      <w:tr>
-        <w:tc>
-          <w:tcPr>
-            <w:tcW w:type="dxa" w:w="4680"/>
-          </w:tcPr>
-          <w:p>
-            <w:r>
-              <w:rPr>
-                <w:rFonts w:ascii="Calibri" w:hAnsi="Calibri"/>
-                <w:sz w:val="22"/>
-              </w:rPr>
-              <w:t>Persistence</w:t>
-            </w:r>
-          </w:p>
-        </w:tc>
-        <w:tc>
-          <w:tcPr>
-            <w:tcW w:type="dxa" w:w="4680"/>
-          </w:tcPr>
-          <w:p>
-            <w:r>
-              <w:rPr>
-                <w:rFonts w:ascii="Calibri" w:hAnsi="Calibri"/>
-                <w:sz w:val="22"/>
-              </w:rPr>
-              <w:t>`dataStore.ts` / `localStorage`</w:t>
-            </w:r>
-          </w:p>
-        </w:tc>
-      </w:tr>
-      <w:tr>
-        <w:tc>
-          <w:tcPr>
-            <w:tcW w:type="dxa" w:w="4680"/>
-          </w:tcPr>
-          <w:p>
-            <w:r>
-              <w:rPr>
-                <w:rFonts w:ascii="Calibri" w:hAnsi="Calibri"/>
-                <w:sz w:val="22"/>
-              </w:rPr>
-              <w:t>Algorithms</w:t>
-            </w:r>
-          </w:p>
-        </w:tc>
-        <w:tc>
-          <w:tcPr>
-            <w:tcW w:type="dxa" w:w="4680"/>
-          </w:tcPr>
-          <w:p>
-            <w:r>
-              <w:rPr>
-                <w:rFonts w:ascii="Calibri" w:hAnsi="Calibri"/>
-                <w:sz w:val="22"/>
-              </w:rPr>
-              <w:t>`binUtils.ts` (`getBinStatus`, priority, validation, ID generation)</w:t>
-            </w:r>
-          </w:p>
-        </w:tc>
-      </w:tr>
-      <w:tr>
-        <w:tc>
-          <w:tcPr>
-            <w:tcW w:type="dxa" w:w="4680"/>
-          </w:tcPr>
-          <w:p>
-            <w:r>
-              <w:rPr>
-                <w:rFonts w:ascii="Calibri" w:hAnsi="Calibri"/>
-                <w:sz w:val="22"/>
-              </w:rPr>
-              <w:t>Tests</w:t>
-            </w:r>
-          </w:p>
-        </w:tc>
-        <w:tc>
-          <w:tcPr>
-            <w:tcW w:type="dxa" w:w="4680"/>
-          </w:tcPr>
-          <w:p>
-            <w:r>
-              <w:rPr>
-                <w:rFonts w:ascii="Calibri" w:hAnsi="Calibri"/>
-                <w:sz w:val="22"/>
-              </w:rPr>
-              <w:t>Vitest</w:t>
-            </w:r>
-          </w:p>
-        </w:tc>
-      </w:tr>
-      <w:tr>
-        <w:tc>
-          <w:tcPr>
-            <w:tcW w:type="dxa" w:w="4680"/>
-          </w:tcPr>
-          <w:p>
-            <w:r>
-              <w:rPr>
-                <w:rFonts w:ascii="Calibri" w:hAnsi="Calibri"/>
-                <w:sz w:val="22"/>
-              </w:rPr>
-              <w:t>Quality</w:t>
-            </w:r>
-          </w:p>
-        </w:tc>
-        <w:tc>
-          <w:tcPr>
-            <w:tcW w:type="dxa" w:w="4680"/>
-          </w:tcPr>
-          <w:p>
-            <w:r>
-              <w:rPr>
-                <w:rFonts w:ascii="Calibri" w:hAnsi="Calibri"/>
-                <w:sz w:val="22"/>
-              </w:rPr>
-              <w:t>ESLint 10, GitHub Actions CI (lint, test, build)</w:t>
-            </w:r>
-          </w:p>
-        </w:tc>
-      </w:tr>
-    </w:tbl>
-    <w:p/>
     <w:p>
       <w:pPr>
-        <w:pStyle w:val="Heading2"/>
+        <w:spacing w:after="200" w:before="0" w:line="276" w:lineRule="auto"/>
+        <w:ind w:firstLine="0"/>
       </w:pPr>
       <w:r>
+        <w:rPr>
+          <w:rFonts w:ascii="Calibri" w:hAnsi="Calibri" w:cs="Calibri" w:eastAsia="Calibri"/>
+          <w:b w:val="0"/>
+          <w:i w:val="0"/>
+          <w:sz w:val="24"/>
+        </w:rPr>
+        <w:t>Vitest unit tests validate business-critical logic, such as fill-level boundaries, invalid sensor values, status normalization, priority calculation, report validation, report-reference generation and report-resolution relationships. Testing is used to make sure that the collection completion addresses a report that is explicitly listed against the collected bin and it does not address a different report. ESLint, and a production build process are also part of the project. These controls enhance maintainability and minimize the risk of integration changes to disrupt the key demonstration workflows.</w:t>
+      </w:r>
+    </w:p>
+    <w:p>
+      <w:pPr>
+        <w:spacing w:after="160" w:before="280" w:line="276" w:lineRule="auto"/>
+      </w:pPr>
+      <w:r>
+        <w:rPr>
+          <w:rFonts w:ascii="Calibri" w:hAnsi="Calibri" w:cs="Calibri" w:eastAsia="Calibri"/>
+          <w:b/>
+          <w:i w:val="0"/>
+          <w:sz w:val="28"/>
+        </w:rPr>
         <w:t>3. Technical Challenges</w:t>
       </w:r>
     </w:p>
     <w:p>
+      <w:pPr>
+        <w:spacing w:after="200" w:before="0" w:line="276" w:lineRule="auto"/>
+        <w:ind w:firstLine="0"/>
+      </w:pPr>
       <w:r>
         <w:rPr>
-          <w:rFonts w:ascii="Calibri" w:hAnsi="Calibri"/>
-          <w:b/>
+          <w:rFonts w:ascii="Calibri" w:hAnsi="Calibri" w:cs="Calibri" w:eastAsia="Calibri"/>
+          <w:b w:val="0"/>
+          <w:i w:val="0"/>
           <w:sz w:val="24"/>
         </w:rPr>
-        <w:t>Single source of truth.</w:t>
-      </w:r>
-      <w:r>
-        <w:rPr>
-          <w:rFonts w:ascii="Calibri" w:hAnsi="Calibri"/>
-          <w:sz w:val="24"/>
-        </w:rPr>
-        <w:t xml:space="preserve"> Early screens used static mock arrays, so collecting a bin on the driver view did not update the map or dashboard. The team moved all reads through Context and derived alerts, charts, and queues from that state. Lesson: demo-ready prototypes still need one store if markers, tables, and KPIs must agree.</w:t>
-      </w:r>
-    </w:p>
-    <w:p>
-      <w:r>
-        <w:rPr>
-          <w:rFonts w:ascii="Calibri" w:hAnsi="Calibri"/>
-          <w:b/>
-          <w:sz w:val="24"/>
-        </w:rPr>
-        <w:t>Invalid telemetry.</w:t>
-      </w:r>
-      <w:r>
-        <w:rPr>
-          <w:rFonts w:ascii="Calibri" w:hAnsi="Calibri"/>
-          <w:sz w:val="24"/>
-        </w:rPr>
-        <w:t xml:space="preserve"> Sensor stubs can emit </w:t>
-      </w:r>
-      <w:r>
-        <w:rPr>
-          <w:rFonts w:ascii="Calibri" w:hAnsi="Calibri"/>
-          <w:i/>
-          <w:sz w:val="24"/>
-        </w:rPr>
-        <w:t>null</w:t>
-      </w:r>
-      <w:r>
-        <w:rPr>
-          <w:rFonts w:ascii="Calibri" w:hAnsi="Calibri"/>
-          <w:sz w:val="24"/>
-        </w:rPr>
-        <w:t xml:space="preserve">, </w:t>
-      </w:r>
-      <w:r>
-        <w:rPr>
-          <w:rFonts w:ascii="Calibri" w:hAnsi="Calibri"/>
-          <w:i/>
-          <w:sz w:val="24"/>
-        </w:rPr>
-        <w:t>NaN</w:t>
-      </w:r>
-      <w:r>
-        <w:rPr>
-          <w:rFonts w:ascii="Calibri" w:hAnsi="Calibri"/>
-          <w:sz w:val="24"/>
-        </w:rPr>
-        <w:t xml:space="preserve">, or values outside 0–100. Clamping inside </w:t>
-      </w:r>
-      <w:r>
-        <w:rPr>
-          <w:rFonts w:ascii="Calibri" w:hAnsi="Calibri"/>
-          <w:i/>
-          <w:sz w:val="24"/>
-        </w:rPr>
-        <w:t>getBinStatus</w:t>
-      </w:r>
-      <w:r>
-        <w:rPr>
-          <w:rFonts w:ascii="Calibri" w:hAnsi="Calibri"/>
-          <w:sz w:val="24"/>
-        </w:rPr>
-        <w:t xml:space="preserve"> and the priority function stopped negative percentages and overflow errors from crashing status badges.</w:t>
-      </w:r>
-    </w:p>
-    <w:p>
-      <w:r>
-        <w:rPr>
-          <w:rFonts w:ascii="Calibri" w:hAnsi="Calibri"/>
-          <w:b/>
-          <w:sz w:val="24"/>
-        </w:rPr>
-        <w:t>Report resolution scope.</w:t>
-      </w:r>
-      <w:r>
-        <w:rPr>
-          <w:rFonts w:ascii="Calibri" w:hAnsi="Calibri"/>
-          <w:sz w:val="24"/>
-        </w:rPr>
-        <w:t xml:space="preserve"> A first collection implementation closed every overflow ticket in a suburb. Tests were added so only records with the matching </w:t>
-      </w:r>
-      <w:r>
-        <w:rPr>
-          <w:rFonts w:ascii="Calibri" w:hAnsi="Calibri"/>
-          <w:i/>
-          <w:sz w:val="24"/>
-        </w:rPr>
-        <w:t>binId</w:t>
-      </w:r>
-      <w:r>
-        <w:rPr>
-          <w:rFonts w:ascii="Calibri" w:hAnsi="Calibri"/>
-          <w:sz w:val="24"/>
-        </w:rPr>
-        <w:t xml:space="preserve"> resolve. That rule is now part of the demonstration script (collect </w:t>
-      </w:r>
-      <w:r>
-        <w:rPr>
-          <w:rFonts w:ascii="Calibri" w:hAnsi="Calibri"/>
-          <w:i/>
-          <w:sz w:val="24"/>
-        </w:rPr>
-        <w:t>WDN-104</w:t>
-      </w:r>
-      <w:r>
-        <w:rPr>
-          <w:rFonts w:ascii="Calibri" w:hAnsi="Calibri"/>
-          <w:sz w:val="24"/>
-        </w:rPr>
-        <w:t xml:space="preserve">, confirm </w:t>
-      </w:r>
-      <w:r>
-        <w:rPr>
-          <w:rFonts w:ascii="Calibri" w:hAnsi="Calibri"/>
-          <w:i/>
-          <w:sz w:val="24"/>
-        </w:rPr>
-        <w:t>WST-2026-1001</w:t>
-      </w:r>
-      <w:r>
-        <w:rPr>
-          <w:rFonts w:ascii="Calibri" w:hAnsi="Calibri"/>
-          <w:sz w:val="24"/>
-        </w:rPr>
-        <w:t xml:space="preserve"> in Civic is unchanged unless it points at that bin).</w:t>
-      </w:r>
-    </w:p>
-    <w:p>
-      <w:r>
-        <w:rPr>
-          <w:rFonts w:ascii="Calibri" w:hAnsi="Calibri"/>
-          <w:b/>
-          <w:sz w:val="24"/>
-        </w:rPr>
-        <w:t>Repeatable demos.</w:t>
-      </w:r>
-      <w:r>
-        <w:rPr>
-          <w:rFonts w:ascii="Calibri" w:hAnsi="Calibri"/>
-          <w:sz w:val="24"/>
-        </w:rPr>
-        <w:t xml:space="preserve"> </w:t>
-      </w:r>
-      <w:r>
-        <w:rPr>
-          <w:rFonts w:ascii="Calibri" w:hAnsi="Calibri"/>
-          <w:i/>
-          <w:sz w:val="24"/>
-        </w:rPr>
-        <w:t>localStorage</w:t>
-      </w:r>
-      <w:r>
-        <w:rPr>
-          <w:rFonts w:ascii="Calibri" w:hAnsi="Calibri"/>
-          <w:sz w:val="24"/>
-        </w:rPr>
-        <w:t xml:space="preserve"> made the app feel persistent but left leftover tickets between marking runs. The administrator reset control, plus ticket persistence in the same store, makes the Week 6 walkthrough deterministic.</w:t>
-      </w:r>
-    </w:p>
-    <w:p>
-      <w:r>
-        <w:rPr>
-          <w:rFonts w:ascii="Calibri" w:hAnsi="Calibri"/>
-          <w:b/>
-          <w:sz w:val="24"/>
-        </w:rPr>
-        <w:t>Honest documentation.</w:t>
-      </w:r>
-      <w:r>
-        <w:rPr>
-          <w:rFonts w:ascii="Calibri" w:hAnsi="Calibri"/>
-          <w:sz w:val="24"/>
-        </w:rPr>
-        <w:t xml:space="preserve"> An earlier Word draft described Express, JWT, PostgreSQL, and Leaflet. The implemented stack is a client-side Vite prototype. This report and the GitHub README were rewritten to match the running code so assessors are not shown an architecture that is not in the repository.</w:t>
-      </w:r>
-    </w:p>
-    <w:p>
-      <w:r>
-        <w:rPr>
-          <w:rFonts w:ascii="Calibri" w:hAnsi="Calibri"/>
-          <w:b/>
-          <w:sz w:val="24"/>
-        </w:rPr>
-        <w:t>Collaboration on one repository.</w:t>
-      </w:r>
-      <w:r>
-        <w:rPr>
-          <w:rFonts w:ascii="Calibri" w:hAnsi="Calibri"/>
-          <w:sz w:val="24"/>
-        </w:rPr>
-        <w:t xml:space="preserve"> Five authors committing to shared files (</w:t>
-      </w:r>
-      <w:r>
-        <w:rPr>
-          <w:rFonts w:ascii="Calibri" w:hAnsi="Calibri"/>
-          <w:i/>
-          <w:sz w:val="24"/>
-        </w:rPr>
-        <w:t>App.tsx</w:t>
-      </w:r>
-      <w:r>
-        <w:rPr>
-          <w:rFonts w:ascii="Calibri" w:hAnsi="Calibri"/>
-          <w:sz w:val="24"/>
-        </w:rPr>
-        <w:t xml:space="preserve">, </w:t>
-      </w:r>
-      <w:r>
-        <w:rPr>
-          <w:rFonts w:ascii="Calibri" w:hAnsi="Calibri"/>
-          <w:i/>
-          <w:sz w:val="24"/>
-        </w:rPr>
-        <w:t>dataStore.ts</w:t>
-      </w:r>
-      <w:r>
-        <w:rPr>
-          <w:rFonts w:ascii="Calibri" w:hAnsi="Calibri"/>
-          <w:sz w:val="24"/>
-        </w:rPr>
-        <w:t xml:space="preserve">, CSS) produced merge conflicts. The team adopted module ownership (slide 6), short-lived feature branches, and pull requests with a shared template so review happened before </w:t>
-      </w:r>
-      <w:r>
-        <w:rPr>
-          <w:rFonts w:ascii="Calibri" w:hAnsi="Calibri"/>
-          <w:i/>
-          <w:sz w:val="24"/>
-        </w:rPr>
-        <w:t>develop</w:t>
-      </w:r>
-      <w:r>
-        <w:rPr>
-          <w:rFonts w:ascii="Calibri" w:hAnsi="Calibri"/>
-          <w:sz w:val="24"/>
-        </w:rPr>
-        <w:t xml:space="preserve"> moved. Conventional commit prefixes (</w:t>
-      </w:r>
-      <w:r>
-        <w:rPr>
-          <w:rFonts w:ascii="Calibri" w:hAnsi="Calibri"/>
-          <w:i/>
-          <w:sz w:val="24"/>
-        </w:rPr>
-        <w:t>feat</w:t>
-      </w:r>
-      <w:r>
-        <w:rPr>
-          <w:rFonts w:ascii="Calibri" w:hAnsi="Calibri"/>
-          <w:sz w:val="24"/>
-        </w:rPr>
-        <w:t xml:space="preserve">, </w:t>
-      </w:r>
-      <w:r>
-        <w:rPr>
-          <w:rFonts w:ascii="Calibri" w:hAnsi="Calibri"/>
-          <w:i/>
-          <w:sz w:val="24"/>
-        </w:rPr>
-        <w:t>fix</w:t>
-      </w:r>
-      <w:r>
-        <w:rPr>
-          <w:rFonts w:ascii="Calibri" w:hAnsi="Calibri"/>
-          <w:sz w:val="24"/>
-        </w:rPr>
-        <w:t xml:space="preserve">, </w:t>
-      </w:r>
-      <w:r>
-        <w:rPr>
-          <w:rFonts w:ascii="Calibri" w:hAnsi="Calibri"/>
-          <w:i/>
-          <w:sz w:val="24"/>
-        </w:rPr>
-        <w:t>test</w:t>
-      </w:r>
-      <w:r>
-        <w:rPr>
-          <w:rFonts w:ascii="Calibri" w:hAnsi="Calibri"/>
-          <w:sz w:val="24"/>
-        </w:rPr>
-        <w:t xml:space="preserve">, </w:t>
-      </w:r>
-      <w:r>
-        <w:rPr>
-          <w:rFonts w:ascii="Calibri" w:hAnsi="Calibri"/>
-          <w:i/>
-          <w:sz w:val="24"/>
-        </w:rPr>
-        <w:t>docs</w:t>
-      </w:r>
-      <w:r>
-        <w:rPr>
-          <w:rFonts w:ascii="Calibri" w:hAnsi="Calibri"/>
-          <w:sz w:val="24"/>
-        </w:rPr>
-        <w:t>) make the history readable for the GitHub marking criterion.</w:t>
+        <w:t>Maintaining state consistency was a big technical challenge. Previous development was done with the separation of seed or mock data from the active application state, allowing an update to one screen while another had an out of date value. The answer was to have a single view of runtime state via AppContext and the data service in order to access the same information for dashboard stats, map markers, alerts and collection views. This was an affirmation of the software-engineering concept of having one source of truth in stateful applications.</w:t>
       </w:r>
     </w:p>
     <w:p>
       <w:pPr>
-        <w:pStyle w:val="Heading2"/>
+        <w:spacing w:after="200" w:before="0" w:line="276" w:lineRule="auto"/>
+        <w:ind w:firstLine="0"/>
       </w:pPr>
       <w:r>
-        <w:t>4. GitHub Repository</w:t>
-      </w:r>
-    </w:p>
-    <w:p>
-      <w:r>
         <w:rPr>
-          <w:rFonts w:ascii="Calibri" w:hAnsi="Calibri"/>
+          <w:rFonts w:ascii="Calibri" w:hAnsi="Calibri" w:cs="Calibri" w:eastAsia="Calibri"/>
+          <w:b w:val="0"/>
+          <w:i w:val="0"/>
           <w:sz w:val="24"/>
         </w:rPr>
-        <w:t>Repository: https://github.com/keinithaxinamalai-art/Smart-waste-management-system</w:t>
-      </w:r>
-    </w:p>
-    <w:p>
-      <w:r>
-        <w:rPr>
-          <w:rFonts w:ascii="Calibri" w:hAnsi="Calibri"/>
-          <w:sz w:val="24"/>
-        </w:rPr>
-        <w:t xml:space="preserve">The team used Git feature branches that match presentation slide 6. Each member committed under their own Git author name and email. Integration used pull requests into </w:t>
-      </w:r>
-      <w:r>
-        <w:rPr>
-          <w:rFonts w:ascii="Calibri" w:hAnsi="Calibri"/>
-          <w:i/>
-          <w:sz w:val="24"/>
-        </w:rPr>
-        <w:t>develop</w:t>
-      </w:r>
-      <w:r>
-        <w:rPr>
-          <w:rFonts w:ascii="Calibri" w:hAnsi="Calibri"/>
-          <w:sz w:val="24"/>
-        </w:rPr>
-        <w:t xml:space="preserve"> and then </w:t>
-      </w:r>
-      <w:r>
-        <w:rPr>
-          <w:rFonts w:ascii="Calibri" w:hAnsi="Calibri"/>
-          <w:i/>
-          <w:sz w:val="24"/>
-        </w:rPr>
-        <w:t>main</w:t>
-      </w:r>
-      <w:r>
-        <w:rPr>
-          <w:rFonts w:ascii="Calibri" w:hAnsi="Calibri"/>
-          <w:sz w:val="24"/>
-        </w:rPr>
-        <w:t>.</w:t>
-      </w:r>
-    </w:p>
-    <w:tbl>
-      <w:tblPr>
-        <w:tblStyle w:val="TableGrid"/>
-        <w:tblW w:type="auto" w:w="0"/>
-        <w:tblLook w:firstColumn="1" w:firstRow="1" w:lastColumn="0" w:lastRow="0" w:noHBand="0" w:noVBand="1" w:val="04A0"/>
-      </w:tblPr>
-      <w:tblGrid>
-        <w:gridCol w:w="3120"/>
-        <w:gridCol w:w="3120"/>
-        <w:gridCol w:w="3120"/>
-      </w:tblGrid>
-      <w:tr>
-        <w:tc>
-          <w:tcPr>
-            <w:tcW w:type="dxa" w:w="3120"/>
-          </w:tcPr>
-          <w:p>
-            <w:r>
-              <w:rPr>
-                <w:rFonts w:ascii="Calibri" w:hAnsi="Calibri"/>
-                <w:b/>
-                <w:sz w:val="22"/>
-              </w:rPr>
-              <w:t>Member</w:t>
-            </w:r>
-          </w:p>
-        </w:tc>
-        <w:tc>
-          <w:tcPr>
-            <w:tcW w:type="dxa" w:w="3120"/>
-          </w:tcPr>
-          <w:p>
-            <w:r>
-              <w:rPr>
-                <w:rFonts w:ascii="Calibri" w:hAnsi="Calibri"/>
-                <w:b/>
-                <w:sz w:val="22"/>
-              </w:rPr>
-              <w:t>Branch</w:t>
-            </w:r>
-          </w:p>
-        </w:tc>
-        <w:tc>
-          <w:tcPr>
-            <w:tcW w:type="dxa" w:w="3120"/>
-          </w:tcPr>
-          <w:p>
-            <w:r>
-              <w:rPr>
-                <w:rFonts w:ascii="Calibri" w:hAnsi="Calibri"/>
-                <w:b/>
-                <w:sz w:val="22"/>
-              </w:rPr>
-              <w:t>Merged PR</w:t>
-            </w:r>
-          </w:p>
-        </w:tc>
-      </w:tr>
-      <w:tr>
-        <w:tc>
-          <w:tcPr>
-            <w:tcW w:type="dxa" w:w="3120"/>
-          </w:tcPr>
-          <w:p>
-            <w:r>
-              <w:rPr>
-                <w:rFonts w:ascii="Calibri" w:hAnsi="Calibri"/>
-                <w:sz w:val="22"/>
-              </w:rPr>
-              <w:t>Ayush Ale</w:t>
-            </w:r>
-          </w:p>
-        </w:tc>
-        <w:tc>
-          <w:tcPr>
-            <w:tcW w:type="dxa" w:w="3120"/>
-          </w:tcPr>
-          <w:p>
-            <w:r>
-              <w:rPr>
-                <w:rFonts w:ascii="Calibri" w:hAnsi="Calibri"/>
-                <w:sz w:val="22"/>
-              </w:rPr>
-              <w:t>`ayush-auth-testing`</w:t>
-            </w:r>
-          </w:p>
-        </w:tc>
-        <w:tc>
-          <w:tcPr>
-            <w:tcW w:type="dxa" w:w="3120"/>
-          </w:tcPr>
-          <w:p>
-            <w:r>
-              <w:rPr>
-                <w:rFonts w:ascii="Calibri" w:hAnsi="Calibri"/>
-                <w:sz w:val="22"/>
-              </w:rPr>
-              <w:t>[#1](https://github.com/keinithaxinamalai-art/Smart-waste-management-system/pull/1)</w:t>
-            </w:r>
-          </w:p>
-        </w:tc>
-      </w:tr>
-      <w:tr>
-        <w:tc>
-          <w:tcPr>
-            <w:tcW w:type="dxa" w:w="3120"/>
-          </w:tcPr>
-          <w:p>
-            <w:r>
-              <w:rPr>
-                <w:rFonts w:ascii="Calibri" w:hAnsi="Calibri"/>
-                <w:sz w:val="22"/>
-              </w:rPr>
-              <w:t>Bijay Pokhrel</w:t>
-            </w:r>
-          </w:p>
-        </w:tc>
-        <w:tc>
-          <w:tcPr>
-            <w:tcW w:type="dxa" w:w="3120"/>
-          </w:tcPr>
-          <w:p>
-            <w:r>
-              <w:rPr>
-                <w:rFonts w:ascii="Calibri" w:hAnsi="Calibri"/>
-                <w:sz w:val="22"/>
-              </w:rPr>
-              <w:t>`bijay-admin-dashboard`</w:t>
-            </w:r>
-          </w:p>
-        </w:tc>
-        <w:tc>
-          <w:tcPr>
-            <w:tcW w:type="dxa" w:w="3120"/>
-          </w:tcPr>
-          <w:p>
-            <w:r>
-              <w:rPr>
-                <w:rFonts w:ascii="Calibri" w:hAnsi="Calibri"/>
-                <w:sz w:val="22"/>
-              </w:rPr>
-              <w:t>[#2](https://github.com/keinithaxinamalai-art/Smart-waste-management-system/pull/2)</w:t>
-            </w:r>
-          </w:p>
-        </w:tc>
-      </w:tr>
-      <w:tr>
-        <w:tc>
-          <w:tcPr>
-            <w:tcW w:type="dxa" w:w="3120"/>
-          </w:tcPr>
-          <w:p>
-            <w:r>
-              <w:rPr>
-                <w:rFonts w:ascii="Calibri" w:hAnsi="Calibri"/>
-                <w:sz w:val="22"/>
-              </w:rPr>
-              <w:t>Samir Bhandari</w:t>
-            </w:r>
-          </w:p>
-        </w:tc>
-        <w:tc>
-          <w:tcPr>
-            <w:tcW w:type="dxa" w:w="3120"/>
-          </w:tcPr>
-          <w:p>
-            <w:r>
-              <w:rPr>
-                <w:rFonts w:ascii="Calibri" w:hAnsi="Calibri"/>
-                <w:sz w:val="22"/>
-              </w:rPr>
-              <w:t>`samir-citizen-interface`</w:t>
-            </w:r>
-          </w:p>
-        </w:tc>
-        <w:tc>
-          <w:tcPr>
-            <w:tcW w:type="dxa" w:w="3120"/>
-          </w:tcPr>
-          <w:p>
-            <w:r>
-              <w:rPr>
-                <w:rFonts w:ascii="Calibri" w:hAnsi="Calibri"/>
-                <w:sz w:val="22"/>
-              </w:rPr>
-              <w:t>[#3](https://github.com/keinithaxinamalai-art/Smart-waste-management-system/pull/3)</w:t>
-            </w:r>
-          </w:p>
-        </w:tc>
-      </w:tr>
-      <w:tr>
-        <w:tc>
-          <w:tcPr>
-            <w:tcW w:type="dxa" w:w="3120"/>
-          </w:tcPr>
-          <w:p>
-            <w:r>
-              <w:rPr>
-                <w:rFonts w:ascii="Calibri" w:hAnsi="Calibri"/>
-                <w:sz w:val="22"/>
-              </w:rPr>
-              <w:t>Krishna Trivedi</w:t>
-            </w:r>
-          </w:p>
-        </w:tc>
-        <w:tc>
-          <w:tcPr>
-            <w:tcW w:type="dxa" w:w="3120"/>
-          </w:tcPr>
-          <w:p>
-            <w:r>
-              <w:rPr>
-                <w:rFonts w:ascii="Calibri" w:hAnsi="Calibri"/>
-                <w:sz w:val="22"/>
-              </w:rPr>
-              <w:t>`krishna-database-collection`</w:t>
-            </w:r>
-          </w:p>
-        </w:tc>
-        <w:tc>
-          <w:tcPr>
-            <w:tcW w:type="dxa" w:w="3120"/>
-          </w:tcPr>
-          <w:p>
-            <w:r>
-              <w:rPr>
-                <w:rFonts w:ascii="Calibri" w:hAnsi="Calibri"/>
-                <w:sz w:val="22"/>
-              </w:rPr>
-              <w:t>[#4](https://github.com/keinithaxinamalai-art/Smart-waste-management-system/pull/4)</w:t>
-            </w:r>
-          </w:p>
-        </w:tc>
-      </w:tr>
-      <w:tr>
-        <w:tc>
-          <w:tcPr>
-            <w:tcW w:type="dxa" w:w="3120"/>
-          </w:tcPr>
-          <w:p>
-            <w:r>
-              <w:rPr>
-                <w:rFonts w:ascii="Calibri" w:hAnsi="Calibri"/>
-                <w:sz w:val="22"/>
-              </w:rPr>
-              <w:t>Integration</w:t>
-            </w:r>
-          </w:p>
-        </w:tc>
-        <w:tc>
-          <w:tcPr>
-            <w:tcW w:type="dxa" w:w="3120"/>
-          </w:tcPr>
-          <w:p>
-            <w:r>
-              <w:rPr>
-                <w:rFonts w:ascii="Calibri" w:hAnsi="Calibri"/>
-                <w:sz w:val="22"/>
-              </w:rPr>
-              <w:t>`develop`</w:t>
-            </w:r>
-          </w:p>
-        </w:tc>
-        <w:tc>
-          <w:tcPr>
-            <w:tcW w:type="dxa" w:w="3120"/>
-          </w:tcPr>
-          <w:p>
-            <w:r>
-              <w:rPr>
-                <w:rFonts w:ascii="Calibri" w:hAnsi="Calibri"/>
-                <w:sz w:val="22"/>
-              </w:rPr>
-              <w:t>[#5](https://github.com/keinithaxinamalai-art/Smart-waste-management-system/pull/5)</w:t>
-            </w:r>
-          </w:p>
-        </w:tc>
-      </w:tr>
-      <w:tr>
-        <w:tc>
-          <w:tcPr>
-            <w:tcW w:type="dxa" w:w="3120"/>
-          </w:tcPr>
-          <w:p>
-            <w:r>
-              <w:rPr>
-                <w:rFonts w:ascii="Calibri" w:hAnsi="Calibri"/>
-                <w:sz w:val="22"/>
-              </w:rPr>
-              <w:t>Charanpal Kaur</w:t>
-            </w:r>
-          </w:p>
-        </w:tc>
-        <w:tc>
-          <w:tcPr>
-            <w:tcW w:type="dxa" w:w="3120"/>
-          </w:tcPr>
-          <w:p>
-            <w:r>
-              <w:rPr>
-                <w:rFonts w:ascii="Calibri" w:hAnsi="Calibri"/>
-                <w:sz w:val="22"/>
-              </w:rPr>
-              <w:t>`charanpal-maintenance-analytics`</w:t>
-            </w:r>
-          </w:p>
-        </w:tc>
-        <w:tc>
-          <w:tcPr>
-            <w:tcW w:type="dxa" w:w="3120"/>
-          </w:tcPr>
-          <w:p>
-            <w:r>
-              <w:rPr>
-                <w:rFonts w:ascii="Calibri" w:hAnsi="Calibri"/>
-                <w:sz w:val="22"/>
-              </w:rPr>
-              <w:t>Diagnostics commits on that branch, merged to `main`</w:t>
-            </w:r>
-          </w:p>
-        </w:tc>
-      </w:tr>
-    </w:tbl>
-    <w:p/>
-    <w:p>
-      <w:r>
-        <w:rPr>
-          <w:rFonts w:ascii="Calibri" w:hAnsi="Calibri"/>
-          <w:sz w:val="24"/>
-        </w:rPr>
-        <w:t xml:space="preserve">Commit messages follow </w:t>
-      </w:r>
-      <w:r>
-        <w:rPr>
-          <w:rFonts w:ascii="Calibri" w:hAnsi="Calibri"/>
-          <w:i/>
-          <w:sz w:val="24"/>
-        </w:rPr>
-        <w:t>feat</w:t>
-      </w:r>
-      <w:r>
-        <w:rPr>
-          <w:rFonts w:ascii="Calibri" w:hAnsi="Calibri"/>
-          <w:sz w:val="24"/>
-        </w:rPr>
-        <w:t xml:space="preserve"> / </w:t>
-      </w:r>
-      <w:r>
-        <w:rPr>
-          <w:rFonts w:ascii="Calibri" w:hAnsi="Calibri"/>
-          <w:i/>
-          <w:sz w:val="24"/>
-        </w:rPr>
-        <w:t>fix</w:t>
-      </w:r>
-      <w:r>
-        <w:rPr>
-          <w:rFonts w:ascii="Calibri" w:hAnsi="Calibri"/>
-          <w:sz w:val="24"/>
-        </w:rPr>
-        <w:t xml:space="preserve"> / </w:t>
-      </w:r>
-      <w:r>
-        <w:rPr>
-          <w:rFonts w:ascii="Calibri" w:hAnsi="Calibri"/>
-          <w:i/>
-          <w:sz w:val="24"/>
-        </w:rPr>
-        <w:t>test</w:t>
-      </w:r>
-      <w:r>
-        <w:rPr>
-          <w:rFonts w:ascii="Calibri" w:hAnsi="Calibri"/>
-          <w:sz w:val="24"/>
-        </w:rPr>
-        <w:t xml:space="preserve"> / </w:t>
-      </w:r>
-      <w:r>
-        <w:rPr>
-          <w:rFonts w:ascii="Calibri" w:hAnsi="Calibri"/>
-          <w:i/>
-          <w:sz w:val="24"/>
-        </w:rPr>
-        <w:t>docs</w:t>
-      </w:r>
-      <w:r>
-        <w:rPr>
-          <w:rFonts w:ascii="Calibri" w:hAnsi="Calibri"/>
-          <w:sz w:val="24"/>
-        </w:rPr>
-        <w:t xml:space="preserve"> conventions. GitHub Actions now runs ESLint, Vitest, and the production build on every push and pull request. Issue and pull-request templates map work to the five modules and a Jira key. </w:t>
-      </w:r>
-      <w:r>
-        <w:rPr>
-          <w:rFonts w:ascii="Calibri" w:hAnsi="Calibri"/>
-          <w:i/>
-          <w:sz w:val="24"/>
-        </w:rPr>
-        <w:t>CONTRIBUTING.md</w:t>
-      </w:r>
-      <w:r>
-        <w:rPr>
-          <w:rFonts w:ascii="Calibri" w:hAnsi="Calibri"/>
-          <w:sz w:val="24"/>
-        </w:rPr>
-        <w:t xml:space="preserve"> records the branching rules for the teaching team. Further GitHub evidence (PR table, contribution notes) is in </w:t>
-      </w:r>
-      <w:r>
-        <w:rPr>
-          <w:rFonts w:ascii="Calibri" w:hAnsi="Calibri"/>
-          <w:i/>
-          <w:sz w:val="24"/>
-        </w:rPr>
-        <w:t>docs/GITHUB-EVIDENCE.md</w:t>
-      </w:r>
-      <w:r>
-        <w:rPr>
-          <w:rFonts w:ascii="Calibri" w:hAnsi="Calibri"/>
-          <w:sz w:val="24"/>
-        </w:rPr>
-        <w:t>.</w:t>
+        <w:t>The second challenge was to standardise the business states. Values were replaced or normalised as per the following for new, assigned and resolved respectively: Submitted, Under Review, Scheduled and Resolved, and collection states were standardised separately. No ambiguity with the TypeScript union types and normalisation helpers. Consistency work was done to match the collection threshold so that Moderate bins do not end up on the wrong side of the threshold as required pickups.</w:t>
       </w:r>
     </w:p>
     <w:p>
       <w:pPr>
-        <w:pStyle w:val="Heading2"/>
+        <w:spacing w:after="200" w:before="0" w:line="276" w:lineRule="auto"/>
+        <w:ind w:firstLine="0"/>
       </w:pPr>
       <w:r>
+        <w:rPr>
+          <w:rFonts w:ascii="Calibri" w:hAnsi="Calibri" w:cs="Calibri" w:eastAsia="Calibri"/>
+          <w:b w:val="0"/>
+          <w:i w:val="0"/>
+          <w:sz w:val="24"/>
+        </w:rPr>
+        <w:t>The third challenge was related to the relationship between reports and collections. If all of the same suburb's reports were automatically resolved, when the bin was emptied, then inaccurate data would result. The final implementation thus only solves those reports where the binId is exactly the same as the one collected. This change helped to ensure the integrity of the data and it also created a good automation testing scenario.</w:t>
+      </w:r>
+    </w:p>
+    <w:p>
+      <w:pPr>
+        <w:spacing w:after="200" w:before="0" w:line="276" w:lineRule="auto"/>
+        <w:ind w:firstLine="0"/>
+      </w:pPr>
+      <w:r>
+        <w:rPr>
+          <w:rFonts w:ascii="Calibri" w:hAnsi="Calibri" w:cs="Calibri" w:eastAsia="Calibri"/>
+          <w:b w:val="0"/>
+          <w:i w:val="0"/>
+          <w:sz w:val="24"/>
+        </w:rPr>
+        <w:t>The team also had to keep in mind technical ambition and scope of Iteration 1. Advanced IoT sensing and vehicle-routing optimisation has been shown in the literature, however without the use of physical sensors, or a production backend, this would have resulted in false claims. The final prototype is thus a labeled simulated telemetry with a suggested sequence of priorities instead of the shortest-path or A.I. optimised routing. One of the main takeaways from Iteration 1 was about how important it is to represent accurately what the software actually implements in order to achieve technical credibility.</w:t>
+      </w:r>
+    </w:p>
+    <w:p>
+      <w:pPr>
+        <w:spacing w:after="160" w:before="280" w:line="276" w:lineRule="auto"/>
+      </w:pPr>
+      <w:r>
+        <w:rPr>
+          <w:rFonts w:ascii="Calibri" w:hAnsi="Calibri" w:cs="Calibri" w:eastAsia="Calibri"/>
+          <w:b/>
+          <w:i w:val="0"/>
+          <w:sz w:val="28"/>
+        </w:rPr>
+        <w:t>4. GitHub Repository and Team Contributions</w:t>
+      </w:r>
+    </w:p>
+    <w:p>
+      <w:pPr>
+        <w:spacing w:after="200" w:before="0" w:line="276" w:lineRule="auto"/>
+        <w:ind w:firstLine="0"/>
+      </w:pPr>
+      <w:r>
+        <w:rPr>
+          <w:rFonts w:ascii="Calibri" w:hAnsi="Calibri" w:cs="Calibri" w:eastAsia="Calibri"/>
+          <w:b w:val="0"/>
+          <w:i w:val="0"/>
+          <w:sz w:val="24"/>
+        </w:rPr>
+        <w:t>Source-control and evidence of technical contribution was kept in GitHub. The working Canberra SmartWaste repository is https://github.com/keinithaxinamalai-art/Smart-waste-management-system. The branching strategy involves three main branches: main - the stable release branch, develop - the integration branch, and feature branches for individual features that will be developed. This will make it less likely to break the demonstration build and will make it easier to check out the contribution history at each module level.</w:t>
+      </w:r>
+    </w:p>
+    <w:p>
+      <w:pPr>
+        <w:spacing w:after="200" w:before="0" w:line="276" w:lineRule="auto"/>
+        <w:ind w:firstLine="0"/>
+      </w:pPr>
+      <w:r>
+        <w:rPr>
+          <w:rFonts w:ascii="Calibri" w:hAnsi="Calibri" w:cs="Calibri" w:eastAsia="Calibri"/>
+          <w:b w:val="0"/>
+          <w:i w:val="0"/>
+          <w:sz w:val="24"/>
+        </w:rPr>
+        <w:t>The major branches are bijay-admin-dashboard, samir-citizen-interface, krishna-database-collection, ayush-auth-testing and charanpal-maintenance-analytics. Bijay worked on the admin/dashboard functionality and project coordination, Samir on the Citizen Reporting interface and validation, Krishna on the data models and persistence and algorithms for data collection, Ayush on authentication, shared-state integration and testing, and Charanpal on smart bin sensor diagnostics and maintenance functionality. Commit history has entries for changes in these areas, and the changes are successfully merged into develop and then into main.</w:t>
+      </w:r>
+    </w:p>
+    <w:p>
+      <w:pPr>
+        <w:spacing w:after="200" w:before="0" w:line="276" w:lineRule="auto"/>
+        <w:ind w:firstLine="0"/>
+      </w:pPr>
+      <w:r>
+        <w:rPr>
+          <w:rFonts w:ascii="Calibri" w:hAnsi="Calibri" w:cs="Calibri" w:eastAsia="Calibri"/>
+          <w:b w:val="0"/>
+          <w:i w:val="0"/>
+          <w:sz w:val="24"/>
+        </w:rPr>
+        <w:t>Coordinating day-to-day communication and sharing of resources was done via Google Chat, while GitHub was the definitive code and version-control history. This separation guaranteed that informal communication did not replace the evidence of development that was traceable.</w:t>
+      </w:r>
+    </w:p>
+    <w:p>
+      <w:pPr>
+        <w:spacing w:after="160" w:before="280" w:line="276" w:lineRule="auto"/>
+      </w:pPr>
+      <w:r>
+        <w:rPr>
+          <w:rFonts w:ascii="Calibri" w:hAnsi="Calibri" w:cs="Calibri" w:eastAsia="Calibri"/>
+          <w:b/>
+          <w:i w:val="0"/>
+          <w:sz w:val="28"/>
+        </w:rPr>
         <w:t>5. Jira Project Management</w:t>
       </w:r>
     </w:p>
     <w:p>
+      <w:pPr>
+        <w:spacing w:after="200" w:before="0" w:line="276" w:lineRule="auto"/>
+        <w:ind w:firstLine="0"/>
+      </w:pPr>
       <w:r>
         <w:rPr>
-          <w:rFonts w:ascii="Calibri" w:hAnsi="Calibri"/>
+          <w:rFonts w:ascii="Calibri" w:hAnsi="Calibri" w:cs="Calibri" w:eastAsia="Calibri"/>
+          <w:b w:val="0"/>
+          <w:i w:val="0"/>
           <w:sz w:val="24"/>
         </w:rPr>
-        <w:t>Jira is the planning system of record for Iteration 1. Epics follow the same five domains as GitHub branches so a story, a branch, and a pull request stay aligned (presentation slides 6 and 9).</w:t>
-      </w:r>
-    </w:p>
-    <w:tbl>
-      <w:tblPr>
-        <w:tblStyle w:val="TableGrid"/>
-        <w:tblW w:type="auto" w:w="0"/>
-        <w:tblLook w:firstColumn="1" w:firstRow="1" w:lastColumn="0" w:lastRow="0" w:noHBand="0" w:noVBand="1" w:val="04A0"/>
-      </w:tblPr>
-      <w:tblGrid>
-        <w:gridCol w:w="3120"/>
-        <w:gridCol w:w="3120"/>
-        <w:gridCol w:w="3120"/>
-      </w:tblGrid>
-      <w:tr>
-        <w:tc>
-          <w:tcPr>
-            <w:tcW w:type="dxa" w:w="3120"/>
-          </w:tcPr>
-          <w:p>
-            <w:r>
-              <w:rPr>
-                <w:rFonts w:ascii="Calibri" w:hAnsi="Calibri"/>
-                <w:b/>
-                <w:sz w:val="22"/>
-              </w:rPr>
-              <w:t>Epic</w:t>
-            </w:r>
-          </w:p>
-        </w:tc>
-        <w:tc>
-          <w:tcPr>
-            <w:tcW w:type="dxa" w:w="3120"/>
-          </w:tcPr>
-          <w:p>
-            <w:r>
-              <w:rPr>
-                <w:rFonts w:ascii="Calibri" w:hAnsi="Calibri"/>
-                <w:b/>
-                <w:sz w:val="22"/>
-              </w:rPr>
-              <w:t>Example stories</w:t>
-            </w:r>
-          </w:p>
-        </w:tc>
-        <w:tc>
-          <w:tcPr>
-            <w:tcW w:type="dxa" w:w="3120"/>
-          </w:tcPr>
-          <w:p>
-            <w:r>
-              <w:rPr>
-                <w:rFonts w:ascii="Calibri" w:hAnsi="Calibri"/>
-                <w:b/>
-                <w:sz w:val="22"/>
-              </w:rPr>
-              <w:t>Branch</w:t>
-            </w:r>
-          </w:p>
-        </w:tc>
-      </w:tr>
-      <w:tr>
-        <w:tc>
-          <w:tcPr>
-            <w:tcW w:type="dxa" w:w="3120"/>
-          </w:tcPr>
-          <w:p>
-            <w:r>
-              <w:rPr>
-                <w:rFonts w:ascii="Calibri" w:hAnsi="Calibri"/>
-                <w:sz w:val="22"/>
-              </w:rPr>
-              <w:t>Admin Management</w:t>
-            </w:r>
-          </w:p>
-        </w:tc>
-        <w:tc>
-          <w:tcPr>
-            <w:tcW w:type="dxa" w:w="3120"/>
-          </w:tcPr>
-          <w:p>
-            <w:r>
-              <w:rPr>
-                <w:rFonts w:ascii="Calibri" w:hAnsi="Calibri"/>
-                <w:sz w:val="22"/>
-              </w:rPr>
-              <w:t>Critical-bin spotlight; role labels; demo reset</w:t>
-            </w:r>
-          </w:p>
-        </w:tc>
-        <w:tc>
-          <w:tcPr>
-            <w:tcW w:type="dxa" w:w="3120"/>
-          </w:tcPr>
-          <w:p>
-            <w:r>
-              <w:rPr>
-                <w:rFonts w:ascii="Calibri" w:hAnsi="Calibri"/>
-                <w:sz w:val="22"/>
-              </w:rPr>
-              <w:t>`bijay-admin-dashboard`</w:t>
-            </w:r>
-          </w:p>
-        </w:tc>
-      </w:tr>
-      <w:tr>
-        <w:tc>
-          <w:tcPr>
-            <w:tcW w:type="dxa" w:w="3120"/>
-          </w:tcPr>
-          <w:p>
-            <w:r>
-              <w:rPr>
-                <w:rFonts w:ascii="Calibri" w:hAnsi="Calibri"/>
-                <w:sz w:val="22"/>
-              </w:rPr>
-              <w:t>Session &amp; Testing</w:t>
-            </w:r>
-          </w:p>
-        </w:tc>
-        <w:tc>
-          <w:tcPr>
-            <w:tcW w:type="dxa" w:w="3120"/>
-          </w:tcPr>
-          <w:p>
-            <w:r>
-              <w:rPr>
-                <w:rFonts w:ascii="Calibri" w:hAnsi="Calibri"/>
-                <w:sz w:val="22"/>
-              </w:rPr>
-              <w:t>Unauthenticated start; demo login validation; Vitest suite</w:t>
-            </w:r>
-          </w:p>
-        </w:tc>
-        <w:tc>
-          <w:tcPr>
-            <w:tcW w:type="dxa" w:w="3120"/>
-          </w:tcPr>
-          <w:p>
-            <w:r>
-              <w:rPr>
-                <w:rFonts w:ascii="Calibri" w:hAnsi="Calibri"/>
-                <w:sz w:val="22"/>
-              </w:rPr>
-              <w:t>`ayush-auth-testing`</w:t>
-            </w:r>
-          </w:p>
-        </w:tc>
-      </w:tr>
-      <w:tr>
-        <w:tc>
-          <w:tcPr>
-            <w:tcW w:type="dxa" w:w="3120"/>
-          </w:tcPr>
-          <w:p>
-            <w:r>
-              <w:rPr>
-                <w:rFonts w:ascii="Calibri" w:hAnsi="Calibri"/>
-                <w:sz w:val="22"/>
-              </w:rPr>
-              <w:t>Citizen Reporting</w:t>
-            </w:r>
-          </w:p>
-        </w:tc>
-        <w:tc>
-          <w:tcPr>
-            <w:tcW w:type="dxa" w:w="3120"/>
-          </w:tcPr>
-          <w:p>
-            <w:r>
-              <w:rPr>
-                <w:rFonts w:ascii="Calibri" w:hAnsi="Calibri"/>
-                <w:sz w:val="22"/>
-              </w:rPr>
-              <w:t>ACT suburbs; whitespace validation; `WST-2026-XXXX`</w:t>
-            </w:r>
-          </w:p>
-        </w:tc>
-        <w:tc>
-          <w:tcPr>
-            <w:tcW w:type="dxa" w:w="3120"/>
-          </w:tcPr>
-          <w:p>
-            <w:r>
-              <w:rPr>
-                <w:rFonts w:ascii="Calibri" w:hAnsi="Calibri"/>
-                <w:sz w:val="22"/>
-              </w:rPr>
-              <w:t>`samir-citizen-interface`</w:t>
-            </w:r>
-          </w:p>
-        </w:tc>
-      </w:tr>
-      <w:tr>
-        <w:tc>
-          <w:tcPr>
-            <w:tcW w:type="dxa" w:w="3120"/>
-          </w:tcPr>
-          <w:p>
-            <w:r>
-              <w:rPr>
-                <w:rFonts w:ascii="Calibri" w:hAnsi="Calibri"/>
-                <w:sz w:val="22"/>
-              </w:rPr>
-              <w:t>Data Persistence</w:t>
-            </w:r>
-          </w:p>
-        </w:tc>
-        <w:tc>
-          <w:tcPr>
-            <w:tcW w:type="dxa" w:w="3120"/>
-          </w:tcPr>
-          <w:p>
-            <w:r>
-              <w:rPr>
-                <w:rFonts w:ascii="Calibri" w:hAnsi="Calibri"/>
-                <w:sz w:val="22"/>
-              </w:rPr>
-              <w:t>Domain types; `localStorage` store; priority formula</w:t>
-            </w:r>
-          </w:p>
-        </w:tc>
-        <w:tc>
-          <w:tcPr>
-            <w:tcW w:type="dxa" w:w="3120"/>
-          </w:tcPr>
-          <w:p>
-            <w:r>
-              <w:rPr>
-                <w:rFonts w:ascii="Calibri" w:hAnsi="Calibri"/>
-                <w:sz w:val="22"/>
-              </w:rPr>
-              <w:t>`krishna-database-collection`</w:t>
-            </w:r>
-          </w:p>
-        </w:tc>
-      </w:tr>
-      <w:tr>
-        <w:tc>
-          <w:tcPr>
-            <w:tcW w:type="dxa" w:w="3120"/>
-          </w:tcPr>
-          <w:p>
-            <w:r>
-              <w:rPr>
-                <w:rFonts w:ascii="Calibri" w:hAnsi="Calibri"/>
-                <w:sz w:val="22"/>
-              </w:rPr>
-              <w:t>Operations &amp; Maintenance</w:t>
-            </w:r>
-          </w:p>
-        </w:tc>
-        <w:tc>
-          <w:tcPr>
-            <w:tcW w:type="dxa" w:w="3120"/>
-          </w:tcPr>
-          <w:p>
-            <w:r>
-              <w:rPr>
-                <w:rFonts w:ascii="Calibri" w:hAnsi="Calibri"/>
-                <w:sz w:val="22"/>
-              </w:rPr>
-              <w:t>Sensor faults; lid-jam tickets; Open/In Progress/Resolved</w:t>
-            </w:r>
-          </w:p>
-        </w:tc>
-        <w:tc>
-          <w:tcPr>
-            <w:tcW w:type="dxa" w:w="3120"/>
-          </w:tcPr>
-          <w:p>
-            <w:r>
-              <w:rPr>
-                <w:rFonts w:ascii="Calibri" w:hAnsi="Calibri"/>
-                <w:sz w:val="22"/>
-              </w:rPr>
-              <w:t>`charanpal-maintenance-analytics`</w:t>
-            </w:r>
-          </w:p>
-        </w:tc>
-      </w:tr>
-    </w:tbl>
-    <w:p/>
-    <w:p>
-      <w:r>
-        <w:rPr>
-          <w:rFonts w:ascii="Calibri" w:hAnsi="Calibri"/>
-          <w:sz w:val="24"/>
-        </w:rPr>
-        <w:t>The Iteration 1 sprint board uses To Do, In Progress, and Done. Each story has an assignee, acceptance criteria, and a link (or key) recorded on the matching GitHub pull request. Export the sprint summary or burndown chart from Jira for the Moodle ZIP so the 5-mark project-management criterion has visual evidence.</w:t>
-      </w:r>
-    </w:p>
-    <w:p>
-      <w:r>
-        <w:rPr>
-          <w:rFonts w:ascii="Calibri" w:hAnsi="Calibri"/>
-          <w:sz w:val="24"/>
-        </w:rPr>
-        <w:t>GitHub issue templates include a Jira key field so defects found during rehearsal can be copied back to the backlog. Remaining Iteration 2 work already sitting in Jira includes live IoT telemetry, a hosted database, and geospatial route optimisation.</w:t>
+        <w:t>Jira is the formal record of the task-management during the Iteration 1. The backlog is structured in the same way as the work packages are at GitHub: authentication and access control, citizen reporting, data and business algorithms, administrator monitoring, collection management, maintenance and diagnostics, integration testing, and assessment preparation. Issues are logged and clearly described, prioritised and have acceptance criteria as well as workflow status set to the member who is responsible for the module.</w:t>
       </w:r>
     </w:p>
     <w:p>
       <w:pPr>
-        <w:pStyle w:val="Heading2"/>
+        <w:spacing w:after="200" w:before="0" w:line="276" w:lineRule="auto"/>
+        <w:ind w:firstLine="0"/>
       </w:pPr>
       <w:r>
-        <w:t>6. Project Demonstration</w:t>
-      </w:r>
-    </w:p>
-    <w:p>
-      <w:r>
         <w:rPr>
-          <w:rFonts w:ascii="Calibri" w:hAnsi="Calibri"/>
+          <w:rFonts w:ascii="Calibri" w:hAnsi="Calibri" w:cs="Calibri" w:eastAsia="Calibri"/>
+          <w:b w:val="0"/>
+          <w:i w:val="0"/>
           <w:sz w:val="24"/>
         </w:rPr>
-        <w:t>The 10-minute live demonstration (plus 5-minute questions) follows README stages A–I and should be split equally among team members:</w:t>
+        <w:t>During the Iteration 1 sprint, there is a separation between To Do and In Progress and Done work in order to allow a review of the work being done on the project, instead of describing it only in the final report. Current development issues are role-based prototype login, citizen reporting, status of the reports, central persistence service, classification of the smart bins, collection priority logic, dashboard integration, map and alert synchronisation, collection execution, maintenance acknowledgement and core automated tests.</w:t>
       </w:r>
     </w:p>
     <w:p>
       <w:pPr>
-        <w:pStyle w:val="ListNumber"/>
+        <w:spacing w:after="200" w:before="0" w:line="276" w:lineRule="auto"/>
+        <w:ind w:firstLine="0"/>
       </w:pPr>
       <w:r>
         <w:rPr>
-          <w:rFonts w:ascii="Calibri" w:hAnsi="Calibri"/>
-          <w:b/>
+          <w:rFonts w:ascii="Calibri" w:hAnsi="Calibri" w:cs="Calibri" w:eastAsia="Calibri"/>
+          <w:b w:val="0"/>
+          <w:i w:val="0"/>
           <w:sz w:val="24"/>
         </w:rPr>
-        <w:t>Unauthenticated start</w:t>
-      </w:r>
-      <w:r>
-        <w:rPr>
-          <w:rFonts w:ascii="Calibri" w:hAnsi="Calibri"/>
-          <w:sz w:val="24"/>
-        </w:rPr>
-        <w:t xml:space="preserve"> — login is required; admin URLs are blocked.</w:t>
+        <w:t>The other assessment related activities are report finalisation, preparing presentation and rehearsing for Jira evidence capture and demonstration. Having these tasks all in one board gives you a good overview of completed milestones, and of outstanding work. It also enables the teaching team to map the ownership of the tasks in Jira to the branches and contributions done in GitHub, thus giving traceability between the planning, implementation, and delivered software.</w:t>
       </w:r>
     </w:p>
     <w:p>
       <w:pPr>
-        <w:pStyle w:val="ListNumber"/>
+        <w:spacing w:after="160" w:before="280" w:line="276" w:lineRule="auto"/>
       </w:pPr>
       <w:r>
         <w:rPr>
-          <w:rFonts w:ascii="Calibri" w:hAnsi="Calibri"/>
+          <w:rFonts w:ascii="Calibri" w:hAnsi="Calibri" w:cs="Calibri" w:eastAsia="Calibri"/>
           <w:b/>
-          <w:sz w:val="24"/>
+          <w:i w:val="0"/>
+          <w:sz w:val="28"/>
         </w:rPr>
-        <w:t>Citizen intake</w:t>
-      </w:r>
-      <w:r>
-        <w:rPr>
-          <w:rFonts w:ascii="Calibri" w:hAnsi="Calibri"/>
-          <w:sz w:val="24"/>
-        </w:rPr>
-        <w:t xml:space="preserve"> — empty submit is rejected; a Canberra City report receives </w:t>
-      </w:r>
-      <w:r>
-        <w:rPr>
-          <w:rFonts w:ascii="Calibri" w:hAnsi="Calibri"/>
-          <w:i/>
-          <w:sz w:val="24"/>
-        </w:rPr>
-        <w:t>WST-2026-XXXX</w:t>
-      </w:r>
-      <w:r>
-        <w:rPr>
-          <w:rFonts w:ascii="Calibri" w:hAnsi="Calibri"/>
-          <w:sz w:val="24"/>
-        </w:rPr>
-        <w:t>.</w:t>
+        <w:t>6. Demonstration, Completed Milestones and Remaining Work</w:t>
       </w:r>
     </w:p>
     <w:p>
       <w:pPr>
-        <w:pStyle w:val="ListNumber"/>
+        <w:spacing w:after="200" w:before="0" w:line="276" w:lineRule="auto"/>
+        <w:ind w:firstLine="0"/>
       </w:pPr>
       <w:r>
         <w:rPr>
-          <w:rFonts w:ascii="Calibri" w:hAnsi="Calibri"/>
-          <w:b/>
+          <w:rFonts w:ascii="Calibri" w:hAnsi="Calibri" w:cs="Calibri" w:eastAsia="Calibri"/>
+          <w:b w:val="0"/>
+          <w:i w:val="0"/>
           <w:sz w:val="24"/>
         </w:rPr>
-        <w:t>Administrator review</w:t>
-      </w:r>
-      <w:r>
-        <w:rPr>
-          <w:rFonts w:ascii="Calibri" w:hAnsi="Calibri"/>
-          <w:sz w:val="24"/>
-        </w:rPr>
-        <w:t xml:space="preserve"> — status moves to Under Review then Scheduled.</w:t>
+        <w:t>Week 6 will NOT be a series of separate screens, but will be an end-to-end workflow. Each of the 5 team members will have 2 minutes to present with 5 minutes for questions after the 10 minute presentation. The demonstration includes unauthenticated access, citizen report submission and tracking, administrator review, smart-bin classification and priority logic, collection assignment, staff collection completion, dashboard/synchronisation with map/alerts, maintenance diagnostics and reset of demonstration data.</w:t>
       </w:r>
     </w:p>
     <w:p>
       <w:pPr>
-        <w:pStyle w:val="ListNumber"/>
+        <w:spacing w:after="200" w:before="0" w:line="276" w:lineRule="auto"/>
+        <w:ind w:firstLine="0"/>
       </w:pPr>
       <w:r>
         <w:rPr>
-          <w:rFonts w:ascii="Calibri" w:hAnsi="Calibri"/>
-          <w:b/>
+          <w:rFonts w:ascii="Calibri" w:hAnsi="Calibri" w:cs="Calibri" w:eastAsia="Calibri"/>
+          <w:b w:val="0"/>
+          <w:i w:val="0"/>
           <w:sz w:val="24"/>
         </w:rPr>
-        <w:t>Citizen sync</w:t>
-      </w:r>
-      <w:r>
-        <w:rPr>
-          <w:rFonts w:ascii="Calibri" w:hAnsi="Calibri"/>
-          <w:sz w:val="24"/>
-        </w:rPr>
-        <w:t xml:space="preserve"> — history shows Scheduled.</w:t>
+        <w:t>For the presentation we will open https://keinithaxinamalai-art.github.io/Smart-waste-management-system/ on the projector. If that link is still not live (GitHub Pages has to be turned on in Settings, see the README), we can run npm run demo on a laptop and open http://localhost:5173/. A timed script is in DEMO.md.</w:t>
       </w:r>
     </w:p>
     <w:p>
       <w:pPr>
-        <w:pStyle w:val="ListNumber"/>
+        <w:spacing w:after="200" w:before="0" w:line="276" w:lineRule="auto"/>
+        <w:ind w:firstLine="0"/>
       </w:pPr>
       <w:r>
         <w:rPr>
-          <w:rFonts w:ascii="Calibri" w:hAnsi="Calibri"/>
-          <w:b/>
+          <w:rFonts w:ascii="Calibri" w:hAnsi="Calibri" w:cs="Calibri" w:eastAsia="Calibri"/>
+          <w:b w:val="0"/>
+          <w:i w:val="0"/>
           <w:sz w:val="24"/>
         </w:rPr>
-        <w:t>Telemetry</w:t>
-      </w:r>
-      <w:r>
-        <w:rPr>
-          <w:rFonts w:ascii="Calibri" w:hAnsi="Calibri"/>
-          <w:sz w:val="24"/>
-        </w:rPr>
-        <w:t xml:space="preserve"> — map and table show all four fill-level tiers.</w:t>
+        <w:t>Iteration 1 milestones are achieved at prototype: three roles, persistent demonstration data, citizen to administrator flow of reports, deterministic collection decisions, collection execution and integrated monitoring. The following versions should include real telemetry and/or API-based IoT data, a backend database and production grade authentication, real geospatial mapping and notifications, and explore advanced vehicle-routing optimisation. The above-mentioned future directions are in line with the latest research on smart waste systems using IoT technology and dynamic waste collection (Addas et al., 2024; Hess et al., 2024), and are definitely not covered by the prototype mentioned in Iteration 1.</w:t>
       </w:r>
     </w:p>
     <w:p>
       <w:pPr>
-        <w:pStyle w:val="ListNumber"/>
+        <w:spacing w:after="160" w:before="280" w:line="276" w:lineRule="auto"/>
       </w:pPr>
       <w:r>
         <w:rPr>
-          <w:rFonts w:ascii="Calibri" w:hAnsi="Calibri"/>
+          <w:rFonts w:ascii="Calibri" w:hAnsi="Calibri" w:cs="Calibri" w:eastAsia="Calibri"/>
           <w:b/>
-          <w:sz w:val="24"/>
+          <w:i w:val="0"/>
+          <w:sz w:val="28"/>
         </w:rPr>
-        <w:t>Consistency</w:t>
-      </w:r>
-      <w:r>
-        <w:rPr>
-          <w:rFonts w:ascii="Calibri" w:hAnsi="Calibri"/>
-          <w:sz w:val="24"/>
-        </w:rPr>
-        <w:t xml:space="preserve"> — </w:t>
-      </w:r>
-      <w:r>
-        <w:rPr>
-          <w:rFonts w:ascii="Calibri" w:hAnsi="Calibri"/>
-          <w:i/>
-          <w:sz w:val="24"/>
-        </w:rPr>
-        <w:t>WDN-104</w:t>
-      </w:r>
-      <w:r>
-        <w:rPr>
-          <w:rFonts w:ascii="Calibri" w:hAnsi="Calibri"/>
-          <w:sz w:val="24"/>
-        </w:rPr>
-        <w:t xml:space="preserve"> at 92% is Critical on map and dashboard.</w:t>
+        <w:t>References</w:t>
       </w:r>
     </w:p>
     <w:p>
       <w:pPr>
-        <w:pStyle w:val="ListNumber"/>
+        <w:spacing w:after="160" w:before="0" w:line="276" w:lineRule="auto"/>
+        <w:ind w:left="720" w:hanging="720"/>
       </w:pPr>
       <w:r>
         <w:rPr>
-          <w:rFonts w:ascii="Calibri" w:hAnsi="Calibri"/>
-          <w:b/>
+          <w:rFonts w:ascii="Calibri" w:hAnsi="Calibri" w:cs="Calibri" w:eastAsia="Calibri"/>
+          <w:b w:val="0"/>
+          <w:i w:val="0"/>
           <w:sz w:val="24"/>
         </w:rPr>
-        <w:t>Collection</w:t>
+        <w:t xml:space="preserve">Addas, A., Khan, M. N., &amp; Naseer, F. (2024). Waste management 2.0 leveraging internet of things for an efficient and eco-friendly smart city solution. </w:t>
       </w:r>
       <w:r>
         <w:rPr>
-          <w:rFonts w:ascii="Calibri" w:hAnsi="Calibri"/>
+          <w:rFonts w:ascii="Calibri" w:hAnsi="Calibri" w:cs="Calibri" w:eastAsia="Calibri"/>
+          <w:b w:val="0"/>
+          <w:i/>
           <w:sz w:val="24"/>
         </w:rPr>
-        <w:t xml:space="preserve"> — staff mark </w:t>
+        <w:t>PLOS ONE, 19</w:t>
       </w:r>
       <w:r>
         <w:rPr>
-          <w:rFonts w:ascii="Calibri" w:hAnsi="Calibri"/>
-          <w:i/>
+          <w:rFonts w:ascii="Calibri" w:hAnsi="Calibri" w:cs="Calibri" w:eastAsia="Calibri"/>
+          <w:b w:val="0"/>
+          <w:i w:val="0"/>
           <w:sz w:val="24"/>
         </w:rPr>
-        <w:t>WDN-104</w:t>
-      </w:r>
-      <w:r>
-        <w:rPr>
-          <w:rFonts w:ascii="Calibri" w:hAnsi="Calibri"/>
-          <w:sz w:val="24"/>
-        </w:rPr>
-        <w:t xml:space="preserve"> collected; fill becomes 5% Normal.</w:t>
+        <w:t>(7), e0307608. https://doi.org/10.1371/journal.pone.0307608</w:t>
       </w:r>
     </w:p>
     <w:p>
       <w:pPr>
-        <w:pStyle w:val="ListNumber"/>
+        <w:spacing w:after="160" w:before="0" w:line="276" w:lineRule="auto"/>
+        <w:ind w:left="720" w:hanging="720"/>
       </w:pPr>
       <w:r>
         <w:rPr>
-          <w:rFonts w:ascii="Calibri" w:hAnsi="Calibri"/>
-          <w:b/>
+          <w:rFonts w:ascii="Calibri" w:hAnsi="Calibri" w:cs="Calibri" w:eastAsia="Calibri"/>
+          <w:b w:val="0"/>
+          <w:i w:val="0"/>
           <w:sz w:val="24"/>
         </w:rPr>
-        <w:t>Cross-screen update</w:t>
+        <w:t xml:space="preserve">An, Y., Qiu, J., &amp; Dong, Z. Y. (2022). Smart waste management system for decision makers by using smart bins: A case study for an Australian municipality. </w:t>
       </w:r>
       <w:r>
         <w:rPr>
-          <w:rFonts w:ascii="Calibri" w:hAnsi="Calibri"/>
+          <w:rFonts w:ascii="Calibri" w:hAnsi="Calibri" w:cs="Calibri" w:eastAsia="Calibri"/>
+          <w:b w:val="0"/>
+          <w:i/>
           <w:sz w:val="24"/>
         </w:rPr>
-        <w:t xml:space="preserve"> — dashboard, alerts, and map agree.</w:t>
+        <w:t>Australian Journal of Civil Engineering, 20</w:t>
+      </w:r>
+      <w:r>
+        <w:rPr>
+          <w:rFonts w:ascii="Calibri" w:hAnsi="Calibri" w:cs="Calibri" w:eastAsia="Calibri"/>
+          <w:b w:val="0"/>
+          <w:i w:val="0"/>
+          <w:sz w:val="24"/>
+        </w:rPr>
+        <w:t>(2), 454–459. https://doi.org/10.1080/14488353.2021.2024329</w:t>
       </w:r>
     </w:p>
     <w:p>
       <w:pPr>
-        <w:pStyle w:val="ListNumber"/>
+        <w:spacing w:after="160" w:before="0" w:line="276" w:lineRule="auto"/>
+        <w:ind w:left="720" w:hanging="720"/>
       </w:pPr>
       <w:r>
         <w:rPr>
-          <w:rFonts w:ascii="Calibri" w:hAnsi="Calibri"/>
-          <w:b/>
+          <w:rFonts w:ascii="Calibri" w:hAnsi="Calibri" w:cs="Calibri" w:eastAsia="Calibri"/>
+          <w:b w:val="0"/>
+          <w:i w:val="0"/>
           <w:sz w:val="24"/>
         </w:rPr>
-        <w:t>Maintenance</w:t>
+        <w:t xml:space="preserve">Ghahramani, M., Zhou, M., Molter, A., &amp; Pilla, F. (2022). IoT-based route recommendation for an intelligent waste management system. </w:t>
       </w:r>
       <w:r>
         <w:rPr>
-          <w:rFonts w:ascii="Calibri" w:hAnsi="Calibri"/>
+          <w:rFonts w:ascii="Calibri" w:hAnsi="Calibri" w:cs="Calibri" w:eastAsia="Calibri"/>
+          <w:b w:val="0"/>
+          <w:i/>
           <w:sz w:val="24"/>
         </w:rPr>
-        <w:t xml:space="preserve"> — start work on an Open sensor ticket; resolve the lid-jam work order.</w:t>
+        <w:t>IEEE Internet of Things Journal, 9</w:t>
+      </w:r>
+      <w:r>
+        <w:rPr>
+          <w:rFonts w:ascii="Calibri" w:hAnsi="Calibri" w:cs="Calibri" w:eastAsia="Calibri"/>
+          <w:b w:val="0"/>
+          <w:i w:val="0"/>
+          <w:sz w:val="24"/>
+        </w:rPr>
+        <w:t>(14), 11883–11892. https://arxiv.org/abs/2201.00180</w:t>
       </w:r>
     </w:p>
     <w:p>
       <w:pPr>
-        <w:pStyle w:val="ListNumber"/>
+        <w:spacing w:after="160" w:before="0" w:line="276" w:lineRule="auto"/>
+        <w:ind w:left="720" w:hanging="720"/>
       </w:pPr>
       <w:r>
         <w:rPr>
-          <w:rFonts w:ascii="Calibri" w:hAnsi="Calibri"/>
-          <w:b/>
+          <w:rFonts w:ascii="Calibri" w:hAnsi="Calibri" w:cs="Calibri" w:eastAsia="Calibri"/>
+          <w:b w:val="0"/>
+          <w:i w:val="0"/>
           <w:sz w:val="24"/>
         </w:rPr>
-        <w:t>Reset</w:t>
+        <w:t xml:space="preserve">Hess, C., Dragomir, A. G., Doerner, K. F., &amp; Vigo, D. (2024). Waste collection routing: A survey on problems and methods. </w:t>
       </w:r>
       <w:r>
         <w:rPr>
-          <w:rFonts w:ascii="Calibri" w:hAnsi="Calibri"/>
+          <w:rFonts w:ascii="Calibri" w:hAnsi="Calibri" w:cs="Calibri" w:eastAsia="Calibri"/>
+          <w:b w:val="0"/>
+          <w:i/>
           <w:sz w:val="24"/>
         </w:rPr>
-        <w:t xml:space="preserve"> — administrator restores seed data.</w:t>
+        <w:t>Central European Journal of Operations Research, 32</w:t>
       </w:r>
-    </w:p>
-    <w:p>
       <w:r>
         <w:rPr>
-          <w:rFonts w:ascii="Calibri" w:hAnsi="Calibri"/>
+          <w:rFonts w:ascii="Calibri" w:hAnsi="Calibri" w:cs="Calibri" w:eastAsia="Calibri"/>
+          <w:b w:val="0"/>
+          <w:i w:val="0"/>
           <w:sz w:val="24"/>
         </w:rPr>
-        <w:t>Remaining work (Iteration 2): replace simulated sensors with microcontroller feeds, persist to a cloud database, and add true geospatial routing. Iteration 1 is a demonstration-ready software prototype for three roles, not a deployed IoT network.</w:t>
+        <w:t>, 399–434. https://doi.org/10.1007/s10100-023-00892-y</w:t>
       </w:r>
     </w:p>
     <w:p>
       <w:pPr>
-        <w:pStyle w:val="Heading2"/>
+        <w:spacing w:after="160" w:before="0" w:line="276" w:lineRule="auto"/>
+        <w:ind w:left="720" w:hanging="720"/>
       </w:pPr>
       <w:r>
-        <w:t>Acknowledgement of AI use</w:t>
+        <w:rPr>
+          <w:rFonts w:ascii="Calibri" w:hAnsi="Calibri" w:cs="Calibri" w:eastAsia="Calibri"/>
+          <w:b w:val="0"/>
+          <w:i w:val="0"/>
+          <w:sz w:val="24"/>
+        </w:rPr>
+        <w:t xml:space="preserve">Kuang, Y., &amp; Lin, B. (2021). Public participation and city sustainability: Evidence from urban garbage classification in China. </w:t>
       </w:r>
-    </w:p>
-    <w:p>
       <w:r>
         <w:rPr>
-          <w:rFonts w:ascii="Calibri" w:hAnsi="Calibri"/>
+          <w:rFonts w:ascii="Calibri" w:hAnsi="Calibri" w:cs="Calibri" w:eastAsia="Calibri"/>
+          <w:b w:val="0"/>
+          <w:i/>
           <w:sz w:val="24"/>
         </w:rPr>
-        <w:t>Generative AI (Cursor) was used to support debugging, documentation drafting, GitHub workflow files, and grammar. Team members remain responsible for the design, code, and the ability to explain the prototype during the Week 6 demonstration, in line with the CIHE Academic Integrity Policy.</w:t>
+        <w:t>Sustainable Cities and Society, 67</w:t>
+      </w:r>
+      <w:r>
+        <w:rPr>
+          <w:rFonts w:ascii="Calibri" w:hAnsi="Calibri" w:cs="Calibri" w:eastAsia="Calibri"/>
+          <w:b w:val="0"/>
+          <w:i w:val="0"/>
+          <w:sz w:val="24"/>
+        </w:rPr>
+        <w:t>, 102741. https://doi.org/10.1016/j.scs.2021.102741</w:t>
       </w:r>
     </w:p>
     <w:p>
       <w:pPr>
-        <w:pStyle w:val="Heading2"/>
+        <w:spacing w:after="160" w:before="0" w:line="276" w:lineRule="auto"/>
+        <w:ind w:left="720" w:hanging="720"/>
       </w:pPr>
       <w:r>
-        <w:t>References</w:t>
+        <w:rPr>
+          <w:rFonts w:ascii="Calibri" w:hAnsi="Calibri" w:cs="Calibri" w:eastAsia="Calibri"/>
+          <w:b w:val="0"/>
+          <w:i w:val="0"/>
+          <w:sz w:val="24"/>
+        </w:rPr>
+        <w:t xml:space="preserve">Roy, A., Manna, A., Kim, J., &amp; Moon, I. (2022). IoT-based smart bin allocation and vehicle routing in solid waste management: A case study in South Korea. </w:t>
+      </w:r>
+      <w:r>
+        <w:rPr>
+          <w:rFonts w:ascii="Calibri" w:hAnsi="Calibri" w:cs="Calibri" w:eastAsia="Calibri"/>
+          <w:b w:val="0"/>
+          <w:i/>
+          <w:sz w:val="24"/>
+        </w:rPr>
+        <w:t>Computers &amp; Industrial Engineering, 171</w:t>
+      </w:r>
+      <w:r>
+        <w:rPr>
+          <w:rFonts w:ascii="Calibri" w:hAnsi="Calibri" w:cs="Calibri" w:eastAsia="Calibri"/>
+          <w:b w:val="0"/>
+          <w:i w:val="0"/>
+          <w:sz w:val="24"/>
+        </w:rPr>
+        <w:t>, 108457. https://doi.org/10.1016/j.cie.2022.108457</w:t>
       </w:r>
     </w:p>
     <w:p>
+      <w:pPr>
+        <w:spacing w:after="160" w:before="0" w:line="276" w:lineRule="auto"/>
+        <w:ind w:left="720" w:hanging="720"/>
+      </w:pPr>
       <w:r>
         <w:rPr>
-          <w:rFonts w:ascii="Calibri" w:hAnsi="Calibri"/>
+          <w:rFonts w:ascii="Calibri" w:hAnsi="Calibri" w:cs="Calibri" w:eastAsia="Calibri"/>
+          <w:b w:val="0"/>
+          <w:i w:val="0"/>
           <w:sz w:val="24"/>
         </w:rPr>
-        <w:t>Bass, L., Clements, P., &amp; Kazman, R. (2021). *Software architecture in practice* (4th ed.). Addison-Wesley.</w:t>
+        <w:t xml:space="preserve">Sosunova, I., &amp; Porras, J. (2022). IoT-enabled smart waste management systems for smart cities: A systematic review. </w:t>
+      </w:r>
+      <w:r>
+        <w:rPr>
+          <w:rFonts w:ascii="Calibri" w:hAnsi="Calibri" w:cs="Calibri" w:eastAsia="Calibri"/>
+          <w:b w:val="0"/>
+          <w:i/>
+          <w:sz w:val="24"/>
+        </w:rPr>
+        <w:t>IEEE Access, 10</w:t>
+      </w:r>
+      <w:r>
+        <w:rPr>
+          <w:rFonts w:ascii="Calibri" w:hAnsi="Calibri" w:cs="Calibri" w:eastAsia="Calibri"/>
+          <w:b w:val="0"/>
+          <w:i w:val="0"/>
+          <w:sz w:val="24"/>
+        </w:rPr>
+        <w:t>, 73326–73363. https://doi.org/10.1109/ACCESS.2022.3188308</w:t>
       </w:r>
     </w:p>
     <w:p>
+      <w:pPr>
+        <w:spacing w:after="160" w:before="0" w:line="276" w:lineRule="auto"/>
+        <w:ind w:left="720" w:hanging="720"/>
+      </w:pPr>
       <w:r>
         <w:rPr>
-          <w:rFonts w:ascii="Calibri" w:hAnsi="Calibri"/>
+          <w:rFonts w:ascii="Calibri" w:hAnsi="Calibri" w:cs="Calibri" w:eastAsia="Calibri"/>
+          <w:b w:val="0"/>
+          <w:i w:val="0"/>
           <w:sz w:val="24"/>
         </w:rPr>
-        <w:t>Mozilla Developer Network. (2023). *Client-side form validation*. https://developer.mozilla.org/en-US/docs/Learn/Forms/Form_validation</w:t>
+        <w:t xml:space="preserve">Wang, C., Qin, J., Qu, C., Ran, X., Liu, C., &amp; Chen, B. (2021). A smart municipal waste management system based on deep-learning and Internet of Things. </w:t>
       </w:r>
-    </w:p>
-    <w:p>
       <w:r>
         <w:rPr>
-          <w:rFonts w:ascii="Calibri" w:hAnsi="Calibri"/>
+          <w:rFonts w:ascii="Calibri" w:hAnsi="Calibri" w:cs="Calibri" w:eastAsia="Calibri"/>
+          <w:b w:val="0"/>
+          <w:i/>
           <w:sz w:val="24"/>
         </w:rPr>
-        <w:t>Sommerville, I. (2016). *Software engineering* (10th ed.). Pearson.</w:t>
+        <w:t>Waste Management, 135</w:t>
+      </w:r>
+      <w:r>
+        <w:rPr>
+          <w:rFonts w:ascii="Calibri" w:hAnsi="Calibri" w:cs="Calibri" w:eastAsia="Calibri"/>
+          <w:b w:val="0"/>
+          <w:i w:val="0"/>
+          <w:sz w:val="24"/>
+        </w:rPr>
+        <w:t>, 20–29. https://pubmed.ncbi.nlm.nih.gov/34461487/</w:t>
       </w:r>
     </w:p>
     <w:sectPr>
@@ -2735,7 +1254,7 @@
     <w:qFormat/>
     <w:rsid w:val="00FC693F"/>
     <w:rPr>
-      <w:rFonts w:ascii="Calibri" w:hAnsi="Calibri"/>
+      <w:rFonts w:ascii="Calibri" w:hAnsi="Calibri" w:cs="Calibri" w:eastAsia="Calibri"/>
       <w:sz w:val="24"/>
     </w:rPr>
   </w:style>
@@ -2753,6 +1272,9 @@
       </w:tabs>
       <w:spacing w:after="0" w:line="240" w:lineRule="auto"/>
     </w:pPr>
+    <w:rPr>
+      <w:rFonts w:ascii="Calibri" w:hAnsi="Calibri" w:cs="Calibri" w:eastAsia="Calibri"/>
+    </w:rPr>
   </w:style>
   <w:style w:type="character" w:customStyle="1" w:styleId="HeaderChar">
     <w:name w:val="Header Char"/>
@@ -2760,6 +1282,9 @@
     <w:link w:val="Header"/>
     <w:uiPriority w:val="99"/>
     <w:rsid w:val="00E618BF"/>
+    <w:rPr>
+      <w:rFonts w:ascii="Calibri" w:hAnsi="Calibri" w:cs="Calibri" w:eastAsia="Calibri"/>
+    </w:rPr>
   </w:style>
   <w:style w:type="paragraph" w:styleId="Footer">
     <w:name w:val="footer"/>
@@ -2775,6 +1300,9 @@
       </w:tabs>
       <w:spacing w:after="0" w:line="240" w:lineRule="auto"/>
     </w:pPr>
+    <w:rPr>
+      <w:rFonts w:ascii="Calibri" w:hAnsi="Calibri" w:cs="Calibri" w:eastAsia="Calibri"/>
+    </w:rPr>
   </w:style>
   <w:style w:type="character" w:customStyle="1" w:styleId="FooterChar">
     <w:name w:val="Footer Char"/>
@@ -2782,6 +1310,9 @@
     <w:link w:val="Footer"/>
     <w:uiPriority w:val="99"/>
     <w:rsid w:val="00E618BF"/>
+    <w:rPr>
+      <w:rFonts w:ascii="Calibri" w:hAnsi="Calibri" w:cs="Calibri" w:eastAsia="Calibri"/>
+    </w:rPr>
   </w:style>
   <w:style w:type="paragraph" w:styleId="Heading1">
     <w:name w:val="heading 1"/>
@@ -2798,10 +1329,10 @@
       <w:outlineLvl w:val="0"/>
     </w:pPr>
     <w:rPr>
-      <w:rFonts w:asciiTheme="majorHAnsi" w:eastAsiaTheme="majorEastAsia" w:hAnsiTheme="majorHAnsi" w:cstheme="majorBidi" w:ascii="Calibri" w:hAnsi="Calibri"/>
+      <w:rFonts w:asciiTheme="majorHAnsi" w:eastAsiaTheme="majorEastAsia" w:hAnsiTheme="majorHAnsi" w:cstheme="majorBidi" w:ascii="Calibri" w:hAnsi="Calibri" w:cs="Calibri" w:eastAsia="Calibri"/>
       <w:b/>
       <w:bCs/>
-      <w:color w:val="0D5C4B"/>
+      <w:color w:val="365F91" w:themeColor="accent1" w:themeShade="BF"/>
       <w:sz w:val="28"/>
       <w:szCs w:val="28"/>
     </w:rPr>
@@ -2822,10 +1353,10 @@
       <w:outlineLvl w:val="1"/>
     </w:pPr>
     <w:rPr>
-      <w:rFonts w:asciiTheme="majorHAnsi" w:eastAsiaTheme="majorEastAsia" w:hAnsiTheme="majorHAnsi" w:cstheme="majorBidi" w:ascii="Calibri" w:hAnsi="Calibri"/>
+      <w:rFonts w:asciiTheme="majorHAnsi" w:eastAsiaTheme="majorEastAsia" w:hAnsiTheme="majorHAnsi" w:cstheme="majorBidi" w:ascii="Calibri" w:hAnsi="Calibri" w:cs="Calibri" w:eastAsia="Calibri"/>
       <w:b/>
       <w:bCs/>
-      <w:color w:val="0D5C4B"/>
+      <w:color w:val="4F81BD" w:themeColor="accent1"/>
       <w:sz w:val="26"/>
       <w:szCs w:val="26"/>
     </w:rPr>
@@ -2846,10 +1377,10 @@
       <w:outlineLvl w:val="2"/>
     </w:pPr>
     <w:rPr>
-      <w:rFonts w:asciiTheme="majorHAnsi" w:eastAsiaTheme="majorEastAsia" w:hAnsiTheme="majorHAnsi" w:cstheme="majorBidi" w:ascii="Calibri" w:hAnsi="Calibri"/>
+      <w:rFonts w:asciiTheme="majorHAnsi" w:eastAsiaTheme="majorEastAsia" w:hAnsiTheme="majorHAnsi" w:cstheme="majorBidi" w:ascii="Calibri" w:hAnsi="Calibri" w:cs="Calibri" w:eastAsia="Calibri"/>
       <w:b/>
       <w:bCs/>
-      <w:color w:val="0D5C4B"/>
+      <w:color w:val="4F81BD" w:themeColor="accent1"/>
     </w:rPr>
   </w:style>
   <w:style w:type="paragraph" w:styleId="Heading4">
@@ -2869,12 +1400,12 @@
       <w:outlineLvl w:val="3"/>
     </w:pPr>
     <w:rPr>
-      <w:rFonts w:asciiTheme="majorHAnsi" w:eastAsiaTheme="majorEastAsia" w:hAnsiTheme="majorHAnsi" w:cstheme="majorBidi" w:ascii="Calibri" w:hAnsi="Calibri"/>
+      <w:rFonts w:asciiTheme="majorHAnsi" w:eastAsiaTheme="majorEastAsia" w:hAnsiTheme="majorHAnsi" w:cstheme="majorBidi" w:ascii="Calibri" w:hAnsi="Calibri" w:cs="Calibri" w:eastAsia="Calibri"/>
       <w:b/>
       <w:bCs/>
       <w:i/>
       <w:iCs/>
-      <w:color w:val="0D5C4B"/>
+      <w:color w:val="4F81BD" w:themeColor="accent1"/>
     </w:rPr>
   </w:style>
   <w:style w:type="paragraph" w:styleId="Heading5">
@@ -2894,7 +1425,7 @@
       <w:outlineLvl w:val="4"/>
     </w:pPr>
     <w:rPr>
-      <w:rFonts w:asciiTheme="majorHAnsi" w:eastAsiaTheme="majorEastAsia" w:hAnsiTheme="majorHAnsi" w:cstheme="majorBidi"/>
+      <w:rFonts w:asciiTheme="majorHAnsi" w:eastAsiaTheme="majorEastAsia" w:hAnsiTheme="majorHAnsi" w:cstheme="majorBidi" w:ascii="Calibri" w:hAnsi="Calibri" w:cs="Calibri" w:eastAsia="Calibri"/>
       <w:color w:val="243F60" w:themeColor="accent1" w:themeShade="7F"/>
     </w:rPr>
   </w:style>
@@ -2915,7 +1446,7 @@
       <w:outlineLvl w:val="5"/>
     </w:pPr>
     <w:rPr>
-      <w:rFonts w:asciiTheme="majorHAnsi" w:eastAsiaTheme="majorEastAsia" w:hAnsiTheme="majorHAnsi" w:cstheme="majorBidi"/>
+      <w:rFonts w:asciiTheme="majorHAnsi" w:eastAsiaTheme="majorEastAsia" w:hAnsiTheme="majorHAnsi" w:cstheme="majorBidi" w:ascii="Calibri" w:hAnsi="Calibri" w:cs="Calibri" w:eastAsia="Calibri"/>
       <w:i/>
       <w:iCs/>
       <w:color w:val="243F60" w:themeColor="accent1" w:themeShade="7F"/>
@@ -2938,7 +1469,7 @@
       <w:outlineLvl w:val="6"/>
     </w:pPr>
     <w:rPr>
-      <w:rFonts w:asciiTheme="majorHAnsi" w:eastAsiaTheme="majorEastAsia" w:hAnsiTheme="majorHAnsi" w:cstheme="majorBidi"/>
+      <w:rFonts w:asciiTheme="majorHAnsi" w:eastAsiaTheme="majorEastAsia" w:hAnsiTheme="majorHAnsi" w:cstheme="majorBidi" w:ascii="Calibri" w:hAnsi="Calibri" w:cs="Calibri" w:eastAsia="Calibri"/>
       <w:i/>
       <w:iCs/>
       <w:color w:val="404040" w:themeColor="text1" w:themeTint="BF"/>
@@ -2961,7 +1492,7 @@
       <w:outlineLvl w:val="7"/>
     </w:pPr>
     <w:rPr>
-      <w:rFonts w:asciiTheme="majorHAnsi" w:eastAsiaTheme="majorEastAsia" w:hAnsiTheme="majorHAnsi" w:cstheme="majorBidi"/>
+      <w:rFonts w:asciiTheme="majorHAnsi" w:eastAsiaTheme="majorEastAsia" w:hAnsiTheme="majorHAnsi" w:cstheme="majorBidi" w:ascii="Calibri" w:hAnsi="Calibri" w:cs="Calibri" w:eastAsia="Calibri"/>
       <w:color w:val="4F81BD" w:themeColor="accent1"/>
       <w:sz w:val="20"/>
       <w:szCs w:val="20"/>
@@ -2984,7 +1515,7 @@
       <w:outlineLvl w:val="8"/>
     </w:pPr>
     <w:rPr>
-      <w:rFonts w:asciiTheme="majorHAnsi" w:eastAsiaTheme="majorEastAsia" w:hAnsiTheme="majorHAnsi" w:cstheme="majorBidi"/>
+      <w:rFonts w:asciiTheme="majorHAnsi" w:eastAsiaTheme="majorEastAsia" w:hAnsiTheme="majorHAnsi" w:cstheme="majorBidi" w:ascii="Calibri" w:hAnsi="Calibri" w:cs="Calibri" w:eastAsia="Calibri"/>
       <w:i/>
       <w:iCs/>
       <w:color w:val="404040" w:themeColor="text1" w:themeTint="BF"/>
@@ -2997,12 +1528,18 @@
     <w:uiPriority w:val="1"/>
     <w:semiHidden/>
     <w:unhideWhenUsed/>
+    <w:rPr>
+      <w:rFonts w:ascii="Calibri" w:hAnsi="Calibri" w:cs="Calibri" w:eastAsia="Calibri"/>
+    </w:rPr>
   </w:style>
   <w:style w:type="table" w:default="1" w:styleId="TableNormal">
     <w:name w:val="Normal Table"/>
     <w:uiPriority w:val="99"/>
     <w:semiHidden/>
     <w:unhideWhenUsed/>
+    <w:rPr>
+      <w:rFonts w:ascii="Calibri" w:hAnsi="Calibri" w:cs="Calibri" w:eastAsia="Calibri"/>
+    </w:rPr>
     <w:tblPr>
       <w:tblInd w:w="0" w:type="dxa"/>
       <w:tblCellMar>
@@ -3027,6 +1564,9 @@
     <w:pPr>
       <w:spacing w:after="0" w:line="240" w:lineRule="auto"/>
     </w:pPr>
+    <w:rPr>
+      <w:rFonts w:ascii="Calibri" w:hAnsi="Calibri" w:cs="Calibri" w:eastAsia="Calibri"/>
+    </w:rPr>
   </w:style>
   <w:style w:type="character" w:customStyle="1" w:styleId="Heading1Char">
     <w:name w:val="Heading 1 Char"/>
@@ -3035,7 +1575,7 @@
     <w:uiPriority w:val="9"/>
     <w:rsid w:val="00FC693F"/>
     <w:rPr>
-      <w:rFonts w:asciiTheme="majorHAnsi" w:eastAsiaTheme="majorEastAsia" w:hAnsiTheme="majorHAnsi" w:cstheme="majorBidi"/>
+      <w:rFonts w:asciiTheme="majorHAnsi" w:eastAsiaTheme="majorEastAsia" w:hAnsiTheme="majorHAnsi" w:cstheme="majorBidi" w:ascii="Calibri" w:hAnsi="Calibri" w:cs="Calibri" w:eastAsia="Calibri"/>
       <w:b/>
       <w:bCs/>
       <w:color w:val="365F91" w:themeColor="accent1" w:themeShade="BF"/>
@@ -3050,7 +1590,7 @@
     <w:uiPriority w:val="9"/>
     <w:rsid w:val="00FC693F"/>
     <w:rPr>
-      <w:rFonts w:asciiTheme="majorHAnsi" w:eastAsiaTheme="majorEastAsia" w:hAnsiTheme="majorHAnsi" w:cstheme="majorBidi"/>
+      <w:rFonts w:asciiTheme="majorHAnsi" w:eastAsiaTheme="majorEastAsia" w:hAnsiTheme="majorHAnsi" w:cstheme="majorBidi" w:ascii="Calibri" w:hAnsi="Calibri" w:cs="Calibri" w:eastAsia="Calibri"/>
       <w:b/>
       <w:bCs/>
       <w:color w:val="4F81BD" w:themeColor="accent1"/>
@@ -3065,7 +1605,7 @@
     <w:uiPriority w:val="9"/>
     <w:rsid w:val="00FC693F"/>
     <w:rPr>
-      <w:rFonts w:asciiTheme="majorHAnsi" w:eastAsiaTheme="majorEastAsia" w:hAnsiTheme="majorHAnsi" w:cstheme="majorBidi"/>
+      <w:rFonts w:asciiTheme="majorHAnsi" w:eastAsiaTheme="majorEastAsia" w:hAnsiTheme="majorHAnsi" w:cstheme="majorBidi" w:ascii="Calibri" w:hAnsi="Calibri" w:cs="Calibri" w:eastAsia="Calibri"/>
       <w:b/>
       <w:bCs/>
       <w:color w:val="4F81BD" w:themeColor="accent1"/>
@@ -3087,7 +1627,7 @@
       <w:contextualSpacing/>
     </w:pPr>
     <w:rPr>
-      <w:rFonts w:asciiTheme="majorHAnsi" w:eastAsiaTheme="majorEastAsia" w:hAnsiTheme="majorHAnsi" w:cstheme="majorBidi"/>
+      <w:rFonts w:asciiTheme="majorHAnsi" w:eastAsiaTheme="majorEastAsia" w:hAnsiTheme="majorHAnsi" w:cstheme="majorBidi" w:ascii="Calibri" w:hAnsi="Calibri" w:cs="Calibri" w:eastAsia="Calibri"/>
       <w:color w:val="17365D" w:themeColor="text2" w:themeShade="BF"/>
       <w:spacing w:val="5"/>
       <w:kern w:val="28"/>
@@ -3102,7 +1642,7 @@
     <w:uiPriority w:val="10"/>
     <w:rsid w:val="00FC693F"/>
     <w:rPr>
-      <w:rFonts w:asciiTheme="majorHAnsi" w:eastAsiaTheme="majorEastAsia" w:hAnsiTheme="majorHAnsi" w:cstheme="majorBidi"/>
+      <w:rFonts w:asciiTheme="majorHAnsi" w:eastAsiaTheme="majorEastAsia" w:hAnsiTheme="majorHAnsi" w:cstheme="majorBidi" w:ascii="Calibri" w:hAnsi="Calibri" w:cs="Calibri" w:eastAsia="Calibri"/>
       <w:color w:val="17365D" w:themeColor="text2" w:themeShade="BF"/>
       <w:spacing w:val="5"/>
       <w:kern w:val="28"/>
@@ -3124,7 +1664,7 @@
       </w:numPr>
     </w:pPr>
     <w:rPr>
-      <w:rFonts w:asciiTheme="majorHAnsi" w:eastAsiaTheme="majorEastAsia" w:hAnsiTheme="majorHAnsi" w:cstheme="majorBidi"/>
+      <w:rFonts w:asciiTheme="majorHAnsi" w:eastAsiaTheme="majorEastAsia" w:hAnsiTheme="majorHAnsi" w:cstheme="majorBidi" w:ascii="Calibri" w:hAnsi="Calibri" w:cs="Calibri" w:eastAsia="Calibri"/>
       <w:i/>
       <w:iCs/>
       <w:color w:val="4F81BD" w:themeColor="accent1"/>
@@ -3140,7 +1680,7 @@
     <w:uiPriority w:val="11"/>
     <w:rsid w:val="00FC693F"/>
     <w:rPr>
-      <w:rFonts w:asciiTheme="majorHAnsi" w:eastAsiaTheme="majorEastAsia" w:hAnsiTheme="majorHAnsi" w:cstheme="majorBidi"/>
+      <w:rFonts w:asciiTheme="majorHAnsi" w:eastAsiaTheme="majorEastAsia" w:hAnsiTheme="majorHAnsi" w:cstheme="majorBidi" w:ascii="Calibri" w:hAnsi="Calibri" w:cs="Calibri" w:eastAsia="Calibri"/>
       <w:i/>
       <w:iCs/>
       <w:color w:val="4F81BD" w:themeColor="accent1"/>
@@ -3159,6 +1699,9 @@
       <w:ind w:left="720"/>
       <w:contextualSpacing/>
     </w:pPr>
+    <w:rPr>
+      <w:rFonts w:ascii="Calibri" w:hAnsi="Calibri" w:cs="Calibri" w:eastAsia="Calibri"/>
+    </w:rPr>
   </w:style>
   <w:style w:type="paragraph" w:styleId="BodyText">
     <w:name w:val="Body Text"/>
@@ -3170,6 +1713,9 @@
     <w:pPr>
       <w:spacing w:after="120"/>
     </w:pPr>
+    <w:rPr>
+      <w:rFonts w:ascii="Calibri" w:hAnsi="Calibri" w:cs="Calibri" w:eastAsia="Calibri"/>
+    </w:rPr>
   </w:style>
   <w:style w:type="character" w:customStyle="1" w:styleId="BodyTextChar">
     <w:name w:val="Body Text Char"/>
@@ -3177,6 +1723,9 @@
     <w:link w:val="BodyText"/>
     <w:uiPriority w:val="99"/>
     <w:rsid w:val="00AA1D8D"/>
+    <w:rPr>
+      <w:rFonts w:ascii="Calibri" w:hAnsi="Calibri" w:cs="Calibri" w:eastAsia="Calibri"/>
+    </w:rPr>
   </w:style>
   <w:style w:type="paragraph" w:styleId="BodyText2">
     <w:name w:val="Body Text 2"/>
@@ -3188,6 +1737,9 @@
     <w:pPr>
       <w:spacing w:after="120" w:line="480" w:lineRule="auto"/>
     </w:pPr>
+    <w:rPr>
+      <w:rFonts w:ascii="Calibri" w:hAnsi="Calibri" w:cs="Calibri" w:eastAsia="Calibri"/>
+    </w:rPr>
   </w:style>
   <w:style w:type="character" w:customStyle="1" w:styleId="BodyText2Char">
     <w:name w:val="Body Text 2 Char"/>
@@ -3195,6 +1747,9 @@
     <w:link w:val="BodyText2"/>
     <w:uiPriority w:val="99"/>
     <w:rsid w:val="00AA1D8D"/>
+    <w:rPr>
+      <w:rFonts w:ascii="Calibri" w:hAnsi="Calibri" w:cs="Calibri" w:eastAsia="Calibri"/>
+    </w:rPr>
   </w:style>
   <w:style w:type="paragraph" w:styleId="BodyText3">
     <w:name w:val="Body Text 3"/>
@@ -3207,6 +1762,7 @@
       <w:spacing w:after="120"/>
     </w:pPr>
     <w:rPr>
+      <w:rFonts w:ascii="Calibri" w:hAnsi="Calibri" w:cs="Calibri" w:eastAsia="Calibri"/>
       <w:sz w:val="16"/>
       <w:szCs w:val="16"/>
     </w:rPr>
@@ -3218,6 +1774,7 @@
     <w:uiPriority w:val="99"/>
     <w:rsid w:val="00AA1D8D"/>
     <w:rPr>
+      <w:rFonts w:ascii="Calibri" w:hAnsi="Calibri" w:cs="Calibri" w:eastAsia="Calibri"/>
       <w:sz w:val="16"/>
       <w:szCs w:val="16"/>
     </w:rPr>
@@ -3232,6 +1789,9 @@
       <w:ind w:left="360" w:hanging="360"/>
       <w:contextualSpacing/>
     </w:pPr>
+    <w:rPr>
+      <w:rFonts w:ascii="Calibri" w:hAnsi="Calibri" w:cs="Calibri" w:eastAsia="Calibri"/>
+    </w:rPr>
   </w:style>
   <w:style w:type="paragraph" w:styleId="List2">
     <w:name w:val="List 2"/>
@@ -3243,6 +1803,9 @@
       <w:ind w:left="720" w:hanging="360"/>
       <w:contextualSpacing/>
     </w:pPr>
+    <w:rPr>
+      <w:rFonts w:ascii="Calibri" w:hAnsi="Calibri" w:cs="Calibri" w:eastAsia="Calibri"/>
+    </w:rPr>
   </w:style>
   <w:style w:type="paragraph" w:styleId="List3">
     <w:name w:val="List 3"/>
@@ -3254,6 +1817,9 @@
       <w:ind w:left="1080" w:hanging="360"/>
       <w:contextualSpacing/>
     </w:pPr>
+    <w:rPr>
+      <w:rFonts w:ascii="Calibri" w:hAnsi="Calibri" w:cs="Calibri" w:eastAsia="Calibri"/>
+    </w:rPr>
   </w:style>
   <w:style w:type="paragraph" w:styleId="ListBullet">
     <w:name w:val="List Bullet"/>
@@ -3267,6 +1833,9 @@
       </w:numPr>
       <w:contextualSpacing/>
     </w:pPr>
+    <w:rPr>
+      <w:rFonts w:ascii="Calibri" w:hAnsi="Calibri" w:cs="Calibri" w:eastAsia="Calibri"/>
+    </w:rPr>
   </w:style>
   <w:style w:type="paragraph" w:styleId="ListBullet2">
     <w:name w:val="List Bullet 2"/>
@@ -3280,6 +1849,9 @@
       </w:numPr>
       <w:contextualSpacing/>
     </w:pPr>
+    <w:rPr>
+      <w:rFonts w:ascii="Calibri" w:hAnsi="Calibri" w:cs="Calibri" w:eastAsia="Calibri"/>
+    </w:rPr>
   </w:style>
   <w:style w:type="paragraph" w:styleId="ListBullet3">
     <w:name w:val="List Bullet 3"/>
@@ -3293,6 +1865,9 @@
       </w:numPr>
       <w:contextualSpacing/>
     </w:pPr>
+    <w:rPr>
+      <w:rFonts w:ascii="Calibri" w:hAnsi="Calibri" w:cs="Calibri" w:eastAsia="Calibri"/>
+    </w:rPr>
   </w:style>
   <w:style w:type="paragraph" w:styleId="ListNumber">
     <w:name w:val="List Number"/>
@@ -3306,6 +1881,9 @@
       </w:numPr>
       <w:contextualSpacing/>
     </w:pPr>
+    <w:rPr>
+      <w:rFonts w:ascii="Calibri" w:hAnsi="Calibri" w:cs="Calibri" w:eastAsia="Calibri"/>
+    </w:rPr>
   </w:style>
   <w:style w:type="paragraph" w:styleId="ListNumber2">
     <w:name w:val="List Number 2"/>
@@ -3319,6 +1897,9 @@
       </w:numPr>
       <w:contextualSpacing/>
     </w:pPr>
+    <w:rPr>
+      <w:rFonts w:ascii="Calibri" w:hAnsi="Calibri" w:cs="Calibri" w:eastAsia="Calibri"/>
+    </w:rPr>
   </w:style>
   <w:style w:type="paragraph" w:styleId="ListNumber3">
     <w:name w:val="List Number 3"/>
@@ -3332,6 +1913,9 @@
       </w:numPr>
       <w:contextualSpacing/>
     </w:pPr>
+    <w:rPr>
+      <w:rFonts w:ascii="Calibri" w:hAnsi="Calibri" w:cs="Calibri" w:eastAsia="Calibri"/>
+    </w:rPr>
   </w:style>
   <w:style w:type="paragraph" w:styleId="ListContinue">
     <w:name w:val="List Continue"/>
@@ -3344,6 +1928,9 @@
       <w:ind w:left="360"/>
       <w:contextualSpacing/>
     </w:pPr>
+    <w:rPr>
+      <w:rFonts w:ascii="Calibri" w:hAnsi="Calibri" w:cs="Calibri" w:eastAsia="Calibri"/>
+    </w:rPr>
   </w:style>
   <w:style w:type="paragraph" w:styleId="ListContinue2">
     <w:name w:val="List Continue 2"/>
@@ -3356,6 +1943,9 @@
       <w:ind w:left="720"/>
       <w:contextualSpacing/>
     </w:pPr>
+    <w:rPr>
+      <w:rFonts w:ascii="Calibri" w:hAnsi="Calibri" w:cs="Calibri" w:eastAsia="Calibri"/>
+    </w:rPr>
   </w:style>
   <w:style w:type="paragraph" w:styleId="ListContinue3">
     <w:name w:val="List Continue 3"/>
@@ -3368,6 +1958,9 @@
       <w:ind w:left="1080"/>
       <w:contextualSpacing/>
     </w:pPr>
+    <w:rPr>
+      <w:rFonts w:ascii="Calibri" w:hAnsi="Calibri" w:cs="Calibri" w:eastAsia="Calibri"/>
+    </w:rPr>
   </w:style>
   <w:style w:type="paragraph" w:styleId="MacroText">
     <w:name w:val="macro"/>
@@ -3387,7 +1980,7 @@
       </w:tabs>
     </w:pPr>
     <w:rPr>
-      <w:rFonts w:ascii="Courier" w:hAnsi="Courier"/>
+      <w:rFonts w:ascii="Calibri" w:hAnsi="Calibri" w:cs="Calibri" w:eastAsia="Calibri"/>
       <w:sz w:val="20"/>
       <w:szCs w:val="20"/>
     </w:rPr>
@@ -3399,7 +1992,7 @@
     <w:uiPriority w:val="99"/>
     <w:rsid w:val="0029639D"/>
     <w:rPr>
-      <w:rFonts w:ascii="Courier" w:hAnsi="Courier"/>
+      <w:rFonts w:ascii="Calibri" w:hAnsi="Calibri" w:cs="Calibri" w:eastAsia="Calibri"/>
       <w:sz w:val="20"/>
       <w:szCs w:val="20"/>
     </w:rPr>
@@ -3413,6 +2006,7 @@
     <w:qFormat/>
     <w:rsid w:val="00FC693F"/>
     <w:rPr>
+      <w:rFonts w:ascii="Calibri" w:hAnsi="Calibri" w:cs="Calibri" w:eastAsia="Calibri"/>
       <w:i/>
       <w:iCs/>
       <w:color w:val="000000" w:themeColor="text1"/>
@@ -3425,6 +2019,7 @@
     <w:uiPriority w:val="29"/>
     <w:rsid w:val="00FC693F"/>
     <w:rPr>
+      <w:rFonts w:ascii="Calibri" w:hAnsi="Calibri" w:cs="Calibri" w:eastAsia="Calibri"/>
       <w:i/>
       <w:iCs/>
       <w:color w:val="000000" w:themeColor="text1"/>
@@ -3438,7 +2033,7 @@
     <w:semiHidden/>
     <w:rsid w:val="00FC693F"/>
     <w:rPr>
-      <w:rFonts w:asciiTheme="majorHAnsi" w:eastAsiaTheme="majorEastAsia" w:hAnsiTheme="majorHAnsi" w:cstheme="majorBidi"/>
+      <w:rFonts w:asciiTheme="majorHAnsi" w:eastAsiaTheme="majorEastAsia" w:hAnsiTheme="majorHAnsi" w:cstheme="majorBidi" w:ascii="Calibri" w:hAnsi="Calibri" w:cs="Calibri" w:eastAsia="Calibri"/>
       <w:b/>
       <w:bCs/>
       <w:i/>
@@ -3454,7 +2049,7 @@
     <w:semiHidden/>
     <w:rsid w:val="00FC693F"/>
     <w:rPr>
-      <w:rFonts w:asciiTheme="majorHAnsi" w:eastAsiaTheme="majorEastAsia" w:hAnsiTheme="majorHAnsi" w:cstheme="majorBidi"/>
+      <w:rFonts w:asciiTheme="majorHAnsi" w:eastAsiaTheme="majorEastAsia" w:hAnsiTheme="majorHAnsi" w:cstheme="majorBidi" w:ascii="Calibri" w:hAnsi="Calibri" w:cs="Calibri" w:eastAsia="Calibri"/>
       <w:color w:val="243F60" w:themeColor="accent1" w:themeShade="7F"/>
     </w:rPr>
   </w:style>
@@ -3466,7 +2061,7 @@
     <w:semiHidden/>
     <w:rsid w:val="00FC693F"/>
     <w:rPr>
-      <w:rFonts w:asciiTheme="majorHAnsi" w:eastAsiaTheme="majorEastAsia" w:hAnsiTheme="majorHAnsi" w:cstheme="majorBidi"/>
+      <w:rFonts w:asciiTheme="majorHAnsi" w:eastAsiaTheme="majorEastAsia" w:hAnsiTheme="majorHAnsi" w:cstheme="majorBidi" w:ascii="Calibri" w:hAnsi="Calibri" w:cs="Calibri" w:eastAsia="Calibri"/>
       <w:i/>
       <w:iCs/>
       <w:color w:val="243F60" w:themeColor="accent1" w:themeShade="7F"/>
@@ -3480,7 +2075,7 @@
     <w:semiHidden/>
     <w:rsid w:val="00FC693F"/>
     <w:rPr>
-      <w:rFonts w:asciiTheme="majorHAnsi" w:eastAsiaTheme="majorEastAsia" w:hAnsiTheme="majorHAnsi" w:cstheme="majorBidi"/>
+      <w:rFonts w:asciiTheme="majorHAnsi" w:eastAsiaTheme="majorEastAsia" w:hAnsiTheme="majorHAnsi" w:cstheme="majorBidi" w:ascii="Calibri" w:hAnsi="Calibri" w:cs="Calibri" w:eastAsia="Calibri"/>
       <w:i/>
       <w:iCs/>
       <w:color w:val="404040" w:themeColor="text1" w:themeTint="BF"/>
@@ -3494,7 +2089,7 @@
     <w:semiHidden/>
     <w:rsid w:val="00FC693F"/>
     <w:rPr>
-      <w:rFonts w:asciiTheme="majorHAnsi" w:eastAsiaTheme="majorEastAsia" w:hAnsiTheme="majorHAnsi" w:cstheme="majorBidi"/>
+      <w:rFonts w:asciiTheme="majorHAnsi" w:eastAsiaTheme="majorEastAsia" w:hAnsiTheme="majorHAnsi" w:cstheme="majorBidi" w:ascii="Calibri" w:hAnsi="Calibri" w:cs="Calibri" w:eastAsia="Calibri"/>
       <w:color w:val="4F81BD" w:themeColor="accent1"/>
       <w:sz w:val="20"/>
       <w:szCs w:val="20"/>
@@ -3508,7 +2103,7 @@
     <w:semiHidden/>
     <w:rsid w:val="00FC693F"/>
     <w:rPr>
-      <w:rFonts w:asciiTheme="majorHAnsi" w:eastAsiaTheme="majorEastAsia" w:hAnsiTheme="majorHAnsi" w:cstheme="majorBidi"/>
+      <w:rFonts w:asciiTheme="majorHAnsi" w:eastAsiaTheme="majorEastAsia" w:hAnsiTheme="majorHAnsi" w:cstheme="majorBidi" w:ascii="Calibri" w:hAnsi="Calibri" w:cs="Calibri" w:eastAsia="Calibri"/>
       <w:i/>
       <w:iCs/>
       <w:color w:val="404040" w:themeColor="text1" w:themeTint="BF"/>
@@ -3529,6 +2124,7 @@
       <w:spacing w:line="240" w:lineRule="auto"/>
     </w:pPr>
     <w:rPr>
+      <w:rFonts w:ascii="Calibri" w:hAnsi="Calibri" w:cs="Calibri" w:eastAsia="Calibri"/>
       <w:b/>
       <w:bCs/>
       <w:color w:val="4F81BD" w:themeColor="accent1"/>
@@ -3543,6 +2139,7 @@
     <w:qFormat/>
     <w:rsid w:val="00FC693F"/>
     <w:rPr>
+      <w:rFonts w:ascii="Calibri" w:hAnsi="Calibri" w:cs="Calibri" w:eastAsia="Calibri"/>
       <w:b/>
       <w:bCs/>
     </w:rPr>
@@ -3554,6 +2151,7 @@
     <w:qFormat/>
     <w:rsid w:val="00FC693F"/>
     <w:rPr>
+      <w:rFonts w:ascii="Calibri" w:hAnsi="Calibri" w:cs="Calibri" w:eastAsia="Calibri"/>
       <w:i/>
       <w:iCs/>
     </w:rPr>
@@ -3574,6 +2172,7 @@
       <w:ind w:left="936" w:right="936"/>
     </w:pPr>
     <w:rPr>
+      <w:rFonts w:ascii="Calibri" w:hAnsi="Calibri" w:cs="Calibri" w:eastAsia="Calibri"/>
       <w:b/>
       <w:bCs/>
       <w:i/>
@@ -3588,6 +2187,7 @@
     <w:uiPriority w:val="30"/>
     <w:rsid w:val="00FC693F"/>
     <w:rPr>
+      <w:rFonts w:ascii="Calibri" w:hAnsi="Calibri" w:cs="Calibri" w:eastAsia="Calibri"/>
       <w:b/>
       <w:bCs/>
       <w:i/>
@@ -3602,6 +2202,7 @@
     <w:qFormat/>
     <w:rsid w:val="00FC693F"/>
     <w:rPr>
+      <w:rFonts w:ascii="Calibri" w:hAnsi="Calibri" w:cs="Calibri" w:eastAsia="Calibri"/>
       <w:i/>
       <w:iCs/>
       <w:color w:val="808080" w:themeColor="text1" w:themeTint="7F"/>
@@ -3614,6 +2215,7 @@
     <w:qFormat/>
     <w:rsid w:val="00FC693F"/>
     <w:rPr>
+      <w:rFonts w:ascii="Calibri" w:hAnsi="Calibri" w:cs="Calibri" w:eastAsia="Calibri"/>
       <w:b/>
       <w:bCs/>
       <w:i/>
@@ -3628,6 +2230,7 @@
     <w:qFormat/>
     <w:rsid w:val="00FC693F"/>
     <w:rPr>
+      <w:rFonts w:ascii="Calibri" w:hAnsi="Calibri" w:cs="Calibri" w:eastAsia="Calibri"/>
       <w:smallCaps/>
       <w:color w:val="C0504D" w:themeColor="accent2"/>
       <w:u w:val="single"/>
@@ -3640,6 +2243,7 @@
     <w:qFormat/>
     <w:rsid w:val="00FC693F"/>
     <w:rPr>
+      <w:rFonts w:ascii="Calibri" w:hAnsi="Calibri" w:cs="Calibri" w:eastAsia="Calibri"/>
       <w:b/>
       <w:bCs/>
       <w:smallCaps/>
@@ -3655,6 +2259,7 @@
     <w:qFormat/>
     <w:rsid w:val="00FC693F"/>
     <w:rPr>
+      <w:rFonts w:ascii="Calibri" w:hAnsi="Calibri" w:cs="Calibri" w:eastAsia="Calibri"/>
       <w:b/>
       <w:bCs/>
       <w:smallCaps/>
@@ -3673,6 +2278,9 @@
     <w:pPr>
       <w:outlineLvl w:val="9"/>
     </w:pPr>
+    <w:rPr>
+      <w:rFonts w:ascii="Calibri" w:hAnsi="Calibri" w:cs="Calibri" w:eastAsia="Calibri"/>
+    </w:rPr>
   </w:style>
   <w:style w:type="table" w:styleId="TableGrid">
     <w:name w:val="Table Grid"/>
@@ -3682,6 +2290,9 @@
     <w:pPr>
       <w:spacing w:after="0" w:line="240" w:lineRule="auto"/>
     </w:pPr>
+    <w:rPr>
+      <w:rFonts w:ascii="Calibri" w:hAnsi="Calibri" w:cs="Calibri" w:eastAsia="Calibri"/>
+    </w:rPr>
     <w:tblPr>
       <w:tblInd w:w="0" w:type="dxa"/>
       <w:tblBorders>
@@ -3709,6 +2320,7 @@
       <w:spacing w:after="0" w:line="240" w:lineRule="auto"/>
     </w:pPr>
     <w:rPr>
+      <w:rFonts w:ascii="Calibri" w:hAnsi="Calibri" w:cs="Calibri" w:eastAsia="Calibri"/>
       <w:color w:val="000000" w:themeColor="text1" w:themeShade="BF"/>
     </w:rPr>
     <w:tblPr>
@@ -3812,6 +2424,7 @@
       <w:spacing w:after="0" w:line="240" w:lineRule="auto"/>
     </w:pPr>
     <w:rPr>
+      <w:rFonts w:ascii="Calibri" w:hAnsi="Calibri" w:cs="Calibri" w:eastAsia="Calibri"/>
       <w:color w:val="365F91" w:themeColor="accent1" w:themeShade="BF"/>
     </w:rPr>
     <w:tblPr>
@@ -3915,6 +2528,7 @@
       <w:spacing w:after="0" w:line="240" w:lineRule="auto"/>
     </w:pPr>
     <w:rPr>
+      <w:rFonts w:ascii="Calibri" w:hAnsi="Calibri" w:cs="Calibri" w:eastAsia="Calibri"/>
       <w:color w:val="943634" w:themeColor="accent2" w:themeShade="BF"/>
     </w:rPr>
     <w:tblPr>
@@ -4018,6 +2632,7 @@
       <w:spacing w:after="0" w:line="240" w:lineRule="auto"/>
     </w:pPr>
     <w:rPr>
+      <w:rFonts w:ascii="Calibri" w:hAnsi="Calibri" w:cs="Calibri" w:eastAsia="Calibri"/>
       <w:color w:val="76923C" w:themeColor="accent3" w:themeShade="BF"/>
     </w:rPr>
     <w:tblPr>
@@ -4121,6 +2736,7 @@
       <w:spacing w:after="0" w:line="240" w:lineRule="auto"/>
     </w:pPr>
     <w:rPr>
+      <w:rFonts w:ascii="Calibri" w:hAnsi="Calibri" w:cs="Calibri" w:eastAsia="Calibri"/>
       <w:color w:val="5F497A" w:themeColor="accent4" w:themeShade="BF"/>
     </w:rPr>
     <w:tblPr>
@@ -4224,6 +2840,7 @@
       <w:spacing w:after="0" w:line="240" w:lineRule="auto"/>
     </w:pPr>
     <w:rPr>
+      <w:rFonts w:ascii="Calibri" w:hAnsi="Calibri" w:cs="Calibri" w:eastAsia="Calibri"/>
       <w:color w:val="31849B" w:themeColor="accent5" w:themeShade="BF"/>
     </w:rPr>
     <w:tblPr>
@@ -4327,6 +2944,7 @@
       <w:spacing w:after="0" w:line="240" w:lineRule="auto"/>
     </w:pPr>
     <w:rPr>
+      <w:rFonts w:ascii="Calibri" w:hAnsi="Calibri" w:cs="Calibri" w:eastAsia="Calibri"/>
       <w:color w:val="E36C0A" w:themeColor="accent6" w:themeShade="BF"/>
     </w:rPr>
     <w:tblPr>
@@ -4429,6 +3047,9 @@
     <w:pPr>
       <w:spacing w:after="0" w:line="240" w:lineRule="auto"/>
     </w:pPr>
+    <w:rPr>
+      <w:rFonts w:ascii="Calibri" w:hAnsi="Calibri" w:cs="Calibri" w:eastAsia="Calibri"/>
+    </w:rPr>
     <w:tblPr>
       <w:tblStyleRowBandSize w:val="1"/>
       <w:tblStyleColBandSize w:val="1"/>
@@ -4521,6 +3142,9 @@
     <w:pPr>
       <w:spacing w:after="0" w:line="240" w:lineRule="auto"/>
     </w:pPr>
+    <w:rPr>
+      <w:rFonts w:ascii="Calibri" w:hAnsi="Calibri" w:cs="Calibri" w:eastAsia="Calibri"/>
+    </w:rPr>
     <w:tblPr>
       <w:tblStyleRowBandSize w:val="1"/>
       <w:tblStyleColBandSize w:val="1"/>
@@ -4613,6 +3237,9 @@
     <w:pPr>
       <w:spacing w:after="0" w:line="240" w:lineRule="auto"/>
     </w:pPr>
+    <w:rPr>
+      <w:rFonts w:ascii="Calibri" w:hAnsi="Calibri" w:cs="Calibri" w:eastAsia="Calibri"/>
+    </w:rPr>
     <w:tblPr>
       <w:tblStyleRowBandSize w:val="1"/>
       <w:tblStyleColBandSize w:val="1"/>
@@ -4705,6 +3332,9 @@
     <w:pPr>
       <w:spacing w:after="0" w:line="240" w:lineRule="auto"/>
     </w:pPr>
+    <w:rPr>
+      <w:rFonts w:ascii="Calibri" w:hAnsi="Calibri" w:cs="Calibri" w:eastAsia="Calibri"/>
+    </w:rPr>
     <w:tblPr>
       <w:tblStyleRowBandSize w:val="1"/>
       <w:tblStyleColBandSize w:val="1"/>
@@ -4797,6 +3427,9 @@
     <w:pPr>
       <w:spacing w:after="0" w:line="240" w:lineRule="auto"/>
     </w:pPr>
+    <w:rPr>
+      <w:rFonts w:ascii="Calibri" w:hAnsi="Calibri" w:cs="Calibri" w:eastAsia="Calibri"/>
+    </w:rPr>
     <w:tblPr>
       <w:tblStyleRowBandSize w:val="1"/>
       <w:tblStyleColBandSize w:val="1"/>
@@ -4889,6 +3522,9 @@
     <w:pPr>
       <w:spacing w:after="0" w:line="240" w:lineRule="auto"/>
     </w:pPr>
+    <w:rPr>
+      <w:rFonts w:ascii="Calibri" w:hAnsi="Calibri" w:cs="Calibri" w:eastAsia="Calibri"/>
+    </w:rPr>
     <w:tblPr>
       <w:tblStyleRowBandSize w:val="1"/>
       <w:tblStyleColBandSize w:val="1"/>
@@ -4981,6 +3617,9 @@
     <w:pPr>
       <w:spacing w:after="0" w:line="240" w:lineRule="auto"/>
     </w:pPr>
+    <w:rPr>
+      <w:rFonts w:ascii="Calibri" w:hAnsi="Calibri" w:cs="Calibri" w:eastAsia="Calibri"/>
+    </w:rPr>
     <w:tblPr>
       <w:tblStyleRowBandSize w:val="1"/>
       <w:tblStyleColBandSize w:val="1"/>
@@ -5073,6 +3712,9 @@
     <w:pPr>
       <w:spacing w:after="0" w:line="240" w:lineRule="auto"/>
     </w:pPr>
+    <w:rPr>
+      <w:rFonts w:ascii="Calibri" w:hAnsi="Calibri" w:cs="Calibri" w:eastAsia="Calibri"/>
+    </w:rPr>
     <w:tblPr>
       <w:tblStyleRowBandSize w:val="1"/>
       <w:tblStyleColBandSize w:val="1"/>
@@ -5203,6 +3845,9 @@
     <w:pPr>
       <w:spacing w:after="0" w:line="240" w:lineRule="auto"/>
     </w:pPr>
+    <w:rPr>
+      <w:rFonts w:ascii="Calibri" w:hAnsi="Calibri" w:cs="Calibri" w:eastAsia="Calibri"/>
+    </w:rPr>
     <w:tblPr>
       <w:tblStyleRowBandSize w:val="1"/>
       <w:tblStyleColBandSize w:val="1"/>
@@ -5333,6 +3978,9 @@
     <w:pPr>
       <w:spacing w:after="0" w:line="240" w:lineRule="auto"/>
     </w:pPr>
+    <w:rPr>
+      <w:rFonts w:ascii="Calibri" w:hAnsi="Calibri" w:cs="Calibri" w:eastAsia="Calibri"/>
+    </w:rPr>
     <w:tblPr>
       <w:tblStyleRowBandSize w:val="1"/>
       <w:tblStyleColBandSize w:val="1"/>
@@ -5463,6 +4111,9 @@
     <w:pPr>
       <w:spacing w:after="0" w:line="240" w:lineRule="auto"/>
     </w:pPr>
+    <w:rPr>
+      <w:rFonts w:ascii="Calibri" w:hAnsi="Calibri" w:cs="Calibri" w:eastAsia="Calibri"/>
+    </w:rPr>
     <w:tblPr>
       <w:tblStyleRowBandSize w:val="1"/>
       <w:tblStyleColBandSize w:val="1"/>
@@ -5593,6 +4244,9 @@
     <w:pPr>
       <w:spacing w:after="0" w:line="240" w:lineRule="auto"/>
     </w:pPr>
+    <w:rPr>
+      <w:rFonts w:ascii="Calibri" w:hAnsi="Calibri" w:cs="Calibri" w:eastAsia="Calibri"/>
+    </w:rPr>
     <w:tblPr>
       <w:tblStyleRowBandSize w:val="1"/>
       <w:tblStyleColBandSize w:val="1"/>
@@ -5723,6 +4377,9 @@
     <w:pPr>
       <w:spacing w:after="0" w:line="240" w:lineRule="auto"/>
     </w:pPr>
+    <w:rPr>
+      <w:rFonts w:ascii="Calibri" w:hAnsi="Calibri" w:cs="Calibri" w:eastAsia="Calibri"/>
+    </w:rPr>
     <w:tblPr>
       <w:tblStyleRowBandSize w:val="1"/>
       <w:tblStyleColBandSize w:val="1"/>
@@ -5853,6 +4510,9 @@
     <w:pPr>
       <w:spacing w:after="0" w:line="240" w:lineRule="auto"/>
     </w:pPr>
+    <w:rPr>
+      <w:rFonts w:ascii="Calibri" w:hAnsi="Calibri" w:cs="Calibri" w:eastAsia="Calibri"/>
+    </w:rPr>
     <w:tblPr>
       <w:tblStyleRowBandSize w:val="1"/>
       <w:tblStyleColBandSize w:val="1"/>
@@ -5983,6 +4643,9 @@
     <w:pPr>
       <w:spacing w:after="0" w:line="240" w:lineRule="auto"/>
     </w:pPr>
+    <w:rPr>
+      <w:rFonts w:ascii="Calibri" w:hAnsi="Calibri" w:cs="Calibri" w:eastAsia="Calibri"/>
+    </w:rPr>
     <w:tblPr>
       <w:tblStyleRowBandSize w:val="1"/>
       <w:tblStyleColBandSize w:val="1"/>
@@ -6089,6 +4752,9 @@
     <w:pPr>
       <w:spacing w:after="0" w:line="240" w:lineRule="auto"/>
     </w:pPr>
+    <w:rPr>
+      <w:rFonts w:ascii="Calibri" w:hAnsi="Calibri" w:cs="Calibri" w:eastAsia="Calibri"/>
+    </w:rPr>
     <w:tblPr>
       <w:tblStyleRowBandSize w:val="1"/>
       <w:tblStyleColBandSize w:val="1"/>
@@ -6195,6 +4861,9 @@
     <w:pPr>
       <w:spacing w:after="0" w:line="240" w:lineRule="auto"/>
     </w:pPr>
+    <w:rPr>
+      <w:rFonts w:ascii="Calibri" w:hAnsi="Calibri" w:cs="Calibri" w:eastAsia="Calibri"/>
+    </w:rPr>
     <w:tblPr>
       <w:tblStyleRowBandSize w:val="1"/>
       <w:tblStyleColBandSize w:val="1"/>
@@ -6301,6 +4970,9 @@
     <w:pPr>
       <w:spacing w:after="0" w:line="240" w:lineRule="auto"/>
     </w:pPr>
+    <w:rPr>
+      <w:rFonts w:ascii="Calibri" w:hAnsi="Calibri" w:cs="Calibri" w:eastAsia="Calibri"/>
+    </w:rPr>
     <w:tblPr>
       <w:tblStyleRowBandSize w:val="1"/>
       <w:tblStyleColBandSize w:val="1"/>
@@ -6407,6 +5079,9 @@
     <w:pPr>
       <w:spacing w:after="0" w:line="240" w:lineRule="auto"/>
     </w:pPr>
+    <w:rPr>
+      <w:rFonts w:ascii="Calibri" w:hAnsi="Calibri" w:cs="Calibri" w:eastAsia="Calibri"/>
+    </w:rPr>
     <w:tblPr>
       <w:tblStyleRowBandSize w:val="1"/>
       <w:tblStyleColBandSize w:val="1"/>
@@ -6513,6 +5188,9 @@
     <w:pPr>
       <w:spacing w:after="0" w:line="240" w:lineRule="auto"/>
     </w:pPr>
+    <w:rPr>
+      <w:rFonts w:ascii="Calibri" w:hAnsi="Calibri" w:cs="Calibri" w:eastAsia="Calibri"/>
+    </w:rPr>
     <w:tblPr>
       <w:tblStyleRowBandSize w:val="1"/>
       <w:tblStyleColBandSize w:val="1"/>
@@ -6619,6 +5297,9 @@
     <w:pPr>
       <w:spacing w:after="0" w:line="240" w:lineRule="auto"/>
     </w:pPr>
+    <w:rPr>
+      <w:rFonts w:ascii="Calibri" w:hAnsi="Calibri" w:cs="Calibri" w:eastAsia="Calibri"/>
+    </w:rPr>
     <w:tblPr>
       <w:tblStyleRowBandSize w:val="1"/>
       <w:tblStyleColBandSize w:val="1"/>
@@ -6725,6 +5406,9 @@
     <w:pPr>
       <w:spacing w:after="0" w:line="240" w:lineRule="auto"/>
     </w:pPr>
+    <w:rPr>
+      <w:rFonts w:ascii="Calibri" w:hAnsi="Calibri" w:cs="Calibri" w:eastAsia="Calibri"/>
+    </w:rPr>
     <w:tblPr>
       <w:tblStyleRowBandSize w:val="1"/>
       <w:tblStyleColBandSize w:val="1"/>
@@ -6874,6 +5558,9 @@
     <w:pPr>
       <w:spacing w:after="0" w:line="240" w:lineRule="auto"/>
     </w:pPr>
+    <w:rPr>
+      <w:rFonts w:ascii="Calibri" w:hAnsi="Calibri" w:cs="Calibri" w:eastAsia="Calibri"/>
+    </w:rPr>
     <w:tblPr>
       <w:tblStyleRowBandSize w:val="1"/>
       <w:tblStyleColBandSize w:val="1"/>
@@ -7023,6 +5710,9 @@
     <w:pPr>
       <w:spacing w:after="0" w:line="240" w:lineRule="auto"/>
     </w:pPr>
+    <w:rPr>
+      <w:rFonts w:ascii="Calibri" w:hAnsi="Calibri" w:cs="Calibri" w:eastAsia="Calibri"/>
+    </w:rPr>
     <w:tblPr>
       <w:tblStyleRowBandSize w:val="1"/>
       <w:tblStyleColBandSize w:val="1"/>
@@ -7172,6 +5862,9 @@
     <w:pPr>
       <w:spacing w:after="0" w:line="240" w:lineRule="auto"/>
     </w:pPr>
+    <w:rPr>
+      <w:rFonts w:ascii="Calibri" w:hAnsi="Calibri" w:cs="Calibri" w:eastAsia="Calibri"/>
+    </w:rPr>
     <w:tblPr>
       <w:tblStyleRowBandSize w:val="1"/>
       <w:tblStyleColBandSize w:val="1"/>
@@ -7321,6 +6014,9 @@
     <w:pPr>
       <w:spacing w:after="0" w:line="240" w:lineRule="auto"/>
     </w:pPr>
+    <w:rPr>
+      <w:rFonts w:ascii="Calibri" w:hAnsi="Calibri" w:cs="Calibri" w:eastAsia="Calibri"/>
+    </w:rPr>
     <w:tblPr>
       <w:tblStyleRowBandSize w:val="1"/>
       <w:tblStyleColBandSize w:val="1"/>
@@ -7470,6 +6166,9 @@
     <w:pPr>
       <w:spacing w:after="0" w:line="240" w:lineRule="auto"/>
     </w:pPr>
+    <w:rPr>
+      <w:rFonts w:ascii="Calibri" w:hAnsi="Calibri" w:cs="Calibri" w:eastAsia="Calibri"/>
+    </w:rPr>
     <w:tblPr>
       <w:tblStyleRowBandSize w:val="1"/>
       <w:tblStyleColBandSize w:val="1"/>
@@ -7619,6 +6318,9 @@
     <w:pPr>
       <w:spacing w:after="0" w:line="240" w:lineRule="auto"/>
     </w:pPr>
+    <w:rPr>
+      <w:rFonts w:ascii="Calibri" w:hAnsi="Calibri" w:cs="Calibri" w:eastAsia="Calibri"/>
+    </w:rPr>
     <w:tblPr>
       <w:tblStyleRowBandSize w:val="1"/>
       <w:tblStyleColBandSize w:val="1"/>
@@ -7769,6 +6471,7 @@
       <w:spacing w:after="0" w:line="240" w:lineRule="auto"/>
     </w:pPr>
     <w:rPr>
+      <w:rFonts w:ascii="Calibri" w:hAnsi="Calibri" w:cs="Calibri" w:eastAsia="Calibri"/>
       <w:color w:val="000000" w:themeColor="text1"/>
     </w:rPr>
     <w:tblPr>
@@ -7853,6 +6556,7 @@
       <w:spacing w:after="0" w:line="240" w:lineRule="auto"/>
     </w:pPr>
     <w:rPr>
+      <w:rFonts w:ascii="Calibri" w:hAnsi="Calibri" w:cs="Calibri" w:eastAsia="Calibri"/>
       <w:color w:val="000000" w:themeColor="text1"/>
     </w:rPr>
     <w:tblPr>
@@ -7937,6 +6641,7 @@
       <w:spacing w:after="0" w:line="240" w:lineRule="auto"/>
     </w:pPr>
     <w:rPr>
+      <w:rFonts w:ascii="Calibri" w:hAnsi="Calibri" w:cs="Calibri" w:eastAsia="Calibri"/>
       <w:color w:val="000000" w:themeColor="text1"/>
     </w:rPr>
     <w:tblPr>
@@ -8021,6 +6726,7 @@
       <w:spacing w:after="0" w:line="240" w:lineRule="auto"/>
     </w:pPr>
     <w:rPr>
+      <w:rFonts w:ascii="Calibri" w:hAnsi="Calibri" w:cs="Calibri" w:eastAsia="Calibri"/>
       <w:color w:val="000000" w:themeColor="text1"/>
     </w:rPr>
     <w:tblPr>
@@ -8105,6 +6811,7 @@
       <w:spacing w:after="0" w:line="240" w:lineRule="auto"/>
     </w:pPr>
     <w:rPr>
+      <w:rFonts w:ascii="Calibri" w:hAnsi="Calibri" w:cs="Calibri" w:eastAsia="Calibri"/>
       <w:color w:val="000000" w:themeColor="text1"/>
     </w:rPr>
     <w:tblPr>
@@ -8189,6 +6896,7 @@
       <w:spacing w:after="0" w:line="240" w:lineRule="auto"/>
     </w:pPr>
     <w:rPr>
+      <w:rFonts w:ascii="Calibri" w:hAnsi="Calibri" w:cs="Calibri" w:eastAsia="Calibri"/>
       <w:color w:val="000000" w:themeColor="text1"/>
     </w:rPr>
     <w:tblPr>
@@ -8273,6 +6981,7 @@
       <w:spacing w:after="0" w:line="240" w:lineRule="auto"/>
     </w:pPr>
     <w:rPr>
+      <w:rFonts w:ascii="Calibri" w:hAnsi="Calibri" w:cs="Calibri" w:eastAsia="Calibri"/>
       <w:color w:val="000000" w:themeColor="text1"/>
     </w:rPr>
     <w:tblPr>
@@ -8357,7 +7066,7 @@
       <w:spacing w:after="0" w:line="240" w:lineRule="auto"/>
     </w:pPr>
     <w:rPr>
-      <w:rFonts w:asciiTheme="majorHAnsi" w:eastAsiaTheme="majorEastAsia" w:hAnsiTheme="majorHAnsi" w:cstheme="majorBidi"/>
+      <w:rFonts w:asciiTheme="majorHAnsi" w:eastAsiaTheme="majorEastAsia" w:hAnsiTheme="majorHAnsi" w:cstheme="majorBidi" w:ascii="Calibri" w:hAnsi="Calibri" w:cs="Calibri" w:eastAsia="Calibri"/>
       <w:color w:val="000000" w:themeColor="text1"/>
     </w:rPr>
     <w:tblPr>
@@ -8485,7 +7194,7 @@
       <w:spacing w:after="0" w:line="240" w:lineRule="auto"/>
     </w:pPr>
     <w:rPr>
-      <w:rFonts w:asciiTheme="majorHAnsi" w:eastAsiaTheme="majorEastAsia" w:hAnsiTheme="majorHAnsi" w:cstheme="majorBidi"/>
+      <w:rFonts w:asciiTheme="majorHAnsi" w:eastAsiaTheme="majorEastAsia" w:hAnsiTheme="majorHAnsi" w:cstheme="majorBidi" w:ascii="Calibri" w:hAnsi="Calibri" w:cs="Calibri" w:eastAsia="Calibri"/>
       <w:color w:val="000000" w:themeColor="text1"/>
     </w:rPr>
     <w:tblPr>
@@ -8613,7 +7322,7 @@
       <w:spacing w:after="0" w:line="240" w:lineRule="auto"/>
     </w:pPr>
     <w:rPr>
-      <w:rFonts w:asciiTheme="majorHAnsi" w:eastAsiaTheme="majorEastAsia" w:hAnsiTheme="majorHAnsi" w:cstheme="majorBidi"/>
+      <w:rFonts w:asciiTheme="majorHAnsi" w:eastAsiaTheme="majorEastAsia" w:hAnsiTheme="majorHAnsi" w:cstheme="majorBidi" w:ascii="Calibri" w:hAnsi="Calibri" w:cs="Calibri" w:eastAsia="Calibri"/>
       <w:color w:val="000000" w:themeColor="text1"/>
     </w:rPr>
     <w:tblPr>
@@ -8741,7 +7450,7 @@
       <w:spacing w:after="0" w:line="240" w:lineRule="auto"/>
     </w:pPr>
     <w:rPr>
-      <w:rFonts w:asciiTheme="majorHAnsi" w:eastAsiaTheme="majorEastAsia" w:hAnsiTheme="majorHAnsi" w:cstheme="majorBidi"/>
+      <w:rFonts w:asciiTheme="majorHAnsi" w:eastAsiaTheme="majorEastAsia" w:hAnsiTheme="majorHAnsi" w:cstheme="majorBidi" w:ascii="Calibri" w:hAnsi="Calibri" w:cs="Calibri" w:eastAsia="Calibri"/>
       <w:color w:val="000000" w:themeColor="text1"/>
     </w:rPr>
     <w:tblPr>
@@ -8869,7 +7578,7 @@
       <w:spacing w:after="0" w:line="240" w:lineRule="auto"/>
     </w:pPr>
     <w:rPr>
-      <w:rFonts w:asciiTheme="majorHAnsi" w:eastAsiaTheme="majorEastAsia" w:hAnsiTheme="majorHAnsi" w:cstheme="majorBidi"/>
+      <w:rFonts w:asciiTheme="majorHAnsi" w:eastAsiaTheme="majorEastAsia" w:hAnsiTheme="majorHAnsi" w:cstheme="majorBidi" w:ascii="Calibri" w:hAnsi="Calibri" w:cs="Calibri" w:eastAsia="Calibri"/>
       <w:color w:val="000000" w:themeColor="text1"/>
     </w:rPr>
     <w:tblPr>
@@ -8997,7 +7706,7 @@
       <w:spacing w:after="0" w:line="240" w:lineRule="auto"/>
     </w:pPr>
     <w:rPr>
-      <w:rFonts w:asciiTheme="majorHAnsi" w:eastAsiaTheme="majorEastAsia" w:hAnsiTheme="majorHAnsi" w:cstheme="majorBidi"/>
+      <w:rFonts w:asciiTheme="majorHAnsi" w:eastAsiaTheme="majorEastAsia" w:hAnsiTheme="majorHAnsi" w:cstheme="majorBidi" w:ascii="Calibri" w:hAnsi="Calibri" w:cs="Calibri" w:eastAsia="Calibri"/>
       <w:color w:val="000000" w:themeColor="text1"/>
     </w:rPr>
     <w:tblPr>
@@ -9125,7 +7834,7 @@
       <w:spacing w:after="0" w:line="240" w:lineRule="auto"/>
     </w:pPr>
     <w:rPr>
-      <w:rFonts w:asciiTheme="majorHAnsi" w:eastAsiaTheme="majorEastAsia" w:hAnsiTheme="majorHAnsi" w:cstheme="majorBidi"/>
+      <w:rFonts w:asciiTheme="majorHAnsi" w:eastAsiaTheme="majorEastAsia" w:hAnsiTheme="majorHAnsi" w:cstheme="majorBidi" w:ascii="Calibri" w:hAnsi="Calibri" w:cs="Calibri" w:eastAsia="Calibri"/>
       <w:color w:val="000000" w:themeColor="text1"/>
     </w:rPr>
     <w:tblPr>
@@ -9252,6 +7961,9 @@
     <w:pPr>
       <w:spacing w:after="0" w:line="240" w:lineRule="auto"/>
     </w:pPr>
+    <w:rPr>
+      <w:rFonts w:ascii="Calibri" w:hAnsi="Calibri" w:cs="Calibri" w:eastAsia="Calibri"/>
+    </w:rPr>
     <w:tblPr>
       <w:tblStyleRowBandSize w:val="1"/>
       <w:tblStyleColBandSize w:val="1"/>
@@ -9325,6 +8037,9 @@
     <w:pPr>
       <w:spacing w:after="0" w:line="240" w:lineRule="auto"/>
     </w:pPr>
+    <w:rPr>
+      <w:rFonts w:ascii="Calibri" w:hAnsi="Calibri" w:cs="Calibri" w:eastAsia="Calibri"/>
+    </w:rPr>
     <w:tblPr>
       <w:tblStyleRowBandSize w:val="1"/>
       <w:tblStyleColBandSize w:val="1"/>
@@ -9398,6 +8113,9 @@
     <w:pPr>
       <w:spacing w:after="0" w:line="240" w:lineRule="auto"/>
     </w:pPr>
+    <w:rPr>
+      <w:rFonts w:ascii="Calibri" w:hAnsi="Calibri" w:cs="Calibri" w:eastAsia="Calibri"/>
+    </w:rPr>
     <w:tblPr>
       <w:tblStyleRowBandSize w:val="1"/>
       <w:tblStyleColBandSize w:val="1"/>
@@ -9471,6 +8189,9 @@
     <w:pPr>
       <w:spacing w:after="0" w:line="240" w:lineRule="auto"/>
     </w:pPr>
+    <w:rPr>
+      <w:rFonts w:ascii="Calibri" w:hAnsi="Calibri" w:cs="Calibri" w:eastAsia="Calibri"/>
+    </w:rPr>
     <w:tblPr>
       <w:tblStyleRowBandSize w:val="1"/>
       <w:tblStyleColBandSize w:val="1"/>
@@ -9544,6 +8265,9 @@
     <w:pPr>
       <w:spacing w:after="0" w:line="240" w:lineRule="auto"/>
     </w:pPr>
+    <w:rPr>
+      <w:rFonts w:ascii="Calibri" w:hAnsi="Calibri" w:cs="Calibri" w:eastAsia="Calibri"/>
+    </w:rPr>
     <w:tblPr>
       <w:tblStyleRowBandSize w:val="1"/>
       <w:tblStyleColBandSize w:val="1"/>
@@ -9617,6 +8341,9 @@
     <w:pPr>
       <w:spacing w:after="0" w:line="240" w:lineRule="auto"/>
     </w:pPr>
+    <w:rPr>
+      <w:rFonts w:ascii="Calibri" w:hAnsi="Calibri" w:cs="Calibri" w:eastAsia="Calibri"/>
+    </w:rPr>
     <w:tblPr>
       <w:tblStyleRowBandSize w:val="1"/>
       <w:tblStyleColBandSize w:val="1"/>
@@ -9690,6 +8417,9 @@
     <w:pPr>
       <w:spacing w:after="0" w:line="240" w:lineRule="auto"/>
     </w:pPr>
+    <w:rPr>
+      <w:rFonts w:ascii="Calibri" w:hAnsi="Calibri" w:cs="Calibri" w:eastAsia="Calibri"/>
+    </w:rPr>
     <w:tblPr>
       <w:tblStyleRowBandSize w:val="1"/>
       <w:tblStyleColBandSize w:val="1"/>
@@ -9764,7 +8494,7 @@
       <w:spacing w:after="0" w:line="240" w:lineRule="auto"/>
     </w:pPr>
     <w:rPr>
-      <w:rFonts w:asciiTheme="majorHAnsi" w:eastAsiaTheme="majorEastAsia" w:hAnsiTheme="majorHAnsi" w:cstheme="majorBidi"/>
+      <w:rFonts w:asciiTheme="majorHAnsi" w:eastAsiaTheme="majorEastAsia" w:hAnsiTheme="majorHAnsi" w:cstheme="majorBidi" w:ascii="Calibri" w:hAnsi="Calibri" w:cs="Calibri" w:eastAsia="Calibri"/>
       <w:color w:val="000000" w:themeColor="text1"/>
     </w:rPr>
     <w:tblPr>
@@ -9889,7 +8619,7 @@
       <w:spacing w:after="0" w:line="240" w:lineRule="auto"/>
     </w:pPr>
     <w:rPr>
-      <w:rFonts w:asciiTheme="majorHAnsi" w:eastAsiaTheme="majorEastAsia" w:hAnsiTheme="majorHAnsi" w:cstheme="majorBidi"/>
+      <w:rFonts w:asciiTheme="majorHAnsi" w:eastAsiaTheme="majorEastAsia" w:hAnsiTheme="majorHAnsi" w:cstheme="majorBidi" w:ascii="Calibri" w:hAnsi="Calibri" w:cs="Calibri" w:eastAsia="Calibri"/>
       <w:color w:val="000000" w:themeColor="text1"/>
     </w:rPr>
     <w:tblPr>
@@ -10014,7 +8744,7 @@
       <w:spacing w:after="0" w:line="240" w:lineRule="auto"/>
     </w:pPr>
     <w:rPr>
-      <w:rFonts w:asciiTheme="majorHAnsi" w:eastAsiaTheme="majorEastAsia" w:hAnsiTheme="majorHAnsi" w:cstheme="majorBidi"/>
+      <w:rFonts w:asciiTheme="majorHAnsi" w:eastAsiaTheme="majorEastAsia" w:hAnsiTheme="majorHAnsi" w:cstheme="majorBidi" w:ascii="Calibri" w:hAnsi="Calibri" w:cs="Calibri" w:eastAsia="Calibri"/>
       <w:color w:val="000000" w:themeColor="text1"/>
     </w:rPr>
     <w:tblPr>
@@ -10139,7 +8869,7 @@
       <w:spacing w:after="0" w:line="240" w:lineRule="auto"/>
     </w:pPr>
     <w:rPr>
-      <w:rFonts w:asciiTheme="majorHAnsi" w:eastAsiaTheme="majorEastAsia" w:hAnsiTheme="majorHAnsi" w:cstheme="majorBidi"/>
+      <w:rFonts w:asciiTheme="majorHAnsi" w:eastAsiaTheme="majorEastAsia" w:hAnsiTheme="majorHAnsi" w:cstheme="majorBidi" w:ascii="Calibri" w:hAnsi="Calibri" w:cs="Calibri" w:eastAsia="Calibri"/>
       <w:color w:val="000000" w:themeColor="text1"/>
     </w:rPr>
     <w:tblPr>
@@ -10264,7 +8994,7 @@
       <w:spacing w:after="0" w:line="240" w:lineRule="auto"/>
     </w:pPr>
     <w:rPr>
-      <w:rFonts w:asciiTheme="majorHAnsi" w:eastAsiaTheme="majorEastAsia" w:hAnsiTheme="majorHAnsi" w:cstheme="majorBidi"/>
+      <w:rFonts w:asciiTheme="majorHAnsi" w:eastAsiaTheme="majorEastAsia" w:hAnsiTheme="majorHAnsi" w:cstheme="majorBidi" w:ascii="Calibri" w:hAnsi="Calibri" w:cs="Calibri" w:eastAsia="Calibri"/>
       <w:color w:val="000000" w:themeColor="text1"/>
     </w:rPr>
     <w:tblPr>
@@ -10389,7 +9119,7 @@
       <w:spacing w:after="0" w:line="240" w:lineRule="auto"/>
     </w:pPr>
     <w:rPr>
-      <w:rFonts w:asciiTheme="majorHAnsi" w:eastAsiaTheme="majorEastAsia" w:hAnsiTheme="majorHAnsi" w:cstheme="majorBidi"/>
+      <w:rFonts w:asciiTheme="majorHAnsi" w:eastAsiaTheme="majorEastAsia" w:hAnsiTheme="majorHAnsi" w:cstheme="majorBidi" w:ascii="Calibri" w:hAnsi="Calibri" w:cs="Calibri" w:eastAsia="Calibri"/>
       <w:color w:val="000000" w:themeColor="text1"/>
     </w:rPr>
     <w:tblPr>
@@ -10514,7 +9244,7 @@
       <w:spacing w:after="0" w:line="240" w:lineRule="auto"/>
     </w:pPr>
     <w:rPr>
-      <w:rFonts w:asciiTheme="majorHAnsi" w:eastAsiaTheme="majorEastAsia" w:hAnsiTheme="majorHAnsi" w:cstheme="majorBidi"/>
+      <w:rFonts w:asciiTheme="majorHAnsi" w:eastAsiaTheme="majorEastAsia" w:hAnsiTheme="majorHAnsi" w:cstheme="majorBidi" w:ascii="Calibri" w:hAnsi="Calibri" w:cs="Calibri" w:eastAsia="Calibri"/>
       <w:color w:val="000000" w:themeColor="text1"/>
     </w:rPr>
     <w:tblPr>
@@ -10638,6 +9368,9 @@
     <w:pPr>
       <w:spacing w:after="0" w:line="240" w:lineRule="auto"/>
     </w:pPr>
+    <w:rPr>
+      <w:rFonts w:ascii="Calibri" w:hAnsi="Calibri" w:cs="Calibri" w:eastAsia="Calibri"/>
+    </w:rPr>
     <w:tblPr>
       <w:tblStyleRowBandSize w:val="1"/>
       <w:tblStyleColBandSize w:val="1"/>
@@ -10779,6 +9512,9 @@
     <w:pPr>
       <w:spacing w:after="0" w:line="240" w:lineRule="auto"/>
     </w:pPr>
+    <w:rPr>
+      <w:rFonts w:ascii="Calibri" w:hAnsi="Calibri" w:cs="Calibri" w:eastAsia="Calibri"/>
+    </w:rPr>
     <w:tblPr>
       <w:tblStyleRowBandSize w:val="1"/>
       <w:tblStyleColBandSize w:val="1"/>
@@ -10920,6 +9656,9 @@
     <w:pPr>
       <w:spacing w:after="0" w:line="240" w:lineRule="auto"/>
     </w:pPr>
+    <w:rPr>
+      <w:rFonts w:ascii="Calibri" w:hAnsi="Calibri" w:cs="Calibri" w:eastAsia="Calibri"/>
+    </w:rPr>
     <w:tblPr>
       <w:tblStyleRowBandSize w:val="1"/>
       <w:tblStyleColBandSize w:val="1"/>
@@ -11061,6 +9800,9 @@
     <w:pPr>
       <w:spacing w:after="0" w:line="240" w:lineRule="auto"/>
     </w:pPr>
+    <w:rPr>
+      <w:rFonts w:ascii="Calibri" w:hAnsi="Calibri" w:cs="Calibri" w:eastAsia="Calibri"/>
+    </w:rPr>
     <w:tblPr>
       <w:tblStyleRowBandSize w:val="1"/>
       <w:tblStyleColBandSize w:val="1"/>
@@ -11202,6 +9944,9 @@
     <w:pPr>
       <w:spacing w:after="0" w:line="240" w:lineRule="auto"/>
     </w:pPr>
+    <w:rPr>
+      <w:rFonts w:ascii="Calibri" w:hAnsi="Calibri" w:cs="Calibri" w:eastAsia="Calibri"/>
+    </w:rPr>
     <w:tblPr>
       <w:tblStyleRowBandSize w:val="1"/>
       <w:tblStyleColBandSize w:val="1"/>
@@ -11343,6 +10088,9 @@
     <w:pPr>
       <w:spacing w:after="0" w:line="240" w:lineRule="auto"/>
     </w:pPr>
+    <w:rPr>
+      <w:rFonts w:ascii="Calibri" w:hAnsi="Calibri" w:cs="Calibri" w:eastAsia="Calibri"/>
+    </w:rPr>
     <w:tblPr>
       <w:tblStyleRowBandSize w:val="1"/>
       <w:tblStyleColBandSize w:val="1"/>
@@ -11484,6 +10232,9 @@
     <w:pPr>
       <w:spacing w:after="0" w:line="240" w:lineRule="auto"/>
     </w:pPr>
+    <w:rPr>
+      <w:rFonts w:ascii="Calibri" w:hAnsi="Calibri" w:cs="Calibri" w:eastAsia="Calibri"/>
+    </w:rPr>
     <w:tblPr>
       <w:tblStyleRowBandSize w:val="1"/>
       <w:tblStyleColBandSize w:val="1"/>
@@ -11626,6 +10377,7 @@
       <w:spacing w:after="0" w:line="240" w:lineRule="auto"/>
     </w:pPr>
     <w:rPr>
+      <w:rFonts w:ascii="Calibri" w:hAnsi="Calibri" w:cs="Calibri" w:eastAsia="Calibri"/>
       <w:color w:val="FFFFFF" w:themeColor="background1"/>
     </w:rPr>
     <w:tblPr>
@@ -11740,6 +10492,7 @@
       <w:spacing w:after="0" w:line="240" w:lineRule="auto"/>
     </w:pPr>
     <w:rPr>
+      <w:rFonts w:ascii="Calibri" w:hAnsi="Calibri" w:cs="Calibri" w:eastAsia="Calibri"/>
       <w:color w:val="FFFFFF" w:themeColor="background1"/>
     </w:rPr>
     <w:tblPr>
@@ -11854,6 +10607,7 @@
       <w:spacing w:after="0" w:line="240" w:lineRule="auto"/>
     </w:pPr>
     <w:rPr>
+      <w:rFonts w:ascii="Calibri" w:hAnsi="Calibri" w:cs="Calibri" w:eastAsia="Calibri"/>
       <w:color w:val="FFFFFF" w:themeColor="background1"/>
     </w:rPr>
     <w:tblPr>
@@ -11968,6 +10722,7 @@
       <w:spacing w:after="0" w:line="240" w:lineRule="auto"/>
     </w:pPr>
     <w:rPr>
+      <w:rFonts w:ascii="Calibri" w:hAnsi="Calibri" w:cs="Calibri" w:eastAsia="Calibri"/>
       <w:color w:val="FFFFFF" w:themeColor="background1"/>
     </w:rPr>
     <w:tblPr>
@@ -12082,6 +10837,7 @@
       <w:spacing w:after="0" w:line="240" w:lineRule="auto"/>
     </w:pPr>
     <w:rPr>
+      <w:rFonts w:ascii="Calibri" w:hAnsi="Calibri" w:cs="Calibri" w:eastAsia="Calibri"/>
       <w:color w:val="FFFFFF" w:themeColor="background1"/>
     </w:rPr>
     <w:tblPr>
@@ -12196,6 +10952,7 @@
       <w:spacing w:after="0" w:line="240" w:lineRule="auto"/>
     </w:pPr>
     <w:rPr>
+      <w:rFonts w:ascii="Calibri" w:hAnsi="Calibri" w:cs="Calibri" w:eastAsia="Calibri"/>
       <w:color w:val="FFFFFF" w:themeColor="background1"/>
     </w:rPr>
     <w:tblPr>
@@ -12310,6 +11067,7 @@
       <w:spacing w:after="0" w:line="240" w:lineRule="auto"/>
     </w:pPr>
     <w:rPr>
+      <w:rFonts w:ascii="Calibri" w:hAnsi="Calibri" w:cs="Calibri" w:eastAsia="Calibri"/>
       <w:color w:val="FFFFFF" w:themeColor="background1"/>
     </w:rPr>
     <w:tblPr>
@@ -12424,6 +11182,7 @@
       <w:spacing w:after="0" w:line="240" w:lineRule="auto"/>
     </w:pPr>
     <w:rPr>
+      <w:rFonts w:ascii="Calibri" w:hAnsi="Calibri" w:cs="Calibri" w:eastAsia="Calibri"/>
       <w:color w:val="000000" w:themeColor="text1"/>
     </w:rPr>
     <w:tblPr>
@@ -12546,6 +11305,7 @@
       <w:spacing w:after="0" w:line="240" w:lineRule="auto"/>
     </w:pPr>
     <w:rPr>
+      <w:rFonts w:ascii="Calibri" w:hAnsi="Calibri" w:cs="Calibri" w:eastAsia="Calibri"/>
       <w:color w:val="000000" w:themeColor="text1"/>
     </w:rPr>
     <w:tblPr>
@@ -12668,6 +11428,7 @@
       <w:spacing w:after="0" w:line="240" w:lineRule="auto"/>
     </w:pPr>
     <w:rPr>
+      <w:rFonts w:ascii="Calibri" w:hAnsi="Calibri" w:cs="Calibri" w:eastAsia="Calibri"/>
       <w:color w:val="000000" w:themeColor="text1"/>
     </w:rPr>
     <w:tblPr>
@@ -12790,6 +11551,7 @@
       <w:spacing w:after="0" w:line="240" w:lineRule="auto"/>
     </w:pPr>
     <w:rPr>
+      <w:rFonts w:ascii="Calibri" w:hAnsi="Calibri" w:cs="Calibri" w:eastAsia="Calibri"/>
       <w:color w:val="000000" w:themeColor="text1"/>
     </w:rPr>
     <w:tblPr>
@@ -12902,6 +11664,7 @@
       <w:spacing w:after="0" w:line="240" w:lineRule="auto"/>
     </w:pPr>
     <w:rPr>
+      <w:rFonts w:ascii="Calibri" w:hAnsi="Calibri" w:cs="Calibri" w:eastAsia="Calibri"/>
       <w:color w:val="000000" w:themeColor="text1"/>
     </w:rPr>
     <w:tblPr>
@@ -13024,6 +11787,7 @@
       <w:spacing w:after="0" w:line="240" w:lineRule="auto"/>
     </w:pPr>
     <w:rPr>
+      <w:rFonts w:ascii="Calibri" w:hAnsi="Calibri" w:cs="Calibri" w:eastAsia="Calibri"/>
       <w:color w:val="000000" w:themeColor="text1"/>
     </w:rPr>
     <w:tblPr>
@@ -13146,6 +11910,7 @@
       <w:spacing w:after="0" w:line="240" w:lineRule="auto"/>
     </w:pPr>
     <w:rPr>
+      <w:rFonts w:ascii="Calibri" w:hAnsi="Calibri" w:cs="Calibri" w:eastAsia="Calibri"/>
       <w:color w:val="000000" w:themeColor="text1"/>
     </w:rPr>
     <w:tblPr>
@@ -13268,6 +12033,7 @@
       <w:spacing w:after="0" w:line="240" w:lineRule="auto"/>
     </w:pPr>
     <w:rPr>
+      <w:rFonts w:ascii="Calibri" w:hAnsi="Calibri" w:cs="Calibri" w:eastAsia="Calibri"/>
       <w:color w:val="000000" w:themeColor="text1"/>
     </w:rPr>
     <w:tblPr>
@@ -13354,6 +12120,7 @@
       <w:spacing w:after="0" w:line="240" w:lineRule="auto"/>
     </w:pPr>
     <w:rPr>
+      <w:rFonts w:ascii="Calibri" w:hAnsi="Calibri" w:cs="Calibri" w:eastAsia="Calibri"/>
       <w:color w:val="000000" w:themeColor="text1"/>
     </w:rPr>
     <w:tblPr>
@@ -13440,6 +12207,7 @@
       <w:spacing w:after="0" w:line="240" w:lineRule="auto"/>
     </w:pPr>
     <w:rPr>
+      <w:rFonts w:ascii="Calibri" w:hAnsi="Calibri" w:cs="Calibri" w:eastAsia="Calibri"/>
       <w:color w:val="000000" w:themeColor="text1"/>
     </w:rPr>
     <w:tblPr>
@@ -13526,6 +12294,7 @@
       <w:spacing w:after="0" w:line="240" w:lineRule="auto"/>
     </w:pPr>
     <w:rPr>
+      <w:rFonts w:ascii="Calibri" w:hAnsi="Calibri" w:cs="Calibri" w:eastAsia="Calibri"/>
       <w:color w:val="000000" w:themeColor="text1"/>
     </w:rPr>
     <w:tblPr>
@@ -13612,6 +12381,7 @@
       <w:spacing w:after="0" w:line="240" w:lineRule="auto"/>
     </w:pPr>
     <w:rPr>
+      <w:rFonts w:ascii="Calibri" w:hAnsi="Calibri" w:cs="Calibri" w:eastAsia="Calibri"/>
       <w:color w:val="000000" w:themeColor="text1"/>
     </w:rPr>
     <w:tblPr>
@@ -13698,6 +12468,7 @@
       <w:spacing w:after="0" w:line="240" w:lineRule="auto"/>
     </w:pPr>
     <w:rPr>
+      <w:rFonts w:ascii="Calibri" w:hAnsi="Calibri" w:cs="Calibri" w:eastAsia="Calibri"/>
       <w:color w:val="000000" w:themeColor="text1"/>
     </w:rPr>
     <w:tblPr>
@@ -13784,6 +12555,7 @@
       <w:spacing w:after="0" w:line="240" w:lineRule="auto"/>
     </w:pPr>
     <w:rPr>
+      <w:rFonts w:ascii="Calibri" w:hAnsi="Calibri" w:cs="Calibri" w:eastAsia="Calibri"/>
       <w:color w:val="000000" w:themeColor="text1"/>
     </w:rPr>
     <w:tblPr>
@@ -13870,6 +12642,7 @@
       <w:spacing w:after="0" w:line="240" w:lineRule="auto"/>
     </w:pPr>
     <w:rPr>
+      <w:rFonts w:ascii="Calibri" w:hAnsi="Calibri" w:cs="Calibri" w:eastAsia="Calibri"/>
       <w:color w:val="000000" w:themeColor="text1"/>
     </w:rPr>
     <w:tblPr>
@@ -13950,6 +12723,7 @@
       <w:spacing w:after="0" w:line="240" w:lineRule="auto"/>
     </w:pPr>
     <w:rPr>
+      <w:rFonts w:ascii="Calibri" w:hAnsi="Calibri" w:cs="Calibri" w:eastAsia="Calibri"/>
       <w:color w:val="000000" w:themeColor="text1"/>
     </w:rPr>
     <w:tblPr>
@@ -14030,6 +12804,7 @@
       <w:spacing w:after="0" w:line="240" w:lineRule="auto"/>
     </w:pPr>
     <w:rPr>
+      <w:rFonts w:ascii="Calibri" w:hAnsi="Calibri" w:cs="Calibri" w:eastAsia="Calibri"/>
       <w:color w:val="000000" w:themeColor="text1"/>
     </w:rPr>
     <w:tblPr>
@@ -14110,6 +12885,7 @@
       <w:spacing w:after="0" w:line="240" w:lineRule="auto"/>
     </w:pPr>
     <w:rPr>
+      <w:rFonts w:ascii="Calibri" w:hAnsi="Calibri" w:cs="Calibri" w:eastAsia="Calibri"/>
       <w:color w:val="000000" w:themeColor="text1"/>
     </w:rPr>
     <w:tblPr>
@@ -14190,6 +12966,7 @@
       <w:spacing w:after="0" w:line="240" w:lineRule="auto"/>
     </w:pPr>
     <w:rPr>
+      <w:rFonts w:ascii="Calibri" w:hAnsi="Calibri" w:cs="Calibri" w:eastAsia="Calibri"/>
       <w:color w:val="000000" w:themeColor="text1"/>
     </w:rPr>
     <w:tblPr>
@@ -14270,6 +13047,7 @@
       <w:spacing w:after="0" w:line="240" w:lineRule="auto"/>
     </w:pPr>
     <w:rPr>
+      <w:rFonts w:ascii="Calibri" w:hAnsi="Calibri" w:cs="Calibri" w:eastAsia="Calibri"/>
       <w:color w:val="000000" w:themeColor="text1"/>
     </w:rPr>
     <w:tblPr>
@@ -14350,6 +13128,7 @@
       <w:spacing w:after="0" w:line="240" w:lineRule="auto"/>
     </w:pPr>
     <w:rPr>
+      <w:rFonts w:ascii="Calibri" w:hAnsi="Calibri" w:cs="Calibri" w:eastAsia="Calibri"/>
       <w:color w:val="000000" w:themeColor="text1"/>
     </w:rPr>
     <w:tblPr>

</xml_diff>

<commit_message>
Add live demo site, group report, and remove unused figma files (#7)
* Add live demo site, group report, and remove unused figma files

Co-authored-by: keinithaxinamalai-art <keinithaxinamalai-art@users.noreply.github.com>

* fix: allow the demo server to load from a public preview URL

Vite was blocking non-localhost hosts so the presentation site failed to open.

Co-authored-by: keinithaxinamalai-art <keinithaxinamalai-art@users.noreply.github.com>

* fix: keep the demo server on port 5173 so it does not jump to another port

Co-authored-by: keinithaxinamalai-art <keinithaxinamalai-art@users.noreply.github.com>

---------

Co-authored-by: keinithaxinamalai-art <keinithaxinamalai-art@users.noreply.github.com>
</commit_message>
<xml_diff>
--- a/Project.docx
+++ b/Project.docx
@@ -4,2361 +4,880 @@
   <w:body>
     <w:p>
       <w:pPr>
-        <w:pStyle w:val="Heading1"/>
+        <w:spacing w:after="240" w:before="0" w:line="276" w:lineRule="auto"/>
+        <w:jc w:val="center"/>
       </w:pPr>
       <w:r>
-        <w:t>ICT308 Iteration 1 Technical Report</w:t>
-      </w:r>
-    </w:p>
-    <w:p>
-      <w:r>
         <w:rPr>
-          <w:rFonts w:ascii="Calibri" w:hAnsi="Calibri"/>
+          <w:rFonts w:ascii="Calibri" w:hAnsi="Calibri" w:cs="Calibri" w:eastAsia="Calibri"/>
           <w:b/>
-          <w:sz w:val="24"/>
+          <w:i w:val="0"/>
+          <w:sz w:val="32"/>
         </w:rPr>
-        <w:t>Canberra SmartWaste — Smart Waste Management System for Canberra</w:t>
-      </w:r>
-    </w:p>
-    <w:p>
-      <w:r>
-        <w:rPr>
-          <w:rFonts w:ascii="Calibri" w:hAnsi="Calibri"/>
-          <w:sz w:val="24"/>
-        </w:rPr>
-        <w:t>ICT308 – Project 2 (BIT Capstone) · Semester 2, 2026</w:t>
-      </w:r>
-    </w:p>
-    <w:p>
-      <w:r>
-        <w:rPr>
-          <w:rFonts w:ascii="Calibri" w:hAnsi="Calibri"/>
-          <w:sz w:val="24"/>
-        </w:rPr>
-        <w:t>Group prototype · Week 6 submission</w:t>
-      </w:r>
-    </w:p>
-    <w:p>
-      <w:r>
-        <w:rPr>
-          <w:rFonts w:ascii="Calibri" w:hAnsi="Calibri"/>
-          <w:b/>
-          <w:sz w:val="24"/>
-        </w:rPr>
-        <w:t>GitHub:</w:t>
-      </w:r>
-      <w:r>
-        <w:rPr>
-          <w:rFonts w:ascii="Calibri" w:hAnsi="Calibri"/>
-          <w:sz w:val="24"/>
-        </w:rPr>
-        <w:t xml:space="preserve"> https://github.com/keinithaxinamalai-art/Smart-waste-management-system</w:t>
-      </w:r>
-    </w:p>
-    <w:p>
-      <w:r>
-        <w:rPr>
-          <w:rFonts w:ascii="Calibri" w:hAnsi="Calibri"/>
-          <w:b/>
-          <w:sz w:val="24"/>
-        </w:rPr>
-        <w:t>Jira:</w:t>
-      </w:r>
-      <w:r>
-        <w:rPr>
-          <w:rFonts w:ascii="Calibri" w:hAnsi="Calibri"/>
-          <w:sz w:val="24"/>
-        </w:rPr>
-        <w:t xml:space="preserve"> (group Jira project link — attach in the Moodle cover sheet)</w:t>
+        <w:t>Canberra SmartWaste: A Smart Waste Management System for Canberra</w:t>
       </w:r>
     </w:p>
     <w:p>
       <w:pPr>
-        <w:pStyle w:val="Heading2"/>
+        <w:spacing w:after="80" w:before="0" w:line="276" w:lineRule="auto"/>
       </w:pPr>
       <w:r>
+        <w:rPr>
+          <w:rFonts w:ascii="Calibri" w:hAnsi="Calibri" w:cs="Calibri" w:eastAsia="Calibri"/>
+          <w:b/>
+          <w:i w:val="0"/>
+          <w:sz w:val="24"/>
+        </w:rPr>
+        <w:t xml:space="preserve">Group Members: </w:t>
+      </w:r>
+      <w:r>
+        <w:rPr>
+          <w:rFonts w:ascii="Calibri" w:hAnsi="Calibri" w:cs="Calibri" w:eastAsia="Calibri"/>
+          <w:b w:val="0"/>
+          <w:i w:val="0"/>
+          <w:sz w:val="24"/>
+        </w:rPr>
+        <w:t>Bijay Pokhrel, Samir Bhandari, Krishna Trivedi, Ayush Ale, Charanpal Kaur</w:t>
+      </w:r>
+    </w:p>
+    <w:p>
+      <w:pPr>
+        <w:spacing w:after="80" w:before="0" w:line="276" w:lineRule="auto"/>
+      </w:pPr>
+      <w:r>
+        <w:rPr>
+          <w:rFonts w:ascii="Calibri" w:hAnsi="Calibri" w:cs="Calibri" w:eastAsia="Calibri"/>
+          <w:b/>
+          <w:i w:val="0"/>
+          <w:sz w:val="24"/>
+        </w:rPr>
+        <w:t xml:space="preserve">GitHub Repository: </w:t>
+      </w:r>
+      <w:r>
+        <w:rPr>
+          <w:rFonts w:ascii="Calibri" w:hAnsi="Calibri" w:cs="Calibri" w:eastAsia="Calibri"/>
+          <w:b w:val="0"/>
+          <w:i w:val="0"/>
+          <w:sz w:val="24"/>
+        </w:rPr>
+        <w:t>https://github.com/keinithaxinamalai-art/Smart-waste-management-system</w:t>
+      </w:r>
+    </w:p>
+    <w:p>
+      <w:pPr>
+        <w:spacing w:after="80" w:before="0" w:line="276" w:lineRule="auto"/>
+      </w:pPr>
+      <w:r>
+        <w:rPr>
+          <w:rFonts w:ascii="Calibri" w:hAnsi="Calibri" w:cs="Calibri" w:eastAsia="Calibri"/>
+          <w:b/>
+          <w:i w:val="0"/>
+          <w:sz w:val="24"/>
+        </w:rPr>
+        <w:t xml:space="preserve">Live demonstration (for the Week 6 presentation): </w:t>
+      </w:r>
+      <w:r>
+        <w:rPr>
+          <w:rFonts w:ascii="Calibri" w:hAnsi="Calibri" w:cs="Calibri" w:eastAsia="Calibri"/>
+          <w:b w:val="0"/>
+          <w:i w:val="0"/>
+          <w:sz w:val="24"/>
+        </w:rPr>
+        <w:t>https://keinithaxinamalai-art.github.io/Smart-waste-management-system/</w:t>
+      </w:r>
+    </w:p>
+    <w:p>
+      <w:pPr>
+        <w:spacing w:after="160" w:before="280" w:line="276" w:lineRule="auto"/>
+      </w:pPr>
+      <w:r>
+        <w:rPr>
+          <w:rFonts w:ascii="Calibri" w:hAnsi="Calibri" w:cs="Calibri" w:eastAsia="Calibri"/>
+          <w:b/>
+          <w:i w:val="0"/>
+          <w:sz w:val="28"/>
+        </w:rPr>
         <w:t>1. Project Overview</w:t>
       </w:r>
     </w:p>
     <w:p>
+      <w:pPr>
+        <w:spacing w:after="200" w:before="0" w:line="276" w:lineRule="auto"/>
+        <w:ind w:firstLine="0"/>
+      </w:pPr>
       <w:r>
         <w:rPr>
-          <w:rFonts w:ascii="Calibri" w:hAnsi="Calibri"/>
+          <w:rFonts w:ascii="Calibri" w:hAnsi="Calibri" w:cs="Calibri" w:eastAsia="Calibri"/>
+          <w:b w:val="0"/>
+          <w:i w:val="0"/>
           <w:sz w:val="24"/>
         </w:rPr>
-        <w:t>Fixed municipal collection schedules waste truck kilometres and still leave busy public bins overflowing. Canberra SmartWaste is an Iteration 1 software prototype for Transport Canberra and City Services (TCCS). It monitors simulated ACT smart-bin telemetry, classifies fill levels, scores collection urgency, accepts citizen reports, and lets staff complete pickups that reset bins and close linked tickets.</w:t>
-      </w:r>
-    </w:p>
-    <w:p>
-      <w:r>
-        <w:rPr>
-          <w:rFonts w:ascii="Calibri" w:hAnsi="Calibri"/>
-          <w:sz w:val="24"/>
-        </w:rPr>
-        <w:t>Iteration 1 deliberately excludes physical IoT hardware. All sensor readings, routes, and credentials are simulated so the team can demonstrate complete role-based workflows in a classroom without a backend or cloud database.</w:t>
-      </w:r>
-    </w:p>
-    <w:p>
-      <w:r>
-        <w:rPr>
-          <w:rFonts w:ascii="Calibri" w:hAnsi="Calibri"/>
-          <w:sz w:val="24"/>
-        </w:rPr>
-        <w:t>Completed work covers five modules that map to GitHub feature branches: administrator operations (Bijay), authentication and tests (Ayush), citizen reporting (Samir), persistence and algorithms (Krishna), and maintenance diagnostics (Charanpal). The working prototype, this report, the 15-slide demonstration deck, the GitHub repository, and the Jira board are the Iteration 1 deliverables.</w:t>
+        <w:t>Canberra SmartWaste is an Iteration 1 prototype to make it easier to see and manage municipal waste collection in Canberra. Efficiencies can be lost with fixed collection days due to the fact that bins in busy areas might fill at different times, and refuse collection vehicles could be taking out bins that don't need to be emptied. As the number of smart-waste studies grows, they are employing a variety of sensor data, central monitoring and operational decision support to enable a more responsive collection (Sosunova &amp; Porras, 2022). In the same vein, in an Australian municipal context An et al. (2022) prove how smart-bin fullness data can be used to complement a dashboard for decision-makers.</w:t>
       </w:r>
     </w:p>
     <w:p>
       <w:pPr>
-        <w:pStyle w:val="Heading2"/>
+        <w:spacing w:after="200" w:before="0" w:line="276" w:lineRule="auto"/>
+        <w:ind w:firstLine="0"/>
       </w:pPr>
       <w:r>
+        <w:rPr>
+          <w:rFonts w:ascii="Calibri" w:hAnsi="Calibri" w:cs="Calibri" w:eastAsia="Calibri"/>
+          <w:b w:val="0"/>
+          <w:i w:val="0"/>
+          <w:sz w:val="24"/>
+        </w:rPr>
+        <w:t>So the goal of the Iteration 1 was to develop the software prototype and not a deployment of Internet of Things (IoT). This system is based on simulated Canberra smart bin data, and offers 3 role based experiences: Citizen, Collection Staff and Administrator. Prototyping, citizen waste-issue reporting and tracking, smart-bin monitoring, a reusable fill status algorithm, a deterministic collection priority scoring, a suggested collection sequence, collection completion, dashboard statistics, search and alerts, maintenance diagnostics, and local persistence and automated testing completed work. Readable WST-2026-XXXX reference numbers are provided for citizens and they can track the report status along Submitted, Under Review, Scheduled and Resolved.</w:t>
+      </w:r>
+    </w:p>
+    <w:p>
+      <w:pPr>
+        <w:spacing w:after="200" w:before="0" w:line="276" w:lineRule="auto"/>
+        <w:ind w:firstLine="0"/>
+      </w:pPr>
+      <w:r>
+        <w:rPr>
+          <w:rFonts w:ascii="Calibri" w:hAnsi="Calibri" w:cs="Calibri" w:eastAsia="Calibri"/>
+          <w:b w:val="0"/>
+          <w:i w:val="0"/>
+          <w:sz w:val="24"/>
+        </w:rPr>
+        <w:t>Recent literature has demonstrated that monitoring and sharing information in smart bins can help in the municipal maintenance, collection and routing decisions (Wang et al., 2021). Public participation is also relevant because the outcomes of waste management also rely on partial participation of the residents in the local waste practices (Kuang &amp; Lin, 2021). As a result, Canberra SmartWaste is an operational monitoring tool, along with a citizen reporting tool.</w:t>
+      </w:r>
+    </w:p>
+    <w:p>
+      <w:pPr>
+        <w:spacing w:after="160" w:before="280" w:line="276" w:lineRule="auto"/>
+      </w:pPr>
+      <w:r>
+        <w:rPr>
+          <w:rFonts w:ascii="Calibri" w:hAnsi="Calibri" w:cs="Calibri" w:eastAsia="Calibri"/>
+          <w:b/>
+          <w:i w:val="0"/>
+          <w:sz w:val="28"/>
+        </w:rPr>
         <w:t>2. System Implementation</w:t>
       </w:r>
     </w:p>
     <w:p>
       <w:pPr>
-        <w:pStyle w:val="Heading3"/>
+        <w:spacing w:after="160" w:before="280" w:line="276" w:lineRule="auto"/>
       </w:pPr>
       <w:r>
-        <w:t>2.1 Architecture</w:t>
-      </w:r>
-    </w:p>
-    <w:p>
-      <w:r>
         <w:rPr>
-          <w:rFonts w:ascii="Calibri" w:hAnsi="Calibri"/>
+          <w:rFonts w:ascii="Calibri" w:hAnsi="Calibri" w:cs="Calibri" w:eastAsia="Calibri"/>
+          <w:b/>
+          <w:i w:val="0"/>
           <w:sz w:val="24"/>
         </w:rPr>
-        <w:t>The prototype is a single-page React 19 + TypeScript 6 + Vite 8 application. There is no Node/Express API and no PostgreSQL database in this iteration. A React Context (</w:t>
-      </w:r>
-      <w:r>
-        <w:rPr>
-          <w:rFonts w:ascii="Calibri" w:hAnsi="Calibri"/>
-          <w:i/>
-          <w:sz w:val="24"/>
-        </w:rPr>
-        <w:t>AppContext</w:t>
-      </w:r>
-      <w:r>
-        <w:rPr>
-          <w:rFonts w:ascii="Calibri" w:hAnsi="Calibri"/>
-          <w:sz w:val="24"/>
-        </w:rPr>
-        <w:t xml:space="preserve">) is the runtime source of truth for role, bins, reports, collections, and technician tickets. </w:t>
-      </w:r>
-      <w:r>
-        <w:rPr>
-          <w:rFonts w:ascii="Calibri" w:hAnsi="Calibri"/>
-          <w:i/>
-          <w:sz w:val="24"/>
-        </w:rPr>
-        <w:t>src/services/dataStore.ts</w:t>
-      </w:r>
-      <w:r>
-        <w:rPr>
-          <w:rFonts w:ascii="Calibri" w:hAnsi="Calibri"/>
-          <w:sz w:val="24"/>
-        </w:rPr>
-        <w:t xml:space="preserve"> serialises that state to </w:t>
-      </w:r>
-      <w:r>
-        <w:rPr>
-          <w:rFonts w:ascii="Calibri" w:hAnsi="Calibri"/>
-          <w:i/>
-          <w:sz w:val="24"/>
-        </w:rPr>
-        <w:t>localStorage</w:t>
-      </w:r>
-      <w:r>
-        <w:rPr>
-          <w:rFonts w:ascii="Calibri" w:hAnsi="Calibri"/>
-          <w:sz w:val="24"/>
-        </w:rPr>
-        <w:t xml:space="preserve"> so a demonstration can be paused and resumed in the same browser. An administrator </w:t>
-      </w:r>
-      <w:r>
-        <w:rPr>
-          <w:rFonts w:ascii="Calibri" w:hAnsi="Calibri"/>
-          <w:b/>
-          <w:sz w:val="24"/>
-        </w:rPr>
-        <w:t>Reset Demo Data</w:t>
-      </w:r>
-      <w:r>
-        <w:rPr>
-          <w:rFonts w:ascii="Calibri" w:hAnsi="Calibri"/>
-          <w:sz w:val="24"/>
-        </w:rPr>
-        <w:t xml:space="preserve"> control restores the seeded ACT dataset.</w:t>
-      </w:r>
-    </w:p>
-    <w:p>
-      <w:r>
-        <w:rPr>
-          <w:rFonts w:ascii="Calibri" w:hAnsi="Calibri"/>
-          <w:sz w:val="24"/>
-        </w:rPr>
-        <w:t>This architecture matches the presentation: a modern frontend stack, unified state, and local persistence suitable for repeatable marking. Later iterations can replace the store with live microcontroller telemetry and a cloud database without rewriting the views.</w:t>
+        <w:t>2.1 Architecture and Software Components</w:t>
       </w:r>
     </w:p>
     <w:p>
       <w:pPr>
-        <w:pStyle w:val="Heading3"/>
+        <w:spacing w:after="200" w:before="0" w:line="276" w:lineRule="auto"/>
+        <w:ind w:firstLine="0"/>
       </w:pPr>
       <w:r>
-        <w:t>2.2 Implemented modules</w:t>
-      </w:r>
-    </w:p>
-    <w:p>
-      <w:r>
         <w:rPr>
-          <w:rFonts w:ascii="Calibri" w:hAnsi="Calibri"/>
-          <w:b/>
+          <w:rFonts w:ascii="Calibri" w:hAnsi="Calibri" w:cs="Calibri" w:eastAsia="Calibri"/>
+          <w:b w:val="0"/>
+          <w:i w:val="0"/>
           <w:sz w:val="24"/>
         </w:rPr>
-        <w:t>Session and role protection.</w:t>
-      </w:r>
-      <w:r>
-        <w:rPr>
-          <w:rFonts w:ascii="Calibri" w:hAnsi="Calibri"/>
-          <w:sz w:val="24"/>
-        </w:rPr>
-        <w:t xml:space="preserve"> Unauthenticated users see the prototype login (or an anonymous public report form). Valid demo accounts are </w:t>
-      </w:r>
-      <w:r>
-        <w:rPr>
-          <w:rFonts w:ascii="Calibri" w:hAnsi="Calibri"/>
-          <w:i/>
-          <w:sz w:val="24"/>
-        </w:rPr>
-        <w:t>admin@smartwaste.demo</w:t>
-      </w:r>
-      <w:r>
-        <w:rPr>
-          <w:rFonts w:ascii="Calibri" w:hAnsi="Calibri"/>
-          <w:sz w:val="24"/>
-        </w:rPr>
-        <w:t xml:space="preserve">, </w:t>
-      </w:r>
-      <w:r>
-        <w:rPr>
-          <w:rFonts w:ascii="Calibri" w:hAnsi="Calibri"/>
-          <w:i/>
-          <w:sz w:val="24"/>
-        </w:rPr>
-        <w:t>staff@smartwaste.demo</w:t>
-      </w:r>
-      <w:r>
-        <w:rPr>
-          <w:rFonts w:ascii="Calibri" w:hAnsi="Calibri"/>
-          <w:sz w:val="24"/>
-        </w:rPr>
-        <w:t xml:space="preserve">, and </w:t>
-      </w:r>
-      <w:r>
-        <w:rPr>
-          <w:rFonts w:ascii="Calibri" w:hAnsi="Calibri"/>
-          <w:i/>
-          <w:sz w:val="24"/>
-        </w:rPr>
-        <w:t>citizen@smartwaste.demo</w:t>
-      </w:r>
-      <w:r>
-        <w:rPr>
-          <w:rFonts w:ascii="Calibri" w:hAnsi="Calibri"/>
-          <w:sz w:val="24"/>
-        </w:rPr>
-        <w:t xml:space="preserve">. Citizens stay in the reporting portal; collection staff see the priority pickup queue; administrators receive the full operations shell (dashboard, map, routes, public-report admin, driver view, maintenance, KPIs). Route protection and central </w:t>
-      </w:r>
-      <w:r>
-        <w:rPr>
-          <w:rFonts w:ascii="Calibri" w:hAnsi="Calibri"/>
-          <w:i/>
-          <w:sz w:val="24"/>
-        </w:rPr>
-        <w:t>ROLE_LABELS</w:t>
-      </w:r>
-      <w:r>
-        <w:rPr>
-          <w:rFonts w:ascii="Calibri" w:hAnsi="Calibri"/>
-          <w:sz w:val="24"/>
-        </w:rPr>
-        <w:t xml:space="preserve"> prevent staff from opening manager screens.</w:t>
-      </w:r>
-    </w:p>
-    <w:p>
-      <w:r>
-        <w:rPr>
-          <w:rFonts w:ascii="Calibri" w:hAnsi="Calibri"/>
-          <w:b/>
-          <w:sz w:val="24"/>
-        </w:rPr>
-        <w:t>Bin monitoring and classification.</w:t>
-      </w:r>
-      <w:r>
-        <w:rPr>
-          <w:rFonts w:ascii="Calibri" w:hAnsi="Calibri"/>
-          <w:sz w:val="24"/>
-        </w:rPr>
-        <w:t xml:space="preserve"> Seeded bins cover eight Canberra suburbs (Canberra City, Belconnen, Gungahlin, Woden, Tuggeranong, Dickson, Kingston, Manuka). </w:t>
-      </w:r>
-      <w:r>
-        <w:rPr>
-          <w:rFonts w:ascii="Calibri" w:hAnsi="Calibri"/>
-          <w:i/>
-          <w:sz w:val="24"/>
-        </w:rPr>
-        <w:t>getBinStatus()</w:t>
-      </w:r>
-      <w:r>
-        <w:rPr>
-          <w:rFonts w:ascii="Calibri" w:hAnsi="Calibri"/>
-          <w:sz w:val="24"/>
-        </w:rPr>
-        <w:t xml:space="preserve"> clamps invalid sensor values and maps fill to four operational tiers: 0–49% Normal, 50–79% Moderate, 80–89% Collection Required, 90–100% Critical. The dashboard critical-bin spotlight, map legend, alerts, and staff queue all use the same helper, so a 92% reading on </w:t>
-      </w:r>
-      <w:r>
-        <w:rPr>
-          <w:rFonts w:ascii="Calibri" w:hAnsi="Calibri"/>
-          <w:i/>
-          <w:sz w:val="24"/>
-        </w:rPr>
-        <w:t>WDN-104</w:t>
-      </w:r>
-      <w:r>
-        <w:rPr>
-          <w:rFonts w:ascii="Calibri" w:hAnsi="Calibri"/>
-          <w:sz w:val="24"/>
-        </w:rPr>
-        <w:t xml:space="preserve"> is Critical everywhere.</w:t>
-      </w:r>
-    </w:p>
-    <w:p>
-      <w:r>
-        <w:rPr>
-          <w:rFonts w:ascii="Calibri" w:hAnsi="Calibri"/>
-          <w:b/>
-          <w:sz w:val="24"/>
-        </w:rPr>
-        <w:t>Priority scoring.</w:t>
-      </w:r>
-      <w:r>
-        <w:rPr>
-          <w:rFonts w:ascii="Calibri" w:hAnsi="Calibri"/>
-          <w:sz w:val="24"/>
-        </w:rPr>
-        <w:t xml:space="preserve"> </w:t>
-      </w:r>
-      <w:r>
-        <w:rPr>
-          <w:rFonts w:ascii="Calibri" w:hAnsi="Calibri"/>
-          <w:i/>
-          <w:sz w:val="24"/>
-        </w:rPr>
-        <w:t>calculateCollectionPriority()</w:t>
-      </w:r>
-      <w:r>
-        <w:rPr>
-          <w:rFonts w:ascii="Calibri" w:hAnsi="Calibri"/>
-          <w:sz w:val="24"/>
-        </w:rPr>
-        <w:t xml:space="preserve"> is a deterministic weighted model: fill contribution (fill × 0.5), urgency contribution (Critical 30 / High 20 / Medium 10 / Low 0), and overdue contribution (capped at 20). Scores map to Low / Medium / High / Critical. Routes view orders stops by score among bins at or above 80% fill.</w:t>
-      </w:r>
-    </w:p>
-    <w:p>
-      <w:r>
-        <w:rPr>
-          <w:rFonts w:ascii="Calibri" w:hAnsi="Calibri"/>
-          <w:b/>
-          <w:sz w:val="24"/>
-        </w:rPr>
-        <w:t>Citizen reporting.</w:t>
-      </w:r>
-      <w:r>
-        <w:rPr>
-          <w:rFonts w:ascii="Calibri" w:hAnsi="Calibri"/>
-          <w:sz w:val="24"/>
-        </w:rPr>
-        <w:t xml:space="preserve"> The intake form captures issue category, street location, ACT suburb, urgency, optional smart-bin ID, and optional photo flag. Client validation rejects empty or whitespace-only required fields. Successful submissions receive a unique </w:t>
-      </w:r>
-      <w:r>
-        <w:rPr>
-          <w:rFonts w:ascii="Calibri" w:hAnsi="Calibri"/>
-          <w:i/>
-          <w:sz w:val="24"/>
-        </w:rPr>
-        <w:t>WST-2026-XXXX</w:t>
-      </w:r>
-      <w:r>
-        <w:rPr>
-          <w:rFonts w:ascii="Calibri" w:hAnsi="Calibri"/>
-          <w:sz w:val="24"/>
-        </w:rPr>
-        <w:t xml:space="preserve"> reference. Status values are normalised to Submitted, Under Review, Scheduled, and Resolved. Administrators advance tickets; citizens see the updated status in report history.</w:t>
-      </w:r>
-    </w:p>
-    <w:p>
-      <w:r>
-        <w:rPr>
-          <w:rFonts w:ascii="Calibri" w:hAnsi="Calibri"/>
-          <w:b/>
-          <w:sz w:val="24"/>
-        </w:rPr>
-        <w:t>Collection execution.</w:t>
-      </w:r>
-      <w:r>
-        <w:rPr>
-          <w:rFonts w:ascii="Calibri" w:hAnsi="Calibri"/>
-          <w:sz w:val="24"/>
-        </w:rPr>
-        <w:t xml:space="preserve"> Marking a bin collected resets fill to 5%, writes </w:t>
-      </w:r>
-      <w:r>
-        <w:rPr>
-          <w:rFonts w:ascii="Calibri" w:hAnsi="Calibri"/>
-          <w:i/>
-          <w:sz w:val="24"/>
-        </w:rPr>
-        <w:t>lastCollected</w:t>
-      </w:r>
-      <w:r>
-        <w:rPr>
-          <w:rFonts w:ascii="Calibri" w:hAnsi="Calibri"/>
-          <w:sz w:val="24"/>
-        </w:rPr>
-        <w:t xml:space="preserve">, recalculates priority, completes matching collection records, and resolves </w:t>
-      </w:r>
-      <w:r>
-        <w:rPr>
-          <w:rFonts w:ascii="Calibri" w:hAnsi="Calibri"/>
-          <w:b/>
-          <w:sz w:val="24"/>
-        </w:rPr>
-        <w:t>only</w:t>
-      </w:r>
-      <w:r>
-        <w:rPr>
-          <w:rFonts w:ascii="Calibri" w:hAnsi="Calibri"/>
-          <w:sz w:val="24"/>
-        </w:rPr>
-        <w:t xml:space="preserve"> public reports whose </w:t>
-      </w:r>
-      <w:r>
-        <w:rPr>
-          <w:rFonts w:ascii="Calibri" w:hAnsi="Calibri"/>
-          <w:i/>
-          <w:sz w:val="24"/>
-        </w:rPr>
-        <w:t>binId</w:t>
-      </w:r>
-      <w:r>
-        <w:rPr>
-          <w:rFonts w:ascii="Calibri" w:hAnsi="Calibri"/>
-          <w:sz w:val="24"/>
-        </w:rPr>
-        <w:t xml:space="preserve"> equals the serviced bin. Unrelated tickets in the same suburb stay open. This is the relational integrity rule exercised in Vitest.</w:t>
-      </w:r>
-    </w:p>
-    <w:p>
-      <w:r>
-        <w:rPr>
-          <w:rFonts w:ascii="Calibri" w:hAnsi="Calibri"/>
-          <w:b/>
-          <w:sz w:val="24"/>
-        </w:rPr>
-        <w:t>Maintenance diagnostics.</w:t>
-      </w:r>
-      <w:r>
-        <w:rPr>
-          <w:rFonts w:ascii="Calibri" w:hAnsi="Calibri"/>
-          <w:sz w:val="24"/>
-        </w:rPr>
-        <w:t xml:space="preserve"> The maintenance view monitors simulated sensor errors, low-battery warnings, lid mechanism jams, and offline modules. Technician work orders persist in </w:t>
-      </w:r>
-      <w:r>
-        <w:rPr>
-          <w:rFonts w:ascii="Calibri" w:hAnsi="Calibri"/>
-          <w:i/>
-          <w:sz w:val="24"/>
-        </w:rPr>
-        <w:t>localStorage</w:t>
-      </w:r>
-      <w:r>
-        <w:rPr>
-          <w:rFonts w:ascii="Calibri" w:hAnsi="Calibri"/>
-          <w:sz w:val="24"/>
-        </w:rPr>
-        <w:t xml:space="preserve"> and follow Open → In Progress → Resolved. Demo reset restores the seeded tickets.</w:t>
+        <w:t>The prototype is done using React 19, TypeScript 6 and Vite 8. The choice for React was made due to the support for re-usable dashboards, tables, forms, alerts and role-specific views. Users, bins, reports, collection records, status values and priorities share the same domain types, which helps to avoid errors from having inconsistent values. We use modular CSS to style the interface and icons are provided by Lucide React and data visualisation by Recharts.</w:t>
       </w:r>
     </w:p>
     <w:p>
       <w:pPr>
-        <w:pStyle w:val="Heading3"/>
+        <w:spacing w:after="200" w:before="0" w:line="276" w:lineRule="auto"/>
+        <w:ind w:firstLine="0"/>
       </w:pPr>
       <w:r>
-        <w:t>2.3 User interface</w:t>
-      </w:r>
-    </w:p>
-    <w:p>
-      <w:r>
         <w:rPr>
-          <w:rFonts w:ascii="Calibri" w:hAnsi="Calibri"/>
+          <w:rFonts w:ascii="Calibri" w:hAnsi="Calibri" w:cs="Calibri" w:eastAsia="Calibri"/>
+          <w:b w:val="0"/>
+          <w:i w:val="0"/>
           <w:sz w:val="24"/>
         </w:rPr>
-        <w:t>Role-specific views are built as modular React components with vanilla CSS custom properties (no Tailwind in this codebase). Lucide icons provide a consistent visual language. The header search overlay and notification bell are wired to the same reactive bin and report state used by the dashboard.</w:t>
-      </w:r>
-    </w:p>
-    <w:p>
-      <w:r>
-        <w:rPr>
-          <w:rFonts w:ascii="Calibri" w:hAnsi="Calibri"/>
-          <w:sz w:val="24"/>
-        </w:rPr>
-        <w:t xml:space="preserve">Screenshot the following screens for the Moodle Word submission (run </w:t>
-      </w:r>
-      <w:r>
-        <w:rPr>
-          <w:rFonts w:ascii="Calibri" w:hAnsi="Calibri"/>
-          <w:i/>
-          <w:sz w:val="24"/>
-        </w:rPr>
-        <w:t>npm run dev</w:t>
-      </w:r>
-      <w:r>
-        <w:rPr>
-          <w:rFonts w:ascii="Calibri" w:hAnsi="Calibri"/>
-          <w:sz w:val="24"/>
-        </w:rPr>
-        <w:t>, then capture each role):</w:t>
+        <w:t>React Context is used to handle the shared application state. AppContext handles the authenticated role, bins, reports and collections and provides actions for log in, log out, submission of reports, changes of report status, assignment of routes, completion of collections and reset of demonstration data. The persistence is centralised in dataStore.ts with the help of localStorage available in the browser. This was made as an engineering choice in Iteration 1 designed to ensure browser persistence and to enable a repeatable demonstration in the classroom without the need to add a backend that wasn't necessary for the first prototype. Architecture continues to be extensible as the persistence service may easily be replaced with API and database calls in the future.</w:t>
       </w:r>
     </w:p>
     <w:p>
       <w:pPr>
-        <w:pStyle w:val="ListBullet"/>
+        <w:spacing w:after="200" w:before="0" w:line="276" w:lineRule="auto"/>
+        <w:ind w:firstLine="0"/>
       </w:pPr>
       <w:r>
         <w:rPr>
-          <w:rFonts w:ascii="Calibri" w:hAnsi="Calibri"/>
-          <w:b/>
+          <w:rFonts w:ascii="Calibri" w:hAnsi="Calibri" w:cs="Calibri" w:eastAsia="Calibri"/>
+          <w:b w:val="0"/>
+          <w:i w:val="0"/>
           <w:sz w:val="24"/>
         </w:rPr>
-        <w:t>Login</w:t>
-      </w:r>
-      <w:r>
-        <w:rPr>
-          <w:rFonts w:ascii="Calibri" w:hAnsi="Calibri"/>
-          <w:sz w:val="24"/>
-        </w:rPr>
-        <w:t xml:space="preserve"> — three prototype roles, password field, invalid-credential error, public report shortcut.</w:t>
+        <w:t>One significant architecture improvement that was made was to eliminate duplicate run-time data sources. The dashboard, map, alerts and collection views now share the current state of the application. Accordingly, dependent views will be updated regularly, and not continue to show stale seed data, when the fill level of the bin changes during collection.</w:t>
       </w:r>
     </w:p>
     <w:p>
       <w:pPr>
-        <w:pStyle w:val="ListBullet"/>
+        <w:spacing w:after="160" w:before="280" w:line="276" w:lineRule="auto"/>
       </w:pPr>
       <w:r>
         <w:rPr>
-          <w:rFonts w:ascii="Calibri" w:hAnsi="Calibri"/>
+          <w:rFonts w:ascii="Calibri" w:hAnsi="Calibri" w:cs="Calibri" w:eastAsia="Calibri"/>
           <w:b/>
+          <w:i w:val="0"/>
           <w:sz w:val="24"/>
         </w:rPr>
-        <w:t>Citizen portal</w:t>
-      </w:r>
-      <w:r>
-        <w:rPr>
-          <w:rFonts w:ascii="Calibri" w:hAnsi="Calibri"/>
-          <w:sz w:val="24"/>
-        </w:rPr>
-        <w:t xml:space="preserve"> — structured intake (suburb list, issue categories, urgency, optional bin ID) and Track Reports history with reference search.</w:t>
+        <w:t>2.2 User Interface and Functional Modules</w:t>
       </w:r>
     </w:p>
     <w:p>
       <w:pPr>
-        <w:pStyle w:val="ListBullet"/>
+        <w:spacing w:after="200" w:before="0" w:line="276" w:lineRule="auto"/>
+        <w:ind w:firstLine="0"/>
       </w:pPr>
       <w:r>
         <w:rPr>
-          <w:rFonts w:ascii="Calibri" w:hAnsi="Calibri"/>
-          <w:b/>
+          <w:rFonts w:ascii="Calibri" w:hAnsi="Calibri" w:cs="Calibri" w:eastAsia="Calibri"/>
+          <w:b w:val="0"/>
+          <w:i w:val="0"/>
           <w:sz w:val="24"/>
         </w:rPr>
-        <w:t>Administrator dashboard</w:t>
-      </w:r>
-      <w:r>
-        <w:rPr>
-          <w:rFonts w:ascii="Calibri" w:hAnsi="Calibri"/>
-          <w:sz w:val="24"/>
-        </w:rPr>
-        <w:t xml:space="preserve"> — live stats, critical-bin spotlight with dispatch, telemetry map, alerts, CSV export.</w:t>
+        <w:t>The authentication of a prototype starts in an unauthenticated mode. Users log in with fake test accounts and the app checks if the account is the one they have selected to log in. The Citizen, Collection Staff and Administrator functionality are separated by role controls. Citizens can view reporting and report history; collection staff can view the required pickup work; and the administrators can view the operational dashboard, public-report administration, smart-bin views, suggested collection sequence, diagnostics and reset demonstration-data.</w:t>
       </w:r>
     </w:p>
     <w:p>
       <w:pPr>
-        <w:pStyle w:val="ListBullet"/>
+        <w:spacing w:after="200" w:before="0" w:line="276" w:lineRule="auto"/>
+        <w:ind w:firstLine="0"/>
       </w:pPr>
       <w:r>
         <w:rPr>
-          <w:rFonts w:ascii="Calibri" w:hAnsi="Calibri"/>
-          <w:b/>
+          <w:rFonts w:ascii="Calibri" w:hAnsi="Calibri" w:cs="Calibri" w:eastAsia="Calibri"/>
+          <w:b w:val="0"/>
+          <w:i w:val="0"/>
           <w:sz w:val="24"/>
         </w:rPr>
-        <w:t>Route planning</w:t>
-      </w:r>
-      <w:r>
-        <w:rPr>
-          <w:rFonts w:ascii="Calibri" w:hAnsi="Calibri"/>
-          <w:sz w:val="24"/>
-        </w:rPr>
-        <w:t xml:space="preserve"> — suggested sequence for fill ≥ 80%, one-click driver assignment.</w:t>
+        <w:t>The citizen reporting module includes issue category, location, Canberra suburb, urgency, waste type, optional bin identification, description and optional contact information. With validation, you cannot leave out required data and whitespace descriptions. Upon successful submission, a unique reference, WST-2026-XXXX is assigned, and a Submitted status is set. The same record is accessible to administrators, and can be advanced through several statuses: Under Review, Scheduled and Resolved. This common workflow gives the traceability between the public input and operational action. Kuang and Lin (2021) highlight supporting facilities and contextual factors as affecting public involvement in waste practices and thus the need to ensure that there is a visible reporting interface through digital technology alongside the internal municipal process.</w:t>
       </w:r>
     </w:p>
     <w:p>
       <w:pPr>
-        <w:pStyle w:val="ListBullet"/>
+        <w:spacing w:after="200" w:before="0" w:line="276" w:lineRule="auto"/>
+        <w:ind w:firstLine="0"/>
       </w:pPr>
       <w:r>
         <w:rPr>
-          <w:rFonts w:ascii="Calibri" w:hAnsi="Calibri"/>
-          <w:b/>
+          <w:rFonts w:ascii="Calibri" w:hAnsi="Calibri" w:cs="Calibri" w:eastAsia="Calibri"/>
+          <w:b w:val="0"/>
+          <w:i w:val="0"/>
           <w:sz w:val="24"/>
         </w:rPr>
-        <w:t>Staff collection</w:t>
-      </w:r>
-      <w:r>
-        <w:rPr>
-          <w:rFonts w:ascii="Calibri" w:hAnsi="Calibri"/>
-          <w:sz w:val="24"/>
-        </w:rPr>
-        <w:t xml:space="preserve"> — priority stop, Mark Collected, upcoming stops.</w:t>
+        <w:t>The simulated data is from a number of locations around Canberra, such as Belconnen, Gungahlin, Woden, Dickson, Kingston and Canberra City. The getBinStatus() function can be called repeatedly as a re-usable function and falls into four predetermined status bins: 0–49% Normal, 50–79% Moderate, 80–89% Collection Required and 90–100% Critical. Values put in to the input are securely limited to stay away from errors due to inappropriate sensor values. The thresholds are project specific business rules and not industry standards claimed. This logic is used in the map, dashboard and collection screens as well to keep the classifications consistent.</w:t>
       </w:r>
     </w:p>
     <w:p>
       <w:pPr>
-        <w:pStyle w:val="ListBullet"/>
+        <w:spacing w:after="200" w:before="0" w:line="276" w:lineRule="auto"/>
+        <w:ind w:firstLine="0"/>
       </w:pPr>
       <w:r>
         <w:rPr>
-          <w:rFonts w:ascii="Calibri" w:hAnsi="Calibri"/>
-          <w:b/>
+          <w:rFonts w:ascii="Calibri" w:hAnsi="Calibri" w:cs="Calibri" w:eastAsia="Calibri"/>
+          <w:b w:val="0"/>
+          <w:i w:val="0"/>
           <w:sz w:val="24"/>
         </w:rPr>
-        <w:t>Public report admin</w:t>
-      </w:r>
-      <w:r>
-        <w:rPr>
-          <w:rFonts w:ascii="Calibri" w:hAnsi="Calibri"/>
-          <w:sz w:val="24"/>
-        </w:rPr>
-        <w:t xml:space="preserve"> — filter chips for Submitted / Under Review / Scheduled / Resolved.</w:t>
+        <w:t>The fill contribution, report urgency and time since collection are factors in the collection-priority algorithm. Fill level is worth up to 50 points, urgency up to 30 points and overdue time up to 20 points. The final score falls into one of the levels Low, Medium, High or Critical. This is not a black box A.I. based approach, but a rule based approach that is transparent. Canberra SmartWaste provides an example of the same general principle that is demonstrated by Roy et al. (2022) and Ghahramani et al. (2022) on an achievable level of Iteration 1.</w:t>
       </w:r>
     </w:p>
     <w:p>
       <w:pPr>
-        <w:pStyle w:val="ListBullet"/>
+        <w:spacing w:after="200" w:before="0" w:line="276" w:lineRule="auto"/>
+        <w:ind w:firstLine="0"/>
       </w:pPr>
       <w:r>
         <w:rPr>
-          <w:rFonts w:ascii="Calibri" w:hAnsi="Calibri"/>
-          <w:b/>
+          <w:rFonts w:ascii="Calibri" w:hAnsi="Calibri" w:cs="Calibri" w:eastAsia="Calibri"/>
+          <w:b w:val="0"/>
+          <w:i w:val="0"/>
           <w:sz w:val="24"/>
         </w:rPr>
-        <w:t>Maintenance</w:t>
-      </w:r>
-      <w:r>
-        <w:rPr>
-          <w:rFonts w:ascii="Calibri" w:hAnsi="Calibri"/>
-          <w:sz w:val="24"/>
-        </w:rPr>
-        <w:t xml:space="preserve"> — sensor stats plus work-order lifecycle controls.</w:t>
+        <w:t>The required collection sequence only includes bins that are either Collection Required or Critical. The sequence can be assigned to collection staff and the assignment information is stored in the data layer. When staff put a bin as collected, the fill level will be reset to 5%, it will become a Normal bin, last collected time will be updated, priority will be recalculated, related collection records will be set as Completed, and reports that are not explicitly connected to this bin will not be automatically resolved. This is an explicit relationship that will stop unrelated reports from the same suburb from being incorrectly resolved.</w:t>
       </w:r>
     </w:p>
     <w:p>
       <w:pPr>
-        <w:pStyle w:val="ListBullet"/>
+        <w:spacing w:after="200" w:before="0" w:line="276" w:lineRule="auto"/>
+        <w:ind w:firstLine="0"/>
       </w:pPr>
       <w:r>
         <w:rPr>
-          <w:rFonts w:ascii="Calibri" w:hAnsi="Calibri"/>
-          <w:b/>
+          <w:rFonts w:ascii="Calibri" w:hAnsi="Calibri" w:cs="Calibri" w:eastAsia="Calibri"/>
+          <w:b w:val="0"/>
+          <w:i w:val="0"/>
           <w:sz w:val="24"/>
         </w:rPr>
-        <w:t>Reports &amp; KPIs</w:t>
-      </w:r>
-      <w:r>
-        <w:rPr>
-          <w:rFonts w:ascii="Calibri" w:hAnsi="Calibri"/>
-          <w:sz w:val="24"/>
-        </w:rPr>
-        <w:t xml:space="preserve"> — composition and volume charts derived from current bin context.</w:t>
+        <w:t>The administrator dashboard is populated with application state statistics including monitored bins, critical bins, bins for collection, active reports, resolved reports and average network fill. Dynamic alerts help maximize the efficiency of hazardous bin and new reports and pending collections identification. The ability to search includes bins, reports and collection records. There is also a maintenance view that shows simulated sensor faults and can enable prototype maintenance-ticket acknowledgement. These qualities all illustrate integration among modules, NOT a series of standalone interface screens.</w:t>
       </w:r>
     </w:p>
     <w:p>
       <w:pPr>
-        <w:pStyle w:val="Heading3"/>
+        <w:spacing w:after="160" w:before="280" w:line="276" w:lineRule="auto"/>
       </w:pPr>
       <w:r>
-        <w:t>2.4 Software components</w:t>
+        <w:rPr>
+          <w:rFonts w:ascii="Calibri" w:hAnsi="Calibri" w:cs="Calibri" w:eastAsia="Calibri"/>
+          <w:b/>
+          <w:i w:val="0"/>
+          <w:sz w:val="24"/>
+        </w:rPr>
+        <w:t>2.3 Testing and Quality Controls</w:t>
       </w:r>
     </w:p>
-    <w:tbl>
-      <w:tblPr>
-        <w:tblStyle w:val="TableGrid"/>
-        <w:tblW w:type="auto" w:w="0"/>
-        <w:tblLook w:firstColumn="1" w:firstRow="1" w:lastColumn="0" w:lastRow="0" w:noHBand="0" w:noVBand="1" w:val="04A0"/>
-      </w:tblPr>
-      <w:tblGrid>
-        <w:gridCol w:w="4680"/>
-        <w:gridCol w:w="4680"/>
-      </w:tblGrid>
-      <w:tr>
-        <w:tc>
-          <w:tcPr>
-            <w:tcW w:type="dxa" w:w="4680"/>
-          </w:tcPr>
-          <w:p>
-            <w:r>
-              <w:rPr>
-                <w:rFonts w:ascii="Calibri" w:hAnsi="Calibri"/>
-                <w:b/>
-                <w:sz w:val="22"/>
-              </w:rPr>
-              <w:t>Layer</w:t>
-            </w:r>
-          </w:p>
-        </w:tc>
-        <w:tc>
-          <w:tcPr>
-            <w:tcW w:type="dxa" w:w="4680"/>
-          </w:tcPr>
-          <w:p>
-            <w:r>
-              <w:rPr>
-                <w:rFonts w:ascii="Calibri" w:hAnsi="Calibri"/>
-                <w:b/>
-                <w:sz w:val="22"/>
-              </w:rPr>
-              <w:t>Implementation</w:t>
-            </w:r>
-          </w:p>
-        </w:tc>
-      </w:tr>
-      <w:tr>
-        <w:tc>
-          <w:tcPr>
-            <w:tcW w:type="dxa" w:w="4680"/>
-          </w:tcPr>
-          <w:p>
-            <w:r>
-              <w:rPr>
-                <w:rFonts w:ascii="Calibri" w:hAnsi="Calibri"/>
-                <w:sz w:val="22"/>
-              </w:rPr>
-              <w:t>UI</w:t>
-            </w:r>
-          </w:p>
-        </w:tc>
-        <w:tc>
-          <w:tcPr>
-            <w:tcW w:type="dxa" w:w="4680"/>
-          </w:tcPr>
-          <w:p>
-            <w:r>
-              <w:rPr>
-                <w:rFonts w:ascii="Calibri" w:hAnsi="Calibri"/>
-                <w:sz w:val="22"/>
-              </w:rPr>
-              <w:t>React 19, TypeScript 6, Vite 8, modular CSS</w:t>
-            </w:r>
-          </w:p>
-        </w:tc>
-      </w:tr>
-      <w:tr>
-        <w:tc>
-          <w:tcPr>
-            <w:tcW w:type="dxa" w:w="4680"/>
-          </w:tcPr>
-          <w:p>
-            <w:r>
-              <w:rPr>
-                <w:rFonts w:ascii="Calibri" w:hAnsi="Calibri"/>
-                <w:sz w:val="22"/>
-              </w:rPr>
-              <w:t>State</w:t>
-            </w:r>
-          </w:p>
-        </w:tc>
-        <w:tc>
-          <w:tcPr>
-            <w:tcW w:type="dxa" w:w="4680"/>
-          </w:tcPr>
-          <w:p>
-            <w:r>
-              <w:rPr>
-                <w:rFonts w:ascii="Calibri" w:hAnsi="Calibri"/>
-                <w:sz w:val="22"/>
-              </w:rPr>
-              <w:t>`AppContext` + `useApp()`</w:t>
-            </w:r>
-          </w:p>
-        </w:tc>
-      </w:tr>
-      <w:tr>
-        <w:tc>
-          <w:tcPr>
-            <w:tcW w:type="dxa" w:w="4680"/>
-          </w:tcPr>
-          <w:p>
-            <w:r>
-              <w:rPr>
-                <w:rFonts w:ascii="Calibri" w:hAnsi="Calibri"/>
-                <w:sz w:val="22"/>
-              </w:rPr>
-              <w:t>Persistence</w:t>
-            </w:r>
-          </w:p>
-        </w:tc>
-        <w:tc>
-          <w:tcPr>
-            <w:tcW w:type="dxa" w:w="4680"/>
-          </w:tcPr>
-          <w:p>
-            <w:r>
-              <w:rPr>
-                <w:rFonts w:ascii="Calibri" w:hAnsi="Calibri"/>
-                <w:sz w:val="22"/>
-              </w:rPr>
-              <w:t>`dataStore.ts` / `localStorage`</w:t>
-            </w:r>
-          </w:p>
-        </w:tc>
-      </w:tr>
-      <w:tr>
-        <w:tc>
-          <w:tcPr>
-            <w:tcW w:type="dxa" w:w="4680"/>
-          </w:tcPr>
-          <w:p>
-            <w:r>
-              <w:rPr>
-                <w:rFonts w:ascii="Calibri" w:hAnsi="Calibri"/>
-                <w:sz w:val="22"/>
-              </w:rPr>
-              <w:t>Algorithms</w:t>
-            </w:r>
-          </w:p>
-        </w:tc>
-        <w:tc>
-          <w:tcPr>
-            <w:tcW w:type="dxa" w:w="4680"/>
-          </w:tcPr>
-          <w:p>
-            <w:r>
-              <w:rPr>
-                <w:rFonts w:ascii="Calibri" w:hAnsi="Calibri"/>
-                <w:sz w:val="22"/>
-              </w:rPr>
-              <w:t>`binUtils.ts` (`getBinStatus`, priority, validation, ID generation)</w:t>
-            </w:r>
-          </w:p>
-        </w:tc>
-      </w:tr>
-      <w:tr>
-        <w:tc>
-          <w:tcPr>
-            <w:tcW w:type="dxa" w:w="4680"/>
-          </w:tcPr>
-          <w:p>
-            <w:r>
-              <w:rPr>
-                <w:rFonts w:ascii="Calibri" w:hAnsi="Calibri"/>
-                <w:sz w:val="22"/>
-              </w:rPr>
-              <w:t>Tests</w:t>
-            </w:r>
-          </w:p>
-        </w:tc>
-        <w:tc>
-          <w:tcPr>
-            <w:tcW w:type="dxa" w:w="4680"/>
-          </w:tcPr>
-          <w:p>
-            <w:r>
-              <w:rPr>
-                <w:rFonts w:ascii="Calibri" w:hAnsi="Calibri"/>
-                <w:sz w:val="22"/>
-              </w:rPr>
-              <w:t>Vitest</w:t>
-            </w:r>
-          </w:p>
-        </w:tc>
-      </w:tr>
-      <w:tr>
-        <w:tc>
-          <w:tcPr>
-            <w:tcW w:type="dxa" w:w="4680"/>
-          </w:tcPr>
-          <w:p>
-            <w:r>
-              <w:rPr>
-                <w:rFonts w:ascii="Calibri" w:hAnsi="Calibri"/>
-                <w:sz w:val="22"/>
-              </w:rPr>
-              <w:t>Quality</w:t>
-            </w:r>
-          </w:p>
-        </w:tc>
-        <w:tc>
-          <w:tcPr>
-            <w:tcW w:type="dxa" w:w="4680"/>
-          </w:tcPr>
-          <w:p>
-            <w:r>
-              <w:rPr>
-                <w:rFonts w:ascii="Calibri" w:hAnsi="Calibri"/>
-                <w:sz w:val="22"/>
-              </w:rPr>
-              <w:t>ESLint 10, GitHub Actions CI (lint, test, build)</w:t>
-            </w:r>
-          </w:p>
-        </w:tc>
-      </w:tr>
-    </w:tbl>
-    <w:p/>
     <w:p>
       <w:pPr>
-        <w:pStyle w:val="Heading2"/>
+        <w:spacing w:after="200" w:before="0" w:line="276" w:lineRule="auto"/>
+        <w:ind w:firstLine="0"/>
       </w:pPr>
       <w:r>
+        <w:rPr>
+          <w:rFonts w:ascii="Calibri" w:hAnsi="Calibri" w:cs="Calibri" w:eastAsia="Calibri"/>
+          <w:b w:val="0"/>
+          <w:i w:val="0"/>
+          <w:sz w:val="24"/>
+        </w:rPr>
+        <w:t>Vitest unit tests validate business-critical logic, such as fill-level boundaries, invalid sensor values, status normalization, priority calculation, report validation, report-reference generation and report-resolution relationships. Testing is used to make sure that the collection completion addresses a report that is explicitly listed against the collected bin and it does not address a different report. ESLint, and a production build process are also part of the project. These controls enhance maintainability and minimize the risk of integration changes to disrupt the key demonstration workflows.</w:t>
+      </w:r>
+    </w:p>
+    <w:p>
+      <w:pPr>
+        <w:spacing w:after="160" w:before="280" w:line="276" w:lineRule="auto"/>
+      </w:pPr>
+      <w:r>
+        <w:rPr>
+          <w:rFonts w:ascii="Calibri" w:hAnsi="Calibri" w:cs="Calibri" w:eastAsia="Calibri"/>
+          <w:b/>
+          <w:i w:val="0"/>
+          <w:sz w:val="28"/>
+        </w:rPr>
         <w:t>3. Technical Challenges</w:t>
       </w:r>
     </w:p>
     <w:p>
+      <w:pPr>
+        <w:spacing w:after="200" w:before="0" w:line="276" w:lineRule="auto"/>
+        <w:ind w:firstLine="0"/>
+      </w:pPr>
       <w:r>
         <w:rPr>
-          <w:rFonts w:ascii="Calibri" w:hAnsi="Calibri"/>
-          <w:b/>
+          <w:rFonts w:ascii="Calibri" w:hAnsi="Calibri" w:cs="Calibri" w:eastAsia="Calibri"/>
+          <w:b w:val="0"/>
+          <w:i w:val="0"/>
           <w:sz w:val="24"/>
         </w:rPr>
-        <w:t>Single source of truth.</w:t>
-      </w:r>
-      <w:r>
-        <w:rPr>
-          <w:rFonts w:ascii="Calibri" w:hAnsi="Calibri"/>
-          <w:sz w:val="24"/>
-        </w:rPr>
-        <w:t xml:space="preserve"> Early screens used static mock arrays, so collecting a bin on the driver view did not update the map or dashboard. The team moved all reads through Context and derived alerts, charts, and queues from that state. Lesson: demo-ready prototypes still need one store if markers, tables, and KPIs must agree.</w:t>
-      </w:r>
-    </w:p>
-    <w:p>
-      <w:r>
-        <w:rPr>
-          <w:rFonts w:ascii="Calibri" w:hAnsi="Calibri"/>
-          <w:b/>
-          <w:sz w:val="24"/>
-        </w:rPr>
-        <w:t>Invalid telemetry.</w:t>
-      </w:r>
-      <w:r>
-        <w:rPr>
-          <w:rFonts w:ascii="Calibri" w:hAnsi="Calibri"/>
-          <w:sz w:val="24"/>
-        </w:rPr>
-        <w:t xml:space="preserve"> Sensor stubs can emit </w:t>
-      </w:r>
-      <w:r>
-        <w:rPr>
-          <w:rFonts w:ascii="Calibri" w:hAnsi="Calibri"/>
-          <w:i/>
-          <w:sz w:val="24"/>
-        </w:rPr>
-        <w:t>null</w:t>
-      </w:r>
-      <w:r>
-        <w:rPr>
-          <w:rFonts w:ascii="Calibri" w:hAnsi="Calibri"/>
-          <w:sz w:val="24"/>
-        </w:rPr>
-        <w:t xml:space="preserve">, </w:t>
-      </w:r>
-      <w:r>
-        <w:rPr>
-          <w:rFonts w:ascii="Calibri" w:hAnsi="Calibri"/>
-          <w:i/>
-          <w:sz w:val="24"/>
-        </w:rPr>
-        <w:t>NaN</w:t>
-      </w:r>
-      <w:r>
-        <w:rPr>
-          <w:rFonts w:ascii="Calibri" w:hAnsi="Calibri"/>
-          <w:sz w:val="24"/>
-        </w:rPr>
-        <w:t xml:space="preserve">, or values outside 0–100. Clamping inside </w:t>
-      </w:r>
-      <w:r>
-        <w:rPr>
-          <w:rFonts w:ascii="Calibri" w:hAnsi="Calibri"/>
-          <w:i/>
-          <w:sz w:val="24"/>
-        </w:rPr>
-        <w:t>getBinStatus</w:t>
-      </w:r>
-      <w:r>
-        <w:rPr>
-          <w:rFonts w:ascii="Calibri" w:hAnsi="Calibri"/>
-          <w:sz w:val="24"/>
-        </w:rPr>
-        <w:t xml:space="preserve"> and the priority function stopped negative percentages and overflow errors from crashing status badges.</w:t>
-      </w:r>
-    </w:p>
-    <w:p>
-      <w:r>
-        <w:rPr>
-          <w:rFonts w:ascii="Calibri" w:hAnsi="Calibri"/>
-          <w:b/>
-          <w:sz w:val="24"/>
-        </w:rPr>
-        <w:t>Report resolution scope.</w:t>
-      </w:r>
-      <w:r>
-        <w:rPr>
-          <w:rFonts w:ascii="Calibri" w:hAnsi="Calibri"/>
-          <w:sz w:val="24"/>
-        </w:rPr>
-        <w:t xml:space="preserve"> A first collection implementation closed every overflow ticket in a suburb. Tests were added so only records with the matching </w:t>
-      </w:r>
-      <w:r>
-        <w:rPr>
-          <w:rFonts w:ascii="Calibri" w:hAnsi="Calibri"/>
-          <w:i/>
-          <w:sz w:val="24"/>
-        </w:rPr>
-        <w:t>binId</w:t>
-      </w:r>
-      <w:r>
-        <w:rPr>
-          <w:rFonts w:ascii="Calibri" w:hAnsi="Calibri"/>
-          <w:sz w:val="24"/>
-        </w:rPr>
-        <w:t xml:space="preserve"> resolve. That rule is now part of the demonstration script (collect </w:t>
-      </w:r>
-      <w:r>
-        <w:rPr>
-          <w:rFonts w:ascii="Calibri" w:hAnsi="Calibri"/>
-          <w:i/>
-          <w:sz w:val="24"/>
-        </w:rPr>
-        <w:t>WDN-104</w:t>
-      </w:r>
-      <w:r>
-        <w:rPr>
-          <w:rFonts w:ascii="Calibri" w:hAnsi="Calibri"/>
-          <w:sz w:val="24"/>
-        </w:rPr>
-        <w:t xml:space="preserve">, confirm </w:t>
-      </w:r>
-      <w:r>
-        <w:rPr>
-          <w:rFonts w:ascii="Calibri" w:hAnsi="Calibri"/>
-          <w:i/>
-          <w:sz w:val="24"/>
-        </w:rPr>
-        <w:t>WST-2026-1001</w:t>
-      </w:r>
-      <w:r>
-        <w:rPr>
-          <w:rFonts w:ascii="Calibri" w:hAnsi="Calibri"/>
-          <w:sz w:val="24"/>
-        </w:rPr>
-        <w:t xml:space="preserve"> in Civic is unchanged unless it points at that bin).</w:t>
-      </w:r>
-    </w:p>
-    <w:p>
-      <w:r>
-        <w:rPr>
-          <w:rFonts w:ascii="Calibri" w:hAnsi="Calibri"/>
-          <w:b/>
-          <w:sz w:val="24"/>
-        </w:rPr>
-        <w:t>Repeatable demos.</w:t>
-      </w:r>
-      <w:r>
-        <w:rPr>
-          <w:rFonts w:ascii="Calibri" w:hAnsi="Calibri"/>
-          <w:sz w:val="24"/>
-        </w:rPr>
-        <w:t xml:space="preserve"> </w:t>
-      </w:r>
-      <w:r>
-        <w:rPr>
-          <w:rFonts w:ascii="Calibri" w:hAnsi="Calibri"/>
-          <w:i/>
-          <w:sz w:val="24"/>
-        </w:rPr>
-        <w:t>localStorage</w:t>
-      </w:r>
-      <w:r>
-        <w:rPr>
-          <w:rFonts w:ascii="Calibri" w:hAnsi="Calibri"/>
-          <w:sz w:val="24"/>
-        </w:rPr>
-        <w:t xml:space="preserve"> made the app feel persistent but left leftover tickets between marking runs. The administrator reset control, plus ticket persistence in the same store, makes the Week 6 walkthrough deterministic.</w:t>
-      </w:r>
-    </w:p>
-    <w:p>
-      <w:r>
-        <w:rPr>
-          <w:rFonts w:ascii="Calibri" w:hAnsi="Calibri"/>
-          <w:b/>
-          <w:sz w:val="24"/>
-        </w:rPr>
-        <w:t>Honest documentation.</w:t>
-      </w:r>
-      <w:r>
-        <w:rPr>
-          <w:rFonts w:ascii="Calibri" w:hAnsi="Calibri"/>
-          <w:sz w:val="24"/>
-        </w:rPr>
-        <w:t xml:space="preserve"> An earlier Word draft described Express, JWT, PostgreSQL, and Leaflet. The implemented stack is a client-side Vite prototype. This report and the GitHub README were rewritten to match the running code so assessors are not shown an architecture that is not in the repository.</w:t>
-      </w:r>
-    </w:p>
-    <w:p>
-      <w:r>
-        <w:rPr>
-          <w:rFonts w:ascii="Calibri" w:hAnsi="Calibri"/>
-          <w:b/>
-          <w:sz w:val="24"/>
-        </w:rPr>
-        <w:t>Collaboration on one repository.</w:t>
-      </w:r>
-      <w:r>
-        <w:rPr>
-          <w:rFonts w:ascii="Calibri" w:hAnsi="Calibri"/>
-          <w:sz w:val="24"/>
-        </w:rPr>
-        <w:t xml:space="preserve"> Five authors committing to shared files (</w:t>
-      </w:r>
-      <w:r>
-        <w:rPr>
-          <w:rFonts w:ascii="Calibri" w:hAnsi="Calibri"/>
-          <w:i/>
-          <w:sz w:val="24"/>
-        </w:rPr>
-        <w:t>App.tsx</w:t>
-      </w:r>
-      <w:r>
-        <w:rPr>
-          <w:rFonts w:ascii="Calibri" w:hAnsi="Calibri"/>
-          <w:sz w:val="24"/>
-        </w:rPr>
-        <w:t xml:space="preserve">, </w:t>
-      </w:r>
-      <w:r>
-        <w:rPr>
-          <w:rFonts w:ascii="Calibri" w:hAnsi="Calibri"/>
-          <w:i/>
-          <w:sz w:val="24"/>
-        </w:rPr>
-        <w:t>dataStore.ts</w:t>
-      </w:r>
-      <w:r>
-        <w:rPr>
-          <w:rFonts w:ascii="Calibri" w:hAnsi="Calibri"/>
-          <w:sz w:val="24"/>
-        </w:rPr>
-        <w:t xml:space="preserve">, CSS) produced merge conflicts. The team adopted module ownership (slide 6), short-lived feature branches, and pull requests with a shared template so review happened before </w:t>
-      </w:r>
-      <w:r>
-        <w:rPr>
-          <w:rFonts w:ascii="Calibri" w:hAnsi="Calibri"/>
-          <w:i/>
-          <w:sz w:val="24"/>
-        </w:rPr>
-        <w:t>develop</w:t>
-      </w:r>
-      <w:r>
-        <w:rPr>
-          <w:rFonts w:ascii="Calibri" w:hAnsi="Calibri"/>
-          <w:sz w:val="24"/>
-        </w:rPr>
-        <w:t xml:space="preserve"> moved. Conventional commit prefixes (</w:t>
-      </w:r>
-      <w:r>
-        <w:rPr>
-          <w:rFonts w:ascii="Calibri" w:hAnsi="Calibri"/>
-          <w:i/>
-          <w:sz w:val="24"/>
-        </w:rPr>
-        <w:t>feat</w:t>
-      </w:r>
-      <w:r>
-        <w:rPr>
-          <w:rFonts w:ascii="Calibri" w:hAnsi="Calibri"/>
-          <w:sz w:val="24"/>
-        </w:rPr>
-        <w:t xml:space="preserve">, </w:t>
-      </w:r>
-      <w:r>
-        <w:rPr>
-          <w:rFonts w:ascii="Calibri" w:hAnsi="Calibri"/>
-          <w:i/>
-          <w:sz w:val="24"/>
-        </w:rPr>
-        <w:t>fix</w:t>
-      </w:r>
-      <w:r>
-        <w:rPr>
-          <w:rFonts w:ascii="Calibri" w:hAnsi="Calibri"/>
-          <w:sz w:val="24"/>
-        </w:rPr>
-        <w:t xml:space="preserve">, </w:t>
-      </w:r>
-      <w:r>
-        <w:rPr>
-          <w:rFonts w:ascii="Calibri" w:hAnsi="Calibri"/>
-          <w:i/>
-          <w:sz w:val="24"/>
-        </w:rPr>
-        <w:t>test</w:t>
-      </w:r>
-      <w:r>
-        <w:rPr>
-          <w:rFonts w:ascii="Calibri" w:hAnsi="Calibri"/>
-          <w:sz w:val="24"/>
-        </w:rPr>
-        <w:t xml:space="preserve">, </w:t>
-      </w:r>
-      <w:r>
-        <w:rPr>
-          <w:rFonts w:ascii="Calibri" w:hAnsi="Calibri"/>
-          <w:i/>
-          <w:sz w:val="24"/>
-        </w:rPr>
-        <w:t>docs</w:t>
-      </w:r>
-      <w:r>
-        <w:rPr>
-          <w:rFonts w:ascii="Calibri" w:hAnsi="Calibri"/>
-          <w:sz w:val="24"/>
-        </w:rPr>
-        <w:t>) make the history readable for the GitHub marking criterion.</w:t>
+        <w:t>Maintaining state consistency was a big technical challenge. Previous development was done with the separation of seed or mock data from the active application state, allowing an update to one screen while another had an out of date value. The answer was to have a single view of runtime state via AppContext and the data service in order to access the same information for dashboard stats, map markers, alerts and collection views. This was an affirmation of the software-engineering concept of having one source of truth in stateful applications.</w:t>
       </w:r>
     </w:p>
     <w:p>
       <w:pPr>
-        <w:pStyle w:val="Heading2"/>
+        <w:spacing w:after="200" w:before="0" w:line="276" w:lineRule="auto"/>
+        <w:ind w:firstLine="0"/>
       </w:pPr>
       <w:r>
-        <w:t>4. GitHub Repository</w:t>
-      </w:r>
-    </w:p>
-    <w:p>
-      <w:r>
         <w:rPr>
-          <w:rFonts w:ascii="Calibri" w:hAnsi="Calibri"/>
+          <w:rFonts w:ascii="Calibri" w:hAnsi="Calibri" w:cs="Calibri" w:eastAsia="Calibri"/>
+          <w:b w:val="0"/>
+          <w:i w:val="0"/>
           <w:sz w:val="24"/>
         </w:rPr>
-        <w:t>Repository: https://github.com/keinithaxinamalai-art/Smart-waste-management-system</w:t>
-      </w:r>
-    </w:p>
-    <w:p>
-      <w:r>
-        <w:rPr>
-          <w:rFonts w:ascii="Calibri" w:hAnsi="Calibri"/>
-          <w:sz w:val="24"/>
-        </w:rPr>
-        <w:t xml:space="preserve">The team used Git feature branches that match presentation slide 6. Each member committed under their own Git author name and email. Integration used pull requests into </w:t>
-      </w:r>
-      <w:r>
-        <w:rPr>
-          <w:rFonts w:ascii="Calibri" w:hAnsi="Calibri"/>
-          <w:i/>
-          <w:sz w:val="24"/>
-        </w:rPr>
-        <w:t>develop</w:t>
-      </w:r>
-      <w:r>
-        <w:rPr>
-          <w:rFonts w:ascii="Calibri" w:hAnsi="Calibri"/>
-          <w:sz w:val="24"/>
-        </w:rPr>
-        <w:t xml:space="preserve"> and then </w:t>
-      </w:r>
-      <w:r>
-        <w:rPr>
-          <w:rFonts w:ascii="Calibri" w:hAnsi="Calibri"/>
-          <w:i/>
-          <w:sz w:val="24"/>
-        </w:rPr>
-        <w:t>main</w:t>
-      </w:r>
-      <w:r>
-        <w:rPr>
-          <w:rFonts w:ascii="Calibri" w:hAnsi="Calibri"/>
-          <w:sz w:val="24"/>
-        </w:rPr>
-        <w:t>.</w:t>
-      </w:r>
-    </w:p>
-    <w:tbl>
-      <w:tblPr>
-        <w:tblStyle w:val="TableGrid"/>
-        <w:tblW w:type="auto" w:w="0"/>
-        <w:tblLook w:firstColumn="1" w:firstRow="1" w:lastColumn="0" w:lastRow="0" w:noHBand="0" w:noVBand="1" w:val="04A0"/>
-      </w:tblPr>
-      <w:tblGrid>
-        <w:gridCol w:w="3120"/>
-        <w:gridCol w:w="3120"/>
-        <w:gridCol w:w="3120"/>
-      </w:tblGrid>
-      <w:tr>
-        <w:tc>
-          <w:tcPr>
-            <w:tcW w:type="dxa" w:w="3120"/>
-          </w:tcPr>
-          <w:p>
-            <w:r>
-              <w:rPr>
-                <w:rFonts w:ascii="Calibri" w:hAnsi="Calibri"/>
-                <w:b/>
-                <w:sz w:val="22"/>
-              </w:rPr>
-              <w:t>Member</w:t>
-            </w:r>
-          </w:p>
-        </w:tc>
-        <w:tc>
-          <w:tcPr>
-            <w:tcW w:type="dxa" w:w="3120"/>
-          </w:tcPr>
-          <w:p>
-            <w:r>
-              <w:rPr>
-                <w:rFonts w:ascii="Calibri" w:hAnsi="Calibri"/>
-                <w:b/>
-                <w:sz w:val="22"/>
-              </w:rPr>
-              <w:t>Branch</w:t>
-            </w:r>
-          </w:p>
-        </w:tc>
-        <w:tc>
-          <w:tcPr>
-            <w:tcW w:type="dxa" w:w="3120"/>
-          </w:tcPr>
-          <w:p>
-            <w:r>
-              <w:rPr>
-                <w:rFonts w:ascii="Calibri" w:hAnsi="Calibri"/>
-                <w:b/>
-                <w:sz w:val="22"/>
-              </w:rPr>
-              <w:t>Merged PR</w:t>
-            </w:r>
-          </w:p>
-        </w:tc>
-      </w:tr>
-      <w:tr>
-        <w:tc>
-          <w:tcPr>
-            <w:tcW w:type="dxa" w:w="3120"/>
-          </w:tcPr>
-          <w:p>
-            <w:r>
-              <w:rPr>
-                <w:rFonts w:ascii="Calibri" w:hAnsi="Calibri"/>
-                <w:sz w:val="22"/>
-              </w:rPr>
-              <w:t>Ayush Ale</w:t>
-            </w:r>
-          </w:p>
-        </w:tc>
-        <w:tc>
-          <w:tcPr>
-            <w:tcW w:type="dxa" w:w="3120"/>
-          </w:tcPr>
-          <w:p>
-            <w:r>
-              <w:rPr>
-                <w:rFonts w:ascii="Calibri" w:hAnsi="Calibri"/>
-                <w:sz w:val="22"/>
-              </w:rPr>
-              <w:t>`ayush-auth-testing`</w:t>
-            </w:r>
-          </w:p>
-        </w:tc>
-        <w:tc>
-          <w:tcPr>
-            <w:tcW w:type="dxa" w:w="3120"/>
-          </w:tcPr>
-          <w:p>
-            <w:r>
-              <w:rPr>
-                <w:rFonts w:ascii="Calibri" w:hAnsi="Calibri"/>
-                <w:sz w:val="22"/>
-              </w:rPr>
-              <w:t>[#1](https://github.com/keinithaxinamalai-art/Smart-waste-management-system/pull/1)</w:t>
-            </w:r>
-          </w:p>
-        </w:tc>
-      </w:tr>
-      <w:tr>
-        <w:tc>
-          <w:tcPr>
-            <w:tcW w:type="dxa" w:w="3120"/>
-          </w:tcPr>
-          <w:p>
-            <w:r>
-              <w:rPr>
-                <w:rFonts w:ascii="Calibri" w:hAnsi="Calibri"/>
-                <w:sz w:val="22"/>
-              </w:rPr>
-              <w:t>Bijay Pokhrel</w:t>
-            </w:r>
-          </w:p>
-        </w:tc>
-        <w:tc>
-          <w:tcPr>
-            <w:tcW w:type="dxa" w:w="3120"/>
-          </w:tcPr>
-          <w:p>
-            <w:r>
-              <w:rPr>
-                <w:rFonts w:ascii="Calibri" w:hAnsi="Calibri"/>
-                <w:sz w:val="22"/>
-              </w:rPr>
-              <w:t>`bijay-admin-dashboard`</w:t>
-            </w:r>
-          </w:p>
-        </w:tc>
-        <w:tc>
-          <w:tcPr>
-            <w:tcW w:type="dxa" w:w="3120"/>
-          </w:tcPr>
-          <w:p>
-            <w:r>
-              <w:rPr>
-                <w:rFonts w:ascii="Calibri" w:hAnsi="Calibri"/>
-                <w:sz w:val="22"/>
-              </w:rPr>
-              <w:t>[#2](https://github.com/keinithaxinamalai-art/Smart-waste-management-system/pull/2)</w:t>
-            </w:r>
-          </w:p>
-        </w:tc>
-      </w:tr>
-      <w:tr>
-        <w:tc>
-          <w:tcPr>
-            <w:tcW w:type="dxa" w:w="3120"/>
-          </w:tcPr>
-          <w:p>
-            <w:r>
-              <w:rPr>
-                <w:rFonts w:ascii="Calibri" w:hAnsi="Calibri"/>
-                <w:sz w:val="22"/>
-              </w:rPr>
-              <w:t>Samir Bhandari</w:t>
-            </w:r>
-          </w:p>
-        </w:tc>
-        <w:tc>
-          <w:tcPr>
-            <w:tcW w:type="dxa" w:w="3120"/>
-          </w:tcPr>
-          <w:p>
-            <w:r>
-              <w:rPr>
-                <w:rFonts w:ascii="Calibri" w:hAnsi="Calibri"/>
-                <w:sz w:val="22"/>
-              </w:rPr>
-              <w:t>`samir-citizen-interface`</w:t>
-            </w:r>
-          </w:p>
-        </w:tc>
-        <w:tc>
-          <w:tcPr>
-            <w:tcW w:type="dxa" w:w="3120"/>
-          </w:tcPr>
-          <w:p>
-            <w:r>
-              <w:rPr>
-                <w:rFonts w:ascii="Calibri" w:hAnsi="Calibri"/>
-                <w:sz w:val="22"/>
-              </w:rPr>
-              <w:t>[#3](https://github.com/keinithaxinamalai-art/Smart-waste-management-system/pull/3)</w:t>
-            </w:r>
-          </w:p>
-        </w:tc>
-      </w:tr>
-      <w:tr>
-        <w:tc>
-          <w:tcPr>
-            <w:tcW w:type="dxa" w:w="3120"/>
-          </w:tcPr>
-          <w:p>
-            <w:r>
-              <w:rPr>
-                <w:rFonts w:ascii="Calibri" w:hAnsi="Calibri"/>
-                <w:sz w:val="22"/>
-              </w:rPr>
-              <w:t>Krishna Trivedi</w:t>
-            </w:r>
-          </w:p>
-        </w:tc>
-        <w:tc>
-          <w:tcPr>
-            <w:tcW w:type="dxa" w:w="3120"/>
-          </w:tcPr>
-          <w:p>
-            <w:r>
-              <w:rPr>
-                <w:rFonts w:ascii="Calibri" w:hAnsi="Calibri"/>
-                <w:sz w:val="22"/>
-              </w:rPr>
-              <w:t>`krishna-database-collection`</w:t>
-            </w:r>
-          </w:p>
-        </w:tc>
-        <w:tc>
-          <w:tcPr>
-            <w:tcW w:type="dxa" w:w="3120"/>
-          </w:tcPr>
-          <w:p>
-            <w:r>
-              <w:rPr>
-                <w:rFonts w:ascii="Calibri" w:hAnsi="Calibri"/>
-                <w:sz w:val="22"/>
-              </w:rPr>
-              <w:t>[#4](https://github.com/keinithaxinamalai-art/Smart-waste-management-system/pull/4)</w:t>
-            </w:r>
-          </w:p>
-        </w:tc>
-      </w:tr>
-      <w:tr>
-        <w:tc>
-          <w:tcPr>
-            <w:tcW w:type="dxa" w:w="3120"/>
-          </w:tcPr>
-          <w:p>
-            <w:r>
-              <w:rPr>
-                <w:rFonts w:ascii="Calibri" w:hAnsi="Calibri"/>
-                <w:sz w:val="22"/>
-              </w:rPr>
-              <w:t>Integration</w:t>
-            </w:r>
-          </w:p>
-        </w:tc>
-        <w:tc>
-          <w:tcPr>
-            <w:tcW w:type="dxa" w:w="3120"/>
-          </w:tcPr>
-          <w:p>
-            <w:r>
-              <w:rPr>
-                <w:rFonts w:ascii="Calibri" w:hAnsi="Calibri"/>
-                <w:sz w:val="22"/>
-              </w:rPr>
-              <w:t>`develop`</w:t>
-            </w:r>
-          </w:p>
-        </w:tc>
-        <w:tc>
-          <w:tcPr>
-            <w:tcW w:type="dxa" w:w="3120"/>
-          </w:tcPr>
-          <w:p>
-            <w:r>
-              <w:rPr>
-                <w:rFonts w:ascii="Calibri" w:hAnsi="Calibri"/>
-                <w:sz w:val="22"/>
-              </w:rPr>
-              <w:t>[#5](https://github.com/keinithaxinamalai-art/Smart-waste-management-system/pull/5)</w:t>
-            </w:r>
-          </w:p>
-        </w:tc>
-      </w:tr>
-      <w:tr>
-        <w:tc>
-          <w:tcPr>
-            <w:tcW w:type="dxa" w:w="3120"/>
-          </w:tcPr>
-          <w:p>
-            <w:r>
-              <w:rPr>
-                <w:rFonts w:ascii="Calibri" w:hAnsi="Calibri"/>
-                <w:sz w:val="22"/>
-              </w:rPr>
-              <w:t>Charanpal Kaur</w:t>
-            </w:r>
-          </w:p>
-        </w:tc>
-        <w:tc>
-          <w:tcPr>
-            <w:tcW w:type="dxa" w:w="3120"/>
-          </w:tcPr>
-          <w:p>
-            <w:r>
-              <w:rPr>
-                <w:rFonts w:ascii="Calibri" w:hAnsi="Calibri"/>
-                <w:sz w:val="22"/>
-              </w:rPr>
-              <w:t>`charanpal-maintenance-analytics`</w:t>
-            </w:r>
-          </w:p>
-        </w:tc>
-        <w:tc>
-          <w:tcPr>
-            <w:tcW w:type="dxa" w:w="3120"/>
-          </w:tcPr>
-          <w:p>
-            <w:r>
-              <w:rPr>
-                <w:rFonts w:ascii="Calibri" w:hAnsi="Calibri"/>
-                <w:sz w:val="22"/>
-              </w:rPr>
-              <w:t>Diagnostics commits on that branch, merged to `main`</w:t>
-            </w:r>
-          </w:p>
-        </w:tc>
-      </w:tr>
-    </w:tbl>
-    <w:p/>
-    <w:p>
-      <w:r>
-        <w:rPr>
-          <w:rFonts w:ascii="Calibri" w:hAnsi="Calibri"/>
-          <w:sz w:val="24"/>
-        </w:rPr>
-        <w:t xml:space="preserve">Commit messages follow </w:t>
-      </w:r>
-      <w:r>
-        <w:rPr>
-          <w:rFonts w:ascii="Calibri" w:hAnsi="Calibri"/>
-          <w:i/>
-          <w:sz w:val="24"/>
-        </w:rPr>
-        <w:t>feat</w:t>
-      </w:r>
-      <w:r>
-        <w:rPr>
-          <w:rFonts w:ascii="Calibri" w:hAnsi="Calibri"/>
-          <w:sz w:val="24"/>
-        </w:rPr>
-        <w:t xml:space="preserve"> / </w:t>
-      </w:r>
-      <w:r>
-        <w:rPr>
-          <w:rFonts w:ascii="Calibri" w:hAnsi="Calibri"/>
-          <w:i/>
-          <w:sz w:val="24"/>
-        </w:rPr>
-        <w:t>fix</w:t>
-      </w:r>
-      <w:r>
-        <w:rPr>
-          <w:rFonts w:ascii="Calibri" w:hAnsi="Calibri"/>
-          <w:sz w:val="24"/>
-        </w:rPr>
-        <w:t xml:space="preserve"> / </w:t>
-      </w:r>
-      <w:r>
-        <w:rPr>
-          <w:rFonts w:ascii="Calibri" w:hAnsi="Calibri"/>
-          <w:i/>
-          <w:sz w:val="24"/>
-        </w:rPr>
-        <w:t>test</w:t>
-      </w:r>
-      <w:r>
-        <w:rPr>
-          <w:rFonts w:ascii="Calibri" w:hAnsi="Calibri"/>
-          <w:sz w:val="24"/>
-        </w:rPr>
-        <w:t xml:space="preserve"> / </w:t>
-      </w:r>
-      <w:r>
-        <w:rPr>
-          <w:rFonts w:ascii="Calibri" w:hAnsi="Calibri"/>
-          <w:i/>
-          <w:sz w:val="24"/>
-        </w:rPr>
-        <w:t>docs</w:t>
-      </w:r>
-      <w:r>
-        <w:rPr>
-          <w:rFonts w:ascii="Calibri" w:hAnsi="Calibri"/>
-          <w:sz w:val="24"/>
-        </w:rPr>
-        <w:t xml:space="preserve"> conventions. GitHub Actions now runs ESLint, Vitest, and the production build on every push and pull request. Issue and pull-request templates map work to the five modules and a Jira key. </w:t>
-      </w:r>
-      <w:r>
-        <w:rPr>
-          <w:rFonts w:ascii="Calibri" w:hAnsi="Calibri"/>
-          <w:i/>
-          <w:sz w:val="24"/>
-        </w:rPr>
-        <w:t>CONTRIBUTING.md</w:t>
-      </w:r>
-      <w:r>
-        <w:rPr>
-          <w:rFonts w:ascii="Calibri" w:hAnsi="Calibri"/>
-          <w:sz w:val="24"/>
-        </w:rPr>
-        <w:t xml:space="preserve"> records the branching rules for the teaching team. Further GitHub evidence (PR table, contribution notes) is in </w:t>
-      </w:r>
-      <w:r>
-        <w:rPr>
-          <w:rFonts w:ascii="Calibri" w:hAnsi="Calibri"/>
-          <w:i/>
-          <w:sz w:val="24"/>
-        </w:rPr>
-        <w:t>docs/GITHUB-EVIDENCE.md</w:t>
-      </w:r>
-      <w:r>
-        <w:rPr>
-          <w:rFonts w:ascii="Calibri" w:hAnsi="Calibri"/>
-          <w:sz w:val="24"/>
-        </w:rPr>
-        <w:t>.</w:t>
+        <w:t>The second challenge was to standardise the business states. Values were replaced or normalised as per the following for new, assigned and resolved respectively: Submitted, Under Review, Scheduled and Resolved, and collection states were standardised separately. No ambiguity with the TypeScript union types and normalisation helpers. Consistency work was done to match the collection threshold so that Moderate bins do not end up on the wrong side of the threshold as required pickups.</w:t>
       </w:r>
     </w:p>
     <w:p>
       <w:pPr>
-        <w:pStyle w:val="Heading2"/>
+        <w:spacing w:after="200" w:before="0" w:line="276" w:lineRule="auto"/>
+        <w:ind w:firstLine="0"/>
       </w:pPr>
       <w:r>
+        <w:rPr>
+          <w:rFonts w:ascii="Calibri" w:hAnsi="Calibri" w:cs="Calibri" w:eastAsia="Calibri"/>
+          <w:b w:val="0"/>
+          <w:i w:val="0"/>
+          <w:sz w:val="24"/>
+        </w:rPr>
+        <w:t>The third challenge was related to the relationship between reports and collections. If all of the same suburb's reports were automatically resolved, when the bin was emptied, then inaccurate data would result. The final implementation thus only solves those reports where the binId is exactly the same as the one collected. This change helped to ensure the integrity of the data and it also created a good automation testing scenario.</w:t>
+      </w:r>
+    </w:p>
+    <w:p>
+      <w:pPr>
+        <w:spacing w:after="200" w:before="0" w:line="276" w:lineRule="auto"/>
+        <w:ind w:firstLine="0"/>
+      </w:pPr>
+      <w:r>
+        <w:rPr>
+          <w:rFonts w:ascii="Calibri" w:hAnsi="Calibri" w:cs="Calibri" w:eastAsia="Calibri"/>
+          <w:b w:val="0"/>
+          <w:i w:val="0"/>
+          <w:sz w:val="24"/>
+        </w:rPr>
+        <w:t>The team also had to keep in mind technical ambition and scope of Iteration 1. Advanced IoT sensing and vehicle-routing optimisation has been shown in the literature, however without the use of physical sensors, or a production backend, this would have resulted in false claims. The final prototype is thus a labeled simulated telemetry with a suggested sequence of priorities instead of the shortest-path or A.I. optimised routing. One of the main takeaways from Iteration 1 was about how important it is to represent accurately what the software actually implements in order to achieve technical credibility.</w:t>
+      </w:r>
+    </w:p>
+    <w:p>
+      <w:pPr>
+        <w:spacing w:after="160" w:before="280" w:line="276" w:lineRule="auto"/>
+      </w:pPr>
+      <w:r>
+        <w:rPr>
+          <w:rFonts w:ascii="Calibri" w:hAnsi="Calibri" w:cs="Calibri" w:eastAsia="Calibri"/>
+          <w:b/>
+          <w:i w:val="0"/>
+          <w:sz w:val="28"/>
+        </w:rPr>
+        <w:t>4. GitHub Repository and Team Contributions</w:t>
+      </w:r>
+    </w:p>
+    <w:p>
+      <w:pPr>
+        <w:spacing w:after="200" w:before="0" w:line="276" w:lineRule="auto"/>
+        <w:ind w:firstLine="0"/>
+      </w:pPr>
+      <w:r>
+        <w:rPr>
+          <w:rFonts w:ascii="Calibri" w:hAnsi="Calibri" w:cs="Calibri" w:eastAsia="Calibri"/>
+          <w:b w:val="0"/>
+          <w:i w:val="0"/>
+          <w:sz w:val="24"/>
+        </w:rPr>
+        <w:t>Source-control and evidence of technical contribution was kept in GitHub. The working Canberra SmartWaste repository is https://github.com/keinithaxinamalai-art/Smart-waste-management-system. The branching strategy involves three main branches: main - the stable release branch, develop - the integration branch, and feature branches for individual features that will be developed. This will make it less likely to break the demonstration build and will make it easier to check out the contribution history at each module level.</w:t>
+      </w:r>
+    </w:p>
+    <w:p>
+      <w:pPr>
+        <w:spacing w:after="200" w:before="0" w:line="276" w:lineRule="auto"/>
+        <w:ind w:firstLine="0"/>
+      </w:pPr>
+      <w:r>
+        <w:rPr>
+          <w:rFonts w:ascii="Calibri" w:hAnsi="Calibri" w:cs="Calibri" w:eastAsia="Calibri"/>
+          <w:b w:val="0"/>
+          <w:i w:val="0"/>
+          <w:sz w:val="24"/>
+        </w:rPr>
+        <w:t>The major branches are bijay-admin-dashboard, samir-citizen-interface, krishna-database-collection, ayush-auth-testing and charanpal-maintenance-analytics. Bijay worked on the admin/dashboard functionality and project coordination, Samir on the Citizen Reporting interface and validation, Krishna on the data models and persistence and algorithms for data collection, Ayush on authentication, shared-state integration and testing, and Charanpal on smart bin sensor diagnostics and maintenance functionality. Commit history has entries for changes in these areas, and the changes are successfully merged into develop and then into main.</w:t>
+      </w:r>
+    </w:p>
+    <w:p>
+      <w:pPr>
+        <w:spacing w:after="200" w:before="0" w:line="276" w:lineRule="auto"/>
+        <w:ind w:firstLine="0"/>
+      </w:pPr>
+      <w:r>
+        <w:rPr>
+          <w:rFonts w:ascii="Calibri" w:hAnsi="Calibri" w:cs="Calibri" w:eastAsia="Calibri"/>
+          <w:b w:val="0"/>
+          <w:i w:val="0"/>
+          <w:sz w:val="24"/>
+        </w:rPr>
+        <w:t>Coordinating day-to-day communication and sharing of resources was done via Google Chat, while GitHub was the definitive code and version-control history. This separation guaranteed that informal communication did not replace the evidence of development that was traceable.</w:t>
+      </w:r>
+    </w:p>
+    <w:p>
+      <w:pPr>
+        <w:spacing w:after="160" w:before="280" w:line="276" w:lineRule="auto"/>
+      </w:pPr>
+      <w:r>
+        <w:rPr>
+          <w:rFonts w:ascii="Calibri" w:hAnsi="Calibri" w:cs="Calibri" w:eastAsia="Calibri"/>
+          <w:b/>
+          <w:i w:val="0"/>
+          <w:sz w:val="28"/>
+        </w:rPr>
         <w:t>5. Jira Project Management</w:t>
       </w:r>
     </w:p>
     <w:p>
+      <w:pPr>
+        <w:spacing w:after="200" w:before="0" w:line="276" w:lineRule="auto"/>
+        <w:ind w:firstLine="0"/>
+      </w:pPr>
       <w:r>
         <w:rPr>
-          <w:rFonts w:ascii="Calibri" w:hAnsi="Calibri"/>
+          <w:rFonts w:ascii="Calibri" w:hAnsi="Calibri" w:cs="Calibri" w:eastAsia="Calibri"/>
+          <w:b w:val="0"/>
+          <w:i w:val="0"/>
           <w:sz w:val="24"/>
         </w:rPr>
-        <w:t>Jira is the planning system of record for Iteration 1. Epics follow the same five domains as GitHub branches so a story, a branch, and a pull request stay aligned (presentation slides 6 and 9).</w:t>
-      </w:r>
-    </w:p>
-    <w:tbl>
-      <w:tblPr>
-        <w:tblStyle w:val="TableGrid"/>
-        <w:tblW w:type="auto" w:w="0"/>
-        <w:tblLook w:firstColumn="1" w:firstRow="1" w:lastColumn="0" w:lastRow="0" w:noHBand="0" w:noVBand="1" w:val="04A0"/>
-      </w:tblPr>
-      <w:tblGrid>
-        <w:gridCol w:w="3120"/>
-        <w:gridCol w:w="3120"/>
-        <w:gridCol w:w="3120"/>
-      </w:tblGrid>
-      <w:tr>
-        <w:tc>
-          <w:tcPr>
-            <w:tcW w:type="dxa" w:w="3120"/>
-          </w:tcPr>
-          <w:p>
-            <w:r>
-              <w:rPr>
-                <w:rFonts w:ascii="Calibri" w:hAnsi="Calibri"/>
-                <w:b/>
-                <w:sz w:val="22"/>
-              </w:rPr>
-              <w:t>Epic</w:t>
-            </w:r>
-          </w:p>
-        </w:tc>
-        <w:tc>
-          <w:tcPr>
-            <w:tcW w:type="dxa" w:w="3120"/>
-          </w:tcPr>
-          <w:p>
-            <w:r>
-              <w:rPr>
-                <w:rFonts w:ascii="Calibri" w:hAnsi="Calibri"/>
-                <w:b/>
-                <w:sz w:val="22"/>
-              </w:rPr>
-              <w:t>Example stories</w:t>
-            </w:r>
-          </w:p>
-        </w:tc>
-        <w:tc>
-          <w:tcPr>
-            <w:tcW w:type="dxa" w:w="3120"/>
-          </w:tcPr>
-          <w:p>
-            <w:r>
-              <w:rPr>
-                <w:rFonts w:ascii="Calibri" w:hAnsi="Calibri"/>
-                <w:b/>
-                <w:sz w:val="22"/>
-              </w:rPr>
-              <w:t>Branch</w:t>
-            </w:r>
-          </w:p>
-        </w:tc>
-      </w:tr>
-      <w:tr>
-        <w:tc>
-          <w:tcPr>
-            <w:tcW w:type="dxa" w:w="3120"/>
-          </w:tcPr>
-          <w:p>
-            <w:r>
-              <w:rPr>
-                <w:rFonts w:ascii="Calibri" w:hAnsi="Calibri"/>
-                <w:sz w:val="22"/>
-              </w:rPr>
-              <w:t>Admin Management</w:t>
-            </w:r>
-          </w:p>
-        </w:tc>
-        <w:tc>
-          <w:tcPr>
-            <w:tcW w:type="dxa" w:w="3120"/>
-          </w:tcPr>
-          <w:p>
-            <w:r>
-              <w:rPr>
-                <w:rFonts w:ascii="Calibri" w:hAnsi="Calibri"/>
-                <w:sz w:val="22"/>
-              </w:rPr>
-              <w:t>Critical-bin spotlight; role labels; demo reset</w:t>
-            </w:r>
-          </w:p>
-        </w:tc>
-        <w:tc>
-          <w:tcPr>
-            <w:tcW w:type="dxa" w:w="3120"/>
-          </w:tcPr>
-          <w:p>
-            <w:r>
-              <w:rPr>
-                <w:rFonts w:ascii="Calibri" w:hAnsi="Calibri"/>
-                <w:sz w:val="22"/>
-              </w:rPr>
-              <w:t>`bijay-admin-dashboard`</w:t>
-            </w:r>
-          </w:p>
-        </w:tc>
-      </w:tr>
-      <w:tr>
-        <w:tc>
-          <w:tcPr>
-            <w:tcW w:type="dxa" w:w="3120"/>
-          </w:tcPr>
-          <w:p>
-            <w:r>
-              <w:rPr>
-                <w:rFonts w:ascii="Calibri" w:hAnsi="Calibri"/>
-                <w:sz w:val="22"/>
-              </w:rPr>
-              <w:t>Session &amp; Testing</w:t>
-            </w:r>
-          </w:p>
-        </w:tc>
-        <w:tc>
-          <w:tcPr>
-            <w:tcW w:type="dxa" w:w="3120"/>
-          </w:tcPr>
-          <w:p>
-            <w:r>
-              <w:rPr>
-                <w:rFonts w:ascii="Calibri" w:hAnsi="Calibri"/>
-                <w:sz w:val="22"/>
-              </w:rPr>
-              <w:t>Unauthenticated start; demo login validation; Vitest suite</w:t>
-            </w:r>
-          </w:p>
-        </w:tc>
-        <w:tc>
-          <w:tcPr>
-            <w:tcW w:type="dxa" w:w="3120"/>
-          </w:tcPr>
-          <w:p>
-            <w:r>
-              <w:rPr>
-                <w:rFonts w:ascii="Calibri" w:hAnsi="Calibri"/>
-                <w:sz w:val="22"/>
-              </w:rPr>
-              <w:t>`ayush-auth-testing`</w:t>
-            </w:r>
-          </w:p>
-        </w:tc>
-      </w:tr>
-      <w:tr>
-        <w:tc>
-          <w:tcPr>
-            <w:tcW w:type="dxa" w:w="3120"/>
-          </w:tcPr>
-          <w:p>
-            <w:r>
-              <w:rPr>
-                <w:rFonts w:ascii="Calibri" w:hAnsi="Calibri"/>
-                <w:sz w:val="22"/>
-              </w:rPr>
-              <w:t>Citizen Reporting</w:t>
-            </w:r>
-          </w:p>
-        </w:tc>
-        <w:tc>
-          <w:tcPr>
-            <w:tcW w:type="dxa" w:w="3120"/>
-          </w:tcPr>
-          <w:p>
-            <w:r>
-              <w:rPr>
-                <w:rFonts w:ascii="Calibri" w:hAnsi="Calibri"/>
-                <w:sz w:val="22"/>
-              </w:rPr>
-              <w:t>ACT suburbs; whitespace validation; `WST-2026-XXXX`</w:t>
-            </w:r>
-          </w:p>
-        </w:tc>
-        <w:tc>
-          <w:tcPr>
-            <w:tcW w:type="dxa" w:w="3120"/>
-          </w:tcPr>
-          <w:p>
-            <w:r>
-              <w:rPr>
-                <w:rFonts w:ascii="Calibri" w:hAnsi="Calibri"/>
-                <w:sz w:val="22"/>
-              </w:rPr>
-              <w:t>`samir-citizen-interface`</w:t>
-            </w:r>
-          </w:p>
-        </w:tc>
-      </w:tr>
-      <w:tr>
-        <w:tc>
-          <w:tcPr>
-            <w:tcW w:type="dxa" w:w="3120"/>
-          </w:tcPr>
-          <w:p>
-            <w:r>
-              <w:rPr>
-                <w:rFonts w:ascii="Calibri" w:hAnsi="Calibri"/>
-                <w:sz w:val="22"/>
-              </w:rPr>
-              <w:t>Data Persistence</w:t>
-            </w:r>
-          </w:p>
-        </w:tc>
-        <w:tc>
-          <w:tcPr>
-            <w:tcW w:type="dxa" w:w="3120"/>
-          </w:tcPr>
-          <w:p>
-            <w:r>
-              <w:rPr>
-                <w:rFonts w:ascii="Calibri" w:hAnsi="Calibri"/>
-                <w:sz w:val="22"/>
-              </w:rPr>
-              <w:t>Domain types; `localStorage` store; priority formula</w:t>
-            </w:r>
-          </w:p>
-        </w:tc>
-        <w:tc>
-          <w:tcPr>
-            <w:tcW w:type="dxa" w:w="3120"/>
-          </w:tcPr>
-          <w:p>
-            <w:r>
-              <w:rPr>
-                <w:rFonts w:ascii="Calibri" w:hAnsi="Calibri"/>
-                <w:sz w:val="22"/>
-              </w:rPr>
-              <w:t>`krishna-database-collection`</w:t>
-            </w:r>
-          </w:p>
-        </w:tc>
-      </w:tr>
-      <w:tr>
-        <w:tc>
-          <w:tcPr>
-            <w:tcW w:type="dxa" w:w="3120"/>
-          </w:tcPr>
-          <w:p>
-            <w:r>
-              <w:rPr>
-                <w:rFonts w:ascii="Calibri" w:hAnsi="Calibri"/>
-                <w:sz w:val="22"/>
-              </w:rPr>
-              <w:t>Operations &amp; Maintenance</w:t>
-            </w:r>
-          </w:p>
-        </w:tc>
-        <w:tc>
-          <w:tcPr>
-            <w:tcW w:type="dxa" w:w="3120"/>
-          </w:tcPr>
-          <w:p>
-            <w:r>
-              <w:rPr>
-                <w:rFonts w:ascii="Calibri" w:hAnsi="Calibri"/>
-                <w:sz w:val="22"/>
-              </w:rPr>
-              <w:t>Sensor faults; lid-jam tickets; Open/In Progress/Resolved</w:t>
-            </w:r>
-          </w:p>
-        </w:tc>
-        <w:tc>
-          <w:tcPr>
-            <w:tcW w:type="dxa" w:w="3120"/>
-          </w:tcPr>
-          <w:p>
-            <w:r>
-              <w:rPr>
-                <w:rFonts w:ascii="Calibri" w:hAnsi="Calibri"/>
-                <w:sz w:val="22"/>
-              </w:rPr>
-              <w:t>`charanpal-maintenance-analytics`</w:t>
-            </w:r>
-          </w:p>
-        </w:tc>
-      </w:tr>
-    </w:tbl>
-    <w:p/>
-    <w:p>
-      <w:r>
-        <w:rPr>
-          <w:rFonts w:ascii="Calibri" w:hAnsi="Calibri"/>
-          <w:sz w:val="24"/>
-        </w:rPr>
-        <w:t>The Iteration 1 sprint board uses To Do, In Progress, and Done. Each story has an assignee, acceptance criteria, and a link (or key) recorded on the matching GitHub pull request. Export the sprint summary or burndown chart from Jira for the Moodle ZIP so the 5-mark project-management criterion has visual evidence.</w:t>
-      </w:r>
-    </w:p>
-    <w:p>
-      <w:r>
-        <w:rPr>
-          <w:rFonts w:ascii="Calibri" w:hAnsi="Calibri"/>
-          <w:sz w:val="24"/>
-        </w:rPr>
-        <w:t>GitHub issue templates include a Jira key field so defects found during rehearsal can be copied back to the backlog. Remaining Iteration 2 work already sitting in Jira includes live IoT telemetry, a hosted database, and geospatial route optimisation.</w:t>
+        <w:t>Jira is the formal record of the task-management during the Iteration 1. The backlog is structured in the same way as the work packages are at GitHub: authentication and access control, citizen reporting, data and business algorithms, administrator monitoring, collection management, maintenance and diagnostics, integration testing, and assessment preparation. Issues are logged and clearly described, prioritised and have acceptance criteria as well as workflow status set to the member who is responsible for the module.</w:t>
       </w:r>
     </w:p>
     <w:p>
       <w:pPr>
-        <w:pStyle w:val="Heading2"/>
+        <w:spacing w:after="200" w:before="0" w:line="276" w:lineRule="auto"/>
+        <w:ind w:firstLine="0"/>
       </w:pPr>
       <w:r>
-        <w:t>6. Project Demonstration</w:t>
-      </w:r>
-    </w:p>
-    <w:p>
-      <w:r>
         <w:rPr>
-          <w:rFonts w:ascii="Calibri" w:hAnsi="Calibri"/>
+          <w:rFonts w:ascii="Calibri" w:hAnsi="Calibri" w:cs="Calibri" w:eastAsia="Calibri"/>
+          <w:b w:val="0"/>
+          <w:i w:val="0"/>
           <w:sz w:val="24"/>
         </w:rPr>
-        <w:t>The 10-minute live demonstration (plus 5-minute questions) follows README stages A–I and should be split equally among team members:</w:t>
+        <w:t>During the Iteration 1 sprint, there is a separation between To Do and In Progress and Done work in order to allow a review of the work being done on the project, instead of describing it only in the final report. Current development issues are role-based prototype login, citizen reporting, status of the reports, central persistence service, classification of the smart bins, collection priority logic, dashboard integration, map and alert synchronisation, collection execution, maintenance acknowledgement and core automated tests.</w:t>
       </w:r>
     </w:p>
     <w:p>
       <w:pPr>
-        <w:pStyle w:val="ListNumber"/>
+        <w:spacing w:after="200" w:before="0" w:line="276" w:lineRule="auto"/>
+        <w:ind w:firstLine="0"/>
       </w:pPr>
       <w:r>
         <w:rPr>
-          <w:rFonts w:ascii="Calibri" w:hAnsi="Calibri"/>
-          <w:b/>
+          <w:rFonts w:ascii="Calibri" w:hAnsi="Calibri" w:cs="Calibri" w:eastAsia="Calibri"/>
+          <w:b w:val="0"/>
+          <w:i w:val="0"/>
           <w:sz w:val="24"/>
         </w:rPr>
-        <w:t>Unauthenticated start</w:t>
-      </w:r>
-      <w:r>
-        <w:rPr>
-          <w:rFonts w:ascii="Calibri" w:hAnsi="Calibri"/>
-          <w:sz w:val="24"/>
-        </w:rPr>
-        <w:t xml:space="preserve"> — login is required; admin URLs are blocked.</w:t>
+        <w:t>The other assessment related activities are report finalisation, preparing presentation and rehearsing for Jira evidence capture and demonstration. Having these tasks all in one board gives you a good overview of completed milestones, and of outstanding work. It also enables the teaching team to map the ownership of the tasks in Jira to the branches and contributions done in GitHub, thus giving traceability between the planning, implementation, and delivered software.</w:t>
       </w:r>
     </w:p>
     <w:p>
       <w:pPr>
-        <w:pStyle w:val="ListNumber"/>
+        <w:spacing w:after="160" w:before="280" w:line="276" w:lineRule="auto"/>
       </w:pPr>
       <w:r>
         <w:rPr>
-          <w:rFonts w:ascii="Calibri" w:hAnsi="Calibri"/>
+          <w:rFonts w:ascii="Calibri" w:hAnsi="Calibri" w:cs="Calibri" w:eastAsia="Calibri"/>
           <w:b/>
-          <w:sz w:val="24"/>
+          <w:i w:val="0"/>
+          <w:sz w:val="28"/>
         </w:rPr>
-        <w:t>Citizen intake</w:t>
-      </w:r>
-      <w:r>
-        <w:rPr>
-          <w:rFonts w:ascii="Calibri" w:hAnsi="Calibri"/>
-          <w:sz w:val="24"/>
-        </w:rPr>
-        <w:t xml:space="preserve"> — empty submit is rejected; a Canberra City report receives </w:t>
-      </w:r>
-      <w:r>
-        <w:rPr>
-          <w:rFonts w:ascii="Calibri" w:hAnsi="Calibri"/>
-          <w:i/>
-          <w:sz w:val="24"/>
-        </w:rPr>
-        <w:t>WST-2026-XXXX</w:t>
-      </w:r>
-      <w:r>
-        <w:rPr>
-          <w:rFonts w:ascii="Calibri" w:hAnsi="Calibri"/>
-          <w:sz w:val="24"/>
-        </w:rPr>
-        <w:t>.</w:t>
+        <w:t>6. Demonstration, Completed Milestones and Remaining Work</w:t>
       </w:r>
     </w:p>
     <w:p>
       <w:pPr>
-        <w:pStyle w:val="ListNumber"/>
+        <w:spacing w:after="200" w:before="0" w:line="276" w:lineRule="auto"/>
+        <w:ind w:firstLine="0"/>
       </w:pPr>
       <w:r>
         <w:rPr>
-          <w:rFonts w:ascii="Calibri" w:hAnsi="Calibri"/>
-          <w:b/>
+          <w:rFonts w:ascii="Calibri" w:hAnsi="Calibri" w:cs="Calibri" w:eastAsia="Calibri"/>
+          <w:b w:val="0"/>
+          <w:i w:val="0"/>
           <w:sz w:val="24"/>
         </w:rPr>
-        <w:t>Administrator review</w:t>
-      </w:r>
-      <w:r>
-        <w:rPr>
-          <w:rFonts w:ascii="Calibri" w:hAnsi="Calibri"/>
-          <w:sz w:val="24"/>
-        </w:rPr>
-        <w:t xml:space="preserve"> — status moves to Under Review then Scheduled.</w:t>
+        <w:t>Week 6 will NOT be a series of separate screens, but will be an end-to-end workflow. Each of the 5 team members will have 2 minutes to present with 5 minutes for questions after the 10 minute presentation. The demonstration includes unauthenticated access, citizen report submission and tracking, administrator review, smart-bin classification and priority logic, collection assignment, staff collection completion, dashboard/synchronisation with map/alerts, maintenance diagnostics and reset of demonstration data.</w:t>
       </w:r>
     </w:p>
     <w:p>
       <w:pPr>
-        <w:pStyle w:val="ListNumber"/>
+        <w:spacing w:after="200" w:before="0" w:line="276" w:lineRule="auto"/>
+        <w:ind w:firstLine="0"/>
       </w:pPr>
       <w:r>
         <w:rPr>
-          <w:rFonts w:ascii="Calibri" w:hAnsi="Calibri"/>
-          <w:b/>
+          <w:rFonts w:ascii="Calibri" w:hAnsi="Calibri" w:cs="Calibri" w:eastAsia="Calibri"/>
+          <w:b w:val="0"/>
+          <w:i w:val="0"/>
           <w:sz w:val="24"/>
         </w:rPr>
-        <w:t>Citizen sync</w:t>
-      </w:r>
-      <w:r>
-        <w:rPr>
-          <w:rFonts w:ascii="Calibri" w:hAnsi="Calibri"/>
-          <w:sz w:val="24"/>
-        </w:rPr>
-        <w:t xml:space="preserve"> — history shows Scheduled.</w:t>
+        <w:t>For the presentation we will open https://keinithaxinamalai-art.github.io/Smart-waste-management-system/ on the projector. If that link is still not live (GitHub Pages has to be turned on in Settings, see the README), we can run npm run demo on a laptop and open http://localhost:5173/. A timed script is in DEMO.md.</w:t>
       </w:r>
     </w:p>
     <w:p>
       <w:pPr>
-        <w:pStyle w:val="ListNumber"/>
+        <w:spacing w:after="200" w:before="0" w:line="276" w:lineRule="auto"/>
+        <w:ind w:firstLine="0"/>
       </w:pPr>
       <w:r>
         <w:rPr>
-          <w:rFonts w:ascii="Calibri" w:hAnsi="Calibri"/>
-          <w:b/>
+          <w:rFonts w:ascii="Calibri" w:hAnsi="Calibri" w:cs="Calibri" w:eastAsia="Calibri"/>
+          <w:b w:val="0"/>
+          <w:i w:val="0"/>
           <w:sz w:val="24"/>
         </w:rPr>
-        <w:t>Telemetry</w:t>
-      </w:r>
-      <w:r>
-        <w:rPr>
-          <w:rFonts w:ascii="Calibri" w:hAnsi="Calibri"/>
-          <w:sz w:val="24"/>
-        </w:rPr>
-        <w:t xml:space="preserve"> — map and table show all four fill-level tiers.</w:t>
+        <w:t>Iteration 1 milestones are achieved at prototype: three roles, persistent demonstration data, citizen to administrator flow of reports, deterministic collection decisions, collection execution and integrated monitoring. The following versions should include real telemetry and/or API-based IoT data, a backend database and production grade authentication, real geospatial mapping and notifications, and explore advanced vehicle-routing optimisation. The above-mentioned future directions are in line with the latest research on smart waste systems using IoT technology and dynamic waste collection (Addas et al., 2024; Hess et al., 2024), and are definitely not covered by the prototype mentioned in Iteration 1.</w:t>
       </w:r>
     </w:p>
     <w:p>
       <w:pPr>
-        <w:pStyle w:val="ListNumber"/>
+        <w:spacing w:after="160" w:before="280" w:line="276" w:lineRule="auto"/>
       </w:pPr>
       <w:r>
         <w:rPr>
-          <w:rFonts w:ascii="Calibri" w:hAnsi="Calibri"/>
+          <w:rFonts w:ascii="Calibri" w:hAnsi="Calibri" w:cs="Calibri" w:eastAsia="Calibri"/>
           <w:b/>
-          <w:sz w:val="24"/>
+          <w:i w:val="0"/>
+          <w:sz w:val="28"/>
         </w:rPr>
-        <w:t>Consistency</w:t>
-      </w:r>
-      <w:r>
-        <w:rPr>
-          <w:rFonts w:ascii="Calibri" w:hAnsi="Calibri"/>
-          <w:sz w:val="24"/>
-        </w:rPr>
-        <w:t xml:space="preserve"> — </w:t>
-      </w:r>
-      <w:r>
-        <w:rPr>
-          <w:rFonts w:ascii="Calibri" w:hAnsi="Calibri"/>
-          <w:i/>
-          <w:sz w:val="24"/>
-        </w:rPr>
-        <w:t>WDN-104</w:t>
-      </w:r>
-      <w:r>
-        <w:rPr>
-          <w:rFonts w:ascii="Calibri" w:hAnsi="Calibri"/>
-          <w:sz w:val="24"/>
-        </w:rPr>
-        <w:t xml:space="preserve"> at 92% is Critical on map and dashboard.</w:t>
+        <w:t>References</w:t>
       </w:r>
     </w:p>
     <w:p>
       <w:pPr>
-        <w:pStyle w:val="ListNumber"/>
+        <w:spacing w:after="160" w:before="0" w:line="276" w:lineRule="auto"/>
+        <w:ind w:left="720" w:hanging="720"/>
       </w:pPr>
       <w:r>
         <w:rPr>
-          <w:rFonts w:ascii="Calibri" w:hAnsi="Calibri"/>
-          <w:b/>
+          <w:rFonts w:ascii="Calibri" w:hAnsi="Calibri" w:cs="Calibri" w:eastAsia="Calibri"/>
+          <w:b w:val="0"/>
+          <w:i w:val="0"/>
           <w:sz w:val="24"/>
         </w:rPr>
-        <w:t>Collection</w:t>
+        <w:t xml:space="preserve">Addas, A., Khan, M. N., &amp; Naseer, F. (2024). Waste management 2.0 leveraging internet of things for an efficient and eco-friendly smart city solution. </w:t>
       </w:r>
       <w:r>
         <w:rPr>
-          <w:rFonts w:ascii="Calibri" w:hAnsi="Calibri"/>
+          <w:rFonts w:ascii="Calibri" w:hAnsi="Calibri" w:cs="Calibri" w:eastAsia="Calibri"/>
+          <w:b w:val="0"/>
+          <w:i/>
           <w:sz w:val="24"/>
         </w:rPr>
-        <w:t xml:space="preserve"> — staff mark </w:t>
+        <w:t>PLOS ONE, 19</w:t>
       </w:r>
       <w:r>
         <w:rPr>
-          <w:rFonts w:ascii="Calibri" w:hAnsi="Calibri"/>
-          <w:i/>
+          <w:rFonts w:ascii="Calibri" w:hAnsi="Calibri" w:cs="Calibri" w:eastAsia="Calibri"/>
+          <w:b w:val="0"/>
+          <w:i w:val="0"/>
           <w:sz w:val="24"/>
         </w:rPr>
-        <w:t>WDN-104</w:t>
-      </w:r>
-      <w:r>
-        <w:rPr>
-          <w:rFonts w:ascii="Calibri" w:hAnsi="Calibri"/>
-          <w:sz w:val="24"/>
-        </w:rPr>
-        <w:t xml:space="preserve"> collected; fill becomes 5% Normal.</w:t>
+        <w:t>(7), e0307608. https://doi.org/10.1371/journal.pone.0307608</w:t>
       </w:r>
     </w:p>
     <w:p>
       <w:pPr>
-        <w:pStyle w:val="ListNumber"/>
+        <w:spacing w:after="160" w:before="0" w:line="276" w:lineRule="auto"/>
+        <w:ind w:left="720" w:hanging="720"/>
       </w:pPr>
       <w:r>
         <w:rPr>
-          <w:rFonts w:ascii="Calibri" w:hAnsi="Calibri"/>
-          <w:b/>
+          <w:rFonts w:ascii="Calibri" w:hAnsi="Calibri" w:cs="Calibri" w:eastAsia="Calibri"/>
+          <w:b w:val="0"/>
+          <w:i w:val="0"/>
           <w:sz w:val="24"/>
         </w:rPr>
-        <w:t>Cross-screen update</w:t>
+        <w:t xml:space="preserve">An, Y., Qiu, J., &amp; Dong, Z. Y. (2022). Smart waste management system for decision makers by using smart bins: A case study for an Australian municipality. </w:t>
       </w:r>
       <w:r>
         <w:rPr>
-          <w:rFonts w:ascii="Calibri" w:hAnsi="Calibri"/>
+          <w:rFonts w:ascii="Calibri" w:hAnsi="Calibri" w:cs="Calibri" w:eastAsia="Calibri"/>
+          <w:b w:val="0"/>
+          <w:i/>
           <w:sz w:val="24"/>
         </w:rPr>
-        <w:t xml:space="preserve"> — dashboard, alerts, and map agree.</w:t>
+        <w:t>Australian Journal of Civil Engineering, 20</w:t>
+      </w:r>
+      <w:r>
+        <w:rPr>
+          <w:rFonts w:ascii="Calibri" w:hAnsi="Calibri" w:cs="Calibri" w:eastAsia="Calibri"/>
+          <w:b w:val="0"/>
+          <w:i w:val="0"/>
+          <w:sz w:val="24"/>
+        </w:rPr>
+        <w:t>(2), 454–459. https://doi.org/10.1080/14488353.2021.2024329</w:t>
       </w:r>
     </w:p>
     <w:p>
       <w:pPr>
-        <w:pStyle w:val="ListNumber"/>
+        <w:spacing w:after="160" w:before="0" w:line="276" w:lineRule="auto"/>
+        <w:ind w:left="720" w:hanging="720"/>
       </w:pPr>
       <w:r>
         <w:rPr>
-          <w:rFonts w:ascii="Calibri" w:hAnsi="Calibri"/>
-          <w:b/>
+          <w:rFonts w:ascii="Calibri" w:hAnsi="Calibri" w:cs="Calibri" w:eastAsia="Calibri"/>
+          <w:b w:val="0"/>
+          <w:i w:val="0"/>
           <w:sz w:val="24"/>
         </w:rPr>
-        <w:t>Maintenance</w:t>
+        <w:t xml:space="preserve">Ghahramani, M., Zhou, M., Molter, A., &amp; Pilla, F. (2022). IoT-based route recommendation for an intelligent waste management system. </w:t>
       </w:r>
       <w:r>
         <w:rPr>
-          <w:rFonts w:ascii="Calibri" w:hAnsi="Calibri"/>
+          <w:rFonts w:ascii="Calibri" w:hAnsi="Calibri" w:cs="Calibri" w:eastAsia="Calibri"/>
+          <w:b w:val="0"/>
+          <w:i/>
           <w:sz w:val="24"/>
         </w:rPr>
-        <w:t xml:space="preserve"> — start work on an Open sensor ticket; resolve the lid-jam work order.</w:t>
+        <w:t>IEEE Internet of Things Journal, 9</w:t>
+      </w:r>
+      <w:r>
+        <w:rPr>
+          <w:rFonts w:ascii="Calibri" w:hAnsi="Calibri" w:cs="Calibri" w:eastAsia="Calibri"/>
+          <w:b w:val="0"/>
+          <w:i w:val="0"/>
+          <w:sz w:val="24"/>
+        </w:rPr>
+        <w:t>(14), 11883–11892. https://arxiv.org/abs/2201.00180</w:t>
       </w:r>
     </w:p>
     <w:p>
       <w:pPr>
-        <w:pStyle w:val="ListNumber"/>
+        <w:spacing w:after="160" w:before="0" w:line="276" w:lineRule="auto"/>
+        <w:ind w:left="720" w:hanging="720"/>
       </w:pPr>
       <w:r>
         <w:rPr>
-          <w:rFonts w:ascii="Calibri" w:hAnsi="Calibri"/>
-          <w:b/>
+          <w:rFonts w:ascii="Calibri" w:hAnsi="Calibri" w:cs="Calibri" w:eastAsia="Calibri"/>
+          <w:b w:val="0"/>
+          <w:i w:val="0"/>
           <w:sz w:val="24"/>
         </w:rPr>
-        <w:t>Reset</w:t>
+        <w:t xml:space="preserve">Hess, C., Dragomir, A. G., Doerner, K. F., &amp; Vigo, D. (2024). Waste collection routing: A survey on problems and methods. </w:t>
       </w:r>
       <w:r>
         <w:rPr>
-          <w:rFonts w:ascii="Calibri" w:hAnsi="Calibri"/>
+          <w:rFonts w:ascii="Calibri" w:hAnsi="Calibri" w:cs="Calibri" w:eastAsia="Calibri"/>
+          <w:b w:val="0"/>
+          <w:i/>
           <w:sz w:val="24"/>
         </w:rPr>
-        <w:t xml:space="preserve"> — administrator restores seed data.</w:t>
+        <w:t>Central European Journal of Operations Research, 32</w:t>
       </w:r>
-    </w:p>
-    <w:p>
       <w:r>
         <w:rPr>
-          <w:rFonts w:ascii="Calibri" w:hAnsi="Calibri"/>
+          <w:rFonts w:ascii="Calibri" w:hAnsi="Calibri" w:cs="Calibri" w:eastAsia="Calibri"/>
+          <w:b w:val="0"/>
+          <w:i w:val="0"/>
           <w:sz w:val="24"/>
         </w:rPr>
-        <w:t>Remaining work (Iteration 2): replace simulated sensors with microcontroller feeds, persist to a cloud database, and add true geospatial routing. Iteration 1 is a demonstration-ready software prototype for three roles, not a deployed IoT network.</w:t>
+        <w:t>, 399–434. https://doi.org/10.1007/s10100-023-00892-y</w:t>
       </w:r>
     </w:p>
     <w:p>
       <w:pPr>
-        <w:pStyle w:val="Heading2"/>
+        <w:spacing w:after="160" w:before="0" w:line="276" w:lineRule="auto"/>
+        <w:ind w:left="720" w:hanging="720"/>
       </w:pPr>
       <w:r>
-        <w:t>Acknowledgement of AI use</w:t>
+        <w:rPr>
+          <w:rFonts w:ascii="Calibri" w:hAnsi="Calibri" w:cs="Calibri" w:eastAsia="Calibri"/>
+          <w:b w:val="0"/>
+          <w:i w:val="0"/>
+          <w:sz w:val="24"/>
+        </w:rPr>
+        <w:t xml:space="preserve">Kuang, Y., &amp; Lin, B. (2021). Public participation and city sustainability: Evidence from urban garbage classification in China. </w:t>
       </w:r>
-    </w:p>
-    <w:p>
       <w:r>
         <w:rPr>
-          <w:rFonts w:ascii="Calibri" w:hAnsi="Calibri"/>
+          <w:rFonts w:ascii="Calibri" w:hAnsi="Calibri" w:cs="Calibri" w:eastAsia="Calibri"/>
+          <w:b w:val="0"/>
+          <w:i/>
           <w:sz w:val="24"/>
         </w:rPr>
-        <w:t>Generative AI (Cursor) was used to support debugging, documentation drafting, GitHub workflow files, and grammar. Team members remain responsible for the design, code, and the ability to explain the prototype during the Week 6 demonstration, in line with the CIHE Academic Integrity Policy.</w:t>
+        <w:t>Sustainable Cities and Society, 67</w:t>
+      </w:r>
+      <w:r>
+        <w:rPr>
+          <w:rFonts w:ascii="Calibri" w:hAnsi="Calibri" w:cs="Calibri" w:eastAsia="Calibri"/>
+          <w:b w:val="0"/>
+          <w:i w:val="0"/>
+          <w:sz w:val="24"/>
+        </w:rPr>
+        <w:t>, 102741. https://doi.org/10.1016/j.scs.2021.102741</w:t>
       </w:r>
     </w:p>
     <w:p>
       <w:pPr>
-        <w:pStyle w:val="Heading2"/>
+        <w:spacing w:after="160" w:before="0" w:line="276" w:lineRule="auto"/>
+        <w:ind w:left="720" w:hanging="720"/>
       </w:pPr>
       <w:r>
-        <w:t>References</w:t>
+        <w:rPr>
+          <w:rFonts w:ascii="Calibri" w:hAnsi="Calibri" w:cs="Calibri" w:eastAsia="Calibri"/>
+          <w:b w:val="0"/>
+          <w:i w:val="0"/>
+          <w:sz w:val="24"/>
+        </w:rPr>
+        <w:t xml:space="preserve">Roy, A., Manna, A., Kim, J., &amp; Moon, I. (2022). IoT-based smart bin allocation and vehicle routing in solid waste management: A case study in South Korea. </w:t>
+      </w:r>
+      <w:r>
+        <w:rPr>
+          <w:rFonts w:ascii="Calibri" w:hAnsi="Calibri" w:cs="Calibri" w:eastAsia="Calibri"/>
+          <w:b w:val="0"/>
+          <w:i/>
+          <w:sz w:val="24"/>
+        </w:rPr>
+        <w:t>Computers &amp; Industrial Engineering, 171</w:t>
+      </w:r>
+      <w:r>
+        <w:rPr>
+          <w:rFonts w:ascii="Calibri" w:hAnsi="Calibri" w:cs="Calibri" w:eastAsia="Calibri"/>
+          <w:b w:val="0"/>
+          <w:i w:val="0"/>
+          <w:sz w:val="24"/>
+        </w:rPr>
+        <w:t>, 108457. https://doi.org/10.1016/j.cie.2022.108457</w:t>
       </w:r>
     </w:p>
     <w:p>
+      <w:pPr>
+        <w:spacing w:after="160" w:before="0" w:line="276" w:lineRule="auto"/>
+        <w:ind w:left="720" w:hanging="720"/>
+      </w:pPr>
       <w:r>
         <w:rPr>
-          <w:rFonts w:ascii="Calibri" w:hAnsi="Calibri"/>
+          <w:rFonts w:ascii="Calibri" w:hAnsi="Calibri" w:cs="Calibri" w:eastAsia="Calibri"/>
+          <w:b w:val="0"/>
+          <w:i w:val="0"/>
           <w:sz w:val="24"/>
         </w:rPr>
-        <w:t>Bass, L., Clements, P., &amp; Kazman, R. (2021). *Software architecture in practice* (4th ed.). Addison-Wesley.</w:t>
+        <w:t xml:space="preserve">Sosunova, I., &amp; Porras, J. (2022). IoT-enabled smart waste management systems for smart cities: A systematic review. </w:t>
+      </w:r>
+      <w:r>
+        <w:rPr>
+          <w:rFonts w:ascii="Calibri" w:hAnsi="Calibri" w:cs="Calibri" w:eastAsia="Calibri"/>
+          <w:b w:val="0"/>
+          <w:i/>
+          <w:sz w:val="24"/>
+        </w:rPr>
+        <w:t>IEEE Access, 10</w:t>
+      </w:r>
+      <w:r>
+        <w:rPr>
+          <w:rFonts w:ascii="Calibri" w:hAnsi="Calibri" w:cs="Calibri" w:eastAsia="Calibri"/>
+          <w:b w:val="0"/>
+          <w:i w:val="0"/>
+          <w:sz w:val="24"/>
+        </w:rPr>
+        <w:t>, 73326–73363. https://doi.org/10.1109/ACCESS.2022.3188308</w:t>
       </w:r>
     </w:p>
     <w:p>
+      <w:pPr>
+        <w:spacing w:after="160" w:before="0" w:line="276" w:lineRule="auto"/>
+        <w:ind w:left="720" w:hanging="720"/>
+      </w:pPr>
       <w:r>
         <w:rPr>
-          <w:rFonts w:ascii="Calibri" w:hAnsi="Calibri"/>
+          <w:rFonts w:ascii="Calibri" w:hAnsi="Calibri" w:cs="Calibri" w:eastAsia="Calibri"/>
+          <w:b w:val="0"/>
+          <w:i w:val="0"/>
           <w:sz w:val="24"/>
         </w:rPr>
-        <w:t>Mozilla Developer Network. (2023). *Client-side form validation*. https://developer.mozilla.org/en-US/docs/Learn/Forms/Form_validation</w:t>
+        <w:t xml:space="preserve">Wang, C., Qin, J., Qu, C., Ran, X., Liu, C., &amp; Chen, B. (2021). A smart municipal waste management system based on deep-learning and Internet of Things. </w:t>
       </w:r>
-    </w:p>
-    <w:p>
       <w:r>
         <w:rPr>
-          <w:rFonts w:ascii="Calibri" w:hAnsi="Calibri"/>
+          <w:rFonts w:ascii="Calibri" w:hAnsi="Calibri" w:cs="Calibri" w:eastAsia="Calibri"/>
+          <w:b w:val="0"/>
+          <w:i/>
           <w:sz w:val="24"/>
         </w:rPr>
-        <w:t>Sommerville, I. (2016). *Software engineering* (10th ed.). Pearson.</w:t>
+        <w:t>Waste Management, 135</w:t>
+      </w:r>
+      <w:r>
+        <w:rPr>
+          <w:rFonts w:ascii="Calibri" w:hAnsi="Calibri" w:cs="Calibri" w:eastAsia="Calibri"/>
+          <w:b w:val="0"/>
+          <w:i w:val="0"/>
+          <w:sz w:val="24"/>
+        </w:rPr>
+        <w:t>, 20–29. https://pubmed.ncbi.nlm.nih.gov/34461487/</w:t>
       </w:r>
     </w:p>
     <w:sectPr>
@@ -2735,7 +1254,7 @@
     <w:qFormat/>
     <w:rsid w:val="00FC693F"/>
     <w:rPr>
-      <w:rFonts w:ascii="Calibri" w:hAnsi="Calibri"/>
+      <w:rFonts w:ascii="Calibri" w:hAnsi="Calibri" w:cs="Calibri" w:eastAsia="Calibri"/>
       <w:sz w:val="24"/>
     </w:rPr>
   </w:style>
@@ -2753,6 +1272,9 @@
       </w:tabs>
       <w:spacing w:after="0" w:line="240" w:lineRule="auto"/>
     </w:pPr>
+    <w:rPr>
+      <w:rFonts w:ascii="Calibri" w:hAnsi="Calibri" w:cs="Calibri" w:eastAsia="Calibri"/>
+    </w:rPr>
   </w:style>
   <w:style w:type="character" w:customStyle="1" w:styleId="HeaderChar">
     <w:name w:val="Header Char"/>
@@ -2760,6 +1282,9 @@
     <w:link w:val="Header"/>
     <w:uiPriority w:val="99"/>
     <w:rsid w:val="00E618BF"/>
+    <w:rPr>
+      <w:rFonts w:ascii="Calibri" w:hAnsi="Calibri" w:cs="Calibri" w:eastAsia="Calibri"/>
+    </w:rPr>
   </w:style>
   <w:style w:type="paragraph" w:styleId="Footer">
     <w:name w:val="footer"/>
@@ -2775,6 +1300,9 @@
       </w:tabs>
       <w:spacing w:after="0" w:line="240" w:lineRule="auto"/>
     </w:pPr>
+    <w:rPr>
+      <w:rFonts w:ascii="Calibri" w:hAnsi="Calibri" w:cs="Calibri" w:eastAsia="Calibri"/>
+    </w:rPr>
   </w:style>
   <w:style w:type="character" w:customStyle="1" w:styleId="FooterChar">
     <w:name w:val="Footer Char"/>
@@ -2782,6 +1310,9 @@
     <w:link w:val="Footer"/>
     <w:uiPriority w:val="99"/>
     <w:rsid w:val="00E618BF"/>
+    <w:rPr>
+      <w:rFonts w:ascii="Calibri" w:hAnsi="Calibri" w:cs="Calibri" w:eastAsia="Calibri"/>
+    </w:rPr>
   </w:style>
   <w:style w:type="paragraph" w:styleId="Heading1">
     <w:name w:val="heading 1"/>
@@ -2798,10 +1329,10 @@
       <w:outlineLvl w:val="0"/>
     </w:pPr>
     <w:rPr>
-      <w:rFonts w:asciiTheme="majorHAnsi" w:eastAsiaTheme="majorEastAsia" w:hAnsiTheme="majorHAnsi" w:cstheme="majorBidi" w:ascii="Calibri" w:hAnsi="Calibri"/>
+      <w:rFonts w:asciiTheme="majorHAnsi" w:eastAsiaTheme="majorEastAsia" w:hAnsiTheme="majorHAnsi" w:cstheme="majorBidi" w:ascii="Calibri" w:hAnsi="Calibri" w:cs="Calibri" w:eastAsia="Calibri"/>
       <w:b/>
       <w:bCs/>
-      <w:color w:val="0D5C4B"/>
+      <w:color w:val="365F91" w:themeColor="accent1" w:themeShade="BF"/>
       <w:sz w:val="28"/>
       <w:szCs w:val="28"/>
     </w:rPr>
@@ -2822,10 +1353,10 @@
       <w:outlineLvl w:val="1"/>
     </w:pPr>
     <w:rPr>
-      <w:rFonts w:asciiTheme="majorHAnsi" w:eastAsiaTheme="majorEastAsia" w:hAnsiTheme="majorHAnsi" w:cstheme="majorBidi" w:ascii="Calibri" w:hAnsi="Calibri"/>
+      <w:rFonts w:asciiTheme="majorHAnsi" w:eastAsiaTheme="majorEastAsia" w:hAnsiTheme="majorHAnsi" w:cstheme="majorBidi" w:ascii="Calibri" w:hAnsi="Calibri" w:cs="Calibri" w:eastAsia="Calibri"/>
       <w:b/>
       <w:bCs/>
-      <w:color w:val="0D5C4B"/>
+      <w:color w:val="4F81BD" w:themeColor="accent1"/>
       <w:sz w:val="26"/>
       <w:szCs w:val="26"/>
     </w:rPr>
@@ -2846,10 +1377,10 @@
       <w:outlineLvl w:val="2"/>
     </w:pPr>
     <w:rPr>
-      <w:rFonts w:asciiTheme="majorHAnsi" w:eastAsiaTheme="majorEastAsia" w:hAnsiTheme="majorHAnsi" w:cstheme="majorBidi" w:ascii="Calibri" w:hAnsi="Calibri"/>
+      <w:rFonts w:asciiTheme="majorHAnsi" w:eastAsiaTheme="majorEastAsia" w:hAnsiTheme="majorHAnsi" w:cstheme="majorBidi" w:ascii="Calibri" w:hAnsi="Calibri" w:cs="Calibri" w:eastAsia="Calibri"/>
       <w:b/>
       <w:bCs/>
-      <w:color w:val="0D5C4B"/>
+      <w:color w:val="4F81BD" w:themeColor="accent1"/>
     </w:rPr>
   </w:style>
   <w:style w:type="paragraph" w:styleId="Heading4">
@@ -2869,12 +1400,12 @@
       <w:outlineLvl w:val="3"/>
     </w:pPr>
     <w:rPr>
-      <w:rFonts w:asciiTheme="majorHAnsi" w:eastAsiaTheme="majorEastAsia" w:hAnsiTheme="majorHAnsi" w:cstheme="majorBidi" w:ascii="Calibri" w:hAnsi="Calibri"/>
+      <w:rFonts w:asciiTheme="majorHAnsi" w:eastAsiaTheme="majorEastAsia" w:hAnsiTheme="majorHAnsi" w:cstheme="majorBidi" w:ascii="Calibri" w:hAnsi="Calibri" w:cs="Calibri" w:eastAsia="Calibri"/>
       <w:b/>
       <w:bCs/>
       <w:i/>
       <w:iCs/>
-      <w:color w:val="0D5C4B"/>
+      <w:color w:val="4F81BD" w:themeColor="accent1"/>
     </w:rPr>
   </w:style>
   <w:style w:type="paragraph" w:styleId="Heading5">
@@ -2894,7 +1425,7 @@
       <w:outlineLvl w:val="4"/>
     </w:pPr>
     <w:rPr>
-      <w:rFonts w:asciiTheme="majorHAnsi" w:eastAsiaTheme="majorEastAsia" w:hAnsiTheme="majorHAnsi" w:cstheme="majorBidi"/>
+      <w:rFonts w:asciiTheme="majorHAnsi" w:eastAsiaTheme="majorEastAsia" w:hAnsiTheme="majorHAnsi" w:cstheme="majorBidi" w:ascii="Calibri" w:hAnsi="Calibri" w:cs="Calibri" w:eastAsia="Calibri"/>
       <w:color w:val="243F60" w:themeColor="accent1" w:themeShade="7F"/>
     </w:rPr>
   </w:style>
@@ -2915,7 +1446,7 @@
       <w:outlineLvl w:val="5"/>
     </w:pPr>
     <w:rPr>
-      <w:rFonts w:asciiTheme="majorHAnsi" w:eastAsiaTheme="majorEastAsia" w:hAnsiTheme="majorHAnsi" w:cstheme="majorBidi"/>
+      <w:rFonts w:asciiTheme="majorHAnsi" w:eastAsiaTheme="majorEastAsia" w:hAnsiTheme="majorHAnsi" w:cstheme="majorBidi" w:ascii="Calibri" w:hAnsi="Calibri" w:cs="Calibri" w:eastAsia="Calibri"/>
       <w:i/>
       <w:iCs/>
       <w:color w:val="243F60" w:themeColor="accent1" w:themeShade="7F"/>
@@ -2938,7 +1469,7 @@
       <w:outlineLvl w:val="6"/>
     </w:pPr>
     <w:rPr>
-      <w:rFonts w:asciiTheme="majorHAnsi" w:eastAsiaTheme="majorEastAsia" w:hAnsiTheme="majorHAnsi" w:cstheme="majorBidi"/>
+      <w:rFonts w:asciiTheme="majorHAnsi" w:eastAsiaTheme="majorEastAsia" w:hAnsiTheme="majorHAnsi" w:cstheme="majorBidi" w:ascii="Calibri" w:hAnsi="Calibri" w:cs="Calibri" w:eastAsia="Calibri"/>
       <w:i/>
       <w:iCs/>
       <w:color w:val="404040" w:themeColor="text1" w:themeTint="BF"/>
@@ -2961,7 +1492,7 @@
       <w:outlineLvl w:val="7"/>
     </w:pPr>
     <w:rPr>
-      <w:rFonts w:asciiTheme="majorHAnsi" w:eastAsiaTheme="majorEastAsia" w:hAnsiTheme="majorHAnsi" w:cstheme="majorBidi"/>
+      <w:rFonts w:asciiTheme="majorHAnsi" w:eastAsiaTheme="majorEastAsia" w:hAnsiTheme="majorHAnsi" w:cstheme="majorBidi" w:ascii="Calibri" w:hAnsi="Calibri" w:cs="Calibri" w:eastAsia="Calibri"/>
       <w:color w:val="4F81BD" w:themeColor="accent1"/>
       <w:sz w:val="20"/>
       <w:szCs w:val="20"/>
@@ -2984,7 +1515,7 @@
       <w:outlineLvl w:val="8"/>
     </w:pPr>
     <w:rPr>
-      <w:rFonts w:asciiTheme="majorHAnsi" w:eastAsiaTheme="majorEastAsia" w:hAnsiTheme="majorHAnsi" w:cstheme="majorBidi"/>
+      <w:rFonts w:asciiTheme="majorHAnsi" w:eastAsiaTheme="majorEastAsia" w:hAnsiTheme="majorHAnsi" w:cstheme="majorBidi" w:ascii="Calibri" w:hAnsi="Calibri" w:cs="Calibri" w:eastAsia="Calibri"/>
       <w:i/>
       <w:iCs/>
       <w:color w:val="404040" w:themeColor="text1" w:themeTint="BF"/>
@@ -2997,12 +1528,18 @@
     <w:uiPriority w:val="1"/>
     <w:semiHidden/>
     <w:unhideWhenUsed/>
+    <w:rPr>
+      <w:rFonts w:ascii="Calibri" w:hAnsi="Calibri" w:cs="Calibri" w:eastAsia="Calibri"/>
+    </w:rPr>
   </w:style>
   <w:style w:type="table" w:default="1" w:styleId="TableNormal">
     <w:name w:val="Normal Table"/>
     <w:uiPriority w:val="99"/>
     <w:semiHidden/>
     <w:unhideWhenUsed/>
+    <w:rPr>
+      <w:rFonts w:ascii="Calibri" w:hAnsi="Calibri" w:cs="Calibri" w:eastAsia="Calibri"/>
+    </w:rPr>
     <w:tblPr>
       <w:tblInd w:w="0" w:type="dxa"/>
       <w:tblCellMar>
@@ -3027,6 +1564,9 @@
     <w:pPr>
       <w:spacing w:after="0" w:line="240" w:lineRule="auto"/>
     </w:pPr>
+    <w:rPr>
+      <w:rFonts w:ascii="Calibri" w:hAnsi="Calibri" w:cs="Calibri" w:eastAsia="Calibri"/>
+    </w:rPr>
   </w:style>
   <w:style w:type="character" w:customStyle="1" w:styleId="Heading1Char">
     <w:name w:val="Heading 1 Char"/>
@@ -3035,7 +1575,7 @@
     <w:uiPriority w:val="9"/>
     <w:rsid w:val="00FC693F"/>
     <w:rPr>
-      <w:rFonts w:asciiTheme="majorHAnsi" w:eastAsiaTheme="majorEastAsia" w:hAnsiTheme="majorHAnsi" w:cstheme="majorBidi"/>
+      <w:rFonts w:asciiTheme="majorHAnsi" w:eastAsiaTheme="majorEastAsia" w:hAnsiTheme="majorHAnsi" w:cstheme="majorBidi" w:ascii="Calibri" w:hAnsi="Calibri" w:cs="Calibri" w:eastAsia="Calibri"/>
       <w:b/>
       <w:bCs/>
       <w:color w:val="365F91" w:themeColor="accent1" w:themeShade="BF"/>
@@ -3050,7 +1590,7 @@
     <w:uiPriority w:val="9"/>
     <w:rsid w:val="00FC693F"/>
     <w:rPr>
-      <w:rFonts w:asciiTheme="majorHAnsi" w:eastAsiaTheme="majorEastAsia" w:hAnsiTheme="majorHAnsi" w:cstheme="majorBidi"/>
+      <w:rFonts w:asciiTheme="majorHAnsi" w:eastAsiaTheme="majorEastAsia" w:hAnsiTheme="majorHAnsi" w:cstheme="majorBidi" w:ascii="Calibri" w:hAnsi="Calibri" w:cs="Calibri" w:eastAsia="Calibri"/>
       <w:b/>
       <w:bCs/>
       <w:color w:val="4F81BD" w:themeColor="accent1"/>
@@ -3065,7 +1605,7 @@
     <w:uiPriority w:val="9"/>
     <w:rsid w:val="00FC693F"/>
     <w:rPr>
-      <w:rFonts w:asciiTheme="majorHAnsi" w:eastAsiaTheme="majorEastAsia" w:hAnsiTheme="majorHAnsi" w:cstheme="majorBidi"/>
+      <w:rFonts w:asciiTheme="majorHAnsi" w:eastAsiaTheme="majorEastAsia" w:hAnsiTheme="majorHAnsi" w:cstheme="majorBidi" w:ascii="Calibri" w:hAnsi="Calibri" w:cs="Calibri" w:eastAsia="Calibri"/>
       <w:b/>
       <w:bCs/>
       <w:color w:val="4F81BD" w:themeColor="accent1"/>
@@ -3087,7 +1627,7 @@
       <w:contextualSpacing/>
     </w:pPr>
     <w:rPr>
-      <w:rFonts w:asciiTheme="majorHAnsi" w:eastAsiaTheme="majorEastAsia" w:hAnsiTheme="majorHAnsi" w:cstheme="majorBidi"/>
+      <w:rFonts w:asciiTheme="majorHAnsi" w:eastAsiaTheme="majorEastAsia" w:hAnsiTheme="majorHAnsi" w:cstheme="majorBidi" w:ascii="Calibri" w:hAnsi="Calibri" w:cs="Calibri" w:eastAsia="Calibri"/>
       <w:color w:val="17365D" w:themeColor="text2" w:themeShade="BF"/>
       <w:spacing w:val="5"/>
       <w:kern w:val="28"/>
@@ -3102,7 +1642,7 @@
     <w:uiPriority w:val="10"/>
     <w:rsid w:val="00FC693F"/>
     <w:rPr>
-      <w:rFonts w:asciiTheme="majorHAnsi" w:eastAsiaTheme="majorEastAsia" w:hAnsiTheme="majorHAnsi" w:cstheme="majorBidi"/>
+      <w:rFonts w:asciiTheme="majorHAnsi" w:eastAsiaTheme="majorEastAsia" w:hAnsiTheme="majorHAnsi" w:cstheme="majorBidi" w:ascii="Calibri" w:hAnsi="Calibri" w:cs="Calibri" w:eastAsia="Calibri"/>
       <w:color w:val="17365D" w:themeColor="text2" w:themeShade="BF"/>
       <w:spacing w:val="5"/>
       <w:kern w:val="28"/>
@@ -3124,7 +1664,7 @@
       </w:numPr>
     </w:pPr>
     <w:rPr>
-      <w:rFonts w:asciiTheme="majorHAnsi" w:eastAsiaTheme="majorEastAsia" w:hAnsiTheme="majorHAnsi" w:cstheme="majorBidi"/>
+      <w:rFonts w:asciiTheme="majorHAnsi" w:eastAsiaTheme="majorEastAsia" w:hAnsiTheme="majorHAnsi" w:cstheme="majorBidi" w:ascii="Calibri" w:hAnsi="Calibri" w:cs="Calibri" w:eastAsia="Calibri"/>
       <w:i/>
       <w:iCs/>
       <w:color w:val="4F81BD" w:themeColor="accent1"/>
@@ -3140,7 +1680,7 @@
     <w:uiPriority w:val="11"/>
     <w:rsid w:val="00FC693F"/>
     <w:rPr>
-      <w:rFonts w:asciiTheme="majorHAnsi" w:eastAsiaTheme="majorEastAsia" w:hAnsiTheme="majorHAnsi" w:cstheme="majorBidi"/>
+      <w:rFonts w:asciiTheme="majorHAnsi" w:eastAsiaTheme="majorEastAsia" w:hAnsiTheme="majorHAnsi" w:cstheme="majorBidi" w:ascii="Calibri" w:hAnsi="Calibri" w:cs="Calibri" w:eastAsia="Calibri"/>
       <w:i/>
       <w:iCs/>
       <w:color w:val="4F81BD" w:themeColor="accent1"/>
@@ -3159,6 +1699,9 @@
       <w:ind w:left="720"/>
       <w:contextualSpacing/>
     </w:pPr>
+    <w:rPr>
+      <w:rFonts w:ascii="Calibri" w:hAnsi="Calibri" w:cs="Calibri" w:eastAsia="Calibri"/>
+    </w:rPr>
   </w:style>
   <w:style w:type="paragraph" w:styleId="BodyText">
     <w:name w:val="Body Text"/>
@@ -3170,6 +1713,9 @@
     <w:pPr>
       <w:spacing w:after="120"/>
     </w:pPr>
+    <w:rPr>
+      <w:rFonts w:ascii="Calibri" w:hAnsi="Calibri" w:cs="Calibri" w:eastAsia="Calibri"/>
+    </w:rPr>
   </w:style>
   <w:style w:type="character" w:customStyle="1" w:styleId="BodyTextChar">
     <w:name w:val="Body Text Char"/>
@@ -3177,6 +1723,9 @@
     <w:link w:val="BodyText"/>
     <w:uiPriority w:val="99"/>
     <w:rsid w:val="00AA1D8D"/>
+    <w:rPr>
+      <w:rFonts w:ascii="Calibri" w:hAnsi="Calibri" w:cs="Calibri" w:eastAsia="Calibri"/>
+    </w:rPr>
   </w:style>
   <w:style w:type="paragraph" w:styleId="BodyText2">
     <w:name w:val="Body Text 2"/>
@@ -3188,6 +1737,9 @@
     <w:pPr>
       <w:spacing w:after="120" w:line="480" w:lineRule="auto"/>
     </w:pPr>
+    <w:rPr>
+      <w:rFonts w:ascii="Calibri" w:hAnsi="Calibri" w:cs="Calibri" w:eastAsia="Calibri"/>
+    </w:rPr>
   </w:style>
   <w:style w:type="character" w:customStyle="1" w:styleId="BodyText2Char">
     <w:name w:val="Body Text 2 Char"/>
@@ -3195,6 +1747,9 @@
     <w:link w:val="BodyText2"/>
     <w:uiPriority w:val="99"/>
     <w:rsid w:val="00AA1D8D"/>
+    <w:rPr>
+      <w:rFonts w:ascii="Calibri" w:hAnsi="Calibri" w:cs="Calibri" w:eastAsia="Calibri"/>
+    </w:rPr>
   </w:style>
   <w:style w:type="paragraph" w:styleId="BodyText3">
     <w:name w:val="Body Text 3"/>
@@ -3207,6 +1762,7 @@
       <w:spacing w:after="120"/>
     </w:pPr>
     <w:rPr>
+      <w:rFonts w:ascii="Calibri" w:hAnsi="Calibri" w:cs="Calibri" w:eastAsia="Calibri"/>
       <w:sz w:val="16"/>
       <w:szCs w:val="16"/>
     </w:rPr>
@@ -3218,6 +1774,7 @@
     <w:uiPriority w:val="99"/>
     <w:rsid w:val="00AA1D8D"/>
     <w:rPr>
+      <w:rFonts w:ascii="Calibri" w:hAnsi="Calibri" w:cs="Calibri" w:eastAsia="Calibri"/>
       <w:sz w:val="16"/>
       <w:szCs w:val="16"/>
     </w:rPr>
@@ -3232,6 +1789,9 @@
       <w:ind w:left="360" w:hanging="360"/>
       <w:contextualSpacing/>
     </w:pPr>
+    <w:rPr>
+      <w:rFonts w:ascii="Calibri" w:hAnsi="Calibri" w:cs="Calibri" w:eastAsia="Calibri"/>
+    </w:rPr>
   </w:style>
   <w:style w:type="paragraph" w:styleId="List2">
     <w:name w:val="List 2"/>
@@ -3243,6 +1803,9 @@
       <w:ind w:left="720" w:hanging="360"/>
       <w:contextualSpacing/>
     </w:pPr>
+    <w:rPr>
+      <w:rFonts w:ascii="Calibri" w:hAnsi="Calibri" w:cs="Calibri" w:eastAsia="Calibri"/>
+    </w:rPr>
   </w:style>
   <w:style w:type="paragraph" w:styleId="List3">
     <w:name w:val="List 3"/>
@@ -3254,6 +1817,9 @@
       <w:ind w:left="1080" w:hanging="360"/>
       <w:contextualSpacing/>
     </w:pPr>
+    <w:rPr>
+      <w:rFonts w:ascii="Calibri" w:hAnsi="Calibri" w:cs="Calibri" w:eastAsia="Calibri"/>
+    </w:rPr>
   </w:style>
   <w:style w:type="paragraph" w:styleId="ListBullet">
     <w:name w:val="List Bullet"/>
@@ -3267,6 +1833,9 @@
       </w:numPr>
       <w:contextualSpacing/>
     </w:pPr>
+    <w:rPr>
+      <w:rFonts w:ascii="Calibri" w:hAnsi="Calibri" w:cs="Calibri" w:eastAsia="Calibri"/>
+    </w:rPr>
   </w:style>
   <w:style w:type="paragraph" w:styleId="ListBullet2">
     <w:name w:val="List Bullet 2"/>
@@ -3280,6 +1849,9 @@
       </w:numPr>
       <w:contextualSpacing/>
     </w:pPr>
+    <w:rPr>
+      <w:rFonts w:ascii="Calibri" w:hAnsi="Calibri" w:cs="Calibri" w:eastAsia="Calibri"/>
+    </w:rPr>
   </w:style>
   <w:style w:type="paragraph" w:styleId="ListBullet3">
     <w:name w:val="List Bullet 3"/>
@@ -3293,6 +1865,9 @@
       </w:numPr>
       <w:contextualSpacing/>
     </w:pPr>
+    <w:rPr>
+      <w:rFonts w:ascii="Calibri" w:hAnsi="Calibri" w:cs="Calibri" w:eastAsia="Calibri"/>
+    </w:rPr>
   </w:style>
   <w:style w:type="paragraph" w:styleId="ListNumber">
     <w:name w:val="List Number"/>
@@ -3306,6 +1881,9 @@
       </w:numPr>
       <w:contextualSpacing/>
     </w:pPr>
+    <w:rPr>
+      <w:rFonts w:ascii="Calibri" w:hAnsi="Calibri" w:cs="Calibri" w:eastAsia="Calibri"/>
+    </w:rPr>
   </w:style>
   <w:style w:type="paragraph" w:styleId="ListNumber2">
     <w:name w:val="List Number 2"/>
@@ -3319,6 +1897,9 @@
       </w:numPr>
       <w:contextualSpacing/>
     </w:pPr>
+    <w:rPr>
+      <w:rFonts w:ascii="Calibri" w:hAnsi="Calibri" w:cs="Calibri" w:eastAsia="Calibri"/>
+    </w:rPr>
   </w:style>
   <w:style w:type="paragraph" w:styleId="ListNumber3">
     <w:name w:val="List Number 3"/>
@@ -3332,6 +1913,9 @@
       </w:numPr>
       <w:contextualSpacing/>
     </w:pPr>
+    <w:rPr>
+      <w:rFonts w:ascii="Calibri" w:hAnsi="Calibri" w:cs="Calibri" w:eastAsia="Calibri"/>
+    </w:rPr>
   </w:style>
   <w:style w:type="paragraph" w:styleId="ListContinue">
     <w:name w:val="List Continue"/>
@@ -3344,6 +1928,9 @@
       <w:ind w:left="360"/>
       <w:contextualSpacing/>
     </w:pPr>
+    <w:rPr>
+      <w:rFonts w:ascii="Calibri" w:hAnsi="Calibri" w:cs="Calibri" w:eastAsia="Calibri"/>
+    </w:rPr>
   </w:style>
   <w:style w:type="paragraph" w:styleId="ListContinue2">
     <w:name w:val="List Continue 2"/>
@@ -3356,6 +1943,9 @@
       <w:ind w:left="720"/>
       <w:contextualSpacing/>
     </w:pPr>
+    <w:rPr>
+      <w:rFonts w:ascii="Calibri" w:hAnsi="Calibri" w:cs="Calibri" w:eastAsia="Calibri"/>
+    </w:rPr>
   </w:style>
   <w:style w:type="paragraph" w:styleId="ListContinue3">
     <w:name w:val="List Continue 3"/>
@@ -3368,6 +1958,9 @@
       <w:ind w:left="1080"/>
       <w:contextualSpacing/>
     </w:pPr>
+    <w:rPr>
+      <w:rFonts w:ascii="Calibri" w:hAnsi="Calibri" w:cs="Calibri" w:eastAsia="Calibri"/>
+    </w:rPr>
   </w:style>
   <w:style w:type="paragraph" w:styleId="MacroText">
     <w:name w:val="macro"/>
@@ -3387,7 +1980,7 @@
       </w:tabs>
     </w:pPr>
     <w:rPr>
-      <w:rFonts w:ascii="Courier" w:hAnsi="Courier"/>
+      <w:rFonts w:ascii="Calibri" w:hAnsi="Calibri" w:cs="Calibri" w:eastAsia="Calibri"/>
       <w:sz w:val="20"/>
       <w:szCs w:val="20"/>
     </w:rPr>
@@ -3399,7 +1992,7 @@
     <w:uiPriority w:val="99"/>
     <w:rsid w:val="0029639D"/>
     <w:rPr>
-      <w:rFonts w:ascii="Courier" w:hAnsi="Courier"/>
+      <w:rFonts w:ascii="Calibri" w:hAnsi="Calibri" w:cs="Calibri" w:eastAsia="Calibri"/>
       <w:sz w:val="20"/>
       <w:szCs w:val="20"/>
     </w:rPr>
@@ -3413,6 +2006,7 @@
     <w:qFormat/>
     <w:rsid w:val="00FC693F"/>
     <w:rPr>
+      <w:rFonts w:ascii="Calibri" w:hAnsi="Calibri" w:cs="Calibri" w:eastAsia="Calibri"/>
       <w:i/>
       <w:iCs/>
       <w:color w:val="000000" w:themeColor="text1"/>
@@ -3425,6 +2019,7 @@
     <w:uiPriority w:val="29"/>
     <w:rsid w:val="00FC693F"/>
     <w:rPr>
+      <w:rFonts w:ascii="Calibri" w:hAnsi="Calibri" w:cs="Calibri" w:eastAsia="Calibri"/>
       <w:i/>
       <w:iCs/>
       <w:color w:val="000000" w:themeColor="text1"/>
@@ -3438,7 +2033,7 @@
     <w:semiHidden/>
     <w:rsid w:val="00FC693F"/>
     <w:rPr>
-      <w:rFonts w:asciiTheme="majorHAnsi" w:eastAsiaTheme="majorEastAsia" w:hAnsiTheme="majorHAnsi" w:cstheme="majorBidi"/>
+      <w:rFonts w:asciiTheme="majorHAnsi" w:eastAsiaTheme="majorEastAsia" w:hAnsiTheme="majorHAnsi" w:cstheme="majorBidi" w:ascii="Calibri" w:hAnsi="Calibri" w:cs="Calibri" w:eastAsia="Calibri"/>
       <w:b/>
       <w:bCs/>
       <w:i/>
@@ -3454,7 +2049,7 @@
     <w:semiHidden/>
     <w:rsid w:val="00FC693F"/>
     <w:rPr>
-      <w:rFonts w:asciiTheme="majorHAnsi" w:eastAsiaTheme="majorEastAsia" w:hAnsiTheme="majorHAnsi" w:cstheme="majorBidi"/>
+      <w:rFonts w:asciiTheme="majorHAnsi" w:eastAsiaTheme="majorEastAsia" w:hAnsiTheme="majorHAnsi" w:cstheme="majorBidi" w:ascii="Calibri" w:hAnsi="Calibri" w:cs="Calibri" w:eastAsia="Calibri"/>
       <w:color w:val="243F60" w:themeColor="accent1" w:themeShade="7F"/>
     </w:rPr>
   </w:style>
@@ -3466,7 +2061,7 @@
     <w:semiHidden/>
     <w:rsid w:val="00FC693F"/>
     <w:rPr>
-      <w:rFonts w:asciiTheme="majorHAnsi" w:eastAsiaTheme="majorEastAsia" w:hAnsiTheme="majorHAnsi" w:cstheme="majorBidi"/>
+      <w:rFonts w:asciiTheme="majorHAnsi" w:eastAsiaTheme="majorEastAsia" w:hAnsiTheme="majorHAnsi" w:cstheme="majorBidi" w:ascii="Calibri" w:hAnsi="Calibri" w:cs="Calibri" w:eastAsia="Calibri"/>
       <w:i/>
       <w:iCs/>
       <w:color w:val="243F60" w:themeColor="accent1" w:themeShade="7F"/>
@@ -3480,7 +2075,7 @@
     <w:semiHidden/>
     <w:rsid w:val="00FC693F"/>
     <w:rPr>
-      <w:rFonts w:asciiTheme="majorHAnsi" w:eastAsiaTheme="majorEastAsia" w:hAnsiTheme="majorHAnsi" w:cstheme="majorBidi"/>
+      <w:rFonts w:asciiTheme="majorHAnsi" w:eastAsiaTheme="majorEastAsia" w:hAnsiTheme="majorHAnsi" w:cstheme="majorBidi" w:ascii="Calibri" w:hAnsi="Calibri" w:cs="Calibri" w:eastAsia="Calibri"/>
       <w:i/>
       <w:iCs/>
       <w:color w:val="404040" w:themeColor="text1" w:themeTint="BF"/>
@@ -3494,7 +2089,7 @@
     <w:semiHidden/>
     <w:rsid w:val="00FC693F"/>
     <w:rPr>
-      <w:rFonts w:asciiTheme="majorHAnsi" w:eastAsiaTheme="majorEastAsia" w:hAnsiTheme="majorHAnsi" w:cstheme="majorBidi"/>
+      <w:rFonts w:asciiTheme="majorHAnsi" w:eastAsiaTheme="majorEastAsia" w:hAnsiTheme="majorHAnsi" w:cstheme="majorBidi" w:ascii="Calibri" w:hAnsi="Calibri" w:cs="Calibri" w:eastAsia="Calibri"/>
       <w:color w:val="4F81BD" w:themeColor="accent1"/>
       <w:sz w:val="20"/>
       <w:szCs w:val="20"/>
@@ -3508,7 +2103,7 @@
     <w:semiHidden/>
     <w:rsid w:val="00FC693F"/>
     <w:rPr>
-      <w:rFonts w:asciiTheme="majorHAnsi" w:eastAsiaTheme="majorEastAsia" w:hAnsiTheme="majorHAnsi" w:cstheme="majorBidi"/>
+      <w:rFonts w:asciiTheme="majorHAnsi" w:eastAsiaTheme="majorEastAsia" w:hAnsiTheme="majorHAnsi" w:cstheme="majorBidi" w:ascii="Calibri" w:hAnsi="Calibri" w:cs="Calibri" w:eastAsia="Calibri"/>
       <w:i/>
       <w:iCs/>
       <w:color w:val="404040" w:themeColor="text1" w:themeTint="BF"/>
@@ -3529,6 +2124,7 @@
       <w:spacing w:line="240" w:lineRule="auto"/>
     </w:pPr>
     <w:rPr>
+      <w:rFonts w:ascii="Calibri" w:hAnsi="Calibri" w:cs="Calibri" w:eastAsia="Calibri"/>
       <w:b/>
       <w:bCs/>
       <w:color w:val="4F81BD" w:themeColor="accent1"/>
@@ -3543,6 +2139,7 @@
     <w:qFormat/>
     <w:rsid w:val="00FC693F"/>
     <w:rPr>
+      <w:rFonts w:ascii="Calibri" w:hAnsi="Calibri" w:cs="Calibri" w:eastAsia="Calibri"/>
       <w:b/>
       <w:bCs/>
     </w:rPr>
@@ -3554,6 +2151,7 @@
     <w:qFormat/>
     <w:rsid w:val="00FC693F"/>
     <w:rPr>
+      <w:rFonts w:ascii="Calibri" w:hAnsi="Calibri" w:cs="Calibri" w:eastAsia="Calibri"/>
       <w:i/>
       <w:iCs/>
     </w:rPr>
@@ -3574,6 +2172,7 @@
       <w:ind w:left="936" w:right="936"/>
     </w:pPr>
     <w:rPr>
+      <w:rFonts w:ascii="Calibri" w:hAnsi="Calibri" w:cs="Calibri" w:eastAsia="Calibri"/>
       <w:b/>
       <w:bCs/>
       <w:i/>
@@ -3588,6 +2187,7 @@
     <w:uiPriority w:val="30"/>
     <w:rsid w:val="00FC693F"/>
     <w:rPr>
+      <w:rFonts w:ascii="Calibri" w:hAnsi="Calibri" w:cs="Calibri" w:eastAsia="Calibri"/>
       <w:b/>
       <w:bCs/>
       <w:i/>
@@ -3602,6 +2202,7 @@
     <w:qFormat/>
     <w:rsid w:val="00FC693F"/>
     <w:rPr>
+      <w:rFonts w:ascii="Calibri" w:hAnsi="Calibri" w:cs="Calibri" w:eastAsia="Calibri"/>
       <w:i/>
       <w:iCs/>
       <w:color w:val="808080" w:themeColor="text1" w:themeTint="7F"/>
@@ -3614,6 +2215,7 @@
     <w:qFormat/>
     <w:rsid w:val="00FC693F"/>
     <w:rPr>
+      <w:rFonts w:ascii="Calibri" w:hAnsi="Calibri" w:cs="Calibri" w:eastAsia="Calibri"/>
       <w:b/>
       <w:bCs/>
       <w:i/>
@@ -3628,6 +2230,7 @@
     <w:qFormat/>
     <w:rsid w:val="00FC693F"/>
     <w:rPr>
+      <w:rFonts w:ascii="Calibri" w:hAnsi="Calibri" w:cs="Calibri" w:eastAsia="Calibri"/>
       <w:smallCaps/>
       <w:color w:val="C0504D" w:themeColor="accent2"/>
       <w:u w:val="single"/>
@@ -3640,6 +2243,7 @@
     <w:qFormat/>
     <w:rsid w:val="00FC693F"/>
     <w:rPr>
+      <w:rFonts w:ascii="Calibri" w:hAnsi="Calibri" w:cs="Calibri" w:eastAsia="Calibri"/>
       <w:b/>
       <w:bCs/>
       <w:smallCaps/>
@@ -3655,6 +2259,7 @@
     <w:qFormat/>
     <w:rsid w:val="00FC693F"/>
     <w:rPr>
+      <w:rFonts w:ascii="Calibri" w:hAnsi="Calibri" w:cs="Calibri" w:eastAsia="Calibri"/>
       <w:b/>
       <w:bCs/>
       <w:smallCaps/>
@@ -3673,6 +2278,9 @@
     <w:pPr>
       <w:outlineLvl w:val="9"/>
     </w:pPr>
+    <w:rPr>
+      <w:rFonts w:ascii="Calibri" w:hAnsi="Calibri" w:cs="Calibri" w:eastAsia="Calibri"/>
+    </w:rPr>
   </w:style>
   <w:style w:type="table" w:styleId="TableGrid">
     <w:name w:val="Table Grid"/>
@@ -3682,6 +2290,9 @@
     <w:pPr>
       <w:spacing w:after="0" w:line="240" w:lineRule="auto"/>
     </w:pPr>
+    <w:rPr>
+      <w:rFonts w:ascii="Calibri" w:hAnsi="Calibri" w:cs="Calibri" w:eastAsia="Calibri"/>
+    </w:rPr>
     <w:tblPr>
       <w:tblInd w:w="0" w:type="dxa"/>
       <w:tblBorders>
@@ -3709,6 +2320,7 @@
       <w:spacing w:after="0" w:line="240" w:lineRule="auto"/>
     </w:pPr>
     <w:rPr>
+      <w:rFonts w:ascii="Calibri" w:hAnsi="Calibri" w:cs="Calibri" w:eastAsia="Calibri"/>
       <w:color w:val="000000" w:themeColor="text1" w:themeShade="BF"/>
     </w:rPr>
     <w:tblPr>
@@ -3812,6 +2424,7 @@
       <w:spacing w:after="0" w:line="240" w:lineRule="auto"/>
     </w:pPr>
     <w:rPr>
+      <w:rFonts w:ascii="Calibri" w:hAnsi="Calibri" w:cs="Calibri" w:eastAsia="Calibri"/>
       <w:color w:val="365F91" w:themeColor="accent1" w:themeShade="BF"/>
     </w:rPr>
     <w:tblPr>
@@ -3915,6 +2528,7 @@
       <w:spacing w:after="0" w:line="240" w:lineRule="auto"/>
     </w:pPr>
     <w:rPr>
+      <w:rFonts w:ascii="Calibri" w:hAnsi="Calibri" w:cs="Calibri" w:eastAsia="Calibri"/>
       <w:color w:val="943634" w:themeColor="accent2" w:themeShade="BF"/>
     </w:rPr>
     <w:tblPr>
@@ -4018,6 +2632,7 @@
       <w:spacing w:after="0" w:line="240" w:lineRule="auto"/>
     </w:pPr>
     <w:rPr>
+      <w:rFonts w:ascii="Calibri" w:hAnsi="Calibri" w:cs="Calibri" w:eastAsia="Calibri"/>
       <w:color w:val="76923C" w:themeColor="accent3" w:themeShade="BF"/>
     </w:rPr>
     <w:tblPr>
@@ -4121,6 +2736,7 @@
       <w:spacing w:after="0" w:line="240" w:lineRule="auto"/>
     </w:pPr>
     <w:rPr>
+      <w:rFonts w:ascii="Calibri" w:hAnsi="Calibri" w:cs="Calibri" w:eastAsia="Calibri"/>
       <w:color w:val="5F497A" w:themeColor="accent4" w:themeShade="BF"/>
     </w:rPr>
     <w:tblPr>
@@ -4224,6 +2840,7 @@
       <w:spacing w:after="0" w:line="240" w:lineRule="auto"/>
     </w:pPr>
     <w:rPr>
+      <w:rFonts w:ascii="Calibri" w:hAnsi="Calibri" w:cs="Calibri" w:eastAsia="Calibri"/>
       <w:color w:val="31849B" w:themeColor="accent5" w:themeShade="BF"/>
     </w:rPr>
     <w:tblPr>
@@ -4327,6 +2944,7 @@
       <w:spacing w:after="0" w:line="240" w:lineRule="auto"/>
     </w:pPr>
     <w:rPr>
+      <w:rFonts w:ascii="Calibri" w:hAnsi="Calibri" w:cs="Calibri" w:eastAsia="Calibri"/>
       <w:color w:val="E36C0A" w:themeColor="accent6" w:themeShade="BF"/>
     </w:rPr>
     <w:tblPr>
@@ -4429,6 +3047,9 @@
     <w:pPr>
       <w:spacing w:after="0" w:line="240" w:lineRule="auto"/>
     </w:pPr>
+    <w:rPr>
+      <w:rFonts w:ascii="Calibri" w:hAnsi="Calibri" w:cs="Calibri" w:eastAsia="Calibri"/>
+    </w:rPr>
     <w:tblPr>
       <w:tblStyleRowBandSize w:val="1"/>
       <w:tblStyleColBandSize w:val="1"/>
@@ -4521,6 +3142,9 @@
     <w:pPr>
       <w:spacing w:after="0" w:line="240" w:lineRule="auto"/>
     </w:pPr>
+    <w:rPr>
+      <w:rFonts w:ascii="Calibri" w:hAnsi="Calibri" w:cs="Calibri" w:eastAsia="Calibri"/>
+    </w:rPr>
     <w:tblPr>
       <w:tblStyleRowBandSize w:val="1"/>
       <w:tblStyleColBandSize w:val="1"/>
@@ -4613,6 +3237,9 @@
     <w:pPr>
       <w:spacing w:after="0" w:line="240" w:lineRule="auto"/>
     </w:pPr>
+    <w:rPr>
+      <w:rFonts w:ascii="Calibri" w:hAnsi="Calibri" w:cs="Calibri" w:eastAsia="Calibri"/>
+    </w:rPr>
     <w:tblPr>
       <w:tblStyleRowBandSize w:val="1"/>
       <w:tblStyleColBandSize w:val="1"/>
@@ -4705,6 +3332,9 @@
     <w:pPr>
       <w:spacing w:after="0" w:line="240" w:lineRule="auto"/>
     </w:pPr>
+    <w:rPr>
+      <w:rFonts w:ascii="Calibri" w:hAnsi="Calibri" w:cs="Calibri" w:eastAsia="Calibri"/>
+    </w:rPr>
     <w:tblPr>
       <w:tblStyleRowBandSize w:val="1"/>
       <w:tblStyleColBandSize w:val="1"/>
@@ -4797,6 +3427,9 @@
     <w:pPr>
       <w:spacing w:after="0" w:line="240" w:lineRule="auto"/>
     </w:pPr>
+    <w:rPr>
+      <w:rFonts w:ascii="Calibri" w:hAnsi="Calibri" w:cs="Calibri" w:eastAsia="Calibri"/>
+    </w:rPr>
     <w:tblPr>
       <w:tblStyleRowBandSize w:val="1"/>
       <w:tblStyleColBandSize w:val="1"/>
@@ -4889,6 +3522,9 @@
     <w:pPr>
       <w:spacing w:after="0" w:line="240" w:lineRule="auto"/>
     </w:pPr>
+    <w:rPr>
+      <w:rFonts w:ascii="Calibri" w:hAnsi="Calibri" w:cs="Calibri" w:eastAsia="Calibri"/>
+    </w:rPr>
     <w:tblPr>
       <w:tblStyleRowBandSize w:val="1"/>
       <w:tblStyleColBandSize w:val="1"/>
@@ -4981,6 +3617,9 @@
     <w:pPr>
       <w:spacing w:after="0" w:line="240" w:lineRule="auto"/>
     </w:pPr>
+    <w:rPr>
+      <w:rFonts w:ascii="Calibri" w:hAnsi="Calibri" w:cs="Calibri" w:eastAsia="Calibri"/>
+    </w:rPr>
     <w:tblPr>
       <w:tblStyleRowBandSize w:val="1"/>
       <w:tblStyleColBandSize w:val="1"/>
@@ -5073,6 +3712,9 @@
     <w:pPr>
       <w:spacing w:after="0" w:line="240" w:lineRule="auto"/>
     </w:pPr>
+    <w:rPr>
+      <w:rFonts w:ascii="Calibri" w:hAnsi="Calibri" w:cs="Calibri" w:eastAsia="Calibri"/>
+    </w:rPr>
     <w:tblPr>
       <w:tblStyleRowBandSize w:val="1"/>
       <w:tblStyleColBandSize w:val="1"/>
@@ -5203,6 +3845,9 @@
     <w:pPr>
       <w:spacing w:after="0" w:line="240" w:lineRule="auto"/>
     </w:pPr>
+    <w:rPr>
+      <w:rFonts w:ascii="Calibri" w:hAnsi="Calibri" w:cs="Calibri" w:eastAsia="Calibri"/>
+    </w:rPr>
     <w:tblPr>
       <w:tblStyleRowBandSize w:val="1"/>
       <w:tblStyleColBandSize w:val="1"/>
@@ -5333,6 +3978,9 @@
     <w:pPr>
       <w:spacing w:after="0" w:line="240" w:lineRule="auto"/>
     </w:pPr>
+    <w:rPr>
+      <w:rFonts w:ascii="Calibri" w:hAnsi="Calibri" w:cs="Calibri" w:eastAsia="Calibri"/>
+    </w:rPr>
     <w:tblPr>
       <w:tblStyleRowBandSize w:val="1"/>
       <w:tblStyleColBandSize w:val="1"/>
@@ -5463,6 +4111,9 @@
     <w:pPr>
       <w:spacing w:after="0" w:line="240" w:lineRule="auto"/>
     </w:pPr>
+    <w:rPr>
+      <w:rFonts w:ascii="Calibri" w:hAnsi="Calibri" w:cs="Calibri" w:eastAsia="Calibri"/>
+    </w:rPr>
     <w:tblPr>
       <w:tblStyleRowBandSize w:val="1"/>
       <w:tblStyleColBandSize w:val="1"/>
@@ -5593,6 +4244,9 @@
     <w:pPr>
       <w:spacing w:after="0" w:line="240" w:lineRule="auto"/>
     </w:pPr>
+    <w:rPr>
+      <w:rFonts w:ascii="Calibri" w:hAnsi="Calibri" w:cs="Calibri" w:eastAsia="Calibri"/>
+    </w:rPr>
     <w:tblPr>
       <w:tblStyleRowBandSize w:val="1"/>
       <w:tblStyleColBandSize w:val="1"/>
@@ -5723,6 +4377,9 @@
     <w:pPr>
       <w:spacing w:after="0" w:line="240" w:lineRule="auto"/>
     </w:pPr>
+    <w:rPr>
+      <w:rFonts w:ascii="Calibri" w:hAnsi="Calibri" w:cs="Calibri" w:eastAsia="Calibri"/>
+    </w:rPr>
     <w:tblPr>
       <w:tblStyleRowBandSize w:val="1"/>
       <w:tblStyleColBandSize w:val="1"/>
@@ -5853,6 +4510,9 @@
     <w:pPr>
       <w:spacing w:after="0" w:line="240" w:lineRule="auto"/>
     </w:pPr>
+    <w:rPr>
+      <w:rFonts w:ascii="Calibri" w:hAnsi="Calibri" w:cs="Calibri" w:eastAsia="Calibri"/>
+    </w:rPr>
     <w:tblPr>
       <w:tblStyleRowBandSize w:val="1"/>
       <w:tblStyleColBandSize w:val="1"/>
@@ -5983,6 +4643,9 @@
     <w:pPr>
       <w:spacing w:after="0" w:line="240" w:lineRule="auto"/>
     </w:pPr>
+    <w:rPr>
+      <w:rFonts w:ascii="Calibri" w:hAnsi="Calibri" w:cs="Calibri" w:eastAsia="Calibri"/>
+    </w:rPr>
     <w:tblPr>
       <w:tblStyleRowBandSize w:val="1"/>
       <w:tblStyleColBandSize w:val="1"/>
@@ -6089,6 +4752,9 @@
     <w:pPr>
       <w:spacing w:after="0" w:line="240" w:lineRule="auto"/>
     </w:pPr>
+    <w:rPr>
+      <w:rFonts w:ascii="Calibri" w:hAnsi="Calibri" w:cs="Calibri" w:eastAsia="Calibri"/>
+    </w:rPr>
     <w:tblPr>
       <w:tblStyleRowBandSize w:val="1"/>
       <w:tblStyleColBandSize w:val="1"/>
@@ -6195,6 +4861,9 @@
     <w:pPr>
       <w:spacing w:after="0" w:line="240" w:lineRule="auto"/>
     </w:pPr>
+    <w:rPr>
+      <w:rFonts w:ascii="Calibri" w:hAnsi="Calibri" w:cs="Calibri" w:eastAsia="Calibri"/>
+    </w:rPr>
     <w:tblPr>
       <w:tblStyleRowBandSize w:val="1"/>
       <w:tblStyleColBandSize w:val="1"/>
@@ -6301,6 +4970,9 @@
     <w:pPr>
       <w:spacing w:after="0" w:line="240" w:lineRule="auto"/>
     </w:pPr>
+    <w:rPr>
+      <w:rFonts w:ascii="Calibri" w:hAnsi="Calibri" w:cs="Calibri" w:eastAsia="Calibri"/>
+    </w:rPr>
     <w:tblPr>
       <w:tblStyleRowBandSize w:val="1"/>
       <w:tblStyleColBandSize w:val="1"/>
@@ -6407,6 +5079,9 @@
     <w:pPr>
       <w:spacing w:after="0" w:line="240" w:lineRule="auto"/>
     </w:pPr>
+    <w:rPr>
+      <w:rFonts w:ascii="Calibri" w:hAnsi="Calibri" w:cs="Calibri" w:eastAsia="Calibri"/>
+    </w:rPr>
     <w:tblPr>
       <w:tblStyleRowBandSize w:val="1"/>
       <w:tblStyleColBandSize w:val="1"/>
@@ -6513,6 +5188,9 @@
     <w:pPr>
       <w:spacing w:after="0" w:line="240" w:lineRule="auto"/>
     </w:pPr>
+    <w:rPr>
+      <w:rFonts w:ascii="Calibri" w:hAnsi="Calibri" w:cs="Calibri" w:eastAsia="Calibri"/>
+    </w:rPr>
     <w:tblPr>
       <w:tblStyleRowBandSize w:val="1"/>
       <w:tblStyleColBandSize w:val="1"/>
@@ -6619,6 +5297,9 @@
     <w:pPr>
       <w:spacing w:after="0" w:line="240" w:lineRule="auto"/>
     </w:pPr>
+    <w:rPr>
+      <w:rFonts w:ascii="Calibri" w:hAnsi="Calibri" w:cs="Calibri" w:eastAsia="Calibri"/>
+    </w:rPr>
     <w:tblPr>
       <w:tblStyleRowBandSize w:val="1"/>
       <w:tblStyleColBandSize w:val="1"/>
@@ -6725,6 +5406,9 @@
     <w:pPr>
       <w:spacing w:after="0" w:line="240" w:lineRule="auto"/>
     </w:pPr>
+    <w:rPr>
+      <w:rFonts w:ascii="Calibri" w:hAnsi="Calibri" w:cs="Calibri" w:eastAsia="Calibri"/>
+    </w:rPr>
     <w:tblPr>
       <w:tblStyleRowBandSize w:val="1"/>
       <w:tblStyleColBandSize w:val="1"/>
@@ -6874,6 +5558,9 @@
     <w:pPr>
       <w:spacing w:after="0" w:line="240" w:lineRule="auto"/>
     </w:pPr>
+    <w:rPr>
+      <w:rFonts w:ascii="Calibri" w:hAnsi="Calibri" w:cs="Calibri" w:eastAsia="Calibri"/>
+    </w:rPr>
     <w:tblPr>
       <w:tblStyleRowBandSize w:val="1"/>
       <w:tblStyleColBandSize w:val="1"/>
@@ -7023,6 +5710,9 @@
     <w:pPr>
       <w:spacing w:after="0" w:line="240" w:lineRule="auto"/>
     </w:pPr>
+    <w:rPr>
+      <w:rFonts w:ascii="Calibri" w:hAnsi="Calibri" w:cs="Calibri" w:eastAsia="Calibri"/>
+    </w:rPr>
     <w:tblPr>
       <w:tblStyleRowBandSize w:val="1"/>
       <w:tblStyleColBandSize w:val="1"/>
@@ -7172,6 +5862,9 @@
     <w:pPr>
       <w:spacing w:after="0" w:line="240" w:lineRule="auto"/>
     </w:pPr>
+    <w:rPr>
+      <w:rFonts w:ascii="Calibri" w:hAnsi="Calibri" w:cs="Calibri" w:eastAsia="Calibri"/>
+    </w:rPr>
     <w:tblPr>
       <w:tblStyleRowBandSize w:val="1"/>
       <w:tblStyleColBandSize w:val="1"/>
@@ -7321,6 +6014,9 @@
     <w:pPr>
       <w:spacing w:after="0" w:line="240" w:lineRule="auto"/>
     </w:pPr>
+    <w:rPr>
+      <w:rFonts w:ascii="Calibri" w:hAnsi="Calibri" w:cs="Calibri" w:eastAsia="Calibri"/>
+    </w:rPr>
     <w:tblPr>
       <w:tblStyleRowBandSize w:val="1"/>
       <w:tblStyleColBandSize w:val="1"/>
@@ -7470,6 +6166,9 @@
     <w:pPr>
       <w:spacing w:after="0" w:line="240" w:lineRule="auto"/>
     </w:pPr>
+    <w:rPr>
+      <w:rFonts w:ascii="Calibri" w:hAnsi="Calibri" w:cs="Calibri" w:eastAsia="Calibri"/>
+    </w:rPr>
     <w:tblPr>
       <w:tblStyleRowBandSize w:val="1"/>
       <w:tblStyleColBandSize w:val="1"/>
@@ -7619,6 +6318,9 @@
     <w:pPr>
       <w:spacing w:after="0" w:line="240" w:lineRule="auto"/>
     </w:pPr>
+    <w:rPr>
+      <w:rFonts w:ascii="Calibri" w:hAnsi="Calibri" w:cs="Calibri" w:eastAsia="Calibri"/>
+    </w:rPr>
     <w:tblPr>
       <w:tblStyleRowBandSize w:val="1"/>
       <w:tblStyleColBandSize w:val="1"/>
@@ -7769,6 +6471,7 @@
       <w:spacing w:after="0" w:line="240" w:lineRule="auto"/>
     </w:pPr>
     <w:rPr>
+      <w:rFonts w:ascii="Calibri" w:hAnsi="Calibri" w:cs="Calibri" w:eastAsia="Calibri"/>
       <w:color w:val="000000" w:themeColor="text1"/>
     </w:rPr>
     <w:tblPr>
@@ -7853,6 +6556,7 @@
       <w:spacing w:after="0" w:line="240" w:lineRule="auto"/>
     </w:pPr>
     <w:rPr>
+      <w:rFonts w:ascii="Calibri" w:hAnsi="Calibri" w:cs="Calibri" w:eastAsia="Calibri"/>
       <w:color w:val="000000" w:themeColor="text1"/>
     </w:rPr>
     <w:tblPr>
@@ -7937,6 +6641,7 @@
       <w:spacing w:after="0" w:line="240" w:lineRule="auto"/>
     </w:pPr>
     <w:rPr>
+      <w:rFonts w:ascii="Calibri" w:hAnsi="Calibri" w:cs="Calibri" w:eastAsia="Calibri"/>
       <w:color w:val="000000" w:themeColor="text1"/>
     </w:rPr>
     <w:tblPr>
@@ -8021,6 +6726,7 @@
       <w:spacing w:after="0" w:line="240" w:lineRule="auto"/>
     </w:pPr>
     <w:rPr>
+      <w:rFonts w:ascii="Calibri" w:hAnsi="Calibri" w:cs="Calibri" w:eastAsia="Calibri"/>
       <w:color w:val="000000" w:themeColor="text1"/>
     </w:rPr>
     <w:tblPr>
@@ -8105,6 +6811,7 @@
       <w:spacing w:after="0" w:line="240" w:lineRule="auto"/>
     </w:pPr>
     <w:rPr>
+      <w:rFonts w:ascii="Calibri" w:hAnsi="Calibri" w:cs="Calibri" w:eastAsia="Calibri"/>
       <w:color w:val="000000" w:themeColor="text1"/>
     </w:rPr>
     <w:tblPr>
@@ -8189,6 +6896,7 @@
       <w:spacing w:after="0" w:line="240" w:lineRule="auto"/>
     </w:pPr>
     <w:rPr>
+      <w:rFonts w:ascii="Calibri" w:hAnsi="Calibri" w:cs="Calibri" w:eastAsia="Calibri"/>
       <w:color w:val="000000" w:themeColor="text1"/>
     </w:rPr>
     <w:tblPr>
@@ -8273,6 +6981,7 @@
       <w:spacing w:after="0" w:line="240" w:lineRule="auto"/>
     </w:pPr>
     <w:rPr>
+      <w:rFonts w:ascii="Calibri" w:hAnsi="Calibri" w:cs="Calibri" w:eastAsia="Calibri"/>
       <w:color w:val="000000" w:themeColor="text1"/>
     </w:rPr>
     <w:tblPr>
@@ -8357,7 +7066,7 @@
       <w:spacing w:after="0" w:line="240" w:lineRule="auto"/>
     </w:pPr>
     <w:rPr>
-      <w:rFonts w:asciiTheme="majorHAnsi" w:eastAsiaTheme="majorEastAsia" w:hAnsiTheme="majorHAnsi" w:cstheme="majorBidi"/>
+      <w:rFonts w:asciiTheme="majorHAnsi" w:eastAsiaTheme="majorEastAsia" w:hAnsiTheme="majorHAnsi" w:cstheme="majorBidi" w:ascii="Calibri" w:hAnsi="Calibri" w:cs="Calibri" w:eastAsia="Calibri"/>
       <w:color w:val="000000" w:themeColor="text1"/>
     </w:rPr>
     <w:tblPr>
@@ -8485,7 +7194,7 @@
       <w:spacing w:after="0" w:line="240" w:lineRule="auto"/>
     </w:pPr>
     <w:rPr>
-      <w:rFonts w:asciiTheme="majorHAnsi" w:eastAsiaTheme="majorEastAsia" w:hAnsiTheme="majorHAnsi" w:cstheme="majorBidi"/>
+      <w:rFonts w:asciiTheme="majorHAnsi" w:eastAsiaTheme="majorEastAsia" w:hAnsiTheme="majorHAnsi" w:cstheme="majorBidi" w:ascii="Calibri" w:hAnsi="Calibri" w:cs="Calibri" w:eastAsia="Calibri"/>
       <w:color w:val="000000" w:themeColor="text1"/>
     </w:rPr>
     <w:tblPr>
@@ -8613,7 +7322,7 @@
       <w:spacing w:after="0" w:line="240" w:lineRule="auto"/>
     </w:pPr>
     <w:rPr>
-      <w:rFonts w:asciiTheme="majorHAnsi" w:eastAsiaTheme="majorEastAsia" w:hAnsiTheme="majorHAnsi" w:cstheme="majorBidi"/>
+      <w:rFonts w:asciiTheme="majorHAnsi" w:eastAsiaTheme="majorEastAsia" w:hAnsiTheme="majorHAnsi" w:cstheme="majorBidi" w:ascii="Calibri" w:hAnsi="Calibri" w:cs="Calibri" w:eastAsia="Calibri"/>
       <w:color w:val="000000" w:themeColor="text1"/>
     </w:rPr>
     <w:tblPr>
@@ -8741,7 +7450,7 @@
       <w:spacing w:after="0" w:line="240" w:lineRule="auto"/>
     </w:pPr>
     <w:rPr>
-      <w:rFonts w:asciiTheme="majorHAnsi" w:eastAsiaTheme="majorEastAsia" w:hAnsiTheme="majorHAnsi" w:cstheme="majorBidi"/>
+      <w:rFonts w:asciiTheme="majorHAnsi" w:eastAsiaTheme="majorEastAsia" w:hAnsiTheme="majorHAnsi" w:cstheme="majorBidi" w:ascii="Calibri" w:hAnsi="Calibri" w:cs="Calibri" w:eastAsia="Calibri"/>
       <w:color w:val="000000" w:themeColor="text1"/>
     </w:rPr>
     <w:tblPr>
@@ -8869,7 +7578,7 @@
       <w:spacing w:after="0" w:line="240" w:lineRule="auto"/>
     </w:pPr>
     <w:rPr>
-      <w:rFonts w:asciiTheme="majorHAnsi" w:eastAsiaTheme="majorEastAsia" w:hAnsiTheme="majorHAnsi" w:cstheme="majorBidi"/>
+      <w:rFonts w:asciiTheme="majorHAnsi" w:eastAsiaTheme="majorEastAsia" w:hAnsiTheme="majorHAnsi" w:cstheme="majorBidi" w:ascii="Calibri" w:hAnsi="Calibri" w:cs="Calibri" w:eastAsia="Calibri"/>
       <w:color w:val="000000" w:themeColor="text1"/>
     </w:rPr>
     <w:tblPr>
@@ -8997,7 +7706,7 @@
       <w:spacing w:after="0" w:line="240" w:lineRule="auto"/>
     </w:pPr>
     <w:rPr>
-      <w:rFonts w:asciiTheme="majorHAnsi" w:eastAsiaTheme="majorEastAsia" w:hAnsiTheme="majorHAnsi" w:cstheme="majorBidi"/>
+      <w:rFonts w:asciiTheme="majorHAnsi" w:eastAsiaTheme="majorEastAsia" w:hAnsiTheme="majorHAnsi" w:cstheme="majorBidi" w:ascii="Calibri" w:hAnsi="Calibri" w:cs="Calibri" w:eastAsia="Calibri"/>
       <w:color w:val="000000" w:themeColor="text1"/>
     </w:rPr>
     <w:tblPr>
@@ -9125,7 +7834,7 @@
       <w:spacing w:after="0" w:line="240" w:lineRule="auto"/>
     </w:pPr>
     <w:rPr>
-      <w:rFonts w:asciiTheme="majorHAnsi" w:eastAsiaTheme="majorEastAsia" w:hAnsiTheme="majorHAnsi" w:cstheme="majorBidi"/>
+      <w:rFonts w:asciiTheme="majorHAnsi" w:eastAsiaTheme="majorEastAsia" w:hAnsiTheme="majorHAnsi" w:cstheme="majorBidi" w:ascii="Calibri" w:hAnsi="Calibri" w:cs="Calibri" w:eastAsia="Calibri"/>
       <w:color w:val="000000" w:themeColor="text1"/>
     </w:rPr>
     <w:tblPr>
@@ -9252,6 +7961,9 @@
     <w:pPr>
       <w:spacing w:after="0" w:line="240" w:lineRule="auto"/>
     </w:pPr>
+    <w:rPr>
+      <w:rFonts w:ascii="Calibri" w:hAnsi="Calibri" w:cs="Calibri" w:eastAsia="Calibri"/>
+    </w:rPr>
     <w:tblPr>
       <w:tblStyleRowBandSize w:val="1"/>
       <w:tblStyleColBandSize w:val="1"/>
@@ -9325,6 +8037,9 @@
     <w:pPr>
       <w:spacing w:after="0" w:line="240" w:lineRule="auto"/>
     </w:pPr>
+    <w:rPr>
+      <w:rFonts w:ascii="Calibri" w:hAnsi="Calibri" w:cs="Calibri" w:eastAsia="Calibri"/>
+    </w:rPr>
     <w:tblPr>
       <w:tblStyleRowBandSize w:val="1"/>
       <w:tblStyleColBandSize w:val="1"/>
@@ -9398,6 +8113,9 @@
     <w:pPr>
       <w:spacing w:after="0" w:line="240" w:lineRule="auto"/>
     </w:pPr>
+    <w:rPr>
+      <w:rFonts w:ascii="Calibri" w:hAnsi="Calibri" w:cs="Calibri" w:eastAsia="Calibri"/>
+    </w:rPr>
     <w:tblPr>
       <w:tblStyleRowBandSize w:val="1"/>
       <w:tblStyleColBandSize w:val="1"/>
@@ -9471,6 +8189,9 @@
     <w:pPr>
       <w:spacing w:after="0" w:line="240" w:lineRule="auto"/>
     </w:pPr>
+    <w:rPr>
+      <w:rFonts w:ascii="Calibri" w:hAnsi="Calibri" w:cs="Calibri" w:eastAsia="Calibri"/>
+    </w:rPr>
     <w:tblPr>
       <w:tblStyleRowBandSize w:val="1"/>
       <w:tblStyleColBandSize w:val="1"/>
@@ -9544,6 +8265,9 @@
     <w:pPr>
       <w:spacing w:after="0" w:line="240" w:lineRule="auto"/>
     </w:pPr>
+    <w:rPr>
+      <w:rFonts w:ascii="Calibri" w:hAnsi="Calibri" w:cs="Calibri" w:eastAsia="Calibri"/>
+    </w:rPr>
     <w:tblPr>
       <w:tblStyleRowBandSize w:val="1"/>
       <w:tblStyleColBandSize w:val="1"/>
@@ -9617,6 +8341,9 @@
     <w:pPr>
       <w:spacing w:after="0" w:line="240" w:lineRule="auto"/>
     </w:pPr>
+    <w:rPr>
+      <w:rFonts w:ascii="Calibri" w:hAnsi="Calibri" w:cs="Calibri" w:eastAsia="Calibri"/>
+    </w:rPr>
     <w:tblPr>
       <w:tblStyleRowBandSize w:val="1"/>
       <w:tblStyleColBandSize w:val="1"/>
@@ -9690,6 +8417,9 @@
     <w:pPr>
       <w:spacing w:after="0" w:line="240" w:lineRule="auto"/>
     </w:pPr>
+    <w:rPr>
+      <w:rFonts w:ascii="Calibri" w:hAnsi="Calibri" w:cs="Calibri" w:eastAsia="Calibri"/>
+    </w:rPr>
     <w:tblPr>
       <w:tblStyleRowBandSize w:val="1"/>
       <w:tblStyleColBandSize w:val="1"/>
@@ -9764,7 +8494,7 @@
       <w:spacing w:after="0" w:line="240" w:lineRule="auto"/>
     </w:pPr>
     <w:rPr>
-      <w:rFonts w:asciiTheme="majorHAnsi" w:eastAsiaTheme="majorEastAsia" w:hAnsiTheme="majorHAnsi" w:cstheme="majorBidi"/>
+      <w:rFonts w:asciiTheme="majorHAnsi" w:eastAsiaTheme="majorEastAsia" w:hAnsiTheme="majorHAnsi" w:cstheme="majorBidi" w:ascii="Calibri" w:hAnsi="Calibri" w:cs="Calibri" w:eastAsia="Calibri"/>
       <w:color w:val="000000" w:themeColor="text1"/>
     </w:rPr>
     <w:tblPr>
@@ -9889,7 +8619,7 @@
       <w:spacing w:after="0" w:line="240" w:lineRule="auto"/>
     </w:pPr>
     <w:rPr>
-      <w:rFonts w:asciiTheme="majorHAnsi" w:eastAsiaTheme="majorEastAsia" w:hAnsiTheme="majorHAnsi" w:cstheme="majorBidi"/>
+      <w:rFonts w:asciiTheme="majorHAnsi" w:eastAsiaTheme="majorEastAsia" w:hAnsiTheme="majorHAnsi" w:cstheme="majorBidi" w:ascii="Calibri" w:hAnsi="Calibri" w:cs="Calibri" w:eastAsia="Calibri"/>
       <w:color w:val="000000" w:themeColor="text1"/>
     </w:rPr>
     <w:tblPr>
@@ -10014,7 +8744,7 @@
       <w:spacing w:after="0" w:line="240" w:lineRule="auto"/>
     </w:pPr>
     <w:rPr>
-      <w:rFonts w:asciiTheme="majorHAnsi" w:eastAsiaTheme="majorEastAsia" w:hAnsiTheme="majorHAnsi" w:cstheme="majorBidi"/>
+      <w:rFonts w:asciiTheme="majorHAnsi" w:eastAsiaTheme="majorEastAsia" w:hAnsiTheme="majorHAnsi" w:cstheme="majorBidi" w:ascii="Calibri" w:hAnsi="Calibri" w:cs="Calibri" w:eastAsia="Calibri"/>
       <w:color w:val="000000" w:themeColor="text1"/>
     </w:rPr>
     <w:tblPr>
@@ -10139,7 +8869,7 @@
       <w:spacing w:after="0" w:line="240" w:lineRule="auto"/>
     </w:pPr>
     <w:rPr>
-      <w:rFonts w:asciiTheme="majorHAnsi" w:eastAsiaTheme="majorEastAsia" w:hAnsiTheme="majorHAnsi" w:cstheme="majorBidi"/>
+      <w:rFonts w:asciiTheme="majorHAnsi" w:eastAsiaTheme="majorEastAsia" w:hAnsiTheme="majorHAnsi" w:cstheme="majorBidi" w:ascii="Calibri" w:hAnsi="Calibri" w:cs="Calibri" w:eastAsia="Calibri"/>
       <w:color w:val="000000" w:themeColor="text1"/>
     </w:rPr>
     <w:tblPr>
@@ -10264,7 +8994,7 @@
       <w:spacing w:after="0" w:line="240" w:lineRule="auto"/>
     </w:pPr>
     <w:rPr>
-      <w:rFonts w:asciiTheme="majorHAnsi" w:eastAsiaTheme="majorEastAsia" w:hAnsiTheme="majorHAnsi" w:cstheme="majorBidi"/>
+      <w:rFonts w:asciiTheme="majorHAnsi" w:eastAsiaTheme="majorEastAsia" w:hAnsiTheme="majorHAnsi" w:cstheme="majorBidi" w:ascii="Calibri" w:hAnsi="Calibri" w:cs="Calibri" w:eastAsia="Calibri"/>
       <w:color w:val="000000" w:themeColor="text1"/>
     </w:rPr>
     <w:tblPr>
@@ -10389,7 +9119,7 @@
       <w:spacing w:after="0" w:line="240" w:lineRule="auto"/>
     </w:pPr>
     <w:rPr>
-      <w:rFonts w:asciiTheme="majorHAnsi" w:eastAsiaTheme="majorEastAsia" w:hAnsiTheme="majorHAnsi" w:cstheme="majorBidi"/>
+      <w:rFonts w:asciiTheme="majorHAnsi" w:eastAsiaTheme="majorEastAsia" w:hAnsiTheme="majorHAnsi" w:cstheme="majorBidi" w:ascii="Calibri" w:hAnsi="Calibri" w:cs="Calibri" w:eastAsia="Calibri"/>
       <w:color w:val="000000" w:themeColor="text1"/>
     </w:rPr>
     <w:tblPr>
@@ -10514,7 +9244,7 @@
       <w:spacing w:after="0" w:line="240" w:lineRule="auto"/>
     </w:pPr>
     <w:rPr>
-      <w:rFonts w:asciiTheme="majorHAnsi" w:eastAsiaTheme="majorEastAsia" w:hAnsiTheme="majorHAnsi" w:cstheme="majorBidi"/>
+      <w:rFonts w:asciiTheme="majorHAnsi" w:eastAsiaTheme="majorEastAsia" w:hAnsiTheme="majorHAnsi" w:cstheme="majorBidi" w:ascii="Calibri" w:hAnsi="Calibri" w:cs="Calibri" w:eastAsia="Calibri"/>
       <w:color w:val="000000" w:themeColor="text1"/>
     </w:rPr>
     <w:tblPr>
@@ -10638,6 +9368,9 @@
     <w:pPr>
       <w:spacing w:after="0" w:line="240" w:lineRule="auto"/>
     </w:pPr>
+    <w:rPr>
+      <w:rFonts w:ascii="Calibri" w:hAnsi="Calibri" w:cs="Calibri" w:eastAsia="Calibri"/>
+    </w:rPr>
     <w:tblPr>
       <w:tblStyleRowBandSize w:val="1"/>
       <w:tblStyleColBandSize w:val="1"/>
@@ -10779,6 +9512,9 @@
     <w:pPr>
       <w:spacing w:after="0" w:line="240" w:lineRule="auto"/>
     </w:pPr>
+    <w:rPr>
+      <w:rFonts w:ascii="Calibri" w:hAnsi="Calibri" w:cs="Calibri" w:eastAsia="Calibri"/>
+    </w:rPr>
     <w:tblPr>
       <w:tblStyleRowBandSize w:val="1"/>
       <w:tblStyleColBandSize w:val="1"/>
@@ -10920,6 +9656,9 @@
     <w:pPr>
       <w:spacing w:after="0" w:line="240" w:lineRule="auto"/>
     </w:pPr>
+    <w:rPr>
+      <w:rFonts w:ascii="Calibri" w:hAnsi="Calibri" w:cs="Calibri" w:eastAsia="Calibri"/>
+    </w:rPr>
     <w:tblPr>
       <w:tblStyleRowBandSize w:val="1"/>
       <w:tblStyleColBandSize w:val="1"/>
@@ -11061,6 +9800,9 @@
     <w:pPr>
       <w:spacing w:after="0" w:line="240" w:lineRule="auto"/>
     </w:pPr>
+    <w:rPr>
+      <w:rFonts w:ascii="Calibri" w:hAnsi="Calibri" w:cs="Calibri" w:eastAsia="Calibri"/>
+    </w:rPr>
     <w:tblPr>
       <w:tblStyleRowBandSize w:val="1"/>
       <w:tblStyleColBandSize w:val="1"/>
@@ -11202,6 +9944,9 @@
     <w:pPr>
       <w:spacing w:after="0" w:line="240" w:lineRule="auto"/>
     </w:pPr>
+    <w:rPr>
+      <w:rFonts w:ascii="Calibri" w:hAnsi="Calibri" w:cs="Calibri" w:eastAsia="Calibri"/>
+    </w:rPr>
     <w:tblPr>
       <w:tblStyleRowBandSize w:val="1"/>
       <w:tblStyleColBandSize w:val="1"/>
@@ -11343,6 +10088,9 @@
     <w:pPr>
       <w:spacing w:after="0" w:line="240" w:lineRule="auto"/>
     </w:pPr>
+    <w:rPr>
+      <w:rFonts w:ascii="Calibri" w:hAnsi="Calibri" w:cs="Calibri" w:eastAsia="Calibri"/>
+    </w:rPr>
     <w:tblPr>
       <w:tblStyleRowBandSize w:val="1"/>
       <w:tblStyleColBandSize w:val="1"/>
@@ -11484,6 +10232,9 @@
     <w:pPr>
       <w:spacing w:after="0" w:line="240" w:lineRule="auto"/>
     </w:pPr>
+    <w:rPr>
+      <w:rFonts w:ascii="Calibri" w:hAnsi="Calibri" w:cs="Calibri" w:eastAsia="Calibri"/>
+    </w:rPr>
     <w:tblPr>
       <w:tblStyleRowBandSize w:val="1"/>
       <w:tblStyleColBandSize w:val="1"/>
@@ -11626,6 +10377,7 @@
       <w:spacing w:after="0" w:line="240" w:lineRule="auto"/>
     </w:pPr>
     <w:rPr>
+      <w:rFonts w:ascii="Calibri" w:hAnsi="Calibri" w:cs="Calibri" w:eastAsia="Calibri"/>
       <w:color w:val="FFFFFF" w:themeColor="background1"/>
     </w:rPr>
     <w:tblPr>
@@ -11740,6 +10492,7 @@
       <w:spacing w:after="0" w:line="240" w:lineRule="auto"/>
     </w:pPr>
     <w:rPr>
+      <w:rFonts w:ascii="Calibri" w:hAnsi="Calibri" w:cs="Calibri" w:eastAsia="Calibri"/>
       <w:color w:val="FFFFFF" w:themeColor="background1"/>
     </w:rPr>
     <w:tblPr>
@@ -11854,6 +10607,7 @@
       <w:spacing w:after="0" w:line="240" w:lineRule="auto"/>
     </w:pPr>
     <w:rPr>
+      <w:rFonts w:ascii="Calibri" w:hAnsi="Calibri" w:cs="Calibri" w:eastAsia="Calibri"/>
       <w:color w:val="FFFFFF" w:themeColor="background1"/>
     </w:rPr>
     <w:tblPr>
@@ -11968,6 +10722,7 @@
       <w:spacing w:after="0" w:line="240" w:lineRule="auto"/>
     </w:pPr>
     <w:rPr>
+      <w:rFonts w:ascii="Calibri" w:hAnsi="Calibri" w:cs="Calibri" w:eastAsia="Calibri"/>
       <w:color w:val="FFFFFF" w:themeColor="background1"/>
     </w:rPr>
     <w:tblPr>
@@ -12082,6 +10837,7 @@
       <w:spacing w:after="0" w:line="240" w:lineRule="auto"/>
     </w:pPr>
     <w:rPr>
+      <w:rFonts w:ascii="Calibri" w:hAnsi="Calibri" w:cs="Calibri" w:eastAsia="Calibri"/>
       <w:color w:val="FFFFFF" w:themeColor="background1"/>
     </w:rPr>
     <w:tblPr>
@@ -12196,6 +10952,7 @@
       <w:spacing w:after="0" w:line="240" w:lineRule="auto"/>
     </w:pPr>
     <w:rPr>
+      <w:rFonts w:ascii="Calibri" w:hAnsi="Calibri" w:cs="Calibri" w:eastAsia="Calibri"/>
       <w:color w:val="FFFFFF" w:themeColor="background1"/>
     </w:rPr>
     <w:tblPr>
@@ -12310,6 +11067,7 @@
       <w:spacing w:after="0" w:line="240" w:lineRule="auto"/>
     </w:pPr>
     <w:rPr>
+      <w:rFonts w:ascii="Calibri" w:hAnsi="Calibri" w:cs="Calibri" w:eastAsia="Calibri"/>
       <w:color w:val="FFFFFF" w:themeColor="background1"/>
     </w:rPr>
     <w:tblPr>
@@ -12424,6 +11182,7 @@
       <w:spacing w:after="0" w:line="240" w:lineRule="auto"/>
     </w:pPr>
     <w:rPr>
+      <w:rFonts w:ascii="Calibri" w:hAnsi="Calibri" w:cs="Calibri" w:eastAsia="Calibri"/>
       <w:color w:val="000000" w:themeColor="text1"/>
     </w:rPr>
     <w:tblPr>
@@ -12546,6 +11305,7 @@
       <w:spacing w:after="0" w:line="240" w:lineRule="auto"/>
     </w:pPr>
     <w:rPr>
+      <w:rFonts w:ascii="Calibri" w:hAnsi="Calibri" w:cs="Calibri" w:eastAsia="Calibri"/>
       <w:color w:val="000000" w:themeColor="text1"/>
     </w:rPr>
     <w:tblPr>
@@ -12668,6 +11428,7 @@
       <w:spacing w:after="0" w:line="240" w:lineRule="auto"/>
     </w:pPr>
     <w:rPr>
+      <w:rFonts w:ascii="Calibri" w:hAnsi="Calibri" w:cs="Calibri" w:eastAsia="Calibri"/>
       <w:color w:val="000000" w:themeColor="text1"/>
     </w:rPr>
     <w:tblPr>
@@ -12790,6 +11551,7 @@
       <w:spacing w:after="0" w:line="240" w:lineRule="auto"/>
     </w:pPr>
     <w:rPr>
+      <w:rFonts w:ascii="Calibri" w:hAnsi="Calibri" w:cs="Calibri" w:eastAsia="Calibri"/>
       <w:color w:val="000000" w:themeColor="text1"/>
     </w:rPr>
     <w:tblPr>
@@ -12902,6 +11664,7 @@
       <w:spacing w:after="0" w:line="240" w:lineRule="auto"/>
     </w:pPr>
     <w:rPr>
+      <w:rFonts w:ascii="Calibri" w:hAnsi="Calibri" w:cs="Calibri" w:eastAsia="Calibri"/>
       <w:color w:val="000000" w:themeColor="text1"/>
     </w:rPr>
     <w:tblPr>
@@ -13024,6 +11787,7 @@
       <w:spacing w:after="0" w:line="240" w:lineRule="auto"/>
     </w:pPr>
     <w:rPr>
+      <w:rFonts w:ascii="Calibri" w:hAnsi="Calibri" w:cs="Calibri" w:eastAsia="Calibri"/>
       <w:color w:val="000000" w:themeColor="text1"/>
     </w:rPr>
     <w:tblPr>
@@ -13146,6 +11910,7 @@
       <w:spacing w:after="0" w:line="240" w:lineRule="auto"/>
     </w:pPr>
     <w:rPr>
+      <w:rFonts w:ascii="Calibri" w:hAnsi="Calibri" w:cs="Calibri" w:eastAsia="Calibri"/>
       <w:color w:val="000000" w:themeColor="text1"/>
     </w:rPr>
     <w:tblPr>
@@ -13268,6 +12033,7 @@
       <w:spacing w:after="0" w:line="240" w:lineRule="auto"/>
     </w:pPr>
     <w:rPr>
+      <w:rFonts w:ascii="Calibri" w:hAnsi="Calibri" w:cs="Calibri" w:eastAsia="Calibri"/>
       <w:color w:val="000000" w:themeColor="text1"/>
     </w:rPr>
     <w:tblPr>
@@ -13354,6 +12120,7 @@
       <w:spacing w:after="0" w:line="240" w:lineRule="auto"/>
     </w:pPr>
     <w:rPr>
+      <w:rFonts w:ascii="Calibri" w:hAnsi="Calibri" w:cs="Calibri" w:eastAsia="Calibri"/>
       <w:color w:val="000000" w:themeColor="text1"/>
     </w:rPr>
     <w:tblPr>
@@ -13440,6 +12207,7 @@
       <w:spacing w:after="0" w:line="240" w:lineRule="auto"/>
     </w:pPr>
     <w:rPr>
+      <w:rFonts w:ascii="Calibri" w:hAnsi="Calibri" w:cs="Calibri" w:eastAsia="Calibri"/>
       <w:color w:val="000000" w:themeColor="text1"/>
     </w:rPr>
     <w:tblPr>
@@ -13526,6 +12294,7 @@
       <w:spacing w:after="0" w:line="240" w:lineRule="auto"/>
     </w:pPr>
     <w:rPr>
+      <w:rFonts w:ascii="Calibri" w:hAnsi="Calibri" w:cs="Calibri" w:eastAsia="Calibri"/>
       <w:color w:val="000000" w:themeColor="text1"/>
     </w:rPr>
     <w:tblPr>
@@ -13612,6 +12381,7 @@
       <w:spacing w:after="0" w:line="240" w:lineRule="auto"/>
     </w:pPr>
     <w:rPr>
+      <w:rFonts w:ascii="Calibri" w:hAnsi="Calibri" w:cs="Calibri" w:eastAsia="Calibri"/>
       <w:color w:val="000000" w:themeColor="text1"/>
     </w:rPr>
     <w:tblPr>
@@ -13698,6 +12468,7 @@
       <w:spacing w:after="0" w:line="240" w:lineRule="auto"/>
     </w:pPr>
     <w:rPr>
+      <w:rFonts w:ascii="Calibri" w:hAnsi="Calibri" w:cs="Calibri" w:eastAsia="Calibri"/>
       <w:color w:val="000000" w:themeColor="text1"/>
     </w:rPr>
     <w:tblPr>
@@ -13784,6 +12555,7 @@
       <w:spacing w:after="0" w:line="240" w:lineRule="auto"/>
     </w:pPr>
     <w:rPr>
+      <w:rFonts w:ascii="Calibri" w:hAnsi="Calibri" w:cs="Calibri" w:eastAsia="Calibri"/>
       <w:color w:val="000000" w:themeColor="text1"/>
     </w:rPr>
     <w:tblPr>
@@ -13870,6 +12642,7 @@
       <w:spacing w:after="0" w:line="240" w:lineRule="auto"/>
     </w:pPr>
     <w:rPr>
+      <w:rFonts w:ascii="Calibri" w:hAnsi="Calibri" w:cs="Calibri" w:eastAsia="Calibri"/>
       <w:color w:val="000000" w:themeColor="text1"/>
     </w:rPr>
     <w:tblPr>
@@ -13950,6 +12723,7 @@
       <w:spacing w:after="0" w:line="240" w:lineRule="auto"/>
     </w:pPr>
     <w:rPr>
+      <w:rFonts w:ascii="Calibri" w:hAnsi="Calibri" w:cs="Calibri" w:eastAsia="Calibri"/>
       <w:color w:val="000000" w:themeColor="text1"/>
     </w:rPr>
     <w:tblPr>
@@ -14030,6 +12804,7 @@
       <w:spacing w:after="0" w:line="240" w:lineRule="auto"/>
     </w:pPr>
     <w:rPr>
+      <w:rFonts w:ascii="Calibri" w:hAnsi="Calibri" w:cs="Calibri" w:eastAsia="Calibri"/>
       <w:color w:val="000000" w:themeColor="text1"/>
     </w:rPr>
     <w:tblPr>
@@ -14110,6 +12885,7 @@
       <w:spacing w:after="0" w:line="240" w:lineRule="auto"/>
     </w:pPr>
     <w:rPr>
+      <w:rFonts w:ascii="Calibri" w:hAnsi="Calibri" w:cs="Calibri" w:eastAsia="Calibri"/>
       <w:color w:val="000000" w:themeColor="text1"/>
     </w:rPr>
     <w:tblPr>
@@ -14190,6 +12966,7 @@
       <w:spacing w:after="0" w:line="240" w:lineRule="auto"/>
     </w:pPr>
     <w:rPr>
+      <w:rFonts w:ascii="Calibri" w:hAnsi="Calibri" w:cs="Calibri" w:eastAsia="Calibri"/>
       <w:color w:val="000000" w:themeColor="text1"/>
     </w:rPr>
     <w:tblPr>
@@ -14270,6 +13047,7 @@
       <w:spacing w:after="0" w:line="240" w:lineRule="auto"/>
     </w:pPr>
     <w:rPr>
+      <w:rFonts w:ascii="Calibri" w:hAnsi="Calibri" w:cs="Calibri" w:eastAsia="Calibri"/>
       <w:color w:val="000000" w:themeColor="text1"/>
     </w:rPr>
     <w:tblPr>
@@ -14350,6 +13128,7 @@
       <w:spacing w:after="0" w:line="240" w:lineRule="auto"/>
     </w:pPr>
     <w:rPr>
+      <w:rFonts w:ascii="Calibri" w:hAnsi="Calibri" w:cs="Calibri" w:eastAsia="Calibri"/>
       <w:color w:val="000000" w:themeColor="text1"/>
     </w:rPr>
     <w:tblPr>

</xml_diff>